<commit_message>
Fill in outline cover: name, student ID and supervisor
</commit_message>
<xml_diff>
--- a/dissertation/Anneal_Dissertation_Outline.docx
+++ b/dissertation/Anneal_Dissertation_Outline.docx
@@ -20,13 +20,7 @@
         <w:pStyle w:val="Author"/>
       </w:pPr>
       <w:r>
-        <w:t xml:space="preserve">Callum </w:t>
-      </w:r>
-      <w:r>
-        <w:rPr>
-          <w:highlight w:val="yellow"/>
-        </w:rPr>
-        <w:t xml:space="preserve">[Surname]</w:t>
+        <w:t xml:space="preserve">Callum Challinor</w:t>
       </w:r>
     </w:p>
     <w:p>
@@ -39,9 +33,8 @@
       <w:r>
         <w:rPr>
           <w:b w:val="0"/>
-          <w:highlight w:val="yellow"/>
         </w:rPr>
-        <w:t xml:space="preserve">[Student ID]</w:t>
+        <w:t xml:space="preserve">3308299</w:t>
       </w:r>
     </w:p>
     <w:p>
@@ -55,14 +48,7 @@
         <w:rPr>
           <w:b w:val="0"/>
         </w:rPr>
-        <w:t xml:space="preserve">Supervisor: </w:t>
-      </w:r>
-      <w:r>
-        <w:rPr>
-          <w:b w:val="0"/>
-          <w:highlight w:val="yellow"/>
-        </w:rPr>
-        <w:t xml:space="preserve">[Supervisor name]</w:t>
+        <w:t xml:space="preserve">Supervisor: Yuanlin Gu</w:t>
       </w:r>
     </w:p>
     <w:p>

</xml_diff>

<commit_message>
Add AI-use statement to the outline cover
</commit_message>
<xml_diff>
--- a/dissertation/Anneal_Dissertation_Outline.docx
+++ b/dissertation/Anneal_Dissertation_Outline.docx
@@ -63,6 +63,19 @@
           <w:i/>
         </w:rPr>
         <w:t xml:space="preserve">October 2026</w:t>
+      </w:r>
+    </w:p>
+    <w:p>
+      <w:pPr>
+        <w:pStyle w:val="Date"/>
+        <w:spacing w:before="216"/>
+        <w:rPr>
+          <w:i/>
+        </w:rPr>
+      </w:pPr>
+      <w:r>
+        <w:rPr/>
+        <w:t xml:space="preserve">I used Claude as an AI assistant to monitor training and to help with document creation.</w:t>
       </w:r>
     </w:p>
     <w:p>

</xml_diff>

<commit_message>
Outline: public-data-only method and keep-if-better loop
Loop rounds train on public datasets only; the first run becomes round 0,
a comparison of the model's own rows with public data. Adds the held-out
gate, sign test and MMLU-Pro check, drops the main-run decay branches and
the generation schedule, and redraws Figure 1 with the loop. 3,958 words.
Syncs the Decision-Log.
</commit_message>
<xml_diff>
--- a/dissertation/Anneal_Dissertation_Outline.docx
+++ b/dissertation/Anneal_Dissertation_Outline.docx
@@ -210,7 +210,7 @@
         <w:pStyle w:val="BodyFirst"/>
       </w:pPr>
       <w:r>
-        <w:t xml:space="preserve">Large language models (LLMs) are widely used to write and repair code, but the most capable run as paid cloud services, so source code leaves the developer's machine. Open-weight models run locally, yet adapting one to a particular kind of work normally needs datacentre hardware. This project, Anneal, investigates whether a low-rank adapter (LoRA) trained on public and self-generated data can measurably improve the software-development ability of the open-weight Qwen3.8-27B model, when training must fit within the 32 GB of memory allocated to the GPU of one AMD machine and the adapted model must keep its 256k-token context window, and how that gain changes with the amount of training data a months-long run can supply.</w:t>
+        <w:t xml:space="preserve">Large language models (LLMs) are widely used to write and repair code, but the most capable run as paid cloud services, so source code leaves the developer's machine. Open-weight models run locally, yet adapting one to a particular kind of work normally needs datacentre hardware. This project, Anneal, investigates whether a low-rank adapter (LoRA) trained only on public datasets can measurably improve the software-development ability of the open-weight Qwen3.8-27B model, when training must fit within the 32 GB of memory allocated to the GPU of one AMD machine and the adapted model must keep its 256k-token context window, and how that gain changes as a months-long improvement loop adds data.</w:t>
       </w:r>
     </w:p>
     <w:p>
@@ -334,7 +334,7 @@
         <w:t xml:space="preserve">&lt;think&gt;</w:t>
       </w:r>
       <w:r>
-        <w:t xml:space="preserve"> block before answering, so every training row needs a trace, or the model learns to skip reasoning. Data must be licensed for research use and must not overlap the evaluation sets, or gains could reflect memorisation.</w:t>
+        <w:t xml:space="preserve"> block before answering, so every training row needs a trace, or the model learns to skip reasoning. Data must come from public datasets licensed for training and must not overlap the evaluation sets, or gains could reflect memorisation.</w:t>
       </w:r>
     </w:p>
     <w:p>
@@ -424,7 +424,7 @@
         <w:tab/>
       </w:r>
       <w:r>
-        <w:t xml:space="preserve">Assemble a licence-checked, decontaminated training set of tens of thousands of reasoning traces, led by self-generated, test-filtered traces and documented in a data card, before the main run starts.</w:t>
+        <w:t xml:space="preserve">Assemble licence-checked public training sets with reasoning traces, decontaminated against every gate and evaluation set and documented in a data card, before each set's first loop round.</w:t>
       </w:r>
     </w:p>
     <w:p>
@@ -490,7 +490,7 @@
         <w:tab/>
       </w:r>
       <w:r>
-        <w:t xml:space="preserve">Measure how coding gain and retention change with training data, from 2,000 rows to the full main run, and the effect of rank, target modules, example length, data source and base precision through 1,000-row ablations.</w:t>
+        <w:t xml:space="preserve">Measure how coding gain and retention change as loop rounds add public data, and the effect of rank, target modules, example length, data source and base precision through 1,000-row ablations.</w:t>
       </w:r>
     </w:p>
     <w:p>
@@ -648,7 +648,7 @@
         </w:r>
       </w:fldSimple>
       <w:r>
-        <w:t xml:space="preserve"> compared LoRA with full fine-tuning on code and mathematics. At standard ranks LoRA learned substantially less, but better preserved performance outside the target domain, and full fine-tuning learned weight changes of 10 to 100 times higher rank. They also report that forgetting grows with training duration, a direct risk for a months-long run. The study used Llama-2-7B, far weaker than Qwen3.8-27B, so whether a strong base leaves similar room to improve is open. For Anneal the paper sets realistic expectations and justifies the rank ablation and the non-coding check; its finding that LoRA forgets less is also the main reason to expect long-context ability to survive short-example training.</w:t>
+        <w:t xml:space="preserve"> compared LoRA with full fine-tuning on code and mathematics. At standard ranks LoRA learned substantially less, but better preserved performance outside the target domain, and full fine-tuning learned weight changes of 10 to 100 times higher rank. They also report that forgetting grows with training duration, a direct risk for a months-long loop. The study used Llama-2-7B, far weaker than Qwen3.8-27B, so whether a strong base leaves similar room to improve is open. For Anneal the paper sets realistic expectations and justifies the rank ablation and the non-coding check; its finding that LoRA forgets less is also the main reason to expect long-context ability to survive short-example training.</w:t>
       </w:r>
     </w:p>
     <w:p>
@@ -1276,7 +1276,7 @@
               <w:rPr>
                 <w:sz w:val="20"/>
               </w:rPr>
-              <w:t xml:space="preserve">Instruction sets; OpenCodeReasoning; self-generated traces; SWE-Gym</w:t>
+              <w:t xml:space="preserve">Public sets with and without traces; self-generated traces; SWE-Gym</w:t>
             </w:r>
           </w:p>
         </w:tc>
@@ -1295,7 +1295,7 @@
               <w:rPr>
                 <w:sz w:val="20"/>
               </w:rPr>
-              <w:t xml:space="preserve">Self-generated traces on OpenCodeInstruct </w:t>
+              <w:t xml:space="preserve">OpenCodeReasoning </w:t>
             </w:r>
             <w:fldSimple w:instr=" REF _RefAnneal20 \r \h ">
               <w:r>
@@ -1309,7 +1309,7 @@
               <w:rPr>
                 <w:sz w:val="20"/>
               </w:rPr>
-              <w:t xml:space="preserve"> and CodeContests prompts, kept only if they pass tests, plus OpenCodeReasoning </w:t>
+              <w:t xml:space="preserve"> (CC-BY-4.0) and, if enough fit, public agent-session steps </w:t>
             </w:r>
             <w:fldSimple w:instr=" REF _RefAnneal21 \r \h ">
               <w:r>
@@ -1323,7 +1323,7 @@
               <w:rPr>
                 <w:sz w:val="20"/>
               </w:rPr>
-              <w:t xml:space="preserve"> traces, all CC-BY-4.0. Instruction sets lack traces; SWE-Gym </w:t>
+              <w:t xml:space="preserve"> (Apache-2.0), both with reasoning traces. Self-generated traces only in the first run; sets lacking traces or answers rejected; SWE-Gym </w:t>
             </w:r>
             <w:fldSimple w:instr=" REF _RefAnneal22 \r \h ">
               <w:r>
@@ -1337,7 +1337,7 @@
               <w:rPr>
                 <w:sz w:val="20"/>
               </w:rPr>
-              <w:t xml:space="preserve"> trajectories far exceed 8,192 tokens.</w:t>
+              <w:t xml:space="preserve"> trajectories exceed 8,192 tokens.</w:t>
             </w:r>
           </w:p>
         </w:tc>
@@ -1429,7 +1429,7 @@
         <w:pStyle w:val="BodyFirst"/>
       </w:pPr>
       <w:r>
-        <w:t xml:space="preserve">The prototype is a version-controlled repository of scripts and configuration for every stage in Figure 1. Drafted before access to the training machine, it was brought up there in October 2026, and the first real run, a 2,000-row adapter scored against the base model, started on 19 October with scores due on 21 October.</w:t>
+        <w:t xml:space="preserve">The prototype is a version-controlled repository of scripts and configuration for every stage in Figure 1. Drafted before access to the training machine, it was brought up there in October 2026, and the first real run, round 0 of the improvement loop (Section 3.3), started on 19 October with scores due on 21 October.</w:t>
       </w:r>
     </w:p>
     <w:p>
@@ -2291,17 +2291,7 @@
         <w:pStyle w:val="BodyFirst"/>
       </w:pPr>
       <w:r>
-        <w:t xml:space="preserve">The main run trains on every test-passing trace that about six weeks of generation can produce. </w:t>
-      </w:r>
-      <w:r>
-        <w:rPr>
-          <w:rFonts w:ascii="Consolas" w:hAnsi="Consolas" w:cs="Consolas"/>
-          <w:sz w:val="19"/>
-        </w:rPr>
-        <w:t xml:space="preserve">generate_traces.py</w:t>
-      </w:r>
-      <w:r>
-        <w:t xml:space="preserve"> sends OpenCodeInstruct prompts with assert tests and CodeContests </w:t>
+        <w:t xml:space="preserve">From loop round 1, every adapter trains only on public datasets with reasoning traces and training licences, never on rows the base model generated, since self-training reinforces the model's own biases. OpenCodeReasoning gives up to three traces per question, but its teacher, DeepSeek-R1, scores 63.5 on LiveCodeBench (August 2024 to May 2025) </w:t>
       </w:r>
       <w:fldSimple w:instr=" REF _RefAnneal24 \r \h ">
         <w:r>
@@ -2309,7 +2299,43 @@
         </w:r>
       </w:fldSimple>
       <w:r>
-        <w:t xml:space="preserve"> problems with stdin/stdout tests to the base model, keeps passing answers, and retries failures in a second round with the best ablation adapter. This follows ReST-EM, whose binary-filtered self-training surpassed fine-tuning on human data alone </w:t>
+        <w:t xml:space="preserve"> against 90.3 reported for Qwen3.8-27B on v6 </w:t>
+      </w:r>
+      <w:fldSimple w:instr=" REF _RefAnneal2 \r \h ">
+        <w:r>
+          <w:t xml:space="preserve">[2]</w:t>
+        </w:r>
+      </w:fldSimple>
+      <w:r>
+        <w:t xml:space="preserve">, so stronger teachers are sought. A public set's long agent sessions are split into one row per assistant step and used only if at least 500 steps fit 8,192 tokens with real tool names. </w:t>
+      </w:r>
+      <w:r>
+        <w:rPr>
+          <w:rFonts w:ascii="Consolas" w:hAnsi="Consolas" w:cs="Consolas"/>
+          <w:sz w:val="19"/>
+        </w:rPr>
+        <w:t xml:space="preserve">prepare_dataset.py</w:t>
+      </w:r>
+      <w:r>
+        <w:t xml:space="preserve"> keeps rows with a </w:t>
+      </w:r>
+      <w:r>
+        <w:rPr>
+          <w:rFonts w:ascii="Consolas" w:hAnsi="Consolas" w:cs="Consolas"/>
+          <w:sz w:val="19"/>
+        </w:rPr>
+        <w:t xml:space="preserve">&lt;think&gt;</w:t>
+      </w:r>
+      <w:r>
+        <w:t xml:space="preserve"> trace, drops rather than truncates rows over 8,192 tokens, and removes any sharing a 13-token window with, or above 0.8 Jaccard similarity to, a gate or evaluation prompt.</w:t>
+      </w:r>
+    </w:p>
+    <w:p>
+      <w:pPr>
+        <w:pStyle w:val="BodyText"/>
+      </w:pPr>
+      <w:r>
+        <w:t xml:space="preserve">The first run is a comparison between the model's own rows and public data: 1,000 base-model answers to OpenCodeInstruct </w:t>
       </w:r>
       <w:fldSimple w:instr=" REF _RefAnneal25 \r \h ">
         <w:r>
@@ -2317,7 +2343,7 @@
         </w:r>
       </w:fldSimple>
       <w:r>
-        <w:t xml:space="preserve">; in the first run the base model passed 54% of attempts, about 27 kept rows an hour. Another 5% are the model's own answers to general Nemotron </w:t>
+        <w:t xml:space="preserve"> prompts that passed their tests, as in ReST-EM </w:t>
       </w:r>
       <w:fldSimple w:instr=" REF _RefAnneal26 \r \h ">
         <w:r>
@@ -2325,7 +2351,23 @@
         </w:r>
       </w:fldSimple>
       <w:r>
-        <w:t xml:space="preserve"> prompts, to limit forgetting. OpenCodeReasoning fills the rest, up to three traces per question, but its teacher, DeepSeek-R1, scores 63.5 on LiveCodeBench (August 2024 to May 2025) </w:t>
+        <w:t xml:space="preserve">, plus 1,000 OpenCodeReasoning rows. The base model passed 54% of attempts, about 27 kept rows an hour, but traces hitting the 6,144-token budget (16% of attempts) were rejected, so kept traces are short (median 436 tokens). Model-written code runs in a sandbox needing no administrator rights, a Windows AppContainer without network or file access inside a job object that limits processes, memory and time; it passed 264 escape checks, and 97.5% of reference solutions pass inside it.</w:t>
+      </w:r>
+    </w:p>
+    <w:p>
+      <w:pPr>
+        <w:pStyle w:val="Heading2"/>
+      </w:pPr>
+      <w:r>
+        <w:t xml:space="preserve">Training</w:t>
+      </w:r>
+    </w:p>
+    <w:p>
+      <w:pPr>
+        <w:pStyle w:val="BodyFirst"/>
+      </w:pPr>
+      <w:r>
+        <w:t xml:space="preserve">Training runs as an unattended keep-if-better loop. Each round trains on fresh public rows, from the base model in round 1 and from the best kept adapter after that, and is scored on a held-out gate that is never trained on or reported: CodeContests </w:t>
       </w:r>
       <w:fldSimple w:instr=" REF _RefAnneal27 \r \h ">
         <w:r>
@@ -2333,56 +2375,20 @@
         </w:r>
       </w:fldSimple>
       <w:r>
-        <w:t xml:space="preserve"> against 90.3 reported for Qwen3.8-27B on v6 </w:t>
-      </w:r>
-      <w:fldSimple w:instr=" REF _RefAnneal2 \r \h ">
+        <w:t xml:space="preserve"> validation and test problems whose reference passes in the sandbox, plus 300 held-out OpenCodeInstruct problems. A round is kept only if its gate score beats the best so far with a one-sided sign test at p ≤ 0.05, and neither the CodeContests part nor a 100-question MMLU-Pro </w:t>
+      </w:r>
+      <w:fldSimple w:instr=" REF _RefAnneal28 \r \h ">
         <w:r>
-          <w:t xml:space="preserve">[2]</w:t>
+          <w:t xml:space="preserve">[28]</w:t>
         </w:r>
       </w:fldSimple>
       <w:r>
-        <w:t xml:space="preserve">, so it is dropped if its 1,000-row ablation does not beat the base model. </w:t>
-      </w:r>
-      <w:r>
-        <w:rPr>
-          <w:rFonts w:ascii="Consolas" w:hAnsi="Consolas" w:cs="Consolas"/>
-          <w:sz w:val="19"/>
-        </w:rPr>
-        <w:t xml:space="preserve">prepare_dataset.py</w:t>
-      </w:r>
-      <w:r>
-        <w:t xml:space="preserve"> keeps rows with a </w:t>
-      </w:r>
-      <w:r>
-        <w:rPr>
-          <w:rFonts w:ascii="Consolas" w:hAnsi="Consolas" w:cs="Consolas"/>
-          <w:sz w:val="19"/>
-        </w:rPr>
-        <w:t xml:space="preserve">&lt;think&gt;</w:t>
-      </w:r>
-      <w:r>
-        <w:t xml:space="preserve"> trace, drops rather than truncates rows over 8,192 tokens, and removes any sharing a 13-token window with, or above 0.8 Jaccard similarity to, an evaluation prompt.</w:t>
+        <w:t xml:space="preserve"> non-coding check worsens beyond a set tolerance. Rejected adapters are deleted but their scores kept; EvalPlus is scored only on kept adapters, so the reported benchmark never selects them.</w:t>
       </w:r>
     </w:p>
     <w:p>
       <w:pPr>
         <w:pStyle w:val="BodyText"/>
-      </w:pPr>
-      <w:r>
-        <w:t xml:space="preserve">Model-written code runs in a sandbox needing no administrator rights, a Windows AppContainer without network or file access inside a job object that limits processes, memory and time; it passed 264 escape checks, and 97.5% of reference solutions pass inside it. The main weakness is a bias towards short reasoning: traces that hit the 6,144-token budget (16% of attempts) are rejected, kept traces have a median of 436 tokens, and only about half of OpenCodeReasoning fits in 8,192 tokens. The data card therefore tabulates difficulty, and reasoning length is compared at every checkpoint.</w:t>
-      </w:r>
-    </w:p>
-    <w:p>
-      <w:pPr>
-        <w:pStyle w:val="Heading2"/>
-      </w:pPr>
-      <w:r>
-        <w:t xml:space="preserve">Training</w:t>
-      </w:r>
-    </w:p>
-    <w:p>
-      <w:pPr>
-        <w:pStyle w:val="BodyFirst"/>
       </w:pPr>
       <w:r>
         <w:rPr>
@@ -2392,15 +2398,15 @@
         <w:t xml:space="preserve">train_longrun.py</w:t>
       </w:r>
       <w:r>
-        <w:t xml:space="preserve"> makes one pass over the data with a warmup-stable-decay schedule, which scales as reliably as cosine decay </w:t>
-      </w:r>
-      <w:fldSimple w:instr=" REF _RefAnneal28 \r \h ">
+        <w:t xml:space="preserve"> uses a warmup-stable-decay schedule </w:t>
+      </w:r>
+      <w:fldSimple w:instr=" REF _RefAnneal29 \r \h ">
         <w:r>
-          <w:t xml:space="preserve">[28]</w:t>
+          <w:t xml:space="preserve">[29]</w:t>
         </w:r>
       </w:fldSimple>
       <w:r>
-        <w:t xml:space="preserve"> but lets a cool-down branch from any point. Decay branches from the checkpoints at 2,000, 8,000 and 20,000 rows therefore turn one run into a data-scaling curve (Listing 1). To survive crashes and updates over months, the trainer saves every 10 steps, resumes when the same command is re-run, pauses cleanly on a STOP file, and refuses to resume if the training file's SHA-256 has changed. In a CPU test with a tiny model of the same architecture, a run killed with </w:t>
+        <w:t xml:space="preserve"> (Listing 1). To survive crashes and updates over months, it saves every 10 steps, resumes when the same command is re-run, pauses cleanly on a STOP file, and refuses to resume if the training file's SHA-256 has changed. In a CPU test with a tiny model of the same architecture, a run killed with </w:t>
       </w:r>
       <w:r>
         <w:rPr>
@@ -2474,7 +2480,7 @@
           <w:rFonts w:ascii="Consolas" w:hAnsi="Consolas" w:cs="Consolas"/>
           <w:sz w:val="17"/>
         </w:rPr>
-        <w:t xml:space="preserve">lora_r: 64                     # set by ablation A1</w:t>
+        <w:t xml:space="preserve">lora_r: 16                     # 16 or 64: ablation A1</w:t>
       </w:r>
     </w:p>
     <w:p>
@@ -2506,7 +2512,7 @@
           <w:rFonts w:ascii="Consolas" w:hAnsi="Consolas" w:cs="Consolas"/>
           <w:sz w:val="17"/>
         </w:rPr>
-        <w:t xml:space="preserve">                 down_proj, in_proj_qkv, in_proj_z, out_proj]</w:t>
+        <w:t xml:space="preserve">                 down_proj]    # DeltaNet projections: A2</w:t>
       </w:r>
     </w:p>
     <w:p>
@@ -2522,7 +2528,7 @@
           <w:rFonts w:ascii="Consolas" w:hAnsi="Consolas" w:cs="Consolas"/>
           <w:sz w:val="17"/>
         </w:rPr>
-        <w:t xml:space="preserve">schedule: wsd                  # warmup-stable-decay</w:t>
+        <w:t xml:space="preserve">schedule: wsd                  # 20 warmup steps, last 20% decays</w:t>
       </w:r>
     </w:p>
     <w:p>
@@ -2538,22 +2544,6 @@
           <w:rFonts w:ascii="Consolas" w:hAnsi="Consolas" w:cs="Consolas"/>
           <w:sz w:val="17"/>
         </w:rPr>
-        <w:t xml:space="preserve">milestone_steps: [250, 1000, 2500]   # 2k, 8k and 20k rows</w:t>
-      </w:r>
-    </w:p>
-    <w:p>
-      <w:pPr>
-        <w:pStyle w:val="BodyText"/>
-        <w:keepNext/>
-        <w:spacing w:before="0" w:after="0"/>
-        <w:ind w:left="284"/>
-        <w:jc w:val="left"/>
-      </w:pPr>
-      <w:r>
-        <w:rPr>
-          <w:rFonts w:ascii="Consolas" w:hAnsi="Consolas" w:cs="Consolas"/>
-          <w:sz w:val="17"/>
-        </w:rPr>
         <w:t xml:space="preserve">save_steps: 10                 # every 80 rows</w:t>
       </w:r>
     </w:p>
@@ -2574,7 +2564,7 @@
         <w:rPr>
           <w:sz w:val="20"/>
         </w:rPr>
-        <w:t xml:space="preserve"> Excerpt of the main-run configuration.</w:t>
+        <w:t xml:space="preserve"> Excerpt of the first-run configuration.</w:t>
       </w:r>
     </w:p>
     <w:p>
@@ -2598,7 +2588,7 @@
         <w:pStyle w:val="BodyFirst"/>
       </w:pPr>
       <w:r>
-        <w:t xml:space="preserve">Bring-up and the first run raised the issues in Table 3. Training then ran at 97 to 102 tokens per second on rows of up to 8,192 tokens. At that rate the 59-day main run covers about 490 million tokens, or 110,000 rows at the planned 4,500-token mean with OpenCodeReasoning, an estimate until A1 and A2 measure the main-run adapter.</w:t>
+        <w:t xml:space="preserve">Bring-up and the first run raised the issues in Table 3. Training then ran at 97 to 102 tokens per second on rows of up to 8,192 tokens.</w:t>
       </w:r>
     </w:p>
     <w:p>
@@ -3047,7 +3037,7 @@
         <w:pStyle w:val="BodyFirst"/>
       </w:pPr>
       <w:r>
-        <w:t xml:space="preserve">The measurement-first design has paid off: the parity test caught a wrong fix before any real run used it. Weaknesses remain. Speed and memory were measured with an adapter about a fifth the size of the main run's, and the first run's scores will be the first evidence that training helps. The Windows workarounds (a bundled C compiler, the convolution rewrite, disabled Vulkan kernels) could break on an update, so versions are pinned, and slower prompt processing lengthens the 256k-token evaluations. With 20 to 50 personal tasks, confidence intervals will be wide.</w:t>
+        <w:t xml:space="preserve">The measurement-first design has paid off: the parity test caught a wrong fix before any real run used it. Weaknesses remain. Speed and memory were measured only at rank 16, and the first run's scores will be the first evidence that training helps. The Windows workarounds (a bundled C compiler, the convolution rewrite, disabled Vulkan kernels) could break on an update, so versions are pinned, and slower prompt processing lengthens the 256k-token evaluations. With 20 to 50 personal tasks, confidence intervals will be wide.</w:t>
       </w:r>
     </w:p>
     <w:p>
@@ -3269,7 +3259,7 @@
               <w:rPr>
                 <w:sz w:val="20"/>
               </w:rPr>
-              <w:t xml:space="preserve">Data card; overlap checks against every evaluation set</w:t>
+              <w:t xml:space="preserve">Data card; overlap checks against the gate and every evaluation set</w:t>
             </w:r>
           </w:p>
         </w:tc>
@@ -3393,7 +3383,7 @@
               <w:rPr>
                 <w:sz w:val="20"/>
               </w:rPr>
-              <w:t xml:space="preserve">RULER and LongCodeBench at 32k to 256k and a 100-question non-coding set, at every checkpoint</w:t>
+              <w:t xml:space="preserve">RULER and LongCodeBench at 32k to 256k and 100 MMLU-Pro questions, for each kept adapter</w:t>
             </w:r>
           </w:p>
         </w:tc>
@@ -3455,7 +3445,7 @@
               <w:rPr>
                 <w:sz w:val="20"/>
               </w:rPr>
-              <w:t xml:space="preserve">Scores at 2,000, 8,000 and 20,000 rows and for the final adapter (one seed); 1,000-row ablations</w:t>
+              <w:t xml:space="preserve">Gate scores of every round; EvalPlus (one seed) for each kept adapter; 1,000-row ablations</w:t>
             </w:r>
           </w:p>
         </w:tc>
@@ -3572,9 +3562,9 @@
       <w:r>
         <w:t xml:space="preserve"> The scaling curve is the main research question beyond O3. Published results suggest small, flattening gains: supervised fine-tuning gains are log-linear in data and smaller for stronger models </w:t>
       </w:r>
-      <w:fldSimple w:instr=" REF _RefAnneal29 \r \h ">
+      <w:fldSimple w:instr=" REF _RefAnneal30 \r \h ">
         <w:r>
-          <w:t xml:space="preserve">[29]</w:t>
+          <w:t xml:space="preserve">[30]</w:t>
         </w:r>
       </w:fldSimple>
       <w:r>
@@ -3586,7 +3576,7 @@
         </w:r>
       </w:fldSimple>
       <w:r>
-        <w:t xml:space="preserve">. The first 2,000-row run, half from a weaker teacher, may show no clear gain; a flat curve is a result, not a failure, and shows how much data is worth the machine time.</w:t>
+        <w:t xml:space="preserve">. Round 0, half from a weaker teacher, may show no clear gain, and many rounds may be rejected; a flat curve is a result, not a failure, and shows how much data is worth the machine time.</w:t>
       </w:r>
     </w:p>
     <w:p>
@@ -3600,7 +3590,7 @@
         <w:t xml:space="preserve">Ablations.</w:t>
       </w:r>
       <w:r>
-        <w:t xml:space="preserve"> Run on 1,000 rows before the main run, each changes one factor: A1 rank (16, 64); A2 adding the DeltaNet targets; A3 example length (4,096, 8,192); A4 data source, which decides whether OpenCodeReasoning is used; A5 long examples or trainable normalisation, only if a checkpoint fails O4; A6 an 8-bit base.</w:t>
+        <w:t xml:space="preserve"> Run on 1,000 public rows between loop rounds, each changes one factor: A1 rank (16, 64); A2 adding the DeltaNet targets; A3 example length (4,096, 8,192); A4 data source: OpenCodeReasoning alone against round 0's mix; A5 long examples or trainable normalisation, only if a kept adapter fails O4; A6 an 8-bit base.</w:t>
       </w:r>
     </w:p>
     <w:p>
@@ -3622,7 +3612,7 @@
         </w:r>
       </w:fldSimple>
       <w:r>
-        <w:t xml:space="preserve">); every training prompt source predates that date, so these problems are clean by date. General rows are also decontaminated against the non-coding questions.</w:t>
+        <w:t xml:space="preserve">); every training prompt source predates that date, so these problems are clean by date. Training rows are also checked against the gate and MMLU-Pro questions.</w:t>
       </w:r>
     </w:p>
     <w:p>
@@ -3638,7 +3628,7 @@
         <w:pStyle w:val="BodyFirst"/>
       </w:pPr>
       <w:r>
-        <w:t xml:space="preserve">Bring-up finished early and the first real run is under way (Section 3.4), so the plan starts with its scores and the main-run adapter's measurements, which everything else depends on. Of about 136 usable machine days from November to March, roughly 42 go to generation, 15 to ablations, 20 to evaluation and 59 to the main run, since only one job can use the GPU at a time.</w:t>
+        <w:t xml:space="preserve">Bring-up finished early and the first real run is under way (Section 3.4), so the plan starts with its scores, which everything else depends on. Of about 136 usable machine days from November to March, roughly 15 go to ablations and 20 to evaluation; loop rounds use the rest, since only one job can use the GPU at a time.</w:t>
       </w:r>
     </w:p>
     <w:tbl>
@@ -3754,7 +3744,7 @@
               <w:rPr>
                 <w:sz w:val="20"/>
               </w:rPr>
-              <w:t xml:space="preserve">First run: 1,000 generated and 1,000 OpenCodeReasoning rows, trained and scored against the base by 21 October. Measure the main-run adapter. Round-1 generation continues.</w:t>
+              <w:t xml:space="preserve">Round 0: 1,000 own and 1,000 OpenCodeReasoning rows, trained and scored against the base by 21 October. Build the gate; start loop rounds.</w:t>
             </w:r>
           </w:p>
         </w:tc>
@@ -3773,7 +3763,7 @@
               <w:rPr>
                 <w:sz w:val="20"/>
               </w:rPr>
-              <w:t xml:space="preserve">First before-and-after scores; main-run size</w:t>
+              <w:t xml:space="preserve">First before-and-after scores</w:t>
             </w:r>
           </w:p>
         </w:tc>
@@ -3816,7 +3806,7 @@
               <w:rPr>
                 <w:sz w:val="20"/>
               </w:rPr>
-              <w:t xml:space="preserve">Three-seed baseline; write the personal tasks. Ablations A1 to A4 between generation batches.</w:t>
+              <w:t xml:space="preserve">Three-seed baseline; write the personal tasks. Ablations A1 to A4 between loop rounds.</w:t>
             </w:r>
           </w:p>
         </w:tc>
@@ -3878,7 +3868,7 @@
               <w:rPr>
                 <w:sz w:val="20"/>
               </w:rPr>
-              <w:t xml:space="preserve">Remaining ablations, including A6. Generation continues.</w:t>
+              <w:t xml:space="preserve">Remaining ablations, including A6. Loop continues.</w:t>
             </w:r>
           </w:p>
         </w:tc>
@@ -3938,7 +3928,7 @@
               <w:rPr>
                 <w:sz w:val="20"/>
               </w:rPr>
-              <w:t xml:space="preserve">Exams. Round-1 generation runs unattended.</w:t>
+              <w:t xml:space="preserve">Exams. The loop runs unattended.</w:t>
             </w:r>
           </w:p>
         </w:tc>
@@ -4075,7 +4065,7 @@
               <w:rPr>
                 <w:sz w:val="20"/>
               </w:rPr>
-              <w:t xml:space="preserve">Round-2 generation with the best ablation adapter. Build and pin the main mix. Start the main run.</w:t>
+              <w:t xml:space="preserve">Loop rounds with the best ablation settings and each new public set.</w:t>
             </w:r>
           </w:p>
         </w:tc>
@@ -4094,7 +4084,7 @@
               <w:rPr>
                 <w:sz w:val="20"/>
               </w:rPr>
-              <w:t xml:space="preserve">Data card (O2); main run under way</w:t>
+              <w:t xml:space="preserve">Data card (O2)</w:t>
             </w:r>
           </w:p>
         </w:tc>
@@ -4137,7 +4127,7 @@
               <w:rPr>
                 <w:sz w:val="20"/>
               </w:rPr>
-              <w:t xml:space="preserve">Main run continues. Interim demo. Evaluate the 2,000-row branch.</w:t>
+              <w:t xml:space="preserve">Loop continues. Interim demo. EvalPlus on new kept adapters.</w:t>
             </w:r>
           </w:p>
         </w:tc>
@@ -4156,7 +4146,7 @@
               <w:rPr>
                 <w:sz w:val="20"/>
               </w:rPr>
-              <w:t xml:space="preserve">First scaling point</w:t>
+              <w:t xml:space="preserve">Scaling points</w:t>
             </w:r>
           </w:p>
         </w:tc>
@@ -4199,7 +4189,7 @@
               <w:rPr>
                 <w:sz w:val="20"/>
               </w:rPr>
-              <w:t xml:space="preserve">Main run continues. Evaluate the 8,000-row branch.</w:t>
+              <w:t xml:space="preserve">Loop continues. Long-context checks on the best adapter.</w:t>
             </w:r>
           </w:p>
         </w:tc>
@@ -4218,7 +4208,7 @@
               <w:rPr>
                 <w:sz w:val="20"/>
               </w:rPr>
-              <w:t xml:space="preserve">Second scaling point</w:t>
+              <w:t xml:space="preserve">Retention results (O4)</w:t>
             </w:r>
           </w:p>
         </w:tc>
@@ -4261,7 +4251,7 @@
               <w:rPr>
                 <w:sz w:val="20"/>
               </w:rPr>
-              <w:t xml:space="preserve">Main run continues. Evaluate the 20,000-row branch. Poster session.</w:t>
+              <w:t xml:space="preserve">Loop continues. Poster session.</w:t>
             </w:r>
           </w:p>
         </w:tc>
@@ -4280,7 +4270,7 @@
               <w:rPr>
                 <w:sz w:val="20"/>
               </w:rPr>
-              <w:t xml:space="preserve">Third scaling point; poster</w:t>
+              <w:t xml:space="preserve">Scaling points; poster</w:t>
             </w:r>
           </w:p>
         </w:tc>
@@ -4323,7 +4313,7 @@
               <w:rPr>
                 <w:sz w:val="20"/>
               </w:rPr>
-              <w:t xml:space="preserve">Main run ends. Three-seed evaluation of the final adapter.</w:t>
+              <w:t xml:space="preserve">Freeze the best kept adapter. Three-seed evaluation.</w:t>
             </w:r>
           </w:p>
         </w:tc>
@@ -4480,7 +4470,7 @@
         <w:pStyle w:val="BodyText"/>
       </w:pPr>
       <w:r>
-        <w:t xml:space="preserve">The main risks have planned responses. If a driver or package update breaks the Windows stack, the pinned versions are reinstalled, with WSL2 as a fallback. If the main-run adapter trains much slower than measured, the main run uses fewer rows, and the earlier checkpoints still give a complete curve. If an improvement sits inside run-to-run noise, more seeds are run before concluding. Every change of plan is dated in the decision log.</w:t>
+        <w:t xml:space="preserve">The main risks have planned responses. If a driver or package update breaks the Windows stack, the pinned versions are reinstalled, with WSL2 as a fallback. If a larger adapter trains much slower than measured, rounds use fewer rows, and every kept round still adds a point to the curve. If an improvement sits inside run-to-run noise, more seeds are run before concluding. Every change of plan is dated in the decision log.</w:t>
       </w:r>
     </w:p>
     <w:p>
@@ -5242,49 +5232,12 @@
         <w:t xml:space="preserve">et al.</w:t>
       </w:r>
       <w:r>
-        <w:t xml:space="preserve">, "OpenCodeInstruct: A large-scale instruction tuning dataset for code LLMs," arXiv preprint arXiv:2504.04030, 2025. </w:t>
+        <w:t xml:space="preserve">, "OpenCodeReasoning: Advancing data distillation for competitive coding," arXiv preprint arXiv:2504.01943, 2025. </w:t>
       </w:r>
       <w:r>
         <w:t xml:space="preserve">[Online]. Available: </w:t>
       </w:r>
       <w:hyperlink r:id="rId41">
-        <w:r>
-          <w:rPr>
-            <w:color w:val="0563C1"/>
-            <w:u w:val="single"/>
-          </w:rPr>
-          <w:t xml:space="preserve">https://arxiv.org/abs/2504.04030</w:t>
-        </w:r>
-      </w:hyperlink>
-      <w:bookmarkEnd w:id="920"/>
-    </w:p>
-    <w:p>
-      <w:pPr>
-        <w:pStyle w:val="Reference"/>
-        <w:tabs>
-          <w:tab w:val="clear" w:pos="426"/>
-          <w:tab w:val="num" w:pos="567"/>
-        </w:tabs>
-        <w:ind w:left="567" w:hanging="567"/>
-        <w:jc w:val="left"/>
-      </w:pPr>
-      <w:bookmarkStart w:id="921" w:name="_RefAnneal21"/>
-      <w:r>
-        <w:t xml:space="preserve">W. U. Ahmad </w:t>
-      </w:r>
-      <w:r>
-        <w:rPr>
-          <w:i/>
-        </w:rPr>
-        <w:t xml:space="preserve">et al.</w:t>
-      </w:r>
-      <w:r>
-        <w:t xml:space="preserve">, "OpenCodeReasoning: Advancing data distillation for competitive coding," arXiv preprint arXiv:2504.01943, 2025. </w:t>
-      </w:r>
-      <w:r>
-        <w:t xml:space="preserve">[Online]. Available: </w:t>
-      </w:r>
-      <w:hyperlink r:id="rId42">
         <w:r>
           <w:rPr>
             <w:color w:val="0563C1"/>
@@ -5293,6 +5246,37 @@
           <w:t xml:space="preserve">https://arxiv.org/abs/2504.01943</w:t>
         </w:r>
       </w:hyperlink>
+      <w:bookmarkEnd w:id="920"/>
+    </w:p>
+    <w:p>
+      <w:pPr>
+        <w:pStyle w:val="Reference"/>
+        <w:tabs>
+          <w:tab w:val="clear" w:pos="426"/>
+          <w:tab w:val="num" w:pos="567"/>
+        </w:tabs>
+        <w:ind w:left="567" w:hanging="567"/>
+        <w:jc w:val="left"/>
+      </w:pPr>
+      <w:bookmarkStart w:id="921" w:name="_RefAnneal21"/>
+      <w:r>
+        <w:t xml:space="preserve">Public agent-session dataset card, Hugging Face, 2026. </w:t>
+      </w:r>
+      <w:r>
+        <w:t xml:space="preserve">[Online]. Available: </w:t>
+      </w:r>
+      <w:hyperlink r:id="rId42">
+        <w:r>
+          <w:rPr>
+            <w:color w:val="0563C1"/>
+            <w:u w:val="single"/>
+          </w:rPr>
+          <w:t xml:space="preserve">https://huggingface.co/datasets</w:t>
+        </w:r>
+      </w:hyperlink>
+      <w:r>
+        <w:t xml:space="preserve"> (accessed Oct. 17, 2026).</w:t>
+      </w:r>
       <w:bookmarkEnd w:id="921"/>
     </w:p>
     <w:p>
@@ -5390,7 +5374,38 @@
       </w:pPr>
       <w:bookmarkStart w:id="924" w:name="_RefAnneal24"/>
       <w:r>
-        <w:t xml:space="preserve">Y. Li </w:t>
+        <w:t xml:space="preserve">DeepSeek-AI, "DeepSeek-R1-0528," Hugging Face model card, 2025. </w:t>
+      </w:r>
+      <w:r>
+        <w:t xml:space="preserve">[Online]. Available: </w:t>
+      </w:r>
+      <w:hyperlink r:id="rId45">
+        <w:r>
+          <w:rPr>
+            <w:color w:val="0563C1"/>
+            <w:u w:val="single"/>
+          </w:rPr>
+          <w:t xml:space="preserve">https://huggingface.co/deepseek-ai/DeepSeek-R1-0528</w:t>
+        </w:r>
+      </w:hyperlink>
+      <w:r>
+        <w:t xml:space="preserve"> (accessed Oct. 17, 2026).</w:t>
+      </w:r>
+      <w:bookmarkEnd w:id="924"/>
+    </w:p>
+    <w:p>
+      <w:pPr>
+        <w:pStyle w:val="Reference"/>
+        <w:tabs>
+          <w:tab w:val="clear" w:pos="426"/>
+          <w:tab w:val="num" w:pos="567"/>
+        </w:tabs>
+        <w:ind w:left="567" w:hanging="567"/>
+        <w:jc w:val="left"/>
+      </w:pPr>
+      <w:bookmarkStart w:id="925" w:name="_RefAnneal25"/>
+      <w:r>
+        <w:t xml:space="preserve">W. U. Ahmad </w:t>
       </w:r>
       <w:r>
         <w:rPr>
@@ -5399,6 +5414,80 @@
         <w:t xml:space="preserve">et al.</w:t>
       </w:r>
       <w:r>
+        <w:t xml:space="preserve">, "OpenCodeInstruct: A large-scale instruction tuning dataset for code LLMs," arXiv preprint arXiv:2504.04030, 2025. </w:t>
+      </w:r>
+      <w:r>
+        <w:t xml:space="preserve">[Online]. Available: </w:t>
+      </w:r>
+      <w:hyperlink r:id="rId46">
+        <w:r>
+          <w:rPr>
+            <w:color w:val="0563C1"/>
+            <w:u w:val="single"/>
+          </w:rPr>
+          <w:t xml:space="preserve">https://arxiv.org/abs/2504.04030</w:t>
+        </w:r>
+      </w:hyperlink>
+      <w:bookmarkEnd w:id="925"/>
+    </w:p>
+    <w:p>
+      <w:pPr>
+        <w:pStyle w:val="Reference"/>
+        <w:tabs>
+          <w:tab w:val="clear" w:pos="426"/>
+          <w:tab w:val="num" w:pos="567"/>
+        </w:tabs>
+        <w:ind w:left="567" w:hanging="567"/>
+        <w:jc w:val="left"/>
+      </w:pPr>
+      <w:bookmarkStart w:id="926" w:name="_RefAnneal26"/>
+      <w:r>
+        <w:t xml:space="preserve">A. Singh </w:t>
+      </w:r>
+      <w:r>
+        <w:rPr>
+          <w:i/>
+        </w:rPr>
+        <w:t xml:space="preserve">et al.</w:t>
+      </w:r>
+      <w:r>
+        <w:t xml:space="preserve">, "Beyond human data: Scaling self-training for problem-solving with language models," arXiv preprint arXiv:2312.06585, 2023. </w:t>
+      </w:r>
+      <w:r>
+        <w:t xml:space="preserve">[Online]. Available: </w:t>
+      </w:r>
+      <w:hyperlink r:id="rId47">
+        <w:r>
+          <w:rPr>
+            <w:color w:val="0563C1"/>
+            <w:u w:val="single"/>
+          </w:rPr>
+          <w:t xml:space="preserve">https://arxiv.org/abs/2312.06585</w:t>
+        </w:r>
+      </w:hyperlink>
+      <w:bookmarkEnd w:id="926"/>
+    </w:p>
+    <w:p>
+      <w:pPr>
+        <w:pStyle w:val="Reference"/>
+        <w:tabs>
+          <w:tab w:val="clear" w:pos="426"/>
+          <w:tab w:val="num" w:pos="567"/>
+        </w:tabs>
+        <w:ind w:left="567" w:hanging="567"/>
+        <w:jc w:val="left"/>
+      </w:pPr>
+      <w:bookmarkStart w:id="927" w:name="_RefAnneal27"/>
+      <w:r>
+        <w:t xml:space="preserve">Y. Li </w:t>
+      </w:r>
+      <w:r>
+        <w:rPr>
+          <w:i/>
+        </w:rPr>
+        <w:t xml:space="preserve">et al.</w:t>
+      </w:r>
+      <w:r>
         <w:t xml:space="preserve">, "Competition-level code generation with AlphaCode," </w:t>
       </w:r>
       <w:r>
@@ -5413,7 +5502,7 @@
       <w:r>
         <w:t xml:space="preserve">[Online]. Available: </w:t>
       </w:r>
-      <w:hyperlink r:id="rId45">
+      <w:hyperlink r:id="rId48">
         <w:r>
           <w:rPr>
             <w:color w:val="0563C1"/>
@@ -5422,7 +5511,7 @@
           <w:t xml:space="preserve">https://arxiv.org/abs/2203.07814</w:t>
         </w:r>
       </w:hyperlink>
-      <w:bookmarkEnd w:id="924"/>
+      <w:bookmarkEnd w:id="927"/>
     </w:p>
     <w:p>
       <w:pPr>
@@ -5434,9 +5523,9 @@
         <w:ind w:left="567" w:hanging="567"/>
         <w:jc w:val="left"/>
       </w:pPr>
-      <w:bookmarkStart w:id="925" w:name="_RefAnneal25"/>
-      <w:r>
-        <w:t xml:space="preserve">A. Singh </w:t>
+      <w:bookmarkStart w:id="928" w:name="_RefAnneal28"/>
+      <w:r>
+        <w:t xml:space="preserve">Y. Wang </w:t>
       </w:r>
       <w:r>
         <w:rPr>
@@ -5445,21 +5534,30 @@
         <w:t xml:space="preserve">et al.</w:t>
       </w:r>
       <w:r>
-        <w:t xml:space="preserve">, "Beyond human data: Scaling self-training for problem-solving with language models," arXiv preprint arXiv:2312.06585, 2023. </w:t>
+        <w:t xml:space="preserve">, "MMLU-Pro: A more robust and challenging multi-task language understanding benchmark," in </w:t>
+      </w:r>
+      <w:r>
+        <w:rPr>
+          <w:i/>
+        </w:rPr>
+        <w:t xml:space="preserve">Advances in Neural Information Processing Systems (NeurIPS)</w:t>
+      </w:r>
+      <w:r>
+        <w:t xml:space="preserve">, vol. 37, 2024. </w:t>
       </w:r>
       <w:r>
         <w:t xml:space="preserve">[Online]. Available: </w:t>
       </w:r>
-      <w:hyperlink r:id="rId46">
+      <w:hyperlink r:id="rId49">
         <w:r>
           <w:rPr>
             <w:color w:val="0563C1"/>
             <w:u w:val="single"/>
           </w:rPr>
-          <w:t xml:space="preserve">https://arxiv.org/abs/2312.06585</w:t>
+          <w:t xml:space="preserve">https://arxiv.org/abs/2406.01574</w:t>
         </w:r>
       </w:hyperlink>
-      <w:bookmarkEnd w:id="925"/>
+      <w:bookmarkEnd w:id="928"/>
     </w:p>
     <w:p>
       <w:pPr>
@@ -5471,76 +5569,14 @@
         <w:ind w:left="567" w:hanging="567"/>
         <w:jc w:val="left"/>
       </w:pPr>
-      <w:bookmarkStart w:id="926" w:name="_RefAnneal26"/>
-      <w:r>
-        <w:t xml:space="preserve">NVIDIA, "Nemotron-Post-Training-Dataset-v1," Hugging Face dataset card, 2025. </w:t>
+      <w:bookmarkStart w:id="929" w:name="_RefAnneal29"/>
+      <w:r>
+        <w:t xml:space="preserve">A. Hägele, E. Bakouch, A. Kosson, L. Ben Allal, L. Von Werra, and M. Jaggi, "Scaling laws and compute-optimal training beyond fixed training durations," arXiv preprint arXiv:2405.18392, 2024. </w:t>
       </w:r>
       <w:r>
         <w:t xml:space="preserve">[Online]. Available: </w:t>
       </w:r>
-      <w:hyperlink r:id="rId47">
-        <w:r>
-          <w:rPr>
-            <w:color w:val="0563C1"/>
-            <w:u w:val="single"/>
-          </w:rPr>
-          <w:t xml:space="preserve">https://huggingface.co/datasets/nvidia/Nemotron-Post-Training-Dataset-v1</w:t>
-        </w:r>
-      </w:hyperlink>
-      <w:r>
-        <w:t xml:space="preserve"> (accessed Oct. 17, 2026).</w:t>
-      </w:r>
-      <w:bookmarkEnd w:id="926"/>
-    </w:p>
-    <w:p>
-      <w:pPr>
-        <w:pStyle w:val="Reference"/>
-        <w:tabs>
-          <w:tab w:val="clear" w:pos="426"/>
-          <w:tab w:val="num" w:pos="567"/>
-        </w:tabs>
-        <w:ind w:left="567" w:hanging="567"/>
-        <w:jc w:val="left"/>
-      </w:pPr>
-      <w:bookmarkStart w:id="927" w:name="_RefAnneal27"/>
-      <w:r>
-        <w:t xml:space="preserve">DeepSeek-AI, "DeepSeek-R1-0528," Hugging Face model card, 2025. </w:t>
-      </w:r>
-      <w:r>
-        <w:t xml:space="preserve">[Online]. Available: </w:t>
-      </w:r>
-      <w:hyperlink r:id="rId48">
-        <w:r>
-          <w:rPr>
-            <w:color w:val="0563C1"/>
-            <w:u w:val="single"/>
-          </w:rPr>
-          <w:t xml:space="preserve">https://huggingface.co/deepseek-ai/DeepSeek-R1-0528</w:t>
-        </w:r>
-      </w:hyperlink>
-      <w:r>
-        <w:t xml:space="preserve"> (accessed Oct. 17, 2026).</w:t>
-      </w:r>
-      <w:bookmarkEnd w:id="927"/>
-    </w:p>
-    <w:p>
-      <w:pPr>
-        <w:pStyle w:val="Reference"/>
-        <w:tabs>
-          <w:tab w:val="clear" w:pos="426"/>
-          <w:tab w:val="num" w:pos="567"/>
-        </w:tabs>
-        <w:ind w:left="567" w:hanging="567"/>
-        <w:jc w:val="left"/>
-      </w:pPr>
-      <w:bookmarkStart w:id="928" w:name="_RefAnneal28"/>
-      <w:r>
-        <w:t xml:space="preserve">A. Hägele, E. Bakouch, A. Kosson, L. Ben Allal, L. Von Werra, and M. Jaggi, "Scaling laws and compute-optimal training beyond fixed training durations," arXiv preprint arXiv:2405.18392, 2024. </w:t>
-      </w:r>
-      <w:r>
-        <w:t xml:space="preserve">[Online]. Available: </w:t>
-      </w:r>
-      <w:hyperlink r:id="rId49">
+      <w:hyperlink r:id="rId50">
         <w:r>
           <w:rPr>
             <w:color w:val="0563C1"/>
@@ -5549,7 +5585,7 @@
           <w:t xml:space="preserve">https://arxiv.org/abs/2405.18392</w:t>
         </w:r>
       </w:hyperlink>
-      <w:bookmarkEnd w:id="928"/>
+      <w:bookmarkEnd w:id="929"/>
     </w:p>
     <w:p>
       <w:pPr>
@@ -5561,7 +5597,7 @@
         <w:ind w:left="567" w:hanging="567"/>
         <w:jc w:val="left"/>
       </w:pPr>
-      <w:bookmarkStart w:id="929" w:name="_RefAnneal29"/>
+      <w:bookmarkStart w:id="930" w:name="_RefAnneal30"/>
       <w:r>
         <w:t xml:space="preserve">Z. Yuan </w:t>
       </w:r>
@@ -5577,7 +5613,7 @@
       <w:r>
         <w:t xml:space="preserve">[Online]. Available: </w:t>
       </w:r>
-      <w:hyperlink r:id="rId50">
+      <w:hyperlink r:id="rId51">
         <w:r>
           <w:rPr>
             <w:color w:val="0563C1"/>
@@ -5586,7 +5622,7 @@
           <w:t xml:space="preserve">https://arxiv.org/abs/2308.01825</w:t>
         </w:r>
       </w:hyperlink>
-      <w:bookmarkEnd w:id="929"/>
+      <w:bookmarkEnd w:id="930"/>
     </w:p>
     <w:sectPr>
       <w:footerReference w:type="default" r:id="rId18"/>

</xml_diff>

<commit_message>
Outline: describe the loop as built
Loop rounds use DeepSeek-V4-Pro code traces (Tachibana4, Banaxi-Tech) and
Nemotron AoPS maths; OpenCodeReasoning stays in the first run only. Adds the
exact keep rule, fresh-seed re-scoring and the Tachibana4 length limit, and
words the ablations as separate runs outside the loop. 3,965 words.
Syncs the Decision-Log.
</commit_message>
<xml_diff>
--- a/dissertation/Anneal_Dissertation_Outline.docx
+++ b/dissertation/Anneal_Dissertation_Outline.docx
@@ -1276,7 +1276,7 @@
               <w:rPr>
                 <w:sz w:val="20"/>
               </w:rPr>
-              <w:t xml:space="preserve">Public sets with and without traces; self-generated traces; SWE-Gym</w:t>
+              <w:t xml:space="preserve">Public trace sets; self-generated traces; teacher API; SWE-Gym</w:t>
             </w:r>
           </w:p>
         </w:tc>
@@ -1295,7 +1295,7 @@
               <w:rPr>
                 <w:sz w:val="20"/>
               </w:rPr>
-              <w:t xml:space="preserve">OpenCodeReasoning </w:t>
+              <w:t xml:space="preserve">DeepSeek-V4-Pro code traces </w:t>
             </w:r>
             <w:fldSimple w:instr=" REF _RefAnneal20 \r \h ">
               <w:r>
@@ -1309,7 +1309,7 @@
               <w:rPr>
                 <w:sz w:val="20"/>
               </w:rPr>
-              <w:t xml:space="preserve"> (CC-BY-4.0) and, if enough fit, public agent-session steps </w:t>
+              <w:t xml:space="preserve">, </w:t>
             </w:r>
             <w:fldSimple w:instr=" REF _RefAnneal21 \r \h ">
               <w:r>
@@ -1323,7 +1323,7 @@
               <w:rPr>
                 <w:sz w:val="20"/>
               </w:rPr>
-              <w:t xml:space="preserve"> (Apache-2.0), both with reasoning traces. Self-generated traces only in the first run; sets lacking traces or answers rejected; SWE-Gym </w:t>
+              <w:t xml:space="preserve"> (Apache-2.0) and AoPS maths </w:t>
             </w:r>
             <w:fldSimple w:instr=" REF _RefAnneal22 \r \h ">
               <w:r>
@@ -1337,6 +1337,48 @@
               <w:rPr>
                 <w:sz w:val="20"/>
               </w:rPr>
+              <w:t xml:space="preserve"> (CC-BY-4.0); agent-session steps </w:t>
+            </w:r>
+            <w:fldSimple w:instr=" REF _RefAnneal23 \r \h ">
+              <w:r>
+                <w:rPr>
+                  <w:sz w:val="20"/>
+                </w:rPr>
+                <w:t xml:space="preserve">[23]</w:t>
+              </w:r>
+            </w:fldSimple>
+            <w:r>
+              <w:rPr>
+                <w:sz w:val="20"/>
+              </w:rPr>
+              <w:t xml:space="preserve"> if enough fit. Own and OpenCodeReasoning </w:t>
+            </w:r>
+            <w:fldSimple w:instr=" REF _RefAnneal24 \r \h ">
+              <w:r>
+                <w:rPr>
+                  <w:sz w:val="20"/>
+                </w:rPr>
+                <w:t xml:space="preserve">[24]</w:t>
+              </w:r>
+            </w:fldSimple>
+            <w:r>
+              <w:rPr>
+                <w:sz w:val="20"/>
+              </w:rPr>
+              <w:t xml:space="preserve"> traces only in the first run; API-generated rows are not public; SWE-Gym </w:t>
+            </w:r>
+            <w:fldSimple w:instr=" REF _RefAnneal25 \r \h ">
+              <w:r>
+                <w:rPr>
+                  <w:sz w:val="20"/>
+                </w:rPr>
+                <w:t xml:space="preserve">[25]</w:t>
+              </w:r>
+            </w:fldSimple>
+            <w:r>
+              <w:rPr>
+                <w:sz w:val="20"/>
+              </w:rPr>
               <w:t xml:space="preserve"> trajectories exceed 8,192 tokens.</w:t>
             </w:r>
           </w:p>
@@ -1429,7 +1471,7 @@
         <w:pStyle w:val="BodyFirst"/>
       </w:pPr>
       <w:r>
-        <w:t xml:space="preserve">The prototype is a version-controlled repository of scripts and configuration for every stage in Figure 1. Drafted before access to the training machine, it was brought up there in October 2026, and the first real run, round 0 of the improvement loop (Section 3.3), started on 19 October with scores due on 21 October.</w:t>
+        <w:t xml:space="preserve">The prototype is a version-controlled repository of scripts and configuration for every stage in Figure 1. Drafted before access to the training machine, it was brought up there in October 2026; the first real run, round 0 of the loop (Section 3.2), started on 19 October.</w:t>
       </w:r>
     </w:p>
     <w:p>
@@ -1531,9 +1573,9 @@
       <w:r>
         <w:t xml:space="preserve">, which changes two large terms (Table 2). Qwen3.8's 248,320-token vocabulary makes the standard loss expensive; Cut Cross-Entropy, which Unsloth adopts, cut Gemma 2's classifier-head training memory from 28 GB to 1 GB </w:t>
       </w:r>
-      <w:fldSimple w:instr=" REF _RefAnneal23 \r \h ">
+      <w:fldSimple w:instr=" REF _RefAnneal26 \r \h ">
         <w:r>
-          <w:t xml:space="preserve">[23]</w:t>
+          <w:t xml:space="preserve">[26]</w:t>
         </w:r>
       </w:fldSimple>
       <w:r>
@@ -2291,15 +2333,15 @@
         <w:pStyle w:val="BodyFirst"/>
       </w:pPr>
       <w:r>
-        <w:t xml:space="preserve">From loop round 1, every adapter trains only on public datasets with reasoning traces and training licences, never on rows the base model generated, since self-training reinforces the model's own biases. OpenCodeReasoning gives up to three traces per question, but its teacher, DeepSeek-R1, scores 63.5 on LiveCodeBench (August 2024 to May 2025) </w:t>
-      </w:r>
-      <w:fldSimple w:instr=" REF _RefAnneal24 \r \h ">
+        <w:t xml:space="preserve">From round 1, the loop trains only on public datasets, never on the base model's own rows, which would reinforce its biases. No large public set of test-verified traces from an equally strong teacher exists, so loop rows come from DeepSeek-V4-Pro, level with Qwen3.8-27B on LiveCodeBench (89.8 against 90.3 </w:t>
+      </w:r>
+      <w:fldSimple w:instr=" REF _RefAnneal27 \r \h ">
         <w:r>
-          <w:t xml:space="preserve">[24]</w:t>
+          <w:t xml:space="preserve">[27]</w:t>
         </w:r>
       </w:fldSimple>
       <w:r>
-        <w:t xml:space="preserve"> against 90.3 reported for Qwen3.8-27B on v6 </w:t>
+        <w:t xml:space="preserve">, </w:t>
       </w:r>
       <w:fldSimple w:instr=" REF _RefAnneal2 \r \h ">
         <w:r>
@@ -2307,7 +2349,31 @@
         </w:r>
       </w:fldSimple>
       <w:r>
-        <w:t xml:space="preserve">, so stronger teachers are sought. A public set's long agent sessions are split into one row per assistant step and used only if at least 500 steps fit 8,192 tokens with real tool names. </w:t>
+        <w:t xml:space="preserve">): 85% Tachibana4 code traces </w:t>
+      </w:r>
+      <w:fldSimple w:instr=" REF _RefAnneal20 \r \h ">
+        <w:r>
+          <w:t xml:space="preserve">[20]</w:t>
+        </w:r>
+      </w:fldSimple>
+      <w:r>
+        <w:t xml:space="preserve">, 5% a second V4-Pro code set </w:t>
+      </w:r>
+      <w:fldSimple w:instr=" REF _RefAnneal21 \r \h ">
+        <w:r>
+          <w:t xml:space="preserve">[21]</w:t>
+        </w:r>
+      </w:fldSimple>
+      <w:r>
+        <w:t xml:space="preserve"> and 10% AoPS maths </w:t>
+      </w:r>
+      <w:fldSimple w:instr=" REF _RefAnneal22 \r \h ">
+        <w:r>
+          <w:t xml:space="preserve">[22]</w:t>
+        </w:r>
+      </w:fldSimple>
+      <w:r>
+        <w:t xml:space="preserve">. These carry no tests, so the gate decides whether they help. Public agent sessions, split into one row per step, get their own round if 500 steps fit 8,192 tokens. </w:t>
       </w:r>
       <w:r>
         <w:rPr>
@@ -2327,7 +2393,7 @@
         <w:t xml:space="preserve">&lt;think&gt;</w:t>
       </w:r>
       <w:r>
-        <w:t xml:space="preserve"> trace, drops rather than truncates rows over 8,192 tokens, and removes any sharing a 13-token window with, or above 0.8 Jaccard similarity to, a gate or evaluation prompt.</w:t>
+        <w:t xml:space="preserve"> trace, drops rather than truncates rows over 8,192 tokens, and removes any sharing a 13-token window with, or above 0.8 Jaccard similarity to, an evaluation prompt.</w:t>
       </w:r>
     </w:p>
     <w:p>
@@ -2335,47 +2401,7 @@
         <w:pStyle w:val="BodyText"/>
       </w:pPr>
       <w:r>
-        <w:t xml:space="preserve">The first run is a comparison between the model's own rows and public data: 1,000 base-model answers to OpenCodeInstruct </w:t>
-      </w:r>
-      <w:fldSimple w:instr=" REF _RefAnneal25 \r \h ">
-        <w:r>
-          <w:t xml:space="preserve">[25]</w:t>
-        </w:r>
-      </w:fldSimple>
-      <w:r>
-        <w:t xml:space="preserve"> prompts that passed their tests, as in ReST-EM </w:t>
-      </w:r>
-      <w:fldSimple w:instr=" REF _RefAnneal26 \r \h ">
-        <w:r>
-          <w:t xml:space="preserve">[26]</w:t>
-        </w:r>
-      </w:fldSimple>
-      <w:r>
-        <w:t xml:space="preserve">, plus 1,000 OpenCodeReasoning rows. The base model passed 54% of attempts, about 27 kept rows an hour, but traces hitting the 6,144-token budget (16% of attempts) were rejected, so kept traces are short (median 436 tokens). Model-written code runs in a sandbox needing no administrator rights, a Windows AppContainer without network or file access inside a job object that limits processes, memory and time; it passed 264 escape checks, and 97.5% of reference solutions pass inside it.</w:t>
-      </w:r>
-    </w:p>
-    <w:p>
-      <w:pPr>
-        <w:pStyle w:val="Heading2"/>
-      </w:pPr>
-      <w:r>
-        <w:t xml:space="preserve">Training</w:t>
-      </w:r>
-    </w:p>
-    <w:p>
-      <w:pPr>
-        <w:pStyle w:val="BodyFirst"/>
-      </w:pPr>
-      <w:r>
-        <w:t xml:space="preserve">Training runs as an unattended keep-if-better loop. Each round trains on fresh public rows, from the base model in round 1 and from the best kept adapter after that, and is scored on a held-out gate that is never trained on or reported: CodeContests </w:t>
-      </w:r>
-      <w:fldSimple w:instr=" REF _RefAnneal27 \r \h ">
-        <w:r>
-          <w:t xml:space="preserve">[27]</w:t>
-        </w:r>
-      </w:fldSimple>
-      <w:r>
-        <w:t xml:space="preserve"> validation and test problems whose reference passes in the sandbox, plus 300 held-out OpenCodeInstruct problems. A round is kept only if its gate score beats the best so far with a one-sided sign test at p ≤ 0.05, and neither the CodeContests part nor a 100-question MMLU-Pro </w:t>
+        <w:t xml:space="preserve">The first run, round 0, is a comparison run using the model's own rows: 1,000 base-model answers to OpenCodeInstruct </w:t>
       </w:r>
       <w:fldSimple w:instr=" REF _RefAnneal28 \r \h ">
         <w:r>
@@ -2383,7 +2409,55 @@
         </w:r>
       </w:fldSimple>
       <w:r>
-        <w:t xml:space="preserve"> non-coding check worsens beyond a set tolerance. Rejected adapters are deleted but their scores kept; EvalPlus is scored only on kept adapters, so the reported benchmark never selects them.</w:t>
+        <w:t xml:space="preserve"> prompts that passed their tests, as in ReST-EM </w:t>
+      </w:r>
+      <w:fldSimple w:instr=" REF _RefAnneal29 \r \h ">
+        <w:r>
+          <w:t xml:space="preserve">[29]</w:t>
+        </w:r>
+      </w:fldSimple>
+      <w:r>
+        <w:t xml:space="preserve">, plus 1,000 OpenCodeReasoning rows, whose DeepSeek-R1 teacher scores only 63.5 on LiveCodeBench </w:t>
+      </w:r>
+      <w:fldSimple w:instr=" REF _RefAnneal30 \r \h ">
+        <w:r>
+          <w:t xml:space="preserve">[30]</w:t>
+        </w:r>
+      </w:fldSimple>
+      <w:r>
+        <w:t xml:space="preserve">. The base model passed 54% of attempts, but traces hitting the 6,144-token budget (16% of attempts) were rejected, so kept traces are short (median 436 tokens). Model-written code runs, without administrator rights, in a Windows AppContainer with no network or file access, inside a job object limiting processes, memory and time; it passed 264 escape checks, and 97.5% of reference solutions pass inside it.</w:t>
+      </w:r>
+    </w:p>
+    <w:p>
+      <w:pPr>
+        <w:pStyle w:val="Heading2"/>
+      </w:pPr>
+      <w:r>
+        <w:t xml:space="preserve">Training</w:t>
+      </w:r>
+    </w:p>
+    <w:p>
+      <w:pPr>
+        <w:pStyle w:val="BodyFirst"/>
+      </w:pPr>
+      <w:r>
+        <w:t xml:space="preserve">Training runs as an unattended keep-if-better loop. Each round continues the best adapter on 1,000 unused public rows and is scored on a held-out gate, never trained on or reported: decontaminated CodeContests </w:t>
+      </w:r>
+      <w:fldSimple w:instr=" REF _RefAnneal31 \r \h ">
+        <w:r>
+          <w:t xml:space="preserve">[31]</w:t>
+        </w:r>
+      </w:fldSimple>
+      <w:r>
+        <w:t xml:space="preserve"> validation and test problems whose reference passes in the sandbox, plus 300 OpenCodeInstruct problems. A round is kept only if a one-sided exact sign test against the best adapter gives p ≤ 0.05, its CodeContests part drops at most 5 points, 100 MMLU-Pro </w:t>
+      </w:r>
+      <w:fldSimple w:instr=" REF _RefAnneal32 \r \h ">
+        <w:r>
+          <w:t xml:space="preserve">[32]</w:t>
+        </w:r>
+      </w:fldSimple>
+      <w:r>
+        <w:t xml:space="preserve"> questions outside computing stay within 5 points of the base, and sample answers are clean. A kept adapter is re-scored with a fresh seed that becomes the new reference, so a lucky seed cannot raise the bar. Rejected adapters are deleted but their scores kept, and EvalPlus is scored only on kept adapters, so the reported benchmark never selects them.</w:t>
       </w:r>
     </w:p>
     <w:p>
@@ -2400,9 +2474,9 @@
       <w:r>
         <w:t xml:space="preserve"> uses a warmup-stable-decay schedule </w:t>
       </w:r>
-      <w:fldSimple w:instr=" REF _RefAnneal29 \r \h ">
+      <w:fldSimple w:instr=" REF _RefAnneal33 \r \h ">
         <w:r>
-          <w:t xml:space="preserve">[29]</w:t>
+          <w:t xml:space="preserve">[33]</w:t>
         </w:r>
       </w:fldSimple>
       <w:r>
@@ -2529,22 +2603,6 @@
           <w:sz w:val="17"/>
         </w:rPr>
         <w:t xml:space="preserve">schedule: wsd                  # 20 warmup steps, last 20% decays</w:t>
-      </w:r>
-    </w:p>
-    <w:p>
-      <w:pPr>
-        <w:pStyle w:val="BodyText"/>
-        <w:keepNext/>
-        <w:spacing w:before="0" w:after="0"/>
-        <w:ind w:left="284"/>
-        <w:jc w:val="left"/>
-      </w:pPr>
-      <w:r>
-        <w:rPr>
-          <w:rFonts w:ascii="Consolas" w:hAnsi="Consolas" w:cs="Consolas"/>
-          <w:sz w:val="17"/>
-        </w:rPr>
-        <w:t xml:space="preserve">save_steps: 10                 # every 80 rows</w:t>
       </w:r>
     </w:p>
     <w:p>
@@ -2724,7 +2782,7 @@
               <w:rPr>
                 <w:sz w:val="20"/>
               </w:rPr>
-              <w:t xml:space="preserve">The loss included the template's system prompt, which the model never predicts; a weight-order patch written to fix it was wrong</w:t>
+              <w:t xml:space="preserve">The loss scored the template's system prompt; a weight-order patch written to fix it was wrong</w:t>
             </w:r>
           </w:p>
         </w:tc>
@@ -3037,7 +3095,7 @@
         <w:pStyle w:val="BodyFirst"/>
       </w:pPr>
       <w:r>
-        <w:t xml:space="preserve">The measurement-first design has paid off: the parity test caught a wrong fix before any real run used it. Weaknesses remain. Speed and memory were measured only at rank 16, and the first run's scores will be the first evidence that training helps. The Windows workarounds (a bundled C compiler, the convolution rewrite, disabled Vulkan kernels) could break on an update, so versions are pinned, and slower prompt processing lengthens the 256k-token evaluations. With 20 to 50 personal tasks, confidence intervals will be wide.</w:t>
+        <w:t xml:space="preserve">The measurement-first design has paid off: the parity test caught a wrong fix before any real run used it. Weaknesses remain. Speed and memory were measured only at rank 16, and the first run's scores will be the first evidence that training helps. The Windows workarounds (a bundled C compiler, the convolution rewrite, disabled Vulkan kernels) could break on an update, so versions are pinned. With 20 to 50 personal tasks, confidence intervals will be wide. Only an estimated 10 to 25% of Tachibana4 fits 8,192 tokens, enough for a few rounds until 16,384-token training is measured.</w:t>
       </w:r>
     </w:p>
     <w:p>
@@ -3562,9 +3620,9 @@
       <w:r>
         <w:t xml:space="preserve"> The scaling curve is the main research question beyond O3. Published results suggest small, flattening gains: supervised fine-tuning gains are log-linear in data and smaller for stronger models </w:t>
       </w:r>
-      <w:fldSimple w:instr=" REF _RefAnneal30 \r \h ">
+      <w:fldSimple w:instr=" REF _RefAnneal34 \r \h ">
         <w:r>
-          <w:t xml:space="preserve">[30]</w:t>
+          <w:t xml:space="preserve">[34]</w:t>
         </w:r>
       </w:fldSimple>
       <w:r>
@@ -3590,7 +3648,7 @@
         <w:t xml:space="preserve">Ablations.</w:t>
       </w:r>
       <w:r>
-        <w:t xml:space="preserve"> Run on 1,000 public rows between loop rounds, each changes one factor: A1 rank (16, 64); A2 adding the DeltaNet targets; A3 example length (4,096, 8,192); A4 data source: OpenCodeReasoning alone against round 0's mix; A5 long examples or trainable normalisation, only if a kept adapter fails O4; A6 an 8-bit base.</w:t>
+        <w:t xml:space="preserve"> Planned as separate 1,000-row runs outside the loop, each changes one factor: A1 rank (16, 64); A2 adding the DeltaNet targets; A3 example length (4,096, 8,192); A4 data source: OpenCodeReasoning alone against round 0's mix; A5 long examples or trainable normalisation, only if a kept adapter fails O4; A6 an 8-bit base.</w:t>
       </w:r>
     </w:p>
     <w:p>
@@ -3612,7 +3670,7 @@
         </w:r>
       </w:fldSimple>
       <w:r>
-        <w:t xml:space="preserve">); every training prompt source predates that date, so these problems are clean by date. Training rows are also checked against the gate and MMLU-Pro questions.</w:t>
+        <w:t xml:space="preserve">). Two code sets are undated, so training rows are checked for overlap with these problems as well as the gate and MMLU-Pro.</w:t>
       </w:r>
     </w:p>
     <w:p>
@@ -3806,7 +3864,7 @@
               <w:rPr>
                 <w:sz w:val="20"/>
               </w:rPr>
-              <w:t xml:space="preserve">Three-seed baseline; write the personal tasks. Ablations A1 to A4 between loop rounds.</w:t>
+              <w:t xml:space="preserve">Three-seed baseline; write the personal tasks. Ablations A1 to A4, pausing the loop.</w:t>
             </w:r>
           </w:p>
         </w:tc>
@@ -4065,7 +4123,7 @@
               <w:rPr>
                 <w:sz w:val="20"/>
               </w:rPr>
-              <w:t xml:space="preserve">Loop rounds with the best ablation settings and each new public set.</w:t>
+              <w:t xml:space="preserve">Loop continues; ablation winners restart it from the base.</w:t>
             </w:r>
           </w:p>
         </w:tc>
@@ -4470,7 +4528,7 @@
         <w:pStyle w:val="BodyText"/>
       </w:pPr>
       <w:r>
-        <w:t xml:space="preserve">The main risks have planned responses. If a driver or package update breaks the Windows stack, the pinned versions are reinstalled, with WSL2 as a fallback. If a larger adapter trains much slower than measured, rounds use fewer rows, and every kept round still adds a point to the curve. If an improvement sits inside run-to-run noise, more seeds are run before concluding. Every change of plan is dated in the decision log.</w:t>
+        <w:t xml:space="preserve">The main risks have planned responses. If a driver or package update breaks the Windows stack, the pinned versions are reinstalled, with WSL2 as a fallback. If a larger adapter trains much slower than measured, fewer rounds fit, but every kept round still adds a point to the curve. If an improvement sits inside run-to-run noise, more seeds are run before concluding. Every change of plan is dated in the decision log.</w:t>
       </w:r>
     </w:p>
     <w:p>
@@ -5223,6 +5281,130 @@
       </w:pPr>
       <w:bookmarkStart w:id="920" w:name="_RefAnneal20"/>
       <w:r>
+        <w:t xml:space="preserve">sequelbox, "Tachibana4-DeepSeek-V4-Pro," Hugging Face dataset card, 2026. </w:t>
+      </w:r>
+      <w:r>
+        <w:t xml:space="preserve">[Online]. Available: </w:t>
+      </w:r>
+      <w:hyperlink r:id="rId41">
+        <w:r>
+          <w:rPr>
+            <w:color w:val="0563C1"/>
+            <w:u w:val="single"/>
+          </w:rPr>
+          <w:t xml:space="preserve">https://huggingface.co/datasets/sequelbox/Tachibana4-DeepSeek-V4-Pro</w:t>
+        </w:r>
+      </w:hyperlink>
+      <w:r>
+        <w:t xml:space="preserve"> (accessed Oct. 17, 2026).</w:t>
+      </w:r>
+      <w:bookmarkEnd w:id="920"/>
+    </w:p>
+    <w:p>
+      <w:pPr>
+        <w:pStyle w:val="Reference"/>
+        <w:tabs>
+          <w:tab w:val="clear" w:pos="426"/>
+          <w:tab w:val="num" w:pos="567"/>
+        </w:tabs>
+        <w:ind w:left="567" w:hanging="567"/>
+        <w:jc w:val="left"/>
+      </w:pPr>
+      <w:bookmarkStart w:id="921" w:name="_RefAnneal21"/>
+      <w:r>
+        <w:t xml:space="preserve">Banaxi-Tech, "Deepseek-V4-Reasoning-Code-2500," Hugging Face dataset card, 2026. </w:t>
+      </w:r>
+      <w:r>
+        <w:t xml:space="preserve">[Online]. Available: </w:t>
+      </w:r>
+      <w:hyperlink r:id="rId42">
+        <w:r>
+          <w:rPr>
+            <w:color w:val="0563C1"/>
+            <w:u w:val="single"/>
+          </w:rPr>
+          <w:t xml:space="preserve">https://huggingface.co/datasets/Banaxi-Tech/Deepseek-V4-Reasoning-Code-2500</w:t>
+        </w:r>
+      </w:hyperlink>
+      <w:r>
+        <w:t xml:space="preserve"> (accessed Oct. 17, 2026).</w:t>
+      </w:r>
+      <w:bookmarkEnd w:id="921"/>
+    </w:p>
+    <w:p>
+      <w:pPr>
+        <w:pStyle w:val="Reference"/>
+        <w:tabs>
+          <w:tab w:val="clear" w:pos="426"/>
+          <w:tab w:val="num" w:pos="567"/>
+        </w:tabs>
+        <w:ind w:left="567" w:hanging="567"/>
+        <w:jc w:val="left"/>
+      </w:pPr>
+      <w:bookmarkStart w:id="922" w:name="_RefAnneal22"/>
+      <w:r>
+        <w:t xml:space="preserve">NVIDIA, "Nemotron-SFT-Math-v4," Hugging Face dataset card, 2026. </w:t>
+      </w:r>
+      <w:r>
+        <w:t xml:space="preserve">[Online]. Available: </w:t>
+      </w:r>
+      <w:hyperlink r:id="rId43">
+        <w:r>
+          <w:rPr>
+            <w:color w:val="0563C1"/>
+            <w:u w:val="single"/>
+          </w:rPr>
+          <w:t xml:space="preserve">https://huggingface.co/datasets/nvidia/Nemotron-SFT-Math-v4</w:t>
+        </w:r>
+      </w:hyperlink>
+      <w:r>
+        <w:t xml:space="preserve"> (accessed Oct. 17, 2026).</w:t>
+      </w:r>
+      <w:bookmarkEnd w:id="922"/>
+    </w:p>
+    <w:p>
+      <w:pPr>
+        <w:pStyle w:val="Reference"/>
+        <w:tabs>
+          <w:tab w:val="clear" w:pos="426"/>
+          <w:tab w:val="num" w:pos="567"/>
+        </w:tabs>
+        <w:ind w:left="567" w:hanging="567"/>
+        <w:jc w:val="left"/>
+      </w:pPr>
+      <w:bookmarkStart w:id="923" w:name="_RefAnneal23"/>
+      <w:r>
+        <w:t xml:space="preserve">Public agent-session dataset card, Hugging Face, 2026. </w:t>
+      </w:r>
+      <w:r>
+        <w:t xml:space="preserve">[Online]. Available: </w:t>
+      </w:r>
+      <w:hyperlink r:id="rId44">
+        <w:r>
+          <w:rPr>
+            <w:color w:val="0563C1"/>
+            <w:u w:val="single"/>
+          </w:rPr>
+          <w:t xml:space="preserve">https://huggingface.co/datasets</w:t>
+        </w:r>
+      </w:hyperlink>
+      <w:r>
+        <w:t xml:space="preserve"> (accessed Oct. 17, 2026).</w:t>
+      </w:r>
+      <w:bookmarkEnd w:id="923"/>
+    </w:p>
+    <w:p>
+      <w:pPr>
+        <w:pStyle w:val="Reference"/>
+        <w:tabs>
+          <w:tab w:val="clear" w:pos="426"/>
+          <w:tab w:val="num" w:pos="567"/>
+        </w:tabs>
+        <w:ind w:left="567" w:hanging="567"/>
+        <w:jc w:val="left"/>
+      </w:pPr>
+      <w:bookmarkStart w:id="924" w:name="_RefAnneal24"/>
+      <w:r>
         <w:t xml:space="preserve">W. U. Ahmad </w:t>
       </w:r>
       <w:r>
@@ -5237,7 +5419,7 @@
       <w:r>
         <w:t xml:space="preserve">[Online]. Available: </w:t>
       </w:r>
-      <w:hyperlink r:id="rId41">
+      <w:hyperlink r:id="rId45">
         <w:r>
           <w:rPr>
             <w:color w:val="0563C1"/>
@@ -5246,7 +5428,7 @@
           <w:t xml:space="preserve">https://arxiv.org/abs/2504.01943</w:t>
         </w:r>
       </w:hyperlink>
-      <w:bookmarkEnd w:id="920"/>
+      <w:bookmarkEnd w:id="924"/>
     </w:p>
     <w:p>
       <w:pPr>
@@ -5258,38 +5440,7 @@
         <w:ind w:left="567" w:hanging="567"/>
         <w:jc w:val="left"/>
       </w:pPr>
-      <w:bookmarkStart w:id="921" w:name="_RefAnneal21"/>
-      <w:r>
-        <w:t xml:space="preserve">Public agent-session dataset card, Hugging Face, 2026. </w:t>
-      </w:r>
-      <w:r>
-        <w:t xml:space="preserve">[Online]. Available: </w:t>
-      </w:r>
-      <w:hyperlink r:id="rId42">
-        <w:r>
-          <w:rPr>
-            <w:color w:val="0563C1"/>
-            <w:u w:val="single"/>
-          </w:rPr>
-          <w:t xml:space="preserve">https://huggingface.co/datasets</w:t>
-        </w:r>
-      </w:hyperlink>
-      <w:r>
-        <w:t xml:space="preserve"> (accessed Oct. 17, 2026).</w:t>
-      </w:r>
-      <w:bookmarkEnd w:id="921"/>
-    </w:p>
-    <w:p>
-      <w:pPr>
-        <w:pStyle w:val="Reference"/>
-        <w:tabs>
-          <w:tab w:val="clear" w:pos="426"/>
-          <w:tab w:val="num" w:pos="567"/>
-        </w:tabs>
-        <w:ind w:left="567" w:hanging="567"/>
-        <w:jc w:val="left"/>
-      </w:pPr>
-      <w:bookmarkStart w:id="922" w:name="_RefAnneal22"/>
+      <w:bookmarkStart w:id="925" w:name="_RefAnneal25"/>
       <w:r>
         <w:t xml:space="preserve">J. Pan </w:t>
       </w:r>
@@ -5314,7 +5465,7 @@
       <w:r>
         <w:t xml:space="preserve">[Online]. Available: </w:t>
       </w:r>
-      <w:hyperlink r:id="rId43">
+      <w:hyperlink r:id="rId46">
         <w:r>
           <w:rPr>
             <w:color w:val="0563C1"/>
@@ -5323,7 +5474,7 @@
           <w:t xml:space="preserve">https://proceedings.mlr.press/v267/pan25g.html</w:t>
         </w:r>
       </w:hyperlink>
-      <w:bookmarkEnd w:id="922"/>
+      <w:bookmarkEnd w:id="925"/>
     </w:p>
     <w:p>
       <w:pPr>
@@ -5335,7 +5486,7 @@
         <w:ind w:left="567" w:hanging="567"/>
         <w:jc w:val="left"/>
       </w:pPr>
-      <w:bookmarkStart w:id="923" w:name="_RefAnneal23"/>
+      <w:bookmarkStart w:id="926" w:name="_RefAnneal26"/>
       <w:r>
         <w:t xml:space="preserve">E. Wijmans, B. Huval, A. Hertzberg, V. Koltun, and P. Krähenbühl, "Cut your losses in large-vocabulary language models," in </w:t>
       </w:r>
@@ -5351,7 +5502,7 @@
       <w:r>
         <w:t xml:space="preserve">[Online]. Available: </w:t>
       </w:r>
-      <w:hyperlink r:id="rId44">
+      <w:hyperlink r:id="rId47">
         <w:r>
           <w:rPr>
             <w:color w:val="0563C1"/>
@@ -5360,7 +5511,7 @@
           <w:t xml:space="preserve">https://arxiv.org/abs/2411.09009</w:t>
         </w:r>
       </w:hyperlink>
-      <w:bookmarkEnd w:id="923"/>
+      <w:bookmarkEnd w:id="926"/>
     </w:p>
     <w:p>
       <w:pPr>
@@ -5372,14 +5523,119 @@
         <w:ind w:left="567" w:hanging="567"/>
         <w:jc w:val="left"/>
       </w:pPr>
-      <w:bookmarkStart w:id="924" w:name="_RefAnneal24"/>
+      <w:bookmarkStart w:id="927" w:name="_RefAnneal27"/>
+      <w:r>
+        <w:t xml:space="preserve">DeepSeek-AI, "DeepSeek-V4-Pro," Hugging Face model card, 2026. </w:t>
+      </w:r>
+      <w:r>
+        <w:t xml:space="preserve">[Online]. Available: </w:t>
+      </w:r>
+      <w:hyperlink r:id="rId48">
+        <w:r>
+          <w:rPr>
+            <w:color w:val="0563C1"/>
+            <w:u w:val="single"/>
+          </w:rPr>
+          <w:t xml:space="preserve">https://huggingface.co/deepseek-ai/DeepSeek-V4-Pro</w:t>
+        </w:r>
+      </w:hyperlink>
+      <w:r>
+        <w:t xml:space="preserve"> (accessed Oct. 17, 2026).</w:t>
+      </w:r>
+      <w:bookmarkEnd w:id="927"/>
+    </w:p>
+    <w:p>
+      <w:pPr>
+        <w:pStyle w:val="Reference"/>
+        <w:tabs>
+          <w:tab w:val="clear" w:pos="426"/>
+          <w:tab w:val="num" w:pos="567"/>
+        </w:tabs>
+        <w:ind w:left="567" w:hanging="567"/>
+        <w:jc w:val="left"/>
+      </w:pPr>
+      <w:bookmarkStart w:id="928" w:name="_RefAnneal28"/>
+      <w:r>
+        <w:t xml:space="preserve">W. U. Ahmad </w:t>
+      </w:r>
+      <w:r>
+        <w:rPr>
+          <w:i/>
+        </w:rPr>
+        <w:t xml:space="preserve">et al.</w:t>
+      </w:r>
+      <w:r>
+        <w:t xml:space="preserve">, "OpenCodeInstruct: A large-scale instruction tuning dataset for code LLMs," arXiv preprint arXiv:2504.04030, 2025. </w:t>
+      </w:r>
+      <w:r>
+        <w:t xml:space="preserve">[Online]. Available: </w:t>
+      </w:r>
+      <w:hyperlink r:id="rId49">
+        <w:r>
+          <w:rPr>
+            <w:color w:val="0563C1"/>
+            <w:u w:val="single"/>
+          </w:rPr>
+          <w:t xml:space="preserve">https://arxiv.org/abs/2504.04030</w:t>
+        </w:r>
+      </w:hyperlink>
+      <w:bookmarkEnd w:id="928"/>
+    </w:p>
+    <w:p>
+      <w:pPr>
+        <w:pStyle w:val="Reference"/>
+        <w:tabs>
+          <w:tab w:val="clear" w:pos="426"/>
+          <w:tab w:val="num" w:pos="567"/>
+        </w:tabs>
+        <w:ind w:left="567" w:hanging="567"/>
+        <w:jc w:val="left"/>
+      </w:pPr>
+      <w:bookmarkStart w:id="929" w:name="_RefAnneal29"/>
+      <w:r>
+        <w:t xml:space="preserve">A. Singh </w:t>
+      </w:r>
+      <w:r>
+        <w:rPr>
+          <w:i/>
+        </w:rPr>
+        <w:t xml:space="preserve">et al.</w:t>
+      </w:r>
+      <w:r>
+        <w:t xml:space="preserve">, "Beyond human data: Scaling self-training for problem-solving with language models," arXiv preprint arXiv:2312.06585, 2023. </w:t>
+      </w:r>
+      <w:r>
+        <w:t xml:space="preserve">[Online]. Available: </w:t>
+      </w:r>
+      <w:hyperlink r:id="rId50">
+        <w:r>
+          <w:rPr>
+            <w:color w:val="0563C1"/>
+            <w:u w:val="single"/>
+          </w:rPr>
+          <w:t xml:space="preserve">https://arxiv.org/abs/2312.06585</w:t>
+        </w:r>
+      </w:hyperlink>
+      <w:bookmarkEnd w:id="929"/>
+    </w:p>
+    <w:p>
+      <w:pPr>
+        <w:pStyle w:val="Reference"/>
+        <w:tabs>
+          <w:tab w:val="clear" w:pos="426"/>
+          <w:tab w:val="num" w:pos="567"/>
+        </w:tabs>
+        <w:ind w:left="567" w:hanging="567"/>
+        <w:jc w:val="left"/>
+      </w:pPr>
+      <w:bookmarkStart w:id="930" w:name="_RefAnneal30"/>
       <w:r>
         <w:t xml:space="preserve">DeepSeek-AI, "DeepSeek-R1-0528," Hugging Face model card, 2025. </w:t>
       </w:r>
       <w:r>
         <w:t xml:space="preserve">[Online]. Available: </w:t>
       </w:r>
-      <w:hyperlink r:id="rId45">
+      <w:hyperlink r:id="rId51">
         <w:r>
           <w:rPr>
             <w:color w:val="0563C1"/>
@@ -5391,7 +5647,7 @@
       <w:r>
         <w:t xml:space="preserve"> (accessed Oct. 17, 2026).</w:t>
       </w:r>
-      <w:bookmarkEnd w:id="924"/>
+      <w:bookmarkEnd w:id="930"/>
     </w:p>
     <w:p>
       <w:pPr>
@@ -5403,9 +5659,9 @@
         <w:ind w:left="567" w:hanging="567"/>
         <w:jc w:val="left"/>
       </w:pPr>
-      <w:bookmarkStart w:id="925" w:name="_RefAnneal25"/>
-      <w:r>
-        <w:t xml:space="preserve">W. U. Ahmad </w:t>
+      <w:bookmarkStart w:id="931" w:name="_RefAnneal31"/>
+      <w:r>
+        <w:t xml:space="preserve">Y. Li </w:t>
       </w:r>
       <w:r>
         <w:rPr>
@@ -5414,80 +5670,6 @@
         <w:t xml:space="preserve">et al.</w:t>
       </w:r>
       <w:r>
-        <w:t xml:space="preserve">, "OpenCodeInstruct: A large-scale instruction tuning dataset for code LLMs," arXiv preprint arXiv:2504.04030, 2025. </w:t>
-      </w:r>
-      <w:r>
-        <w:t xml:space="preserve">[Online]. Available: </w:t>
-      </w:r>
-      <w:hyperlink r:id="rId46">
-        <w:r>
-          <w:rPr>
-            <w:color w:val="0563C1"/>
-            <w:u w:val="single"/>
-          </w:rPr>
-          <w:t xml:space="preserve">https://arxiv.org/abs/2504.04030</w:t>
-        </w:r>
-      </w:hyperlink>
-      <w:bookmarkEnd w:id="925"/>
-    </w:p>
-    <w:p>
-      <w:pPr>
-        <w:pStyle w:val="Reference"/>
-        <w:tabs>
-          <w:tab w:val="clear" w:pos="426"/>
-          <w:tab w:val="num" w:pos="567"/>
-        </w:tabs>
-        <w:ind w:left="567" w:hanging="567"/>
-        <w:jc w:val="left"/>
-      </w:pPr>
-      <w:bookmarkStart w:id="926" w:name="_RefAnneal26"/>
-      <w:r>
-        <w:t xml:space="preserve">A. Singh </w:t>
-      </w:r>
-      <w:r>
-        <w:rPr>
-          <w:i/>
-        </w:rPr>
-        <w:t xml:space="preserve">et al.</w:t>
-      </w:r>
-      <w:r>
-        <w:t xml:space="preserve">, "Beyond human data: Scaling self-training for problem-solving with language models," arXiv preprint arXiv:2312.06585, 2023. </w:t>
-      </w:r>
-      <w:r>
-        <w:t xml:space="preserve">[Online]. Available: </w:t>
-      </w:r>
-      <w:hyperlink r:id="rId47">
-        <w:r>
-          <w:rPr>
-            <w:color w:val="0563C1"/>
-            <w:u w:val="single"/>
-          </w:rPr>
-          <w:t xml:space="preserve">https://arxiv.org/abs/2312.06585</w:t>
-        </w:r>
-      </w:hyperlink>
-      <w:bookmarkEnd w:id="926"/>
-    </w:p>
-    <w:p>
-      <w:pPr>
-        <w:pStyle w:val="Reference"/>
-        <w:tabs>
-          <w:tab w:val="clear" w:pos="426"/>
-          <w:tab w:val="num" w:pos="567"/>
-        </w:tabs>
-        <w:ind w:left="567" w:hanging="567"/>
-        <w:jc w:val="left"/>
-      </w:pPr>
-      <w:bookmarkStart w:id="927" w:name="_RefAnneal27"/>
-      <w:r>
-        <w:t xml:space="preserve">Y. Li </w:t>
-      </w:r>
-      <w:r>
-        <w:rPr>
-          <w:i/>
-        </w:rPr>
-        <w:t xml:space="preserve">et al.</w:t>
-      </w:r>
-      <w:r>
         <w:t xml:space="preserve">, "Competition-level code generation with AlphaCode," </w:t>
       </w:r>
       <w:r>
@@ -5502,7 +5684,7 @@
       <w:r>
         <w:t xml:space="preserve">[Online]. Available: </w:t>
       </w:r>
-      <w:hyperlink r:id="rId48">
+      <w:hyperlink r:id="rId52">
         <w:r>
           <w:rPr>
             <w:color w:val="0563C1"/>
@@ -5511,7 +5693,7 @@
           <w:t xml:space="preserve">https://arxiv.org/abs/2203.07814</w:t>
         </w:r>
       </w:hyperlink>
-      <w:bookmarkEnd w:id="927"/>
+      <w:bookmarkEnd w:id="931"/>
     </w:p>
     <w:p>
       <w:pPr>
@@ -5523,7 +5705,7 @@
         <w:ind w:left="567" w:hanging="567"/>
         <w:jc w:val="left"/>
       </w:pPr>
-      <w:bookmarkStart w:id="928" w:name="_RefAnneal28"/>
+      <w:bookmarkStart w:id="932" w:name="_RefAnneal32"/>
       <w:r>
         <w:t xml:space="preserve">Y. Wang </w:t>
       </w:r>
@@ -5548,7 +5730,7 @@
       <w:r>
         <w:t xml:space="preserve">[Online]. Available: </w:t>
       </w:r>
-      <w:hyperlink r:id="rId49">
+      <w:hyperlink r:id="rId53">
         <w:r>
           <w:rPr>
             <w:color w:val="0563C1"/>
@@ -5557,7 +5739,7 @@
           <w:t xml:space="preserve">https://arxiv.org/abs/2406.01574</w:t>
         </w:r>
       </w:hyperlink>
-      <w:bookmarkEnd w:id="928"/>
+      <w:bookmarkEnd w:id="932"/>
     </w:p>
     <w:p>
       <w:pPr>
@@ -5569,14 +5751,14 @@
         <w:ind w:left="567" w:hanging="567"/>
         <w:jc w:val="left"/>
       </w:pPr>
-      <w:bookmarkStart w:id="929" w:name="_RefAnneal29"/>
+      <w:bookmarkStart w:id="933" w:name="_RefAnneal33"/>
       <w:r>
         <w:t xml:space="preserve">A. Hägele, E. Bakouch, A. Kosson, L. Ben Allal, L. Von Werra, and M. Jaggi, "Scaling laws and compute-optimal training beyond fixed training durations," arXiv preprint arXiv:2405.18392, 2024. </w:t>
       </w:r>
       <w:r>
         <w:t xml:space="preserve">[Online]. Available: </w:t>
       </w:r>
-      <w:hyperlink r:id="rId50">
+      <w:hyperlink r:id="rId54">
         <w:r>
           <w:rPr>
             <w:color w:val="0563C1"/>
@@ -5585,7 +5767,7 @@
           <w:t xml:space="preserve">https://arxiv.org/abs/2405.18392</w:t>
         </w:r>
       </w:hyperlink>
-      <w:bookmarkEnd w:id="929"/>
+      <w:bookmarkEnd w:id="933"/>
     </w:p>
     <w:p>
       <w:pPr>
@@ -5597,7 +5779,7 @@
         <w:ind w:left="567" w:hanging="567"/>
         <w:jc w:val="left"/>
       </w:pPr>
-      <w:bookmarkStart w:id="930" w:name="_RefAnneal30"/>
+      <w:bookmarkStart w:id="934" w:name="_RefAnneal34"/>
       <w:r>
         <w:t xml:space="preserve">Z. Yuan </w:t>
       </w:r>
@@ -5613,7 +5795,7 @@
       <w:r>
         <w:t xml:space="preserve">[Online]. Available: </w:t>
       </w:r>
-      <w:hyperlink r:id="rId51">
+      <w:hyperlink r:id="rId55">
         <w:r>
           <w:rPr>
             <w:color w:val="0563C1"/>
@@ -5622,7 +5804,7 @@
           <w:t xml:space="preserve">https://arxiv.org/abs/2308.01825</w:t>
         </w:r>
       </w:hyperlink>
-      <w:bookmarkEnd w:id="930"/>
+      <w:bookmarkEnd w:id="934"/>
     </w:p>
     <w:sectPr>
       <w:footerReference w:type="default" r:id="rId18"/>

</xml_diff>

<commit_message>
Outline: first public round starts from the base model
The first-run adapter never becomes the loop's best, so every adapter after
round 0 is trained on public data only. 3,968 words.
</commit_message>
<xml_diff>
--- a/dissertation/Anneal_Dissertation_Outline.docx
+++ b/dissertation/Anneal_Dissertation_Outline.docx
@@ -2441,7 +2441,7 @@
         <w:pStyle w:val="BodyFirst"/>
       </w:pPr>
       <w:r>
-        <w:t xml:space="preserve">Training runs as an unattended keep-if-better loop. Each round continues the best adapter on 1,000 unused public rows and is scored on a held-out gate, never trained on or reported: decontaminated CodeContests </w:t>
+        <w:t xml:space="preserve">Training runs as an unattended keep-if-better loop. Starting from the base model, never the first-run adapter, each round continues the best adapter on 1,000 unused public rows and is scored on a held-out gate, never trained on or reported: decontaminated CodeContests </w:t>
       </w:r>
       <w:fldSimple w:instr=" REF _RefAnneal31 \r \h ">
         <w:r>
@@ -2457,7 +2457,7 @@
         </w:r>
       </w:fldSimple>
       <w:r>
-        <w:t xml:space="preserve"> questions outside computing stay within 5 points of the base, and sample answers are clean. A kept adapter is re-scored with a fresh seed that becomes the new reference, so a lucky seed cannot raise the bar. Rejected adapters are deleted but their scores kept, and EvalPlus is scored only on kept adapters, so the reported benchmark never selects them.</w:t>
+        <w:t xml:space="preserve"> questions outside computing stay within 5 points of the base, and sample answers are clean. A kept adapter is re-scored with a fresh seed that becomes the new reference, so a lucky seed cannot raise the bar. Rejected adapters are deleted but their scores kept; EvalPlus, scored only on kept adapters, never selects them.</w:t>
       </w:r>
     </w:p>
     <w:p>

</xml_diff>

<commit_message>
Outline: kept rows carry forward with replay
Later rounds continue the last kept adapter on 1,000 new rows plus 250
replayed rows with the learning rate re-warmed (Ibrahim et al., TMLR 2024).
Names the gate size. 3,975 words.
</commit_message>
<xml_diff>
--- a/dissertation/Anneal_Dissertation_Outline.docx
+++ b/dissertation/Anneal_Dissertation_Outline.docx
@@ -1587,15 +1587,7 @@
         <w:pStyle w:val="BodyText"/>
       </w:pPr>
       <w:r>
-        <w:t xml:space="preserve">Table 2 decided the precision. An 8-bit base fits only if Unsloth's optimisations work on this chip, whereas a 4-bit base fits on either path and is the setup Unsloth documents for this model </w:t>
-      </w:r>
-      <w:fldSimple w:instr=" REF _RefAnneal7 \r \h ">
-        <w:r>
-          <w:t xml:space="preserve">[7]</w:t>
-        </w:r>
-      </w:fldSimple>
-      <w:r>
-        <w:t xml:space="preserve">; ablation A6 measures its cost in quantisation error. Measured on the machine at 8,192 tokens with a rank-16 adapter, the peak was 25.2 GiB, inside the 32 GB allocation.</w:t>
+        <w:t xml:space="preserve">Table 2 decided the precision. An 8-bit base fits only if Unsloth's optimisations work on this chip, whereas a 4-bit base fits on either path; ablation A6 measures its cost in quantisation error. Measured on the machine at 8,192 tokens with a rank-16 adapter, the peak was 25.2 GiB, inside the 32 GB allocation.</w:t>
       </w:r>
     </w:p>
     <w:p>
@@ -2333,7 +2325,7 @@
         <w:pStyle w:val="BodyFirst"/>
       </w:pPr>
       <w:r>
-        <w:t xml:space="preserve">From round 1, the loop trains only on public datasets, never on the base model's own rows, which would reinforce its biases. No large public set of test-verified traces from an equally strong teacher exists, so loop rows come from DeepSeek-V4-Pro, level with Qwen3.8-27B on LiveCodeBench (89.8 against 90.3 </w:t>
+        <w:t xml:space="preserve">From round 1, the loop trains only on public datasets, never on the base model's own rows, which would reinforce its biases. No large public set of test-verified traces from an equally strong teacher exists, so loop rows are untested traces from DeepSeek-V4-Pro, level with Qwen3.8-27B on LiveCodeBench (89.8 against 90.3 </w:t>
       </w:r>
       <w:fldSimple w:instr=" REF _RefAnneal27 \r \h ">
         <w:r>
@@ -2373,7 +2365,7 @@
         </w:r>
       </w:fldSimple>
       <w:r>
-        <w:t xml:space="preserve">. These carry no tests, so the gate decides whether they help. Public agent sessions, split into one row per step, get their own round if 500 steps fit 8,192 tokens. </w:t>
+        <w:t xml:space="preserve">. Public agent sessions, split into one row per step, get their own round if 500 steps fit 8,192 tokens. </w:t>
       </w:r>
       <w:r>
         <w:rPr>
@@ -2441,7 +2433,7 @@
         <w:pStyle w:val="BodyFirst"/>
       </w:pPr>
       <w:r>
-        <w:t xml:space="preserve">Training runs as an unattended keep-if-better loop. Starting from the base model, never the first-run adapter, each round continues the best adapter on 1,000 unused public rows and is scored on a held-out gate, never trained on or reported: decontaminated CodeContests </w:t>
+        <w:t xml:space="preserve">Training runs as an unattended keep-if-better loop. Round 1 starts from the base model, never the first-run adapter; each later round continues the last kept adapter on 1,000 new public rows plus 250 replayed from its earlier rows, re-warming and decaying the learning rate, which in continual pre-training matched retraining on all data </w:t>
       </w:r>
       <w:fldSimple w:instr=" REF _RefAnneal31 \r \h ">
         <w:r>
@@ -2449,7 +2441,7 @@
         </w:r>
       </w:fldSimple>
       <w:r>
-        <w:t xml:space="preserve"> validation and test problems whose reference passes in the sandbox, plus 300 OpenCodeInstruct problems. A round is kept only if a one-sided exact sign test against the best adapter gives p ≤ 0.05, its CodeContests part drops at most 5 points, 100 MMLU-Pro </w:t>
+        <w:t xml:space="preserve">. Each round is scored on a held-out gate, never trained on or reported: 195 decontaminated CodeContests </w:t>
       </w:r>
       <w:fldSimple w:instr=" REF _RefAnneal32 \r \h ">
         <w:r>
@@ -2457,7 +2449,15 @@
         </w:r>
       </w:fldSimple>
       <w:r>
-        <w:t xml:space="preserve"> questions outside computing stay within 5 points of the base, and sample answers are clean. A kept adapter is re-scored with a fresh seed that becomes the new reference, so a lucky seed cannot raise the bar. Rejected adapters are deleted but their scores kept; EvalPlus, scored only on kept adapters, never selects them.</w:t>
+        <w:t xml:space="preserve"> validation and test problems with a passing reference, plus 300 OpenCodeInstruct problems. A round is kept only if a one-sided exact sign test against the best adapter gives p ≤ 0.05, its CodeContests part drops at most 5 points, 100 MMLU-Pro </w:t>
+      </w:r>
+      <w:fldSimple w:instr=" REF _RefAnneal33 \r \h ">
+        <w:r>
+          <w:t xml:space="preserve">[33]</w:t>
+        </w:r>
+      </w:fldSimple>
+      <w:r>
+        <w:t xml:space="preserve"> questions outside computing stay within 5 points of the base, and sample answers are clean. A kept adapter is re-scored with a fresh seed that becomes the new reference, so a lucky seed cannot raise the bar. A rejected round's adapter and rows are discarded but its scores kept; EvalPlus, scored only on kept adapters, never selects them.</w:t>
       </w:r>
     </w:p>
     <w:p>
@@ -2474,9 +2474,9 @@
       <w:r>
         <w:t xml:space="preserve"> uses a warmup-stable-decay schedule </w:t>
       </w:r>
-      <w:fldSimple w:instr=" REF _RefAnneal33 \r \h ">
+      <w:fldSimple w:instr=" REF _RefAnneal34 \r \h ">
         <w:r>
-          <w:t xml:space="preserve">[33]</w:t>
+          <w:t xml:space="preserve">[34]</w:t>
         </w:r>
       </w:fldSimple>
       <w:r>
@@ -3119,7 +3119,7 @@
         </w:r>
       </w:fldSimple>
       <w:r>
-        <w:t xml:space="preserve">; Anneal keeps 0.6 and 32,768 tokens to bound evaluation time. Both systems share every setting, so the comparison stays fair, though absolute scores may sit below the card's.</w:t>
+        <w:t xml:space="preserve">; Anneal keeps 0.6 and 32,768 tokens to bound evaluation time. Both systems share every setting, though absolute scores may sit below the card's.</w:t>
       </w:r>
     </w:p>
     <w:p>
@@ -3620,9 +3620,9 @@
       <w:r>
         <w:t xml:space="preserve"> The scaling curve is the main research question beyond O3. Published results suggest small, flattening gains: supervised fine-tuning gains are log-linear in data and smaller for stronger models </w:t>
       </w:r>
-      <w:fldSimple w:instr=" REF _RefAnneal34 \r \h ">
+      <w:fldSimple w:instr=" REF _RefAnneal35 \r \h ">
         <w:r>
-          <w:t xml:space="preserve">[34]</w:t>
+          <w:t xml:space="preserve">[35]</w:t>
         </w:r>
       </w:fldSimple>
       <w:r>
@@ -5661,7 +5661,7 @@
       </w:pPr>
       <w:bookmarkStart w:id="931" w:name="_RefAnneal31"/>
       <w:r>
-        <w:t xml:space="preserve">Y. Li </w:t>
+        <w:t xml:space="preserve">A. Ibrahim </w:t>
       </w:r>
       <w:r>
         <w:rPr>
@@ -5670,6 +5670,52 @@
         <w:t xml:space="preserve">et al.</w:t>
       </w:r>
       <w:r>
+        <w:t xml:space="preserve">, "Simple and scalable strategies to continually pre-train large language models," </w:t>
+      </w:r>
+      <w:r>
+        <w:rPr>
+          <w:i/>
+        </w:rPr>
+        <w:t xml:space="preserve">Trans. Machine Learning Research</w:t>
+      </w:r>
+      <w:r>
+        <w:t xml:space="preserve">, 2024. </w:t>
+      </w:r>
+      <w:r>
+        <w:t xml:space="preserve">[Online]. Available: </w:t>
+      </w:r>
+      <w:hyperlink r:id="rId52">
+        <w:r>
+          <w:rPr>
+            <w:color w:val="0563C1"/>
+            <w:u w:val="single"/>
+          </w:rPr>
+          <w:t xml:space="preserve">https://arxiv.org/abs/2403.08763</w:t>
+        </w:r>
+      </w:hyperlink>
+      <w:bookmarkEnd w:id="931"/>
+    </w:p>
+    <w:p>
+      <w:pPr>
+        <w:pStyle w:val="Reference"/>
+        <w:tabs>
+          <w:tab w:val="clear" w:pos="426"/>
+          <w:tab w:val="num" w:pos="567"/>
+        </w:tabs>
+        <w:ind w:left="567" w:hanging="567"/>
+        <w:jc w:val="left"/>
+      </w:pPr>
+      <w:bookmarkStart w:id="932" w:name="_RefAnneal32"/>
+      <w:r>
+        <w:t xml:space="preserve">Y. Li </w:t>
+      </w:r>
+      <w:r>
+        <w:rPr>
+          <w:i/>
+        </w:rPr>
+        <w:t xml:space="preserve">et al.</w:t>
+      </w:r>
+      <w:r>
         <w:t xml:space="preserve">, "Competition-level code generation with AlphaCode," </w:t>
       </w:r>
       <w:r>
@@ -5684,7 +5730,7 @@
       <w:r>
         <w:t xml:space="preserve">[Online]. Available: </w:t>
       </w:r>
-      <w:hyperlink r:id="rId52">
+      <w:hyperlink r:id="rId53">
         <w:r>
           <w:rPr>
             <w:color w:val="0563C1"/>
@@ -5693,7 +5739,7 @@
           <w:t xml:space="preserve">https://arxiv.org/abs/2203.07814</w:t>
         </w:r>
       </w:hyperlink>
-      <w:bookmarkEnd w:id="931"/>
+      <w:bookmarkEnd w:id="932"/>
     </w:p>
     <w:p>
       <w:pPr>
@@ -5705,7 +5751,7 @@
         <w:ind w:left="567" w:hanging="567"/>
         <w:jc w:val="left"/>
       </w:pPr>
-      <w:bookmarkStart w:id="932" w:name="_RefAnneal32"/>
+      <w:bookmarkStart w:id="933" w:name="_RefAnneal33"/>
       <w:r>
         <w:t xml:space="preserve">Y. Wang </w:t>
       </w:r>
@@ -5730,7 +5776,7 @@
       <w:r>
         <w:t xml:space="preserve">[Online]. Available: </w:t>
       </w:r>
-      <w:hyperlink r:id="rId53">
+      <w:hyperlink r:id="rId54">
         <w:r>
           <w:rPr>
             <w:color w:val="0563C1"/>
@@ -5739,7 +5785,7 @@
           <w:t xml:space="preserve">https://arxiv.org/abs/2406.01574</w:t>
         </w:r>
       </w:hyperlink>
-      <w:bookmarkEnd w:id="932"/>
+      <w:bookmarkEnd w:id="933"/>
     </w:p>
     <w:p>
       <w:pPr>
@@ -5751,14 +5797,14 @@
         <w:ind w:left="567" w:hanging="567"/>
         <w:jc w:val="left"/>
       </w:pPr>
-      <w:bookmarkStart w:id="933" w:name="_RefAnneal33"/>
+      <w:bookmarkStart w:id="934" w:name="_RefAnneal34"/>
       <w:r>
         <w:t xml:space="preserve">A. Hägele, E. Bakouch, A. Kosson, L. Ben Allal, L. Von Werra, and M. Jaggi, "Scaling laws and compute-optimal training beyond fixed training durations," arXiv preprint arXiv:2405.18392, 2024. </w:t>
       </w:r>
       <w:r>
         <w:t xml:space="preserve">[Online]. Available: </w:t>
       </w:r>
-      <w:hyperlink r:id="rId54">
+      <w:hyperlink r:id="rId55">
         <w:r>
           <w:rPr>
             <w:color w:val="0563C1"/>
@@ -5767,7 +5813,7 @@
           <w:t xml:space="preserve">https://arxiv.org/abs/2405.18392</w:t>
         </w:r>
       </w:hyperlink>
-      <w:bookmarkEnd w:id="933"/>
+      <w:bookmarkEnd w:id="934"/>
     </w:p>
     <w:p>
       <w:pPr>
@@ -5779,7 +5825,7 @@
         <w:ind w:left="567" w:hanging="567"/>
         <w:jc w:val="left"/>
       </w:pPr>
-      <w:bookmarkStart w:id="934" w:name="_RefAnneal34"/>
+      <w:bookmarkStart w:id="935" w:name="_RefAnneal35"/>
       <w:r>
         <w:t xml:space="preserve">Z. Yuan </w:t>
       </w:r>
@@ -5795,7 +5841,7 @@
       <w:r>
         <w:t xml:space="preserve">[Online]. Available: </w:t>
       </w:r>
-      <w:hyperlink r:id="rId55">
+      <w:hyperlink r:id="rId56">
         <w:r>
           <w:rPr>
             <w:color w:val="0563C1"/>
@@ -5804,7 +5850,7 @@
           <w:t xml:space="preserve">https://arxiv.org/abs/2308.01825</w:t>
         </w:r>
       </w:hyperlink>
-      <w:bookmarkEnd w:id="934"/>
+      <w:bookmarkEnd w:id="935"/>
     </w:p>
     <w:sectPr>
       <w:footerReference w:type="default" r:id="rId18"/>

</xml_diff>

<commit_message>
Outline: rejected rows roll forward, rank-64 and paired rounds
Section 3.3 follows the loop as built: rejected rounds' rows roll into the
next attempt (up to 3,000), and a two-pass round runs before the loop waits.
The ablations move A1 and A2 into the loop's rank-64 round and add the
paired continue-vs-retrain round. 3,973 words.
</commit_message>
<xml_diff>
--- a/dissertation/Anneal_Dissertation_Outline.docx
+++ b/dissertation/Anneal_Dissertation_Outline.docx
@@ -490,7 +490,7 @@
         <w:tab/>
       </w:r>
       <w:r>
-        <w:t xml:space="preserve">Measure how coding gain and retention change as loop rounds add public data, and the effect of rank, target modules, example length, data source and base precision through 1,000-row ablations.</w:t>
+        <w:t xml:space="preserve">Measure how coding gain and retention change as loop rounds add public data, and the effect of rank, target modules, example length, data source and base precision through ablations.</w:t>
       </w:r>
     </w:p>
     <w:p>
@@ -1579,7 +1579,7 @@
         </w:r>
       </w:fldSimple>
       <w:r>
-        <w:t xml:space="preserve">, shrinking this model's loss from about 12.6 GiB to 0.5 GiB. Unsloth also offloads gradient checkpoints to host memory.</w:t>
+        <w:t xml:space="preserve">, shrinking this model's loss from about 12.6 GiB to 0.5 GiB.</w:t>
       </w:r>
     </w:p>
     <w:p>
@@ -2385,7 +2385,7 @@
         <w:t xml:space="preserve">&lt;think&gt;</w:t>
       </w:r>
       <w:r>
-        <w:t xml:space="preserve"> trace, drops rather than truncates rows over 8,192 tokens, and removes any sharing a 13-token window with, or above 0.8 Jaccard similarity to, an evaluation prompt.</w:t>
+        <w:t xml:space="preserve"> trace, drops rows over 8,192 tokens and removes near-duplicates of evaluation prompts (13-gram or Jaccard overlap).</w:t>
       </w:r>
     </w:p>
     <w:p>
@@ -2417,7 +2417,7 @@
         </w:r>
       </w:fldSimple>
       <w:r>
-        <w:t xml:space="preserve">. The base model passed 54% of attempts, but traces hitting the 6,144-token budget (16% of attempts) were rejected, so kept traces are short (median 436 tokens). Model-written code runs, without administrator rights, in a Windows AppContainer with no network or file access, inside a job object limiting processes, memory and time; it passed 264 escape checks, and 97.5% of reference solutions pass inside it.</w:t>
+        <w:t xml:space="preserve">. The base model passed 54% of attempts, but traces hitting the 6,144-token budget (16% of attempts) were rejected, so kept traces are short (median 436 tokens). Model-written code runs in a Windows AppContainer sandbox without network, file or administrator access, which passed 264 escape checks; 97.5% of reference solutions pass inside it.</w:t>
       </w:r>
     </w:p>
     <w:p>
@@ -2433,7 +2433,7 @@
         <w:pStyle w:val="BodyFirst"/>
       </w:pPr>
       <w:r>
-        <w:t xml:space="preserve">Training runs as an unattended keep-if-better loop. Round 1 starts from the base model, never the first-run adapter; each later round continues the last kept adapter on 1,000 new public rows plus 250 replayed from its earlier rows, re-warming and decaying the learning rate, which in continual pre-training matched retraining on all data </w:t>
+        <w:t xml:space="preserve">Training runs as an unattended keep-if-better loop. Round 1 starts from the base model, never the first-run adapter; each later round continues the best adapter on 1,000 new public rows plus 25% replayed from its earlier rows, re-warming and decaying the learning rate, which in continual pre-training matched retraining on all data </w:t>
       </w:r>
       <w:fldSimple w:instr=" REF _RefAnneal31 \r \h ">
         <w:r>
@@ -2457,7 +2457,7 @@
         </w:r>
       </w:fldSimple>
       <w:r>
-        <w:t xml:space="preserve"> questions outside computing stay within 5 points of the base, and sample answers are clean. A kept adapter is re-scored with a fresh seed that becomes the new reference, so a lucky seed cannot raise the bar. A rejected round's adapter and rows are discarded but its scores kept; EvalPlus, scored only on kept adapters, never selects them.</w:t>
+        <w:t xml:space="preserve"> questions outside computing stay within 5 points of the base, and sample answers are clean. A kept adapter is re-scored with a fresh seed that becomes the new reference. A rejected round's adapter is deleted, its scores kept and its rows rolled into the next attempt, up to 3,000 new rows, because a real 2-point gain passes the gate only 24 to 44% of the time (power calculation). When fresh rows run out, a two-pass round runs before the loop waits for new sets. EvalPlus, scored only on kept adapters, never selects them.</w:t>
       </w:r>
     </w:p>
     <w:p>
@@ -2480,7 +2480,7 @@
         </w:r>
       </w:fldSimple>
       <w:r>
-        <w:t xml:space="preserve"> (Listing 1). To survive crashes and updates over months, it saves every 10 steps, resumes when the same command is re-run, pauses cleanly on a STOP file, and refuses to resume if the training file's SHA-256 has changed. In a CPU test with a tiny model of the same architecture, a run killed with </w:t>
+        <w:t xml:space="preserve"> (Listing 1). To survive crashes and updates over months, it saves every 10 steps, resumes when the same command is re-run, and refuses to resume if the training file has changed. In a CPU test with a tiny model of the same architecture, a run killed with </w:t>
       </w:r>
       <w:r>
         <w:rPr>
@@ -2538,7 +2538,7 @@
           <w:rFonts w:ascii="Consolas" w:hAnsi="Consolas" w:cs="Consolas"/>
           <w:sz w:val="17"/>
         </w:rPr>
-        <w:t xml:space="preserve">grad_accum: 8                  # 8 rows per optimiser step</w:t>
+        <w:t xml:space="preserve">lora_r: 16                     # 64 in a later loop round</w:t>
       </w:r>
     </w:p>
     <w:p>
@@ -2554,7 +2554,7 @@
           <w:rFonts w:ascii="Consolas" w:hAnsi="Consolas" w:cs="Consolas"/>
           <w:sz w:val="17"/>
         </w:rPr>
-        <w:t xml:space="preserve">lora_r: 16                     # 16 or 64: ablation A1</w:t>
+        <w:t xml:space="preserve">target_modules: [q_proj, k_proj, v_proj, o_proj, gate_proj, up_proj,</w:t>
       </w:r>
     </w:p>
     <w:p>
@@ -2570,23 +2570,7 @@
           <w:rFonts w:ascii="Consolas" w:hAnsi="Consolas" w:cs="Consolas"/>
           <w:sz w:val="17"/>
         </w:rPr>
-        <w:t xml:space="preserve">target_modules: [q_proj, k_proj, v_proj, o_proj, gate_proj, up_proj,</w:t>
-      </w:r>
-    </w:p>
-    <w:p>
-      <w:pPr>
-        <w:pStyle w:val="BodyText"/>
-        <w:keepNext/>
-        <w:spacing w:before="0" w:after="0"/>
-        <w:ind w:left="284"/>
-        <w:jc w:val="left"/>
-      </w:pPr>
-      <w:r>
-        <w:rPr>
-          <w:rFonts w:ascii="Consolas" w:hAnsi="Consolas" w:cs="Consolas"/>
-          <w:sz w:val="17"/>
-        </w:rPr>
-        <w:t xml:space="preserve">                 down_proj]    # DeltaNet projections: A2</w:t>
+        <w:t xml:space="preserve">                 down_proj]    # + DeltaNet at rank 64</w:t>
       </w:r>
     </w:p>
     <w:p>
@@ -3071,7 +3055,7 @@
         <w:pStyle w:val="BodyFirst"/>
       </w:pPr>
       <w:r>
-        <w:t xml:space="preserve">The evaluation script serves the model through llama.cpp at the full 262k context with thinking on and scores HumanEval+ and MBPP+ with the Windows EvalPlus port. HumanEval/32 fails every solution through an EvalPlus 0.3.1 bug, so HumanEval+ is also reported without it. A 20-problem calibration chose four parallel requests without multi-token prediction (MTP), which slowed them to 0.94 times: 29.2 tokens per second in total, with answers averaging 877 tokens, so one 542-problem pass takes about 4.6 hours. Because parallel output drifts at near-ties, every model uses this one setup.</w:t>
+        <w:t xml:space="preserve">The evaluation script serves the model through llama.cpp at the full 262k context with thinking on and scores HumanEval+ and MBPP+ with the Windows EvalPlus port. HumanEval/32 fails every solution through an EvalPlus 0.3.1 bug, so HumanEval+ is also reported without it. A 20-problem calibration chose four parallel requests without multi-token prediction (MTP): 29.2 tokens per second in total, with answers averaging 877 tokens, so one 542-problem pass takes about 4.6 hours. Because parallel output drifts at near-ties, every model uses this one setup.</w:t>
       </w:r>
     </w:p>
     <w:p>
@@ -3119,7 +3103,7 @@
         </w:r>
       </w:fldSimple>
       <w:r>
-        <w:t xml:space="preserve">; Anneal keeps 0.6 and 32,768 tokens to bound evaluation time. Both systems share every setting, though absolute scores may sit below the card's.</w:t>
+        <w:t xml:space="preserve">; Anneal keeps 0.6 and 32,768 tokens to bound evaluation time, so absolute scores may sit below the card's.</w:t>
       </w:r>
     </w:p>
     <w:p>
@@ -3503,7 +3487,7 @@
               <w:rPr>
                 <w:sz w:val="20"/>
               </w:rPr>
-              <w:t xml:space="preserve">Gate scores of every round; EvalPlus (one seed) for each kept adapter; 1,000-row ablations</w:t>
+              <w:t xml:space="preserve">Gate scores of every round; EvalPlus (one seed) for each kept adapter; ablations and the paired round</w:t>
             </w:r>
           </w:p>
         </w:tc>
@@ -3648,7 +3632,7 @@
         <w:t xml:space="preserve">Ablations.</w:t>
       </w:r>
       <w:r>
-        <w:t xml:space="preserve"> Planned as separate 1,000-row runs outside the loop, each changes one factor: A1 rank (16, 64); A2 adding the DeltaNet targets; A3 example length (4,096, 8,192); A4 data source: OpenCodeReasoning alone against round 0's mix; A5 long examples or trainable normalisation, only if a kept adapter fails O4; A6 an 8-bit base.</w:t>
+        <w:t xml:space="preserve"> One loop round tests A1 rank and A2 DeltaNet targets together: rank 64 on every projection (435M trainable parameters against 80M), retrained from the base on all kept rows. A paired round retrains a kept adapter's rows from the base, comparing continuing with replay against retraining. Separate 1,000-row runs cover A3 example length (4,096, 8,192), A4 OpenCodeReasoning alone against round 0's mix, A5 long examples or trainable normalisation if a kept adapter fails O4, and A6 an 8-bit base.</w:t>
       </w:r>
     </w:p>
     <w:p>
@@ -3686,7 +3670,7 @@
         <w:pStyle w:val="BodyFirst"/>
       </w:pPr>
       <w:r>
-        <w:t xml:space="preserve">Bring-up finished early and the first real run is under way (Section 3.4), so the plan starts with its scores, which everything else depends on. Of about 136 usable machine days from November to March, roughly 15 go to ablations and 20 to evaluation; loop rounds use the rest, since only one job can use the GPU at a time.</w:t>
+        <w:t xml:space="preserve">The first real run is under way (Section 3.4), and everything else depends on its scores. Of about 136 usable machine days from November to March, roughly 15 go to ablations and 20 to evaluation; loop rounds use the rest, since only one job can use the GPU at a time.</w:t>
       </w:r>
     </w:p>
     <w:tbl>
@@ -3802,7 +3786,7 @@
               <w:rPr>
                 <w:sz w:val="20"/>
               </w:rPr>
-              <w:t xml:space="preserve">Round 0: 1,000 own and 1,000 OpenCodeReasoning rows, trained and scored against the base by 21 October. Build the gate; start loop rounds.</w:t>
+              <w:t xml:space="preserve">Round 0 (1,000 own and 1,000 OpenCodeReasoning rows) trained and scored against the base. Build the gate; start the loop.</w:t>
             </w:r>
           </w:p>
         </w:tc>
@@ -3864,7 +3848,7 @@
               <w:rPr>
                 <w:sz w:val="20"/>
               </w:rPr>
-              <w:t xml:space="preserve">Three-seed baseline; write the personal tasks. Ablations A1 to A4, pausing the loop.</w:t>
+              <w:t xml:space="preserve">Three-seed baseline; write the personal tasks. Ablations A3 and A4, pausing the loop.</w:t>
             </w:r>
           </w:p>
         </w:tc>

</xml_diff>

<commit_message>
Outline: first run is 500 own rows + 1,500 OpenCodeReasoning rows
</commit_message>
<xml_diff>
--- a/dissertation/Anneal_Dissertation_Outline.docx
+++ b/dissertation/Anneal_Dissertation_Outline.docx
@@ -2393,7 +2393,7 @@
         <w:pStyle w:val="BodyText"/>
       </w:pPr>
       <w:r>
-        <w:t xml:space="preserve">The first run, round 0, is a comparison run using the model's own rows: 1,000 base-model answers to OpenCodeInstruct </w:t>
+        <w:t xml:space="preserve">The first run, round 0, is a comparison run using the model's own rows: 500 base-model answers to OpenCodeInstruct </w:t>
       </w:r>
       <w:fldSimple w:instr=" REF _RefAnneal28 \r \h ">
         <w:r>
@@ -2409,7 +2409,7 @@
         </w:r>
       </w:fldSimple>
       <w:r>
-        <w:t xml:space="preserve">, plus 1,000 OpenCodeReasoning rows, whose DeepSeek-R1 teacher scores only 63.5 on LiveCodeBench </w:t>
+        <w:t xml:space="preserve">, plus 1,500 OpenCodeReasoning rows, whose DeepSeek-R1 teacher scores only 63.5 on LiveCodeBench </w:t>
       </w:r>
       <w:fldSimple w:instr=" REF _RefAnneal30 \r \h ">
         <w:r>
@@ -3618,7 +3618,7 @@
         </w:r>
       </w:fldSimple>
       <w:r>
-        <w:t xml:space="preserve">. Round 0, half from a weaker teacher, may show no clear gain, and many rounds may be rejected; a flat curve is a result, not a failure, and shows how much data is worth the machine time.</w:t>
+        <w:t xml:space="preserve">. Round 0, three-quarters from a weaker teacher, may show no clear gain, and many rounds may be rejected; a flat curve is a result, not a failure, and shows how much data is worth the machine time.</w:t>
       </w:r>
     </w:p>
     <w:p>
@@ -3786,7 +3786,7 @@
               <w:rPr>
                 <w:sz w:val="20"/>
               </w:rPr>
-              <w:t xml:space="preserve">Round 0 (1,000 own and 1,000 OpenCodeReasoning rows) trained and scored against the base. Build the gate; start the loop.</w:t>
+              <w:t xml:space="preserve">Round 0 (500 own and 1,500 OpenCodeReasoning rows) trained and scored against the base. Build the gate; start the loop.</w:t>
             </w:r>
           </w:p>
         </w:tc>

</xml_diff>

<commit_message>
Outline: bring it in line with the decision log
The outline now covers the NPU reworded-copy check, lists human-written sets with the rejected sources, drops the agent-session round (its tool calls are redacted), gives the measured Tachibana4 count (4,561 of 17,234 rows), and cites papers and dataset cards. The standalone pipeline figure matches the one in the docx. 3,973 words.
</commit_message>
<xml_diff>
--- a/dissertation/Anneal_Dissertation_Outline.docx
+++ b/dissertation/Anneal_Dissertation_Outline.docx
@@ -1053,7 +1053,7 @@
               <w:rPr>
                 <w:sz w:val="20"/>
               </w:rPr>
-              <w:t xml:space="preserve">, Vulkan build: full 262k context with a quantised KV cache, separate reasoning output, runtime adapters and MTP speculative decoding.</w:t>
+              <w:t xml:space="preserve">, Vulkan build: full 262k context with a quantised KV cache, separate reasoning output and runtime adapters.</w:t>
             </w:r>
           </w:p>
         </w:tc>
@@ -1276,7 +1276,7 @@
               <w:rPr>
                 <w:sz w:val="20"/>
               </w:rPr>
-              <w:t xml:space="preserve">Public trace sets; self-generated traces; teacher API; SWE-Gym</w:t>
+              <w:t xml:space="preserve">Public AI-written traces; human-written sets; own traces; teacher API; SWE-Gym</w:t>
             </w:r>
           </w:p>
         </w:tc>
@@ -1337,7 +1337,7 @@
               <w:rPr>
                 <w:sz w:val="20"/>
               </w:rPr>
-              <w:t xml:space="preserve"> (CC-BY-4.0); agent-session steps </w:t>
+              <w:t xml:space="preserve"> (CC-BY-4.0). Own and OpenCodeReasoning </w:t>
             </w:r>
             <w:fldSimple w:instr=" REF _RefAnneal23 \r \h ">
               <w:r>
@@ -1351,7 +1351,7 @@
               <w:rPr>
                 <w:sz w:val="20"/>
               </w:rPr>
-              <w:t xml:space="preserve"> if enough fit. Own and OpenCodeReasoning </w:t>
+              <w:t xml:space="preserve"> traces only in the first run; human-written sets lack traces; public agent-session steps </w:t>
             </w:r>
             <w:fldSimple w:instr=" REF _RefAnneal24 \r \h ">
               <w:r>
@@ -1365,7 +1365,7 @@
               <w:rPr>
                 <w:sz w:val="20"/>
               </w:rPr>
-              <w:t xml:space="preserve"> traces only in the first run; API-generated rows are not public; SWE-Gym </w:t>
+              <w:t xml:space="preserve"> have redacted tool calls; API-generated rows are not public; SWE-Gym </w:t>
             </w:r>
             <w:fldSimple w:instr=" REF _RefAnneal25 \r \h ">
               <w:r>
@@ -1471,7 +1471,7 @@
         <w:pStyle w:val="BodyFirst"/>
       </w:pPr>
       <w:r>
-        <w:t xml:space="preserve">The prototype is a version-controlled repository of scripts and configuration for every stage in Figure 1. Drafted before access to the training machine, it was brought up there in October 2026; the first real run, round 0 of the loop (Section 3.2), started on 19 October.</w:t>
+        <w:t xml:space="preserve">The prototype is a version-controlled repository of scripts and configuration for every stage in Figure 1. Drafted before access to the training machine, it was brought up there in October 2026; the first real run, round 0 of the loop (Section 3.2), started on 19 October, with scores due on 21 October.</w:t>
       </w:r>
     </w:p>
     <w:p>
@@ -2365,7 +2365,7 @@
         </w:r>
       </w:fldSimple>
       <w:r>
-        <w:t xml:space="preserve">. Public agent sessions, split into one row per step, get their own round if 500 steps fit 8,192 tokens. </w:t>
+        <w:t xml:space="preserve">. A public agent-session set was dropped: 62,372 of its 64,998 steps call tools with redacted placeholders. </w:t>
       </w:r>
       <w:r>
         <w:rPr>
@@ -2385,15 +2385,7 @@
         <w:t xml:space="preserve">&lt;think&gt;</w:t>
       </w:r>
       <w:r>
-        <w:t xml:space="preserve"> trace, drops rows over 8,192 tokens and removes near-duplicates of evaluation prompts (13-gram or Jaccard overlap).</w:t>
-      </w:r>
-    </w:p>
-    <w:p>
-      <w:pPr>
-        <w:pStyle w:val="BodyText"/>
-      </w:pPr>
-      <w:r>
-        <w:t xml:space="preserve">The first run, round 0, is a comparison run using the model's own rows: 500 base-model answers to OpenCodeInstruct </w:t>
+        <w:t xml:space="preserve"> trace, drops rows over 8,192 tokens and removes near-duplicates of evaluation prompts (13-gram or Jaccard overlap). An embedding search on the otherwise idle NPU also flags reworded copies, which n-gram checks miss </w:t>
       </w:r>
       <w:fldSimple w:instr=" REF _RefAnneal28 \r \h ">
         <w:r>
@@ -2401,7 +2393,15 @@
         </w:r>
       </w:fldSimple>
       <w:r>
-        <w:t xml:space="preserve"> prompts that passed their tests, as in ReST-EM </w:t>
+        <w:t xml:space="preserve">.</w:t>
+      </w:r>
+    </w:p>
+    <w:p>
+      <w:pPr>
+        <w:pStyle w:val="BodyText"/>
+      </w:pPr>
+      <w:r>
+        <w:t xml:space="preserve">The first run, round 0, is a comparison run using the model's own rows: 500 base-model answers to OpenCodeInstruct </w:t>
       </w:r>
       <w:fldSimple w:instr=" REF _RefAnneal29 \r \h ">
         <w:r>
@@ -2409,7 +2409,7 @@
         </w:r>
       </w:fldSimple>
       <w:r>
-        <w:t xml:space="preserve">, plus 1,500 OpenCodeReasoning rows, whose DeepSeek-R1 teacher scores only 63.5 on LiveCodeBench </w:t>
+        <w:t xml:space="preserve"> prompts that passed their tests, as in ReST-EM </w:t>
       </w:r>
       <w:fldSimple w:instr=" REF _RefAnneal30 \r \h ">
         <w:r>
@@ -2417,23 +2417,7 @@
         </w:r>
       </w:fldSimple>
       <w:r>
-        <w:t xml:space="preserve">. The base model passed 54% of attempts, but traces hitting the 6,144-token budget (16% of attempts) were rejected, so kept traces are short (median 436 tokens). Model-written code runs in a Windows AppContainer sandbox without network, file or administrator access, which passed 264 escape checks; 97.5% of reference solutions pass inside it.</w:t>
-      </w:r>
-    </w:p>
-    <w:p>
-      <w:pPr>
-        <w:pStyle w:val="Heading2"/>
-      </w:pPr>
-      <w:r>
-        <w:t xml:space="preserve">Training</w:t>
-      </w:r>
-    </w:p>
-    <w:p>
-      <w:pPr>
-        <w:pStyle w:val="BodyFirst"/>
-      </w:pPr>
-      <w:r>
-        <w:t xml:space="preserve">Training runs as an unattended keep-if-better loop. Round 1 starts from the base model, never the first-run adapter; each later round continues the best adapter on 1,000 new public rows plus 25% replayed from its earlier rows, re-warming and decaying the learning rate, which in continual pre-training matched retraining on all data </w:t>
+        <w:t xml:space="preserve">, plus 1,500 OpenCodeReasoning rows, whose DeepSeek-R1 teacher scores only 63.5 on LiveCodeBench </w:t>
       </w:r>
       <w:fldSimple w:instr=" REF _RefAnneal31 \r \h ">
         <w:r>
@@ -2441,7 +2425,23 @@
         </w:r>
       </w:fldSimple>
       <w:r>
-        <w:t xml:space="preserve">. Each round is scored on a held-out gate, never trained on or reported: 195 decontaminated CodeContests </w:t>
+        <w:t xml:space="preserve">. The base model passed 54% of attempts, but traces hitting the 6,144-token budget (16% of attempts) were rejected, so kept traces are short (median 436 tokens). Model-written code runs in a Windows AppContainer sandbox without network, file or administrator access, which passed 264 escape checks; 97.5% of reference solutions pass inside it.</w:t>
+      </w:r>
+    </w:p>
+    <w:p>
+      <w:pPr>
+        <w:pStyle w:val="Heading2"/>
+      </w:pPr>
+      <w:r>
+        <w:t xml:space="preserve">Training</w:t>
+      </w:r>
+    </w:p>
+    <w:p>
+      <w:pPr>
+        <w:pStyle w:val="BodyFirst"/>
+      </w:pPr>
+      <w:r>
+        <w:t xml:space="preserve">Training runs as an unattended keep-if-better loop. Round 1 starts from the base model, never the first-run adapter; each later round continues the best adapter on 1,000 new public rows plus 25% replayed from its earlier rows, re-warming and decaying the learning rate, which in continual pre-training matched retraining on all data </w:t>
       </w:r>
       <w:fldSimple w:instr=" REF _RefAnneal32 \r \h ">
         <w:r>
@@ -2449,7 +2449,7 @@
         </w:r>
       </w:fldSimple>
       <w:r>
-        <w:t xml:space="preserve"> validation and test problems with a passing reference, plus 300 OpenCodeInstruct problems. A round is kept only if a one-sided exact sign test against the best adapter gives p ≤ 0.05, its CodeContests part drops at most 5 points, 100 MMLU-Pro </w:t>
+        <w:t xml:space="preserve">. Each round is scored on a held-out gate, never trained on or reported: 195 decontaminated CodeContests </w:t>
       </w:r>
       <w:fldSimple w:instr=" REF _RefAnneal33 \r \h ">
         <w:r>
@@ -2457,6 +2457,14 @@
         </w:r>
       </w:fldSimple>
       <w:r>
+        <w:t xml:space="preserve"> validation and test problems with a passing reference, plus 300 OpenCodeInstruct problems. A round is kept only if a one-sided exact sign test against the best adapter gives p ≤ 0.05, its CodeContests part drops at most 5 points, 100 MMLU-Pro </w:t>
+      </w:r>
+      <w:fldSimple w:instr=" REF _RefAnneal34 \r \h ">
+        <w:r>
+          <w:t xml:space="preserve">[34]</w:t>
+        </w:r>
+      </w:fldSimple>
+      <w:r>
         <w:t xml:space="preserve"> questions outside computing stay within 5 points of the base, and sample answers are clean. A kept adapter is re-scored with a fresh seed that becomes the new reference. A rejected round's adapter is deleted, its scores kept and its rows rolled into the next attempt, up to 3,000 new rows, because a real 2-point gain passes the gate only 24 to 44% of the time (power calculation). When fresh rows run out, a two-pass round runs before the loop waits for new sets. EvalPlus, scored only on kept adapters, never selects them.</w:t>
       </w:r>
     </w:p>
@@ -2474,9 +2482,9 @@
       <w:r>
         <w:t xml:space="preserve"> uses a warmup-stable-decay schedule </w:t>
       </w:r>
-      <w:fldSimple w:instr=" REF _RefAnneal34 \r \h ">
+      <w:fldSimple w:instr=" REF _RefAnneal35 \r \h ">
         <w:r>
-          <w:t xml:space="preserve">[34]</w:t>
+          <w:t xml:space="preserve">[35]</w:t>
         </w:r>
       </w:fldSimple>
       <w:r>
@@ -3079,7 +3087,7 @@
         <w:pStyle w:val="BodyFirst"/>
       </w:pPr>
       <w:r>
-        <w:t xml:space="preserve">The measurement-first design has paid off: the parity test caught a wrong fix before any real run used it. Weaknesses remain. Speed and memory were measured only at rank 16, and the first run's scores will be the first evidence that training helps. The Windows workarounds (a bundled C compiler, the convolution rewrite, disabled Vulkan kernels) could break on an update, so versions are pinned. With 20 to 50 personal tasks, confidence intervals will be wide. Only an estimated 10 to 25% of Tachibana4 fits 8,192 tokens, enough for a few rounds until 16,384-token training is measured.</w:t>
+        <w:t xml:space="preserve">The measurement-first design has paid off: the parity test caught a wrong fix before any real run used it. Speed and memory were measured only at rank 16, and the first run's scores will be the first evidence that training helps. The Windows workarounds (a bundled C compiler, the convolution rewrite, disabled Vulkan kernels) could break on an update, so versions are pinned. With 20 to 50 personal tasks, confidence intervals will be wide. Only 4,561 of Tachibana4's 17,234 rows pass the filters at 8,192 tokens, enough for about five rounds until 16,384-token training is measured.</w:t>
       </w:r>
     </w:p>
     <w:p>
@@ -3602,11 +3610,11 @@
         <w:t xml:space="preserve">Data scaling.</w:t>
       </w:r>
       <w:r>
-        <w:t xml:space="preserve"> The scaling curve is the main research question beyond O3. Published results suggest small, flattening gains: supervised fine-tuning gains are log-linear in data and smaller for stronger models </w:t>
-      </w:r>
-      <w:fldSimple w:instr=" REF _RefAnneal35 \r \h ">
+        <w:t xml:space="preserve"> Published results suggest small, flattening gains: supervised fine-tuning gains are log-linear in data and smaller for stronger models </w:t>
+      </w:r>
+      <w:fldSimple w:instr=" REF _RefAnneal36 \r \h ">
         <w:r>
-          <w:t xml:space="preserve">[35]</w:t>
+          <w:t xml:space="preserve">[36]</w:t>
         </w:r>
       </w:fldSimple>
       <w:r>
@@ -3654,7 +3662,7 @@
         </w:r>
       </w:fldSimple>
       <w:r>
-        <w:t xml:space="preserve">). Two code sets are undated, so training rows are checked for overlap with these problems as well as the gate and MMLU-Pro.</w:t>
+        <w:t xml:space="preserve">). Two code sets are undated, so training rows are also checked against these problems.</w:t>
       </w:r>
     </w:p>
     <w:p>
@@ -4512,7 +4520,7 @@
         <w:pStyle w:val="BodyText"/>
       </w:pPr>
       <w:r>
-        <w:t xml:space="preserve">The main risks have planned responses. If a driver or package update breaks the Windows stack, the pinned versions are reinstalled, with WSL2 as a fallback. If a larger adapter trains much slower than measured, fewer rounds fit, but every kept round still adds a point to the curve. If an improvement sits inside run-to-run noise, more seeds are run before concluding. Every change of plan is dated in the decision log.</w:t>
+        <w:t xml:space="preserve">If a driver or package update breaks the Windows stack, the pinned versions are reinstalled, with WSL2 as a fallback. If a larger adapter trains much slower than measured, fewer rounds fit, but every kept round still adds a point to the curve. If an improvement sits inside run-to-run noise, more seeds are run before concluding. Every change of plan is dated in the decision log.</w:t>
       </w:r>
     </w:p>
     <w:p>
@@ -5358,12 +5366,49 @@
       </w:pPr>
       <w:bookmarkStart w:id="923" w:name="_RefAnneal23"/>
       <w:r>
+        <w:t xml:space="preserve">W. U. Ahmad </w:t>
+      </w:r>
+      <w:r>
+        <w:rPr>
+          <w:i/>
+        </w:rPr>
+        <w:t xml:space="preserve">et al.</w:t>
+      </w:r>
+      <w:r>
+        <w:t xml:space="preserve">, "OpenCodeReasoning: Advancing data distillation for competitive coding," arXiv preprint arXiv:2504.01943, 2025. </w:t>
+      </w:r>
+      <w:r>
+        <w:t xml:space="preserve">[Online]. Available: </w:t>
+      </w:r>
+      <w:hyperlink r:id="rId44">
+        <w:r>
+          <w:rPr>
+            <w:color w:val="0563C1"/>
+            <w:u w:val="single"/>
+          </w:rPr>
+          <w:t xml:space="preserve">https://arxiv.org/abs/2504.01943</w:t>
+        </w:r>
+      </w:hyperlink>
+      <w:bookmarkEnd w:id="923"/>
+    </w:p>
+    <w:p>
+      <w:pPr>
+        <w:pStyle w:val="Reference"/>
+        <w:tabs>
+          <w:tab w:val="clear" w:pos="426"/>
+          <w:tab w:val="num" w:pos="567"/>
+        </w:tabs>
+        <w:ind w:left="567" w:hanging="567"/>
+        <w:jc w:val="left"/>
+      </w:pPr>
+      <w:bookmarkStart w:id="924" w:name="_RefAnneal24"/>
+      <w:r>
         <w:t xml:space="preserve">Public agent-session dataset card, Hugging Face, 2026. </w:t>
       </w:r>
       <w:r>
         <w:t xml:space="preserve">[Online]. Available: </w:t>
       </w:r>
-      <w:hyperlink r:id="rId44">
+      <w:hyperlink r:id="rId45">
         <w:r>
           <w:rPr>
             <w:color w:val="0563C1"/>
@@ -5375,43 +5420,6 @@
       <w:r>
         <w:t xml:space="preserve"> (accessed Oct. 17, 2026).</w:t>
       </w:r>
-      <w:bookmarkEnd w:id="923"/>
-    </w:p>
-    <w:p>
-      <w:pPr>
-        <w:pStyle w:val="Reference"/>
-        <w:tabs>
-          <w:tab w:val="clear" w:pos="426"/>
-          <w:tab w:val="num" w:pos="567"/>
-        </w:tabs>
-        <w:ind w:left="567" w:hanging="567"/>
-        <w:jc w:val="left"/>
-      </w:pPr>
-      <w:bookmarkStart w:id="924" w:name="_RefAnneal24"/>
-      <w:r>
-        <w:t xml:space="preserve">W. U. Ahmad </w:t>
-      </w:r>
-      <w:r>
-        <w:rPr>
-          <w:i/>
-        </w:rPr>
-        <w:t xml:space="preserve">et al.</w:t>
-      </w:r>
-      <w:r>
-        <w:t xml:space="preserve">, "OpenCodeReasoning: Advancing data distillation for competitive coding," arXiv preprint arXiv:2504.01943, 2025. </w:t>
-      </w:r>
-      <w:r>
-        <w:t xml:space="preserve">[Online]. Available: </w:t>
-      </w:r>
-      <w:hyperlink r:id="rId45">
-        <w:r>
-          <w:rPr>
-            <w:color w:val="0563C1"/>
-            <w:u w:val="single"/>
-          </w:rPr>
-          <w:t xml:space="preserve">https://arxiv.org/abs/2504.01943</w:t>
-        </w:r>
-      </w:hyperlink>
       <w:bookmarkEnd w:id="924"/>
     </w:p>
     <w:p>
@@ -5540,6 +5548,34 @@
       </w:pPr>
       <w:bookmarkStart w:id="928" w:name="_RefAnneal28"/>
       <w:r>
+        <w:t xml:space="preserve">S. Yang, W.-L. Chiang, L. Zheng, J. E. Gonzalez, and I. Stoica, "Rethinking benchmark and contamination for language models with rephrased samples," arXiv preprint arXiv:2311.04850, 2023. </w:t>
+      </w:r>
+      <w:r>
+        <w:t xml:space="preserve">[Online]. Available: </w:t>
+      </w:r>
+      <w:hyperlink r:id="rId49">
+        <w:r>
+          <w:rPr>
+            <w:color w:val="0563C1"/>
+            <w:u w:val="single"/>
+          </w:rPr>
+          <w:t xml:space="preserve">https://arxiv.org/abs/2311.04850</w:t>
+        </w:r>
+      </w:hyperlink>
+      <w:bookmarkEnd w:id="928"/>
+    </w:p>
+    <w:p>
+      <w:pPr>
+        <w:pStyle w:val="Reference"/>
+        <w:tabs>
+          <w:tab w:val="clear" w:pos="426"/>
+          <w:tab w:val="num" w:pos="567"/>
+        </w:tabs>
+        <w:ind w:left="567" w:hanging="567"/>
+        <w:jc w:val="left"/>
+      </w:pPr>
+      <w:bookmarkStart w:id="929" w:name="_RefAnneal29"/>
+      <w:r>
         <w:t xml:space="preserve">W. U. Ahmad </w:t>
       </w:r>
       <w:r>
@@ -5554,7 +5590,7 @@
       <w:r>
         <w:t xml:space="preserve">[Online]. Available: </w:t>
       </w:r>
-      <w:hyperlink r:id="rId49">
+      <w:hyperlink r:id="rId50">
         <w:r>
           <w:rPr>
             <w:color w:val="0563C1"/>
@@ -5563,7 +5599,7 @@
           <w:t xml:space="preserve">https://arxiv.org/abs/2504.04030</w:t>
         </w:r>
       </w:hyperlink>
-      <w:bookmarkEnd w:id="928"/>
+      <w:bookmarkEnd w:id="929"/>
     </w:p>
     <w:p>
       <w:pPr>
@@ -5575,7 +5611,7 @@
         <w:ind w:left="567" w:hanging="567"/>
         <w:jc w:val="left"/>
       </w:pPr>
-      <w:bookmarkStart w:id="929" w:name="_RefAnneal29"/>
+      <w:bookmarkStart w:id="930" w:name="_RefAnneal30"/>
       <w:r>
         <w:t xml:space="preserve">A. Singh </w:t>
       </w:r>
@@ -5591,7 +5627,7 @@
       <w:r>
         <w:t xml:space="preserve">[Online]. Available: </w:t>
       </w:r>
-      <w:hyperlink r:id="rId50">
+      <w:hyperlink r:id="rId51">
         <w:r>
           <w:rPr>
             <w:color w:val="0563C1"/>
@@ -5600,7 +5636,7 @@
           <w:t xml:space="preserve">https://arxiv.org/abs/2312.06585</w:t>
         </w:r>
       </w:hyperlink>
-      <w:bookmarkEnd w:id="929"/>
+      <w:bookmarkEnd w:id="930"/>
     </w:p>
     <w:p>
       <w:pPr>
@@ -5612,14 +5648,14 @@
         <w:ind w:left="567" w:hanging="567"/>
         <w:jc w:val="left"/>
       </w:pPr>
-      <w:bookmarkStart w:id="930" w:name="_RefAnneal30"/>
+      <w:bookmarkStart w:id="931" w:name="_RefAnneal31"/>
       <w:r>
         <w:t xml:space="preserve">DeepSeek-AI, "DeepSeek-R1-0528," Hugging Face model card, 2025. </w:t>
       </w:r>
       <w:r>
         <w:t xml:space="preserve">[Online]. Available: </w:t>
       </w:r>
-      <w:hyperlink r:id="rId51">
+      <w:hyperlink r:id="rId52">
         <w:r>
           <w:rPr>
             <w:color w:val="0563C1"/>
@@ -5631,7 +5667,7 @@
       <w:r>
         <w:t xml:space="preserve"> (accessed Oct. 17, 2026).</w:t>
       </w:r>
-      <w:bookmarkEnd w:id="930"/>
+      <w:bookmarkEnd w:id="931"/>
     </w:p>
     <w:p>
       <w:pPr>
@@ -5643,7 +5679,7 @@
         <w:ind w:left="567" w:hanging="567"/>
         <w:jc w:val="left"/>
       </w:pPr>
-      <w:bookmarkStart w:id="931" w:name="_RefAnneal31"/>
+      <w:bookmarkStart w:id="932" w:name="_RefAnneal32"/>
       <w:r>
         <w:t xml:space="preserve">A. Ibrahim </w:t>
       </w:r>
@@ -5668,7 +5704,7 @@
       <w:r>
         <w:t xml:space="preserve">[Online]. Available: </w:t>
       </w:r>
-      <w:hyperlink r:id="rId52">
+      <w:hyperlink r:id="rId53">
         <w:r>
           <w:rPr>
             <w:color w:val="0563C1"/>
@@ -5677,7 +5713,7 @@
           <w:t xml:space="preserve">https://arxiv.org/abs/2403.08763</w:t>
         </w:r>
       </w:hyperlink>
-      <w:bookmarkEnd w:id="931"/>
+      <w:bookmarkEnd w:id="932"/>
     </w:p>
     <w:p>
       <w:pPr>
@@ -5689,7 +5725,7 @@
         <w:ind w:left="567" w:hanging="567"/>
         <w:jc w:val="left"/>
       </w:pPr>
-      <w:bookmarkStart w:id="932" w:name="_RefAnneal32"/>
+      <w:bookmarkStart w:id="933" w:name="_RefAnneal33"/>
       <w:r>
         <w:t xml:space="preserve">Y. Li </w:t>
       </w:r>
@@ -5714,7 +5750,7 @@
       <w:r>
         <w:t xml:space="preserve">[Online]. Available: </w:t>
       </w:r>
-      <w:hyperlink r:id="rId53">
+      <w:hyperlink r:id="rId54">
         <w:r>
           <w:rPr>
             <w:color w:val="0563C1"/>
@@ -5723,7 +5759,7 @@
           <w:t xml:space="preserve">https://arxiv.org/abs/2203.07814</w:t>
         </w:r>
       </w:hyperlink>
-      <w:bookmarkEnd w:id="932"/>
+      <w:bookmarkEnd w:id="933"/>
     </w:p>
     <w:p>
       <w:pPr>
@@ -5735,7 +5771,7 @@
         <w:ind w:left="567" w:hanging="567"/>
         <w:jc w:val="left"/>
       </w:pPr>
-      <w:bookmarkStart w:id="933" w:name="_RefAnneal33"/>
+      <w:bookmarkStart w:id="934" w:name="_RefAnneal34"/>
       <w:r>
         <w:t xml:space="preserve">Y. Wang </w:t>
       </w:r>
@@ -5760,7 +5796,7 @@
       <w:r>
         <w:t xml:space="preserve">[Online]. Available: </w:t>
       </w:r>
-      <w:hyperlink r:id="rId54">
+      <w:hyperlink r:id="rId55">
         <w:r>
           <w:rPr>
             <w:color w:val="0563C1"/>
@@ -5769,7 +5805,7 @@
           <w:t xml:space="preserve">https://arxiv.org/abs/2406.01574</w:t>
         </w:r>
       </w:hyperlink>
-      <w:bookmarkEnd w:id="933"/>
+      <w:bookmarkEnd w:id="934"/>
     </w:p>
     <w:p>
       <w:pPr>
@@ -5781,14 +5817,14 @@
         <w:ind w:left="567" w:hanging="567"/>
         <w:jc w:val="left"/>
       </w:pPr>
-      <w:bookmarkStart w:id="934" w:name="_RefAnneal34"/>
+      <w:bookmarkStart w:id="935" w:name="_RefAnneal35"/>
       <w:r>
         <w:t xml:space="preserve">A. Hägele, E. Bakouch, A. Kosson, L. Ben Allal, L. Von Werra, and M. Jaggi, "Scaling laws and compute-optimal training beyond fixed training durations," arXiv preprint arXiv:2405.18392, 2024. </w:t>
       </w:r>
       <w:r>
         <w:t xml:space="preserve">[Online]. Available: </w:t>
       </w:r>
-      <w:hyperlink r:id="rId55">
+      <w:hyperlink r:id="rId56">
         <w:r>
           <w:rPr>
             <w:color w:val="0563C1"/>
@@ -5797,7 +5833,7 @@
           <w:t xml:space="preserve">https://arxiv.org/abs/2405.18392</w:t>
         </w:r>
       </w:hyperlink>
-      <w:bookmarkEnd w:id="934"/>
+      <w:bookmarkEnd w:id="935"/>
     </w:p>
     <w:p>
       <w:pPr>
@@ -5809,7 +5845,7 @@
         <w:ind w:left="567" w:hanging="567"/>
         <w:jc w:val="left"/>
       </w:pPr>
-      <w:bookmarkStart w:id="935" w:name="_RefAnneal35"/>
+      <w:bookmarkStart w:id="936" w:name="_RefAnneal36"/>
       <w:r>
         <w:t xml:space="preserve">Z. Yuan </w:t>
       </w:r>
@@ -5825,7 +5861,7 @@
       <w:r>
         <w:t xml:space="preserve">[Online]. Available: </w:t>
       </w:r>
-      <w:hyperlink r:id="rId56">
+      <w:hyperlink r:id="rId57">
         <w:r>
           <w:rPr>
             <w:color w:val="0563C1"/>
@@ -5834,7 +5870,7 @@
           <w:t xml:space="preserve">https://arxiv.org/abs/2308.01825</w:t>
         </w:r>
       </w:hyperlink>
-      <w:bookmarkEnd w:id="935"/>
+      <w:bookmarkEnd w:id="936"/>
     </w:p>
     <w:sectPr>
       <w:footerReference w:type="default" r:id="rId18"/>

</xml_diff>

<commit_message>
Outline: add the measured first-run training and reworded-copy results
The first run trained on 7.39 million tokens at 99.5 tokens per second, with validation loss falling from 0.124 to 0.050. The NPU check flagged 33 of 15,276 loop rows without slowing training, and three HumanEval+ problems in round 0's own rows, so HumanEval+ is also reported without them for round 0. 3,993 words.
</commit_message>
<xml_diff>
--- a/dissertation/Anneal_Dissertation_Outline.docx
+++ b/dissertation/Anneal_Dissertation_Outline.docx
@@ -2365,7 +2365,7 @@
         </w:r>
       </w:fldSimple>
       <w:r>
-        <w:t xml:space="preserve">. A public agent-session set was dropped: 62,372 of its 64,998 steps call tools with redacted placeholders. </w:t>
+        <w:t xml:space="preserve">. A public agent-session set was dropped: 96% of its steps redact tool calls. </w:t>
       </w:r>
       <w:r>
         <w:rPr>
@@ -2393,7 +2393,7 @@
         </w:r>
       </w:fldSimple>
       <w:r>
-        <w:t xml:space="preserve">.</w:t>
+        <w:t xml:space="preserve">; it flagged 33 of 15,276 loop rows without measurably slowing training.</w:t>
       </w:r>
     </w:p>
     <w:p>
@@ -2638,7 +2638,7 @@
         <w:pStyle w:val="BodyFirst"/>
       </w:pPr>
       <w:r>
-        <w:t xml:space="preserve">Bring-up and the first run raised the issues in Table 3. Training then ran at 97 to 102 tokens per second on rows of up to 8,192 tokens.</w:t>
+        <w:t xml:space="preserve">Bring-up and the first run raised the issues in Table 3. The run trained on 7.39 million tokens at 99.5 tokens per second; validation loss fell from 0.124 to 0.050.</w:t>
       </w:r>
     </w:p>
     <w:p>
@@ -3063,7 +3063,7 @@
         <w:pStyle w:val="BodyFirst"/>
       </w:pPr>
       <w:r>
-        <w:t xml:space="preserve">The evaluation script serves the model through llama.cpp at the full 262k context with thinking on and scores HumanEval+ and MBPP+ with the Windows EvalPlus port. HumanEval/32 fails every solution through an EvalPlus 0.3.1 bug, so HumanEval+ is also reported without it. A 20-problem calibration chose four parallel requests without multi-token prediction (MTP): 29.2 tokens per second in total, with answers averaging 877 tokens, so one 542-problem pass takes about 4.6 hours. Because parallel output drifts at near-ties, every model uses this one setup.</w:t>
+        <w:t xml:space="preserve">The evaluation script serves the model through llama.cpp at the full 262k context with thinking on and scores HumanEval+ and MBPP+ with the Windows EvalPlus port. HumanEval+ is also reported without HumanEval/32, which fails every solution through an EvalPlus 0.3.1 bug, and, for round 0, without three problems flagged in its own rows. A 20-problem calibration chose four parallel requests without multi-token prediction (MTP): 29.2 tokens per second in total, with answers averaging 877 tokens, so one 542-problem pass takes about 4.6 hours. Because parallel output drifts at near-ties, every model uses this one setup.</w:t>
       </w:r>
     </w:p>
     <w:p>
@@ -3678,7 +3678,7 @@
         <w:pStyle w:val="BodyFirst"/>
       </w:pPr>
       <w:r>
-        <w:t xml:space="preserve">The first real run is under way (Section 3.4), and everything else depends on its scores. Of about 136 usable machine days from November to March, roughly 15 go to ablations and 20 to evaluation; loop rounds use the rest, since only one job can use the GPU at a time.</w:t>
+        <w:t xml:space="preserve">The first real run has trained (Section 3.4), and everything else depends on its scores. Of about 136 usable machine days from November to March, roughly 15 go to ablations and 20 to evaluation; loop rounds use the rest, since only one job can use the GPU at a time.</w:t>
       </w:r>
     </w:p>
     <w:tbl>

</xml_diff>

<commit_message>
Outline: data, gate and row length as decided on 21 October
Every row carries its teacher's real reasoning from a teacher at least as strong as the base on Vals AI. Each round is 55% test-passed DeepSeek V4-Flash-0731 bug-fix runs outside Python and 45% DeepSeek-V4-Pro coding answers without Python; Python rows and maths wait. The gate is being rebuilt around other languages and wider software work, and a memory test tries 16,384-token rows first. 3,992 words.
</commit_message>
<xml_diff>
--- a/dissertation/Anneal_Dissertation_Outline.docx
+++ b/dissertation/Anneal_Dissertation_Outline.docx
@@ -294,7 +294,7 @@
         </w:r>
       </w:fldSimple>
       <w:r>
-        <w:t xml:space="preserve">. Activation memory limits training examples to about 8,192 tokens, and short-example fine-tuning risks dulling long-range behaviour unnoticed </w:t>
+        <w:t xml:space="preserve">. Activation memory limits training examples to 8,192 tokens, perhaps 16,384, and short-example fine-tuning risks dulling long-range behaviour unnoticed </w:t>
       </w:r>
       <w:fldSimple w:instr=" REF _RefAnneal3 \r \h ">
         <w:r>
@@ -334,7 +334,7 @@
         <w:t xml:space="preserve">&lt;think&gt;</w:t>
       </w:r>
       <w:r>
-        <w:t xml:space="preserve"> block before answering, so every training row needs a trace, or the model learns to skip reasoning. Data must come from public datasets licensed for training and must not overlap the evaluation sets, or gains could reflect memorisation.</w:t>
+        <w:t xml:space="preserve"> block before answering, so every training row needs a trace, or the model learns to skip reasoning. Data must come from public datasets licensed for training, written by a teacher at least as strong as the base, and must not overlap the evaluation sets, or gains could reflect memorisation.</w:t>
       </w:r>
     </w:p>
     <w:p>
@@ -728,7 +728,7 @@
         </w:r>
       </w:fldSimple>
       <w:r>
-        <w:t xml:space="preserve"> built SWE-bench from 2,294 GitHub issues across 12 Python repositories: a model must edit the repository until the project's own tests pass, which matches scenario S2 far better than single-function benchmarks. At publication the best model resolved 1.96% of issues. Its weaknesses are cost and noise. Each task needs a container and a token-hungry agent loop, scores depend on the agent scaffold, and underspecified tasks led to SWE-bench Verified, a human-validated subset of 500 </w:t>
+        <w:t xml:space="preserve"> built SWE-bench from 2,294 GitHub issues across 12 Python repositories: a model must edit the repository until the project's own tests pass, which matches scenario S2 far better than single-function benchmarks. Its weaknesses are cost and noise. Each task needs a container and a token-hungry agent loop, scores depend on the agent scaffold, and underspecified tasks led to SWE-bench Verified, a human-validated subset of 500 </w:t>
       </w:r>
       <w:fldSimple w:instr=" REF _RefAnneal10 \r \h ">
         <w:r>
@@ -1295,7 +1295,7 @@
               <w:rPr>
                 <w:sz w:val="20"/>
               </w:rPr>
-              <w:t xml:space="preserve">DeepSeek-V4-Pro code traces </w:t>
+              <w:t xml:space="preserve">Test-passed DeepSeek V4-Flash bug-fix runs </w:t>
             </w:r>
             <w:fldSimple w:instr=" REF _RefAnneal20 \r \h ">
               <w:r>
@@ -1309,7 +1309,7 @@
               <w:rPr>
                 <w:sz w:val="20"/>
               </w:rPr>
-              <w:t xml:space="preserve">, </w:t>
+              <w:t xml:space="preserve"> (CC-BY-4.0) and V4-Pro coding answers </w:t>
             </w:r>
             <w:fldSimple w:instr=" REF _RefAnneal21 \r \h ">
               <w:r>
@@ -1323,7 +1323,7 @@
               <w:rPr>
                 <w:sz w:val="20"/>
               </w:rPr>
-              <w:t xml:space="preserve"> (Apache-2.0) and AoPS maths </w:t>
+              <w:t xml:space="preserve">, </w:t>
             </w:r>
             <w:fldSimple w:instr=" REF _RefAnneal22 \r \h ">
               <w:r>
@@ -1337,7 +1337,7 @@
               <w:rPr>
                 <w:sz w:val="20"/>
               </w:rPr>
-              <w:t xml:space="preserve"> (CC-BY-4.0). Own and OpenCodeReasoning </w:t>
+              <w:t xml:space="preserve"> (Apache-2.0), other languages before Python. Own and OpenCodeReasoning </w:t>
             </w:r>
             <w:fldSimple w:instr=" REF _RefAnneal23 \r \h ">
               <w:r>
@@ -1351,7 +1351,7 @@
               <w:rPr>
                 <w:sz w:val="20"/>
               </w:rPr>
-              <w:t xml:space="preserve"> traces only in the first run; human-written sets lack traces; public agent-session steps </w:t>
+              <w:t xml:space="preserve"> traces only in the first run; human-written sets lack traces; agent-session sets </w:t>
             </w:r>
             <w:fldSimple w:instr=" REF _RefAnneal24 \r \h ">
               <w:r>
@@ -1365,7 +1365,7 @@
               <w:rPr>
                 <w:sz w:val="20"/>
               </w:rPr>
-              <w:t xml:space="preserve"> have redacted tool calls; API-generated rows are not public; SWE-Gym </w:t>
+              <w:t xml:space="preserve"> lack raw reasoning; API-generated rows are not public; SWE-Gym </w:t>
             </w:r>
             <w:fldSimple w:instr=" REF _RefAnneal25 \r \h ">
               <w:r>
@@ -1455,7 +1455,7 @@
         <w:pStyle w:val="BodyText"/>
       </w:pPr>
       <w:r>
-        <w:t xml:space="preserve">In summary, QLoRA fixes the training configuration; LoRA and Biderman et al. frame what improvement to expect and which hyperparameters to test; LongLoRA and RULER define the long-context risk and how to measure it; and SWE-bench shapes the realistic tasks. Anneal's contribution is to combine these at 256k context, on AMD hardware, within 32 GB, and to report the outcome openly.</w:t>
+        <w:t xml:space="preserve">In summary, QLoRA fixes the training configuration; LoRA and Biderman et al. frame what to expect and which hyperparameters to test; LongLoRA and RULER define the long-context risk; and SWE-bench shapes the realistic tasks. Anneal combines these at 256k context, on AMD hardware, within 32 GB, and reports the outcome openly.</w:t>
       </w:r>
     </w:p>
     <w:p>
@@ -1471,7 +1471,7 @@
         <w:pStyle w:val="BodyFirst"/>
       </w:pPr>
       <w:r>
-        <w:t xml:space="preserve">The prototype is a version-controlled repository of scripts and configuration for every stage in Figure 1. Drafted before access to the training machine, it was brought up there in October 2026; the first real run, round 0 of the loop (Section 3.2), started on 19 October, with scores due on 21 October.</w:t>
+        <w:t xml:space="preserve">The prototype is a version-controlled repository of scripts and configuration for every stage in Figure 1. Drafted before access to the training machine, it was brought up there in October 2026; the first real run, round 0 of the loop (Section 3.2), trained on 19 and 20 October.</w:t>
       </w:r>
     </w:p>
     <w:p>
@@ -1587,7 +1587,7 @@
         <w:pStyle w:val="BodyText"/>
       </w:pPr>
       <w:r>
-        <w:t xml:space="preserve">Table 2 decided the precision. An 8-bit base fits only if Unsloth's optimisations work on this chip, whereas a 4-bit base fits on either path; ablation A6 measures its cost in quantisation error. Measured on the machine at 8,192 tokens with a rank-16 adapter, the peak was 25.2 GiB, inside the 32 GB allocation.</w:t>
+        <w:t xml:space="preserve">Table 2 decided the precision. An 8-bit base fits only if Unsloth's optimisations work on this chip, whereas a 4-bit base fits on either path; ablation A6 measures its cost in quantisation error. Measured on the machine at 8,192 tokens with a rank-16 adapter, the peak was 25.2 GiB, inside the 32 GB allocation. A five-step test before the loop tries 16,384-token rows, used only if the peak stays within 29 GB with 6 GB of system memory free.</w:t>
       </w:r>
     </w:p>
     <w:p>
@@ -2325,7 +2325,15 @@
         <w:pStyle w:val="BodyFirst"/>
       </w:pPr>
       <w:r>
-        <w:t xml:space="preserve">From round 1, the loop trains only on public datasets, never on the base model's own rows, which would reinforce its biases. No large public set of test-verified traces from an equally strong teacher exists, so loop rows are untested traces from DeepSeek-V4-Pro, level with Qwen3.8-27B on LiveCodeBench (89.8 against 90.3 </w:t>
+        <w:t xml:space="preserve">From round 1, the loop trains only on public datasets, never on the base model's own rows, which would reinforce its biases. Every row must carry its teacher's real reasoning, and the teacher must match or beat Qwen3.8-27B on the Vals AI board for that task, where all models share one harness. Each round takes 55% from test-passed bug-fix runs in real TypeScript, Go, JavaScript and other non-Python repositories by DeepSeek V4-Flash-0731 </w:t>
+      </w:r>
+      <w:fldSimple w:instr=" REF _RefAnneal20 \r \h ">
+        <w:r>
+          <w:t xml:space="preserve">[20]</w:t>
+        </w:r>
+      </w:fldSimple>
+      <w:r>
+        <w:t xml:space="preserve">, which beats the base on LiveCodeBench, SWE-bench Verified and Terminal-Bench (87.3, 88.8 and 67.0 against 84.0, 86.0 and 58.4 </w:t>
       </w:r>
       <w:fldSimple w:instr=" REF _RefAnneal27 \r \h ">
         <w:r>
@@ -2335,21 +2343,21 @@
       <w:r>
         <w:t xml:space="preserve">, </w:t>
       </w:r>
-      <w:fldSimple w:instr=" REF _RefAnneal2 \r \h ">
+      <w:fldSimple w:instr=" REF _RefAnneal28 \r \h ">
         <w:r>
-          <w:t xml:space="preserve">[2]</w:t>
+          <w:t xml:space="preserve">[28]</w:t>
         </w:r>
       </w:fldSimple>
       <w:r>
-        <w:t xml:space="preserve">): 85% Tachibana4 code traces </w:t>
-      </w:r>
-      <w:fldSimple w:instr=" REF _RefAnneal20 \r \h ">
+        <w:t xml:space="preserve">, </w:t>
+      </w:r>
+      <w:fldSimple w:instr=" REF _RefAnneal29 \r \h ">
         <w:r>
-          <w:t xml:space="preserve">[20]</w:t>
+          <w:t xml:space="preserve">[29]</w:t>
         </w:r>
       </w:fldSimple>
       <w:r>
-        <w:t xml:space="preserve">, 5% a second V4-Pro code set </w:t>
+        <w:t xml:space="preserve">). The other 45% are DeepSeek-V4-Pro coding answers without Python </w:t>
       </w:r>
       <w:fldSimple w:instr=" REF _RefAnneal21 \r \h ">
         <w:r>
@@ -2357,7 +2365,7 @@
         </w:r>
       </w:fldSimple>
       <w:r>
-        <w:t xml:space="preserve"> and 10% AoPS maths </w:t>
+        <w:t xml:space="preserve">, </w:t>
       </w:r>
       <w:fldSimple w:instr=" REF _RefAnneal22 \r \h ">
         <w:r>
@@ -2365,7 +2373,15 @@
         </w:r>
       </w:fldSimple>
       <w:r>
-        <w:t xml:space="preserve">. A public agent-session set was dropped: 96% of its steps redact tool calls. </w:t>
+        <w:t xml:space="preserve">, from a teacher ahead only on LiveCodeBench (87.5). Python rows and maths </w:t>
+      </w:r>
+      <w:fldSimple w:instr=" REF _RefAnneal30 \r \h ">
+        <w:r>
+          <w:t xml:space="preserve">[30]</w:t>
+        </w:r>
+      </w:fldSimple>
+      <w:r>
+        <w:t xml:space="preserve"> wait until these run out. </w:t>
       </w:r>
       <w:r>
         <w:rPr>
@@ -2385,39 +2401,7 @@
         <w:t xml:space="preserve">&lt;think&gt;</w:t>
       </w:r>
       <w:r>
-        <w:t xml:space="preserve"> trace, drops rows over 8,192 tokens and removes near-duplicates of evaluation prompts (13-gram or Jaccard overlap). An embedding search on the otherwise idle NPU also flags reworded copies, which n-gram checks miss </w:t>
-      </w:r>
-      <w:fldSimple w:instr=" REF _RefAnneal28 \r \h ">
-        <w:r>
-          <w:t xml:space="preserve">[28]</w:t>
-        </w:r>
-      </w:fldSimple>
-      <w:r>
-        <w:t xml:space="preserve">; it flagged 33 of 15,276 loop rows without measurably slowing training.</w:t>
-      </w:r>
-    </w:p>
-    <w:p>
-      <w:pPr>
-        <w:pStyle w:val="BodyText"/>
-      </w:pPr>
-      <w:r>
-        <w:t xml:space="preserve">The first run, round 0, is a comparison run using the model's own rows: 500 base-model answers to OpenCodeInstruct </w:t>
-      </w:r>
-      <w:fldSimple w:instr=" REF _RefAnneal29 \r \h ">
-        <w:r>
-          <w:t xml:space="preserve">[29]</w:t>
-        </w:r>
-      </w:fldSimple>
-      <w:r>
-        <w:t xml:space="preserve"> prompts that passed their tests, as in ReST-EM </w:t>
-      </w:r>
-      <w:fldSimple w:instr=" REF _RefAnneal30 \r \h ">
-        <w:r>
-          <w:t xml:space="preserve">[30]</w:t>
-        </w:r>
-      </w:fldSimple>
-      <w:r>
-        <w:t xml:space="preserve">, plus 1,500 OpenCodeReasoning rows, whose DeepSeek-R1 teacher scores only 63.5 on LiveCodeBench </w:t>
+        <w:t xml:space="preserve"> trace, drops over-length rows and removes near-duplicates of evaluation prompts (13-gram or Jaccard overlap). An embedding search on the otherwise idle NPU also flags reworded copies, which n-gram checks miss </w:t>
       </w:r>
       <w:fldSimple w:instr=" REF _RefAnneal31 \r \h ">
         <w:r>
@@ -2425,23 +2409,15 @@
         </w:r>
       </w:fldSimple>
       <w:r>
-        <w:t xml:space="preserve">. The base model passed 54% of attempts, but traces hitting the 6,144-token budget (16% of attempts) were rejected, so kept traces are short (median 436 tokens). Model-written code runs in a Windows AppContainer sandbox without network, file or administrator access, which passed 264 escape checks; 97.5% of reference solutions pass inside it.</w:t>
-      </w:r>
-    </w:p>
-    <w:p>
-      <w:pPr>
-        <w:pStyle w:val="Heading2"/>
-      </w:pPr>
-      <w:r>
-        <w:t xml:space="preserve">Training</w:t>
-      </w:r>
-    </w:p>
-    <w:p>
-      <w:pPr>
-        <w:pStyle w:val="BodyFirst"/>
-      </w:pPr>
-      <w:r>
-        <w:t xml:space="preserve">Training runs as an unattended keep-if-better loop. Round 1 starts from the base model, never the first-run adapter; each later round continues the best adapter on 1,000 new public rows plus 25% replayed from its earlier rows, re-warming and decaying the learning rate, which in continual pre-training matched retraining on all data </w:t>
+        <w:t xml:space="preserve">; in the first pools it flagged 33 of 15,276 rows without measurably slowing training.</w:t>
+      </w:r>
+    </w:p>
+    <w:p>
+      <w:pPr>
+        <w:pStyle w:val="BodyText"/>
+      </w:pPr>
+      <w:r>
+        <w:t xml:space="preserve">The first run, round 0, is a comparison run using the model's own rows: 500 base-model answers to OpenCodeInstruct </w:t>
       </w:r>
       <w:fldSimple w:instr=" REF _RefAnneal32 \r \h ">
         <w:r>
@@ -2449,7 +2425,7 @@
         </w:r>
       </w:fldSimple>
       <w:r>
-        <w:t xml:space="preserve">. Each round is scored on a held-out gate, never trained on or reported: 195 decontaminated CodeContests </w:t>
+        <w:t xml:space="preserve"> prompts that passed their tests, as in ReST-EM </w:t>
       </w:r>
       <w:fldSimple w:instr=" REF _RefAnneal33 \r \h ">
         <w:r>
@@ -2457,7 +2433,7 @@
         </w:r>
       </w:fldSimple>
       <w:r>
-        <w:t xml:space="preserve"> validation and test problems with a passing reference, plus 300 OpenCodeInstruct problems. A round is kept only if a one-sided exact sign test against the best adapter gives p ≤ 0.05, its CodeContests part drops at most 5 points, 100 MMLU-Pro </w:t>
+        <w:t xml:space="preserve">, plus 1,500 OpenCodeReasoning rows, whose DeepSeek-R1 teacher scores only 63.5 on LiveCodeBench </w:t>
       </w:r>
       <w:fldSimple w:instr=" REF _RefAnneal34 \r \h ">
         <w:r>
@@ -2465,7 +2441,47 @@
         </w:r>
       </w:fldSimple>
       <w:r>
-        <w:t xml:space="preserve"> questions outside computing stay within 5 points of the base, and sample answers are clean. A kept adapter is re-scored with a fresh seed that becomes the new reference. A rejected round's adapter is deleted, its scores kept and its rows rolled into the next attempt, up to 3,000 new rows, because a real 2-point gain passes the gate only 24 to 44% of the time (power calculation). When fresh rows run out, a two-pass round runs before the loop waits for new sets. EvalPlus, scored only on kept adapters, never selects them.</w:t>
+        <w:t xml:space="preserve">. Traces hitting the 6,144-token budget were rejected, so kept traces are short (median 436 tokens). Model-written code runs in a Windows AppContainer sandbox without network, file or administrator access, which passed 264 escape checks.</w:t>
+      </w:r>
+    </w:p>
+    <w:p>
+      <w:pPr>
+        <w:pStyle w:val="Heading2"/>
+      </w:pPr>
+      <w:r>
+        <w:t xml:space="preserve">Training</w:t>
+      </w:r>
+    </w:p>
+    <w:p>
+      <w:pPr>
+        <w:pStyle w:val="BodyFirst"/>
+      </w:pPr>
+      <w:r>
+        <w:t xml:space="preserve">Training runs as an unattended keep-if-better loop. Round 1 starts from the base model, never the first-run adapter; each later round continues the best adapter on 1,000 new rows plus 25% replayed from earlier rows, re-warming and decaying the learning rate, which in continual pre-training matched retraining on all data </w:t>
+      </w:r>
+      <w:fldSimple w:instr=" REF _RefAnneal35 \r \h ">
+        <w:r>
+          <w:t xml:space="preserve">[35]</w:t>
+        </w:r>
+      </w:fldSimple>
+      <w:r>
+        <w:t xml:space="preserve">. Each round is scored on a held-out gate, never trained on or reported: 195 decontaminated CodeContests </w:t>
+      </w:r>
+      <w:fldSimple w:instr=" REF _RefAnneal36 \r \h ">
+        <w:r>
+          <w:t xml:space="preserve">[36]</w:t>
+        </w:r>
+      </w:fldSimple>
+      <w:r>
+        <w:t xml:space="preserve"> problems and 300 OpenCodeInstruct problems, being rebuilt around other languages and wider software work (bug fixes, review, tests, tool use) so that a Python-only gain is not kept. A round is kept only if a one-sided exact sign test against the best adapter gives p ≤ 0.05, 100 MMLU-Pro </w:t>
+      </w:r>
+      <w:fldSimple w:instr=" REF _RefAnneal37 \r \h ">
+        <w:r>
+          <w:t xml:space="preserve">[37]</w:t>
+        </w:r>
+      </w:fldSimple>
+      <w:r>
+        <w:t xml:space="preserve"> questions outside computing stay within 5 points of the base, and sample answers are clean; a fresh-seed re-score then becomes the new reference. A rejected round's rows roll into the next attempt, up to 3,000 new rows, because a real 2-point gain passes the gate only 24 to 44% of the time (power calculation). EvalPlus, scored only on kept adapters, never selects them.</w:t>
       </w:r>
     </w:p>
     <w:p>
@@ -2482,9 +2498,9 @@
       <w:r>
         <w:t xml:space="preserve"> uses a warmup-stable-decay schedule </w:t>
       </w:r>
-      <w:fldSimple w:instr=" REF _RefAnneal35 \r \h ">
+      <w:fldSimple w:instr=" REF _RefAnneal38 \r \h ">
         <w:r>
-          <w:t xml:space="preserve">[35]</w:t>
+          <w:t xml:space="preserve">[38]</w:t>
         </w:r>
       </w:fldSimple>
       <w:r>
@@ -3087,7 +3103,7 @@
         <w:pStyle w:val="BodyFirst"/>
       </w:pPr>
       <w:r>
-        <w:t xml:space="preserve">The measurement-first design has paid off: the parity test caught a wrong fix before any real run used it. Speed and memory were measured only at rank 16, and the first run's scores will be the first evidence that training helps. The Windows workarounds (a bundled C compiler, the convolution rewrite, disabled Vulkan kernels) could break on an update, so versions are pinned. With 20 to 50 personal tasks, confidence intervals will be wide. Only 4,561 of Tachibana4's 17,234 rows pass the filters at 8,192 tokens, enough for about five rounds until 16,384-token training is measured.</w:t>
+        <w:t xml:space="preserve">The measurement-first design has paid off: the parity test caught a wrong fix before any real run used it. Speed and memory were measured only at rank 16. The Windows workarounds (a bundled C compiler, the convolution rewrite, disabled Vulkan kernels) could break on an update, so versions are pinned. With 20 to 50 personal tasks, confidence intervals will be wide. HumanEval+ and MBPP+ are Python-only, while the loop now trains mostly on other languages, so EvalPlus may understate gains that the rebuilt gate measures.</w:t>
       </w:r>
     </w:p>
     <w:p>
@@ -3612,9 +3628,9 @@
       <w:r>
         <w:t xml:space="preserve"> Published results suggest small, flattening gains: supervised fine-tuning gains are log-linear in data and smaller for stronger models </w:t>
       </w:r>
-      <w:fldSimple w:instr=" REF _RefAnneal36 \r \h ">
+      <w:fldSimple w:instr=" REF _RefAnneal39 \r \h ">
         <w:r>
-          <w:t xml:space="preserve">[36]</w:t>
+          <w:t xml:space="preserve">[39]</w:t>
         </w:r>
       </w:fldSimple>
       <w:r>
@@ -3626,7 +3642,7 @@
         </w:r>
       </w:fldSimple>
       <w:r>
-        <w:t xml:space="preserve">. Round 0, three-quarters from a weaker teacher, may show no clear gain, and many rounds may be rejected; a flat curve is a result, not a failure, and shows how much data is worth the machine time.</w:t>
+        <w:t xml:space="preserve">. Round 0, three-quarters from a weaker teacher, may show no clear gain, and many rounds may be rejected; a flat curve is still a result.</w:t>
       </w:r>
     </w:p>
     <w:p>
@@ -3794,7 +3810,7 @@
               <w:rPr>
                 <w:sz w:val="20"/>
               </w:rPr>
-              <w:t xml:space="preserve">Round 0 (500 own and 1,500 OpenCodeReasoning rows) trained and scored against the base. Build the gate; start the loop.</w:t>
+              <w:t xml:space="preserve">Round 0 (500 own and 1,500 OpenCodeReasoning rows) trained and scored against the base. Test longer rows; rebuild the gate; start the loop.</w:t>
             </w:r>
           </w:p>
         </w:tc>
@@ -5273,12 +5289,43 @@
       </w:pPr>
       <w:bookmarkStart w:id="920" w:name="_RefAnneal20"/>
       <w:r>
+        <w:t xml:space="preserve">NVIDIA, "Open-SWE-Traces," Hugging Face dataset card, 2026. </w:t>
+      </w:r>
+      <w:r>
+        <w:t xml:space="preserve">[Online]. Available: </w:t>
+      </w:r>
+      <w:hyperlink r:id="rId41">
+        <w:r>
+          <w:rPr>
+            <w:color w:val="0563C1"/>
+            <w:u w:val="single"/>
+          </w:rPr>
+          <w:t xml:space="preserve">https://huggingface.co/datasets/nvidia/Open-SWE-Traces</w:t>
+        </w:r>
+      </w:hyperlink>
+      <w:r>
+        <w:t xml:space="preserve"> (accessed Oct. 21, 2026).</w:t>
+      </w:r>
+      <w:bookmarkEnd w:id="920"/>
+    </w:p>
+    <w:p>
+      <w:pPr>
+        <w:pStyle w:val="Reference"/>
+        <w:tabs>
+          <w:tab w:val="clear" w:pos="426"/>
+          <w:tab w:val="num" w:pos="567"/>
+        </w:tabs>
+        <w:ind w:left="567" w:hanging="567"/>
+        <w:jc w:val="left"/>
+      </w:pPr>
+      <w:bookmarkStart w:id="921" w:name="_RefAnneal21"/>
+      <w:r>
         <w:t xml:space="preserve">sequelbox, "Tachibana4-DeepSeek-V4-Pro," Hugging Face dataset card, 2026. </w:t>
       </w:r>
       <w:r>
         <w:t xml:space="preserve">[Online]. Available: </w:t>
       </w:r>
-      <w:hyperlink r:id="rId41">
+      <w:hyperlink r:id="rId42">
         <w:r>
           <w:rPr>
             <w:color w:val="0563C1"/>
@@ -5290,7 +5337,7 @@
       <w:r>
         <w:t xml:space="preserve"> (accessed Oct. 17, 2026).</w:t>
       </w:r>
-      <w:bookmarkEnd w:id="920"/>
+      <w:bookmarkEnd w:id="921"/>
     </w:p>
     <w:p>
       <w:pPr>
@@ -5302,51 +5349,20 @@
         <w:ind w:left="567" w:hanging="567"/>
         <w:jc w:val="left"/>
       </w:pPr>
-      <w:bookmarkStart w:id="921" w:name="_RefAnneal21"/>
+      <w:bookmarkStart w:id="922" w:name="_RefAnneal22"/>
       <w:r>
         <w:t xml:space="preserve">Banaxi-Tech, "Deepseek-V4-Reasoning-Code-2500," Hugging Face dataset card, 2026. </w:t>
       </w:r>
       <w:r>
         <w:t xml:space="preserve">[Online]. Available: </w:t>
       </w:r>
-      <w:hyperlink r:id="rId42">
+      <w:hyperlink r:id="rId43">
         <w:r>
           <w:rPr>
             <w:color w:val="0563C1"/>
             <w:u w:val="single"/>
           </w:rPr>
           <w:t xml:space="preserve">https://huggingface.co/datasets/Banaxi-Tech/Deepseek-V4-Reasoning-Code-2500</w:t>
-        </w:r>
-      </w:hyperlink>
-      <w:r>
-        <w:t xml:space="preserve"> (accessed Oct. 17, 2026).</w:t>
-      </w:r>
-      <w:bookmarkEnd w:id="921"/>
-    </w:p>
-    <w:p>
-      <w:pPr>
-        <w:pStyle w:val="Reference"/>
-        <w:tabs>
-          <w:tab w:val="clear" w:pos="426"/>
-          <w:tab w:val="num" w:pos="567"/>
-        </w:tabs>
-        <w:ind w:left="567" w:hanging="567"/>
-        <w:jc w:val="left"/>
-      </w:pPr>
-      <w:bookmarkStart w:id="922" w:name="_RefAnneal22"/>
-      <w:r>
-        <w:t xml:space="preserve">NVIDIA, "Nemotron-SFT-Math-v4," Hugging Face dataset card, 2026. </w:t>
-      </w:r>
-      <w:r>
-        <w:t xml:space="preserve">[Online]. Available: </w:t>
-      </w:r>
-      <w:hyperlink r:id="rId43">
-        <w:r>
-          <w:rPr>
-            <w:color w:val="0563C1"/>
-            <w:u w:val="single"/>
-          </w:rPr>
-          <w:t xml:space="preserve">https://huggingface.co/datasets/nvidia/Nemotron-SFT-Math-v4</w:t>
         </w:r>
       </w:hyperlink>
       <w:r>
@@ -5517,7 +5533,7 @@
       </w:pPr>
       <w:bookmarkStart w:id="927" w:name="_RefAnneal27"/>
       <w:r>
-        <w:t xml:space="preserve">DeepSeek-AI, "DeepSeek-V4-Pro," Hugging Face model card, 2026. </w:t>
+        <w:t xml:space="preserve">Vals AI, "LiveCodeBench leaderboard," 2026. </w:t>
       </w:r>
       <w:r>
         <w:t xml:space="preserve">[Online]. Available: </w:t>
@@ -5528,11 +5544,11 @@
             <w:color w:val="0563C1"/>
             <w:u w:val="single"/>
           </w:rPr>
-          <w:t xml:space="preserve">https://huggingface.co/deepseek-ai/DeepSeek-V4-Pro</w:t>
+          <w:t xml:space="preserve">https://www.vals.ai/benchmarks/lcb</w:t>
         </w:r>
       </w:hyperlink>
       <w:r>
-        <w:t xml:space="preserve"> (accessed Oct. 17, 2026).</w:t>
+        <w:t xml:space="preserve"> (accessed Oct. 21, 2026).</w:t>
       </w:r>
       <w:bookmarkEnd w:id="927"/>
     </w:p>
@@ -5548,12 +5564,105 @@
       </w:pPr>
       <w:bookmarkStart w:id="928" w:name="_RefAnneal28"/>
       <w:r>
+        <w:t xml:space="preserve">Vals AI, "SWE-bench Verified leaderboard," 2026. </w:t>
+      </w:r>
+      <w:r>
+        <w:t xml:space="preserve">[Online]. Available: </w:t>
+      </w:r>
+      <w:hyperlink r:id="rId49">
+        <w:r>
+          <w:rPr>
+            <w:color w:val="0563C1"/>
+            <w:u w:val="single"/>
+          </w:rPr>
+          <w:t xml:space="preserve">https://www.vals.ai/benchmarks/swebench</w:t>
+        </w:r>
+      </w:hyperlink>
+      <w:r>
+        <w:t xml:space="preserve"> (accessed Oct. 21, 2026).</w:t>
+      </w:r>
+      <w:bookmarkEnd w:id="928"/>
+    </w:p>
+    <w:p>
+      <w:pPr>
+        <w:pStyle w:val="Reference"/>
+        <w:tabs>
+          <w:tab w:val="clear" w:pos="426"/>
+          <w:tab w:val="num" w:pos="567"/>
+        </w:tabs>
+        <w:ind w:left="567" w:hanging="567"/>
+        <w:jc w:val="left"/>
+      </w:pPr>
+      <w:bookmarkStart w:id="929" w:name="_RefAnneal29"/>
+      <w:r>
+        <w:t xml:space="preserve">Vals AI, "Terminal-Bench 2.1 leaderboard," 2026. </w:t>
+      </w:r>
+      <w:r>
+        <w:t xml:space="preserve">[Online]. Available: </w:t>
+      </w:r>
+      <w:hyperlink r:id="rId50">
+        <w:r>
+          <w:rPr>
+            <w:color w:val="0563C1"/>
+            <w:u w:val="single"/>
+          </w:rPr>
+          <w:t xml:space="preserve">https://www.vals.ai/benchmarks/terminal-bench-2-1</w:t>
+        </w:r>
+      </w:hyperlink>
+      <w:r>
+        <w:t xml:space="preserve"> (accessed Oct. 21, 2026).</w:t>
+      </w:r>
+      <w:bookmarkEnd w:id="929"/>
+    </w:p>
+    <w:p>
+      <w:pPr>
+        <w:pStyle w:val="Reference"/>
+        <w:tabs>
+          <w:tab w:val="clear" w:pos="426"/>
+          <w:tab w:val="num" w:pos="567"/>
+        </w:tabs>
+        <w:ind w:left="567" w:hanging="567"/>
+        <w:jc w:val="left"/>
+      </w:pPr>
+      <w:bookmarkStart w:id="930" w:name="_RefAnneal30"/>
+      <w:r>
+        <w:t xml:space="preserve">NVIDIA, "Nemotron-SFT-Math-v4," Hugging Face dataset card, 2026. </w:t>
+      </w:r>
+      <w:r>
+        <w:t xml:space="preserve">[Online]. Available: </w:t>
+      </w:r>
+      <w:hyperlink r:id="rId51">
+        <w:r>
+          <w:rPr>
+            <w:color w:val="0563C1"/>
+            <w:u w:val="single"/>
+          </w:rPr>
+          <w:t xml:space="preserve">https://huggingface.co/datasets/nvidia/Nemotron-SFT-Math-v4</w:t>
+        </w:r>
+      </w:hyperlink>
+      <w:r>
+        <w:t xml:space="preserve"> (accessed Oct. 17, 2026).</w:t>
+      </w:r>
+      <w:bookmarkEnd w:id="930"/>
+    </w:p>
+    <w:p>
+      <w:pPr>
+        <w:pStyle w:val="Reference"/>
+        <w:tabs>
+          <w:tab w:val="clear" w:pos="426"/>
+          <w:tab w:val="num" w:pos="567"/>
+        </w:tabs>
+        <w:ind w:left="567" w:hanging="567"/>
+        <w:jc w:val="left"/>
+      </w:pPr>
+      <w:bookmarkStart w:id="931" w:name="_RefAnneal31"/>
+      <w:r>
         <w:t xml:space="preserve">S. Yang, W.-L. Chiang, L. Zheng, J. E. Gonzalez, and I. Stoica, "Rethinking benchmark and contamination for language models with rephrased samples," arXiv preprint arXiv:2311.04850, 2023. </w:t>
       </w:r>
       <w:r>
         <w:t xml:space="preserve">[Online]. Available: </w:t>
       </w:r>
-      <w:hyperlink r:id="rId49">
+      <w:hyperlink r:id="rId52">
         <w:r>
           <w:rPr>
             <w:color w:val="0563C1"/>
@@ -5562,7 +5671,7 @@
           <w:t xml:space="preserve">https://arxiv.org/abs/2311.04850</w:t>
         </w:r>
       </w:hyperlink>
-      <w:bookmarkEnd w:id="928"/>
+      <w:bookmarkEnd w:id="931"/>
     </w:p>
     <w:p>
       <w:pPr>
@@ -5574,7 +5683,7 @@
         <w:ind w:left="567" w:hanging="567"/>
         <w:jc w:val="left"/>
       </w:pPr>
-      <w:bookmarkStart w:id="929" w:name="_RefAnneal29"/>
+      <w:bookmarkStart w:id="932" w:name="_RefAnneal32"/>
       <w:r>
         <w:t xml:space="preserve">W. U. Ahmad </w:t>
       </w:r>
@@ -5590,7 +5699,7 @@
       <w:r>
         <w:t xml:space="preserve">[Online]. Available: </w:t>
       </w:r>
-      <w:hyperlink r:id="rId50">
+      <w:hyperlink r:id="rId53">
         <w:r>
           <w:rPr>
             <w:color w:val="0563C1"/>
@@ -5599,7 +5708,7 @@
           <w:t xml:space="preserve">https://arxiv.org/abs/2504.04030</w:t>
         </w:r>
       </w:hyperlink>
-      <w:bookmarkEnd w:id="929"/>
+      <w:bookmarkEnd w:id="932"/>
     </w:p>
     <w:p>
       <w:pPr>
@@ -5611,7 +5720,7 @@
         <w:ind w:left="567" w:hanging="567"/>
         <w:jc w:val="left"/>
       </w:pPr>
-      <w:bookmarkStart w:id="930" w:name="_RefAnneal30"/>
+      <w:bookmarkStart w:id="933" w:name="_RefAnneal33"/>
       <w:r>
         <w:t xml:space="preserve">A. Singh </w:t>
       </w:r>
@@ -5627,7 +5736,7 @@
       <w:r>
         <w:t xml:space="preserve">[Online]. Available: </w:t>
       </w:r>
-      <w:hyperlink r:id="rId51">
+      <w:hyperlink r:id="rId54">
         <w:r>
           <w:rPr>
             <w:color w:val="0563C1"/>
@@ -5636,7 +5745,7 @@
           <w:t xml:space="preserve">https://arxiv.org/abs/2312.06585</w:t>
         </w:r>
       </w:hyperlink>
-      <w:bookmarkEnd w:id="930"/>
+      <w:bookmarkEnd w:id="933"/>
     </w:p>
     <w:p>
       <w:pPr>
@@ -5648,14 +5757,14 @@
         <w:ind w:left="567" w:hanging="567"/>
         <w:jc w:val="left"/>
       </w:pPr>
-      <w:bookmarkStart w:id="931" w:name="_RefAnneal31"/>
+      <w:bookmarkStart w:id="934" w:name="_RefAnneal34"/>
       <w:r>
         <w:t xml:space="preserve">DeepSeek-AI, "DeepSeek-R1-0528," Hugging Face model card, 2025. </w:t>
       </w:r>
       <w:r>
         <w:t xml:space="preserve">[Online]. Available: </w:t>
       </w:r>
-      <w:hyperlink r:id="rId52">
+      <w:hyperlink r:id="rId55">
         <w:r>
           <w:rPr>
             <w:color w:val="0563C1"/>
@@ -5667,7 +5776,7 @@
       <w:r>
         <w:t xml:space="preserve"> (accessed Oct. 17, 2026).</w:t>
       </w:r>
-      <w:bookmarkEnd w:id="931"/>
+      <w:bookmarkEnd w:id="934"/>
     </w:p>
     <w:p>
       <w:pPr>
@@ -5679,7 +5788,7 @@
         <w:ind w:left="567" w:hanging="567"/>
         <w:jc w:val="left"/>
       </w:pPr>
-      <w:bookmarkStart w:id="932" w:name="_RefAnneal32"/>
+      <w:bookmarkStart w:id="935" w:name="_RefAnneal35"/>
       <w:r>
         <w:t xml:space="preserve">A. Ibrahim </w:t>
       </w:r>
@@ -5704,7 +5813,7 @@
       <w:r>
         <w:t xml:space="preserve">[Online]. Available: </w:t>
       </w:r>
-      <w:hyperlink r:id="rId53">
+      <w:hyperlink r:id="rId56">
         <w:r>
           <w:rPr>
             <w:color w:val="0563C1"/>
@@ -5713,7 +5822,7 @@
           <w:t xml:space="preserve">https://arxiv.org/abs/2403.08763</w:t>
         </w:r>
       </w:hyperlink>
-      <w:bookmarkEnd w:id="932"/>
+      <w:bookmarkEnd w:id="935"/>
     </w:p>
     <w:p>
       <w:pPr>
@@ -5725,7 +5834,7 @@
         <w:ind w:left="567" w:hanging="567"/>
         <w:jc w:val="left"/>
       </w:pPr>
-      <w:bookmarkStart w:id="933" w:name="_RefAnneal33"/>
+      <w:bookmarkStart w:id="936" w:name="_RefAnneal36"/>
       <w:r>
         <w:t xml:space="preserve">Y. Li </w:t>
       </w:r>
@@ -5750,7 +5859,7 @@
       <w:r>
         <w:t xml:space="preserve">[Online]. Available: </w:t>
       </w:r>
-      <w:hyperlink r:id="rId54">
+      <w:hyperlink r:id="rId57">
         <w:r>
           <w:rPr>
             <w:color w:val="0563C1"/>
@@ -5759,7 +5868,7 @@
           <w:t xml:space="preserve">https://arxiv.org/abs/2203.07814</w:t>
         </w:r>
       </w:hyperlink>
-      <w:bookmarkEnd w:id="933"/>
+      <w:bookmarkEnd w:id="936"/>
     </w:p>
     <w:p>
       <w:pPr>
@@ -5771,7 +5880,7 @@
         <w:ind w:left="567" w:hanging="567"/>
         <w:jc w:val="left"/>
       </w:pPr>
-      <w:bookmarkStart w:id="934" w:name="_RefAnneal34"/>
+      <w:bookmarkStart w:id="937" w:name="_RefAnneal37"/>
       <w:r>
         <w:t xml:space="preserve">Y. Wang </w:t>
       </w:r>
@@ -5796,7 +5905,7 @@
       <w:r>
         <w:t xml:space="preserve">[Online]. Available: </w:t>
       </w:r>
-      <w:hyperlink r:id="rId55">
+      <w:hyperlink r:id="rId58">
         <w:r>
           <w:rPr>
             <w:color w:val="0563C1"/>
@@ -5805,7 +5914,7 @@
           <w:t xml:space="preserve">https://arxiv.org/abs/2406.01574</w:t>
         </w:r>
       </w:hyperlink>
-      <w:bookmarkEnd w:id="934"/>
+      <w:bookmarkEnd w:id="937"/>
     </w:p>
     <w:p>
       <w:pPr>
@@ -5817,14 +5926,14 @@
         <w:ind w:left="567" w:hanging="567"/>
         <w:jc w:val="left"/>
       </w:pPr>
-      <w:bookmarkStart w:id="935" w:name="_RefAnneal35"/>
+      <w:bookmarkStart w:id="938" w:name="_RefAnneal38"/>
       <w:r>
         <w:t xml:space="preserve">A. Hägele, E. Bakouch, A. Kosson, L. Ben Allal, L. Von Werra, and M. Jaggi, "Scaling laws and compute-optimal training beyond fixed training durations," arXiv preprint arXiv:2405.18392, 2024. </w:t>
       </w:r>
       <w:r>
         <w:t xml:space="preserve">[Online]. Available: </w:t>
       </w:r>
-      <w:hyperlink r:id="rId56">
+      <w:hyperlink r:id="rId59">
         <w:r>
           <w:rPr>
             <w:color w:val="0563C1"/>
@@ -5833,7 +5942,7 @@
           <w:t xml:space="preserve">https://arxiv.org/abs/2405.18392</w:t>
         </w:r>
       </w:hyperlink>
-      <w:bookmarkEnd w:id="935"/>
+      <w:bookmarkEnd w:id="938"/>
     </w:p>
     <w:p>
       <w:pPr>
@@ -5845,7 +5954,7 @@
         <w:ind w:left="567" w:hanging="567"/>
         <w:jc w:val="left"/>
       </w:pPr>
-      <w:bookmarkStart w:id="936" w:name="_RefAnneal36"/>
+      <w:bookmarkStart w:id="939" w:name="_RefAnneal39"/>
       <w:r>
         <w:t xml:space="preserve">Z. Yuan </w:t>
       </w:r>
@@ -5861,7 +5970,7 @@
       <w:r>
         <w:t xml:space="preserve">[Online]. Available: </w:t>
       </w:r>
-      <w:hyperlink r:id="rId57">
+      <w:hyperlink r:id="rId60">
         <w:r>
           <w:rPr>
             <w:color w:val="0563C1"/>
@@ -5870,7 +5979,7 @@
           <w:t xml:space="preserve">https://arxiv.org/abs/2308.01825</w:t>
         </w:r>
       </w:hyperlink>
-      <w:bookmarkEnd w:id="936"/>
+      <w:bookmarkEnd w:id="939"/>
     </w:p>
     <w:sectPr>
       <w:footerReference w:type="default" r:id="rId18"/>

</xml_diff>

<commit_message>
Outline: first-run result, six-language gate and GLM-5.3 share
Base 86.2% vs adapter 85.4% over all 542 EvalPlus problems (p = 0.57, no significant change) while held-out loss fell 0.593 to 0.498. The gate section describes the six-language test with the bug-fix loss rule; the mix is 45% Open-SWE, 30% GLM-5.3 terminal, 20% Tachibana4, 5% Banaxi. A pass takes 10 to 12 hours. Ablation A4 (OpenCodeReasoning alone) is dropped under the no-subpar rule and the listing is cut. 3,979 words.
</commit_message>
<xml_diff>
--- a/dissertation/Anneal_Dissertation_Outline.docx
+++ b/dissertation/Anneal_Dissertation_Outline.docx
@@ -490,7 +490,7 @@
         <w:tab/>
       </w:r>
       <w:r>
-        <w:t xml:space="preserve">Measure how coding gain and retention change as loop rounds add public data, and the effect of rank, target modules, example length, data source and base precision through ablations.</w:t>
+        <w:t xml:space="preserve">Measure how coding gain and retention change as loop rounds add public data, and the effect of rank, target modules, example length and base precision through ablations.</w:t>
       </w:r>
     </w:p>
     <w:p>
@@ -624,7 +624,7 @@
         </w:r>
       </w:fldSimple>
       <w:r>
-        <w:t xml:space="preserve">, and ablation A6 trains one 8-bit adapter to measure the remaining cost.</w:t>
+        <w:t xml:space="preserve">, and ablation A5 trains one 8-bit adapter to measure the remaining cost.</w:t>
       </w:r>
     </w:p>
     <w:p>
@@ -680,7 +680,7 @@
         </w:r>
       </w:fldSimple>
       <w:r>
-        <w:t xml:space="preserve"> extend context windows using shifted sparse attention to cut training cost. They show that plain LoRA is not enough for extension: on Llama 2 7B at 32k tokens it reached a perplexity of 11.44 against 8.08 for full fine-tuning, while LoRA with trainable embedding and normalisation layers reached 8.12. Their largest run used eight A100 GPUs. Anneal preserves an existing 256k window rather than extending one, and shifted sparse attention assumes standard attention in every layer, whereas three in four Qwen3.8 layers use DeltaNet, so the method does not transfer. Two lessons do: adapters can affect long-range behaviour in non-obvious ways, so retention must be tested, and if it fails, long examples or trainable normalisation layers are evidence-based remedies (ablation A5).</w:t>
+        <w:t xml:space="preserve"> extend context windows using shifted sparse attention to cut training cost. They show that plain LoRA is not enough for extension: on Llama 2 7B at 32k tokens it reached a perplexity of 11.44 against 8.08 for full fine-tuning, while LoRA with trainable embedding and normalisation layers reached 8.12. Their largest run used eight A100 GPUs. Anneal preserves an existing 256k window rather than extending one, and shifted sparse attention assumes standard attention in every layer, whereas three in four Qwen3.8 layers use DeltaNet, so the method does not transfer. Two lessons do: adapters can affect long-range behaviour in non-obvious ways, so retention must be tested, and if it fails, long examples or trainable normalisation layers are evidence-based remedies (ablation A4).</w:t>
       </w:r>
     </w:p>
     <w:p>
@@ -1295,7 +1295,7 @@
               <w:rPr>
                 <w:sz w:val="20"/>
               </w:rPr>
-              <w:t xml:space="preserve">Test-passed DeepSeek V4-Flash bug-fix runs </w:t>
+              <w:t xml:space="preserve">Test-passed DeepSeek V4-Flash bug-fix and GLM-5.3 terminal runs </w:t>
             </w:r>
             <w:fldSimple w:instr=" REF _RefAnneal20 \r \h ">
               <w:r>
@@ -1309,7 +1309,7 @@
               <w:rPr>
                 <w:sz w:val="20"/>
               </w:rPr>
-              <w:t xml:space="preserve"> (CC-BY-4.0) and V4-Pro coding answers </w:t>
+              <w:t xml:space="preserve">, </w:t>
             </w:r>
             <w:fldSimple w:instr=" REF _RefAnneal21 \r \h ">
               <w:r>
@@ -1323,7 +1323,7 @@
               <w:rPr>
                 <w:sz w:val="20"/>
               </w:rPr>
-              <w:t xml:space="preserve">, </w:t>
+              <w:t xml:space="preserve"> (CC-BY-4.0) and V4-Pro coding answers </w:t>
             </w:r>
             <w:fldSimple w:instr=" REF _RefAnneal22 \r \h ">
               <w:r>
@@ -1337,7 +1337,7 @@
               <w:rPr>
                 <w:sz w:val="20"/>
               </w:rPr>
-              <w:t xml:space="preserve"> (Apache-2.0), other languages before Python. Own and OpenCodeReasoning </w:t>
+              <w:t xml:space="preserve">, </w:t>
             </w:r>
             <w:fldSimple w:instr=" REF _RefAnneal23 \r \h ">
               <w:r>
@@ -1351,7 +1351,7 @@
               <w:rPr>
                 <w:sz w:val="20"/>
               </w:rPr>
-              <w:t xml:space="preserve"> traces only in the first run; human-written sets lack traces; agent-session sets </w:t>
+              <w:t xml:space="preserve"> (Apache-2.0), other languages before Python. Own and OpenCodeReasoning </w:t>
             </w:r>
             <w:fldSimple w:instr=" REF _RefAnneal24 \r \h ">
               <w:r>
@@ -1365,7 +1365,7 @@
               <w:rPr>
                 <w:sz w:val="20"/>
               </w:rPr>
-              <w:t xml:space="preserve"> lack raw reasoning; API-generated rows are not public; SWE-Gym </w:t>
+              <w:t xml:space="preserve"> traces only in the first run; human-written sets lack traces; agent-session sets </w:t>
             </w:r>
             <w:fldSimple w:instr=" REF _RefAnneal25 \r \h ">
               <w:r>
@@ -1379,6 +1379,20 @@
               <w:rPr>
                 <w:sz w:val="20"/>
               </w:rPr>
+              <w:t xml:space="preserve"> lack raw reasoning; API-generated rows are not public; SWE-Gym </w:t>
+            </w:r>
+            <w:fldSimple w:instr=" REF _RefAnneal26 \r \h ">
+              <w:r>
+                <w:rPr>
+                  <w:sz w:val="20"/>
+                </w:rPr>
+                <w:t xml:space="preserve">[26]</w:t>
+              </w:r>
+            </w:fldSimple>
+            <w:r>
+              <w:rPr>
+                <w:sz w:val="20"/>
+              </w:rPr>
               <w:t xml:space="preserve"> trajectories exceed 8,192 tokens.</w:t>
             </w:r>
           </w:p>
@@ -1471,7 +1485,7 @@
         <w:pStyle w:val="BodyFirst"/>
       </w:pPr>
       <w:r>
-        <w:t xml:space="preserve">The prototype is a version-controlled repository of scripts and configuration for every stage in Figure 1. Drafted before access to the training machine, it was brought up there in October 2026; the first real run, round 0 of the loop (Section 3.2), trained on 19 and 20 October.</w:t>
+        <w:t xml:space="preserve">The prototype is a version-controlled repository of scripts and configuration for every stage in Figure 1. Drafted before access to the training machine, it was brought up there in October 2026; the first real run, round 0 of the loop (Section 3.2), was trained and scored by 21 October.</w:t>
       </w:r>
     </w:p>
     <w:p>
@@ -1553,17 +1567,7 @@
         <w:t xml:space="preserve">measure_memory.py</w:t>
       </w:r>
       <w:r>
-        <w:t xml:space="preserve"> replaces the estimate by running training steps and recording the peak. The estimator models plain Hugging Face training, but </w:t>
-      </w:r>
-      <w:r>
-        <w:rPr>
-          <w:rFonts w:ascii="Consolas" w:hAnsi="Consolas" w:cs="Consolas"/>
-          <w:sz w:val="19"/>
-        </w:rPr>
-        <w:t xml:space="preserve">train_longrun.py</w:t>
-      </w:r>
-      <w:r>
-        <w:t xml:space="preserve"> uses Unsloth </w:t>
+        <w:t xml:space="preserve"> measures the peak over real training steps. Unsloth </w:t>
       </w:r>
       <w:fldSimple w:instr=" REF _RefAnneal11 \r \h ">
         <w:r>
@@ -1571,15 +1575,15 @@
         </w:r>
       </w:fldSimple>
       <w:r>
-        <w:t xml:space="preserve">, which changes two large terms (Table 2). Qwen3.8's 248,320-token vocabulary makes the standard loss expensive; Cut Cross-Entropy, which Unsloth adopts, cut Gemma 2's classifier-head training memory from 28 GB to 1 GB </w:t>
-      </w:r>
-      <w:fldSimple w:instr=" REF _RefAnneal26 \r \h ">
+        <w:t xml:space="preserve"> changes two large terms (Table 2): Qwen3.8's 248,320-token vocabulary makes the standard loss expensive, and Cut Cross-Entropy, which cut Gemma 2's classifier-head training memory from 28 GB to 1 GB </w:t>
+      </w:r>
+      <w:fldSimple w:instr=" REF _RefAnneal27 \r \h ">
         <w:r>
-          <w:t xml:space="preserve">[26]</w:t>
+          <w:t xml:space="preserve">[27]</w:t>
         </w:r>
       </w:fldSimple>
       <w:r>
-        <w:t xml:space="preserve">, shrinking this model's loss from about 12.6 GiB to 0.5 GiB.</w:t>
+        <w:t xml:space="preserve">, shrinks this model's loss from about 12.6 GiB to 0.5 GiB.</w:t>
       </w:r>
     </w:p>
     <w:p>
@@ -1587,7 +1591,7 @@
         <w:pStyle w:val="BodyText"/>
       </w:pPr>
       <w:r>
-        <w:t xml:space="preserve">Table 2 decided the precision. An 8-bit base fits only if Unsloth's optimisations work on this chip, whereas a 4-bit base fits on either path; ablation A6 measures its cost in quantisation error. Measured on the machine at 8,192 tokens with a rank-16 adapter, the peak was 25.2 GiB, inside the 32 GB allocation. A five-step test before the loop tries 16,384-token rows, used only if the peak stays within 29 GB with 6 GB of system memory free.</w:t>
+        <w:t xml:space="preserve">Table 2 decided the precision. An 8-bit base fits only if Unsloth's optimisations work on this chip, whereas a 4-bit base fits on either path; ablation A5 measures its cost in quantisation error. At 8,192 tokens the measured peak was 25.2 GiB. A five-step test before the loop tries 16,384-token rows, used only if the peak stays within 29 GB with 6 GB of system memory free.</w:t>
       </w:r>
     </w:p>
     <w:p>
@@ -1680,7 +1684,7 @@
               <w:rPr>
                 <w:sz w:val="20"/>
               </w:rPr>
-              <w:t xml:space="preserve">8-bit (A6)</w:t>
+              <w:t xml:space="preserve">8-bit (A5)</w:t>
             </w:r>
           </w:p>
         </w:tc>
@@ -2325,7 +2329,7 @@
         <w:pStyle w:val="BodyFirst"/>
       </w:pPr>
       <w:r>
-        <w:t xml:space="preserve">From round 1, the loop trains only on public datasets, never on the base model's own rows, which would reinforce its biases. Every row must carry its teacher's real reasoning, and the teacher must match or beat Qwen3.8-27B on the Vals AI board for that task, where all models share one harness. Each round takes 55% from test-passed bug-fix runs in real TypeScript, Go, JavaScript and other non-Python repositories by DeepSeek V4-Flash-0731 </w:t>
+        <w:t xml:space="preserve">From round 1, the loop trains only on public datasets, never on the base model's own rows, which would reinforce its biases. Every row must carry its teacher's real reasoning, and the teacher must match or beat Qwen3.8-27B on the Vals AI board for that task, where all models share one harness. Each round takes 45% from test-passed bug-fix runs in real TypeScript, Go, JavaScript and other non-Python repositories by DeepSeek V4-Flash-0731 </w:t>
       </w:r>
       <w:fldSimple w:instr=" REF _RefAnneal20 \r \h ">
         <w:r>
@@ -2335,14 +2339,6 @@
       <w:r>
         <w:t xml:space="preserve">, which beats the base on LiveCodeBench, SWE-bench Verified and Terminal-Bench (87.3, 88.8 and 67.0 against 84.0, 86.0 and 58.4 </w:t>
       </w:r>
-      <w:fldSimple w:instr=" REF _RefAnneal27 \r \h ">
-        <w:r>
-          <w:t xml:space="preserve">[27]</w:t>
-        </w:r>
-      </w:fldSimple>
-      <w:r>
-        <w:t xml:space="preserve">, </w:t>
-      </w:r>
       <w:fldSimple w:instr=" REF _RefAnneal28 \r \h ">
         <w:r>
           <w:t xml:space="preserve">[28]</w:t>
@@ -2357,7 +2353,15 @@
         </w:r>
       </w:fldSimple>
       <w:r>
-        <w:t xml:space="preserve">). The other 45% are DeepSeek-V4-Pro coding answers without Python </w:t>
+        <w:t xml:space="preserve">, </w:t>
+      </w:r>
+      <w:fldSimple w:instr=" REF _RefAnneal30 \r \h ">
+        <w:r>
+          <w:t xml:space="preserve">[30]</w:t>
+        </w:r>
+      </w:fldSimple>
+      <w:r>
+        <w:t xml:space="preserve">); 30% from test-passed Linux terminal runs by GLM-5.3 </w:t>
       </w:r>
       <w:fldSimple w:instr=" REF _RefAnneal21 \r \h ">
         <w:r>
@@ -2365,7 +2369,7 @@
         </w:r>
       </w:fldSimple>
       <w:r>
-        <w:t xml:space="preserve">, </w:t>
+        <w:t xml:space="preserve"> (Terminal-Bench 71.5); and 25% from DeepSeek-V4-Pro coding answers </w:t>
       </w:r>
       <w:fldSimple w:instr=" REF _RefAnneal22 \r \h ">
         <w:r>
@@ -2373,15 +2377,23 @@
         </w:r>
       </w:fldSimple>
       <w:r>
-        <w:t xml:space="preserve">, from a teacher ahead only on LiveCodeBench (87.5). Python rows and maths </w:t>
-      </w:r>
-      <w:fldSimple w:instr=" REF _RefAnneal30 \r \h ">
+        <w:t xml:space="preserve">, </w:t>
+      </w:r>
+      <w:fldSimple w:instr=" REF _RefAnneal23 \r \h ">
         <w:r>
-          <w:t xml:space="preserve">[30]</w:t>
+          <w:t xml:space="preserve">[23]</w:t>
         </w:r>
       </w:fldSimple>
       <w:r>
-        <w:t xml:space="preserve"> wait until these run out. </w:t>
+        <w:t xml:space="preserve">, a teacher ahead only on LiveCodeBench (87.5). Rows using Python, and maths </w:t>
+      </w:r>
+      <w:fldSimple w:instr=" REF _RefAnneal31 \r \h ">
+        <w:r>
+          <w:t xml:space="preserve">[31]</w:t>
+        </w:r>
+      </w:fldSimple>
+      <w:r>
+        <w:t xml:space="preserve">, wait until these run out. </w:t>
       </w:r>
       <w:r>
         <w:rPr>
@@ -2401,23 +2413,7 @@
         <w:t xml:space="preserve">&lt;think&gt;</w:t>
       </w:r>
       <w:r>
-        <w:t xml:space="preserve"> trace, drops over-length rows and removes near-duplicates of evaluation prompts (13-gram or Jaccard overlap). An embedding search on the otherwise idle NPU also flags reworded copies, which n-gram checks miss </w:t>
-      </w:r>
-      <w:fldSimple w:instr=" REF _RefAnneal31 \r \h ">
-        <w:r>
-          <w:t xml:space="preserve">[31]</w:t>
-        </w:r>
-      </w:fldSimple>
-      <w:r>
-        <w:t xml:space="preserve">; in the first pools it flagged 33 of 15,276 rows without measurably slowing training.</w:t>
-      </w:r>
-    </w:p>
-    <w:p>
-      <w:pPr>
-        <w:pStyle w:val="BodyText"/>
-      </w:pPr>
-      <w:r>
-        <w:t xml:space="preserve">The first run, round 0, is a comparison run using the model's own rows: 500 base-model answers to OpenCodeInstruct </w:t>
+        <w:t xml:space="preserve"> trace, drops over-length rows and removes near-duplicates of evaluation prompts. An embedding search on the otherwise idle NPU also flags reworded copies, which n-gram checks miss </w:t>
       </w:r>
       <w:fldSimple w:instr=" REF _RefAnneal32 \r \h ">
         <w:r>
@@ -2425,7 +2421,15 @@
         </w:r>
       </w:fldSimple>
       <w:r>
-        <w:t xml:space="preserve"> prompts that passed their tests, as in ReST-EM </w:t>
+        <w:t xml:space="preserve">; in the first pools it flagged 33 of 15,276 rows without measurably slowing training.</w:t>
+      </w:r>
+    </w:p>
+    <w:p>
+      <w:pPr>
+        <w:pStyle w:val="BodyText"/>
+      </w:pPr>
+      <w:r>
+        <w:t xml:space="preserve">The first run, round 0, is a comparison run using the model's own rows: 500 base-model answers to OpenCodeInstruct </w:t>
       </w:r>
       <w:fldSimple w:instr=" REF _RefAnneal33 \r \h ">
         <w:r>
@@ -2433,7 +2437,7 @@
         </w:r>
       </w:fldSimple>
       <w:r>
-        <w:t xml:space="preserve">, plus 1,500 OpenCodeReasoning rows, whose DeepSeek-R1 teacher scores only 63.5 on LiveCodeBench </w:t>
+        <w:t xml:space="preserve"> prompts that passed their tests, as in ReST-EM </w:t>
       </w:r>
       <w:fldSimple w:instr=" REF _RefAnneal34 \r \h ">
         <w:r>
@@ -2441,23 +2445,7 @@
         </w:r>
       </w:fldSimple>
       <w:r>
-        <w:t xml:space="preserve">. Traces hitting the 6,144-token budget were rejected, so kept traces are short (median 436 tokens). Model-written code runs in a Windows AppContainer sandbox without network, file or administrator access, which passed 264 escape checks.</w:t>
-      </w:r>
-    </w:p>
-    <w:p>
-      <w:pPr>
-        <w:pStyle w:val="Heading2"/>
-      </w:pPr>
-      <w:r>
-        <w:t xml:space="preserve">Training</w:t>
-      </w:r>
-    </w:p>
-    <w:p>
-      <w:pPr>
-        <w:pStyle w:val="BodyFirst"/>
-      </w:pPr>
-      <w:r>
-        <w:t xml:space="preserve">Training runs as an unattended keep-if-better loop. Round 1 starts from the base model, never the first-run adapter; each later round continues the best adapter on 1,000 new rows plus 25% replayed from earlier rows, re-warming and decaying the learning rate, which in continual pre-training matched retraining on all data </w:t>
+        <w:t xml:space="preserve">, plus 1,500 OpenCodeReasoning rows, whose DeepSeek-R1 teacher scores only 63.5 on LiveCodeBench </w:t>
       </w:r>
       <w:fldSimple w:instr=" REF _RefAnneal35 \r \h ">
         <w:r>
@@ -2465,7 +2453,23 @@
         </w:r>
       </w:fldSimple>
       <w:r>
-        <w:t xml:space="preserve">. Each round is scored on a held-out gate, never trained on or reported: 195 decontaminated CodeContests </w:t>
+        <w:t xml:space="preserve">. Traces hitting the 6,144-token budget were rejected, so kept traces are short (median 436 tokens). Model-written code runs in a Windows AppContainer sandbox without network, file or administrator access, which passed 264 escape checks.</w:t>
+      </w:r>
+    </w:p>
+    <w:p>
+      <w:pPr>
+        <w:pStyle w:val="Heading2"/>
+      </w:pPr>
+      <w:r>
+        <w:t xml:space="preserve">Training</w:t>
+      </w:r>
+    </w:p>
+    <w:p>
+      <w:pPr>
+        <w:pStyle w:val="BodyFirst"/>
+      </w:pPr>
+      <w:r>
+        <w:t xml:space="preserve">Training runs as an unattended keep-if-better loop. Round 1 starts from the base model, never the first-run adapter; each later round continues the best adapter on 1,000 new rows plus 25% replayed from earlier rows, re-warming and decaying the learning rate, which in continual pre-training matched retraining on all data </w:t>
       </w:r>
       <w:fldSimple w:instr=" REF _RefAnneal36 \r \h ">
         <w:r>
@@ -2473,7 +2477,7 @@
         </w:r>
       </w:fldSimple>
       <w:r>
-        <w:t xml:space="preserve"> problems and 300 OpenCodeInstruct problems, being rebuilt around other languages and wider software work (bug fixes, review, tests, tool use) so that a Python-only gain is not kept. A round is kept only if a one-sided exact sign test against the best adapter gives p ≤ 0.05, 100 MMLU-Pro </w:t>
+        <w:t xml:space="preserve">. Each round is scored on a held-out gate of 495 decontaminated CodeContests </w:t>
       </w:r>
       <w:fldSimple w:instr=" REF _RefAnneal37 \r \h ">
         <w:r>
@@ -2481,7 +2485,15 @@
         </w:r>
       </w:fldSimple>
       <w:r>
-        <w:t xml:space="preserve"> questions outside computing stay within 5 points of the base, and sample answers are clean; a fresh-seed re-score then becomes the new reference. A rejected round's rows roll into the next attempt, up to 3,000 new rows, because a real 2-point gain passes the gate only 24 to 44% of the time (power calculation). EvalPlus, scored only on kept adapters, never selects them.</w:t>
+        <w:t xml:space="preserve"> items, never trained on or reported: write a program in C++, Java, Go, Rust, JavaScript or TypeScript (286), or fix a wrong C++ or Java submission (209), each built and run on up to 30 tests. A round is kept if a one-sided exact sign test against the best adapter gives p ≤ 0.05, or if its score is no lower and its loss falls on significantly more of 177 held-out bug-fix steps than it rises, since contest items cannot see what bug-fix rows teach. Either way, neither part nor 100 MMLU-Pro </w:t>
+      </w:r>
+      <w:fldSimple w:instr=" REF _RefAnneal38 \r \h ">
+        <w:r>
+          <w:t xml:space="preserve">[38]</w:t>
+        </w:r>
+      </w:fldSimple>
+      <w:r>
+        <w:t xml:space="preserve"> questions outside computing may drop by over 5 points or significantly, and a fresh-seed re-score becomes the new reference. A rejected round's rows roll into the next attempt, up to 3,000 new rows, because a real 2-point gain passes the gate only 24 to 44% of the time (power calculation). EvalPlus, scored only on kept adapters, never selects them.</w:t>
       </w:r>
     </w:p>
     <w:p>
@@ -2498,13 +2510,13 @@
       <w:r>
         <w:t xml:space="preserve"> uses a warmup-stable-decay schedule </w:t>
       </w:r>
-      <w:fldSimple w:instr=" REF _RefAnneal38 \r \h ">
+      <w:fldSimple w:instr=" REF _RefAnneal39 \r \h ">
         <w:r>
-          <w:t xml:space="preserve">[38]</w:t>
+          <w:t xml:space="preserve">[39]</w:t>
         </w:r>
       </w:fldSimple>
       <w:r>
-        <w:t xml:space="preserve"> (Listing 1). To survive crashes and updates over months, it saves every 10 steps, resumes when the same command is re-run, and refuses to resume if the training file has changed. In a CPU test with a tiny model of the same architecture, a run killed with </w:t>
+        <w:t xml:space="preserve"> (20 warm-up steps, decay over the last 20%). To survive crashes and updates over months, it saves every 10 steps, resumes when the same command is re-run, and refuses to resume if the training file has changed. In a CPU test with a tiny model of the same architecture, a run killed with </w:t>
       </w:r>
       <w:r>
         <w:rPr>
@@ -2520,122 +2532,6 @@
     <w:p>
       <w:pPr>
         <w:pStyle w:val="BodyText"/>
-        <w:keepNext/>
-        <w:spacing w:before="120" w:after="0"/>
-        <w:ind w:left="284"/>
-        <w:jc w:val="left"/>
-      </w:pPr>
-      <w:r>
-        <w:rPr>
-          <w:rFonts w:ascii="Consolas" w:hAnsi="Consolas" w:cs="Consolas"/>
-          <w:sz w:val="17"/>
-        </w:rPr>
-        <w:t xml:space="preserve">base_model: unsloth/Qwen3.8-27B-unsloth-bnb-4bit</w:t>
-      </w:r>
-    </w:p>
-    <w:p>
-      <w:pPr>
-        <w:pStyle w:val="BodyText"/>
-        <w:keepNext/>
-        <w:spacing w:before="0" w:after="0"/>
-        <w:ind w:left="284"/>
-        <w:jc w:val="left"/>
-      </w:pPr>
-      <w:r>
-        <w:rPr>
-          <w:rFonts w:ascii="Consolas" w:hAnsi="Consolas" w:cs="Consolas"/>
-          <w:sz w:val="17"/>
-        </w:rPr>
-        <w:t xml:space="preserve">seq_len: 8192                  # per example, not the context</w:t>
-      </w:r>
-    </w:p>
-    <w:p>
-      <w:pPr>
-        <w:pStyle w:val="BodyText"/>
-        <w:keepNext/>
-        <w:spacing w:before="0" w:after="0"/>
-        <w:ind w:left="284"/>
-        <w:jc w:val="left"/>
-      </w:pPr>
-      <w:r>
-        <w:rPr>
-          <w:rFonts w:ascii="Consolas" w:hAnsi="Consolas" w:cs="Consolas"/>
-          <w:sz w:val="17"/>
-        </w:rPr>
-        <w:t xml:space="preserve">lora_r: 16                     # 64 in a later loop round</w:t>
-      </w:r>
-    </w:p>
-    <w:p>
-      <w:pPr>
-        <w:pStyle w:val="BodyText"/>
-        <w:keepNext/>
-        <w:spacing w:before="0" w:after="0"/>
-        <w:ind w:left="284"/>
-        <w:jc w:val="left"/>
-      </w:pPr>
-      <w:r>
-        <w:rPr>
-          <w:rFonts w:ascii="Consolas" w:hAnsi="Consolas" w:cs="Consolas"/>
-          <w:sz w:val="17"/>
-        </w:rPr>
-        <w:t xml:space="preserve">target_modules: [q_proj, k_proj, v_proj, o_proj, gate_proj, up_proj,</w:t>
-      </w:r>
-    </w:p>
-    <w:p>
-      <w:pPr>
-        <w:pStyle w:val="BodyText"/>
-        <w:keepNext/>
-        <w:spacing w:before="0" w:after="0"/>
-        <w:ind w:left="284"/>
-        <w:jc w:val="left"/>
-      </w:pPr>
-      <w:r>
-        <w:rPr>
-          <w:rFonts w:ascii="Consolas" w:hAnsi="Consolas" w:cs="Consolas"/>
-          <w:sz w:val="17"/>
-        </w:rPr>
-        <w:t xml:space="preserve">                 down_proj]    # + DeltaNet at rank 64</w:t>
-      </w:r>
-    </w:p>
-    <w:p>
-      <w:pPr>
-        <w:pStyle w:val="BodyText"/>
-        <w:keepNext/>
-        <w:spacing w:before="0" w:after="0"/>
-        <w:ind w:left="284"/>
-        <w:jc w:val="left"/>
-      </w:pPr>
-      <w:r>
-        <w:rPr>
-          <w:rFonts w:ascii="Consolas" w:hAnsi="Consolas" w:cs="Consolas"/>
-          <w:sz w:val="17"/>
-        </w:rPr>
-        <w:t xml:space="preserve">schedule: wsd                  # 20 warmup steps, last 20% decays</w:t>
-      </w:r>
-    </w:p>
-    <w:p>
-      <w:pPr>
-        <w:pStyle w:val="BodyCentre"/>
-        <w:keepNext/>
-        <w:spacing w:before="120" w:after="60"/>
-      </w:pPr>
-      <w:r>
-        <w:rPr>
-          <w:b/>
-          <w:sz w:val="20"/>
-        </w:rPr>
-        <w:t xml:space="preserve">Listing 1.</w:t>
-      </w:r>
-      <w:r>
-        <w:rPr>
-          <w:sz w:val="20"/>
-        </w:rPr>
-        <w:t xml:space="preserve"> Excerpt of the first-run configuration.</w:t>
-      </w:r>
-    </w:p>
-    <w:p>
-      <w:pPr>
-        <w:pStyle w:val="BodyText"/>
       </w:pPr>
       <w:r>
         <w:t xml:space="preserve">Small test fixtures caught four silent bugs, all fixed: the unit-test filter passed every answer, length was checked in characters so over-length rows could be truncated, the targets missed the 48 DeltaNet layers' projections, and a seed set after adapter creation made identical runs diverge from step 3.</w:t>
@@ -2654,7 +2550,7 @@
         <w:pStyle w:val="BodyFirst"/>
       </w:pPr>
       <w:r>
-        <w:t xml:space="preserve">Bring-up and the first run raised the issues in Table 3. The run trained on 7.39 million tokens at 99.5 tokens per second; validation loss fell from 0.124 to 0.050.</w:t>
+        <w:t xml:space="preserve">Bring-up and the first run raised the issues in Table 3. The run trained on 7.40 million tokens at about 100 tokens per second, and held-out loss fell from 0.593 to 0.498, yet scores did not rise. Over all 542 EvalPlus problems with extra tests the base scored 86.2% and the adapter 85.4% (−0.7 points, 95% CI −2.6 to +1.1, p = 0.57); HumanEval+ rose 1.8 points and MBPP+ fell 1.9, neither significant, and leaving out five unreliable or overlapping problems changes nothing. The adapter learned its data without improving, consistent with a teacher weaker than the base, though one answer per problem cannot separate the two sources.</w:t>
       </w:r>
     </w:p>
     <w:p>
@@ -3079,7 +2975,7 @@
         <w:pStyle w:val="BodyFirst"/>
       </w:pPr>
       <w:r>
-        <w:t xml:space="preserve">The evaluation script serves the model through llama.cpp at the full 262k context with thinking on and scores HumanEval+ and MBPP+ with the Windows EvalPlus port. HumanEval+ is also reported without HumanEval/32, which fails every solution through an EvalPlus 0.3.1 bug, and, for round 0, without three problems flagged in its own rows. A 20-problem calibration chose four parallel requests without multi-token prediction (MTP): 29.2 tokens per second in total, with answers averaging 877 tokens, so one 542-problem pass takes about 4.6 hours. Because parallel output drifts at near-ties, every model uses this one setup.</w:t>
+        <w:t xml:space="preserve">The evaluation script serves the model through llama.cpp at the full 262k context with thinking on and scores HumanEval+ and MBPP+ with the Windows EvalPlus port. HumanEval+ is also reported without HumanEval/32, which fails every solution through an EvalPlus 0.3.1 bug. A 20-problem calibration chose four parallel requests without multi-token prediction (MTP), 29.2 tokens per second in total; a 542-problem pass took 10 to 12 hours, as full answers reason longer than in calibration.</w:t>
       </w:r>
     </w:p>
     <w:p>
@@ -3087,7 +2983,7 @@
         <w:pStyle w:val="BodyText"/>
       </w:pPr>
       <w:r>
-        <w:t xml:space="preserve">The adapter is converted alone to GGUF and loaded over the same base, which avoids a 55 GB merged model and keeps the base weights identical. Trained against NF4 but served over Q4_K_M, the smoke-test adapter gave losses of 0.756 in training and 0.728 in llama.cpp on 779 identical answer tokens, with 96% top-1 agreement, as close as the base model alone, so evaluation measures the adapter as deployed.</w:t>
+        <w:t xml:space="preserve">The adapter is converted alone to GGUF and loaded over the same base, avoiding a 55 GB merged model. Trained against NF4 but served over Q4_K_M, a smoke-test adapter gave matching losses (0.756 in training, 0.728 in llama.cpp, 96% top-1 agreement), so evaluation measures the adapter as deployed.</w:t>
       </w:r>
     </w:p>
     <w:p>
@@ -3103,7 +2999,7 @@
         <w:pStyle w:val="BodyFirst"/>
       </w:pPr>
       <w:r>
-        <w:t xml:space="preserve">The measurement-first design has paid off: the parity test caught a wrong fix before any real run used it. Speed and memory were measured only at rank 16. The Windows workarounds (a bundled C compiler, the convolution rewrite, disabled Vulkan kernels) could break on an update, so versions are pinned. With 20 to 50 personal tasks, confidence intervals will be wide. HumanEval+ and MBPP+ are Python-only, while the loop now trains mostly on other languages, so EvalPlus may understate gains that the rebuilt gate measures.</w:t>
+        <w:t xml:space="preserve">The measurement-first design has paid off: the parity test caught a wrong fix before any real run used it. Speed and memory were measured only at rank 16. The Windows workarounds (a bundled C compiler, the convolution rewrite, disabled Vulkan kernels) could break on an update, so versions are pinned. With 20 to 50 personal tasks, confidence intervals will be wide. HumanEval+ and MBPP+ are Python-only, while the loop trains mostly on other languages, so EvalPlus may understate gains that the gate measures. Round 0 showed that a correctly working pipeline can still fail to improve a strong base.</w:t>
       </w:r>
     </w:p>
     <w:p>
@@ -3612,7 +3508,7 @@
         <w:t xml:space="preserve">Statistics.</w:t>
       </w:r>
       <w:r>
-        <w:t xml:space="preserve"> Pass rates are averaged over seeds; 95% confidence intervals for A minus B come from a paired bootstrap over problems, with a paired permutation test for significance. In calibration, 2 of 20 answers changed between two runs of the same model, so one seed over 542 problems resolves only a gain of roughly 3 points (an estimate); three seeds narrow this.</w:t>
+        <w:t xml:space="preserve"> Pass rates are averaged over seeds; 95% confidence intervals for A minus B come from a paired bootstrap over problems, with a paired permutation test for significance. With one seed, round 0's 95% interval spanned 3.7 points; three seeds narrow it.</w:t>
       </w:r>
     </w:p>
     <w:p>
@@ -3628,9 +3524,9 @@
       <w:r>
         <w:t xml:space="preserve"> Published results suggest small, flattening gains: supervised fine-tuning gains are log-linear in data and smaller for stronger models </w:t>
       </w:r>
-      <w:fldSimple w:instr=" REF _RefAnneal39 \r \h ">
+      <w:fldSimple w:instr=" REF _RefAnneal40 \r \h ">
         <w:r>
-          <w:t xml:space="preserve">[39]</w:t>
+          <w:t xml:space="preserve">[40]</w:t>
         </w:r>
       </w:fldSimple>
       <w:r>
@@ -3642,7 +3538,7 @@
         </w:r>
       </w:fldSimple>
       <w:r>
-        <w:t xml:space="preserve">. Round 0, three-quarters from a weaker teacher, may show no clear gain, and many rounds may be rejected; a flat curve is still a result.</w:t>
+        <w:t xml:space="preserve">. Round 0, three-quarters from a weaker teacher, showed no clear gain, and many rounds may be rejected; a flat curve is still a result.</w:t>
       </w:r>
     </w:p>
     <w:p>
@@ -3656,7 +3552,7 @@
         <w:t xml:space="preserve">Ablations.</w:t>
       </w:r>
       <w:r>
-        <w:t xml:space="preserve"> One loop round tests A1 rank and A2 DeltaNet targets together: rank 64 on every projection (435M trainable parameters against 80M), retrained from the base on all kept rows. A paired round retrains a kept adapter's rows from the base, comparing continuing with replay against retraining. Separate 1,000-row runs cover A3 example length (4,096, 8,192), A4 OpenCodeReasoning alone against round 0's mix, A5 long examples or trainable normalisation if a kept adapter fails O4, and A6 an 8-bit base.</w:t>
+        <w:t xml:space="preserve"> One loop round tests A1 rank and A2 DeltaNet targets together: rank 64 on every projection (435M trainable parameters against 80M), retrained from the base on all kept rows. A paired round retrains a kept adapter's rows from the base, comparing continuing with replay against retraining. Separate 1,000-row runs cover A3 example length (4,096, 8,192), A4 long examples or trainable normalisation if a kept adapter fails O4, and A5 an 8-bit base.</w:t>
       </w:r>
     </w:p>
     <w:p>
@@ -3694,7 +3590,7 @@
         <w:pStyle w:val="BodyFirst"/>
       </w:pPr>
       <w:r>
-        <w:t xml:space="preserve">The first real run has trained (Section 3.4), and everything else depends on its scores. Of about 136 usable machine days from November to March, roughly 15 go to ablations and 20 to evaluation; loop rounds use the rest, since only one job can use the GPU at a time.</w:t>
+        <w:t xml:space="preserve">Round 0 is scored (Section 3.4), and the loop starts from the base model. Of about 136 usable machine days from November to March, roughly 15 go to ablations and 20 to evaluation; loop rounds use the rest, since only one job can use the GPU at a time.</w:t>
       </w:r>
     </w:p>
     <w:tbl>
@@ -3810,7 +3706,7 @@
               <w:rPr>
                 <w:sz w:val="20"/>
               </w:rPr>
-              <w:t xml:space="preserve">Round 0 (500 own and 1,500 OpenCodeReasoning rows) trained and scored against the base. Test longer rows; rebuild the gate; start the loop.</w:t>
+              <w:t xml:space="preserve">Round 0 trained and scored against the base: no significant change. Six-language gate built; test longer rows; start the loop.</w:t>
             </w:r>
           </w:p>
         </w:tc>
@@ -3872,7 +3768,7 @@
               <w:rPr>
                 <w:sz w:val="20"/>
               </w:rPr>
-              <w:t xml:space="preserve">Three-seed baseline; write the personal tasks. Ablations A3 and A4, pausing the loop.</w:t>
+              <w:t xml:space="preserve">Three-seed baseline; write the personal tasks. Ablation A3, pausing the loop.</w:t>
             </w:r>
           </w:p>
         </w:tc>
@@ -3934,7 +3830,7 @@
               <w:rPr>
                 <w:sz w:val="20"/>
               </w:rPr>
-              <w:t xml:space="preserve">Remaining ablations, including A6. Loop continues.</w:t>
+              <w:t xml:space="preserve">Remaining ablations, including A5. Loop continues.</w:t>
             </w:r>
           </w:p>
         </w:tc>
@@ -5320,12 +5216,43 @@
       </w:pPr>
       <w:bookmarkStart w:id="921" w:name="_RefAnneal21"/>
       <w:r>
+        <w:t xml:space="preserve">Open Athena, "recursive-task-synthesis-glm-5.3-rollouts," Hugging Face dataset card, 2026. </w:t>
+      </w:r>
+      <w:r>
+        <w:t xml:space="preserve">[Online]. Available: </w:t>
+      </w:r>
+      <w:hyperlink r:id="rId42">
+        <w:r>
+          <w:rPr>
+            <w:color w:val="0563C1"/>
+            <w:u w:val="single"/>
+          </w:rPr>
+          <w:t xml:space="preserve">https://huggingface.co/datasets/open-athena/recursive-task-synthesis-glm-5.3-rollouts</w:t>
+        </w:r>
+      </w:hyperlink>
+      <w:r>
+        <w:t xml:space="preserve"> (accessed Oct. 21, 2026).</w:t>
+      </w:r>
+      <w:bookmarkEnd w:id="921"/>
+    </w:p>
+    <w:p>
+      <w:pPr>
+        <w:pStyle w:val="Reference"/>
+        <w:tabs>
+          <w:tab w:val="clear" w:pos="426"/>
+          <w:tab w:val="num" w:pos="567"/>
+        </w:tabs>
+        <w:ind w:left="567" w:hanging="567"/>
+        <w:jc w:val="left"/>
+      </w:pPr>
+      <w:bookmarkStart w:id="922" w:name="_RefAnneal22"/>
+      <w:r>
         <w:t xml:space="preserve">sequelbox, "Tachibana4-DeepSeek-V4-Pro," Hugging Face dataset card, 2026. </w:t>
       </w:r>
       <w:r>
         <w:t xml:space="preserve">[Online]. Available: </w:t>
       </w:r>
-      <w:hyperlink r:id="rId42">
+      <w:hyperlink r:id="rId43">
         <w:r>
           <w:rPr>
             <w:color w:val="0563C1"/>
@@ -5337,7 +5264,7 @@
       <w:r>
         <w:t xml:space="preserve"> (accessed Oct. 17, 2026).</w:t>
       </w:r>
-      <w:bookmarkEnd w:id="921"/>
+      <w:bookmarkEnd w:id="922"/>
     </w:p>
     <w:p>
       <w:pPr>
@@ -5349,14 +5276,14 @@
         <w:ind w:left="567" w:hanging="567"/>
         <w:jc w:val="left"/>
       </w:pPr>
-      <w:bookmarkStart w:id="922" w:name="_RefAnneal22"/>
+      <w:bookmarkStart w:id="923" w:name="_RefAnneal23"/>
       <w:r>
         <w:t xml:space="preserve">Banaxi-Tech, "Deepseek-V4-Reasoning-Code-2500," Hugging Face dataset card, 2026. </w:t>
       </w:r>
       <w:r>
         <w:t xml:space="preserve">[Online]. Available: </w:t>
       </w:r>
-      <w:hyperlink r:id="rId43">
+      <w:hyperlink r:id="rId44">
         <w:r>
           <w:rPr>
             <w:color w:val="0563C1"/>
@@ -5368,7 +5295,7 @@
       <w:r>
         <w:t xml:space="preserve"> (accessed Oct. 17, 2026).</w:t>
       </w:r>
-      <w:bookmarkEnd w:id="922"/>
+      <w:bookmarkEnd w:id="923"/>
     </w:p>
     <w:p>
       <w:pPr>
@@ -5380,7 +5307,7 @@
         <w:ind w:left="567" w:hanging="567"/>
         <w:jc w:val="left"/>
       </w:pPr>
-      <w:bookmarkStart w:id="923" w:name="_RefAnneal23"/>
+      <w:bookmarkStart w:id="924" w:name="_RefAnneal24"/>
       <w:r>
         <w:t xml:space="preserve">W. U. Ahmad </w:t>
       </w:r>
@@ -5396,7 +5323,7 @@
       <w:r>
         <w:t xml:space="preserve">[Online]. Available: </w:t>
       </w:r>
-      <w:hyperlink r:id="rId44">
+      <w:hyperlink r:id="rId45">
         <w:r>
           <w:rPr>
             <w:color w:val="0563C1"/>
@@ -5405,7 +5332,7 @@
           <w:t xml:space="preserve">https://arxiv.org/abs/2504.01943</w:t>
         </w:r>
       </w:hyperlink>
-      <w:bookmarkEnd w:id="923"/>
+      <w:bookmarkEnd w:id="924"/>
     </w:p>
     <w:p>
       <w:pPr>
@@ -5417,14 +5344,14 @@
         <w:ind w:left="567" w:hanging="567"/>
         <w:jc w:val="left"/>
       </w:pPr>
-      <w:bookmarkStart w:id="924" w:name="_RefAnneal24"/>
+      <w:bookmarkStart w:id="925" w:name="_RefAnneal25"/>
       <w:r>
         <w:t xml:space="preserve">Public agent-session dataset card, Hugging Face, 2026. </w:t>
       </w:r>
       <w:r>
         <w:t xml:space="preserve">[Online]. Available: </w:t>
       </w:r>
-      <w:hyperlink r:id="rId45">
+      <w:hyperlink r:id="rId46">
         <w:r>
           <w:rPr>
             <w:color w:val="0563C1"/>
@@ -5436,7 +5363,7 @@
       <w:r>
         <w:t xml:space="preserve"> (accessed Oct. 17, 2026).</w:t>
       </w:r>
-      <w:bookmarkEnd w:id="924"/>
+      <w:bookmarkEnd w:id="925"/>
     </w:p>
     <w:p>
       <w:pPr>
@@ -5448,7 +5375,7 @@
         <w:ind w:left="567" w:hanging="567"/>
         <w:jc w:val="left"/>
       </w:pPr>
-      <w:bookmarkStart w:id="925" w:name="_RefAnneal25"/>
+      <w:bookmarkStart w:id="926" w:name="_RefAnneal26"/>
       <w:r>
         <w:t xml:space="preserve">J. Pan </w:t>
       </w:r>
@@ -5473,7 +5400,7 @@
       <w:r>
         <w:t xml:space="preserve">[Online]. Available: </w:t>
       </w:r>
-      <w:hyperlink r:id="rId46">
+      <w:hyperlink r:id="rId47">
         <w:r>
           <w:rPr>
             <w:color w:val="0563C1"/>
@@ -5482,7 +5409,7 @@
           <w:t xml:space="preserve">https://proceedings.mlr.press/v267/pan25g.html</w:t>
         </w:r>
       </w:hyperlink>
-      <w:bookmarkEnd w:id="925"/>
+      <w:bookmarkEnd w:id="926"/>
     </w:p>
     <w:p>
       <w:pPr>
@@ -5494,7 +5421,7 @@
         <w:ind w:left="567" w:hanging="567"/>
         <w:jc w:val="left"/>
       </w:pPr>
-      <w:bookmarkStart w:id="926" w:name="_RefAnneal26"/>
+      <w:bookmarkStart w:id="927" w:name="_RefAnneal27"/>
       <w:r>
         <w:t xml:space="preserve">E. Wijmans, B. Huval, A. Hertzberg, V. Koltun, and P. Krähenbühl, "Cut your losses in large-vocabulary language models," in </w:t>
       </w:r>
@@ -5510,7 +5437,7 @@
       <w:r>
         <w:t xml:space="preserve">[Online]. Available: </w:t>
       </w:r>
-      <w:hyperlink r:id="rId47">
+      <w:hyperlink r:id="rId48">
         <w:r>
           <w:rPr>
             <w:color w:val="0563C1"/>
@@ -5519,7 +5446,7 @@
           <w:t xml:space="preserve">https://arxiv.org/abs/2411.09009</w:t>
         </w:r>
       </w:hyperlink>
-      <w:bookmarkEnd w:id="926"/>
+      <w:bookmarkEnd w:id="927"/>
     </w:p>
     <w:p>
       <w:pPr>
@@ -5531,14 +5458,14 @@
         <w:ind w:left="567" w:hanging="567"/>
         <w:jc w:val="left"/>
       </w:pPr>
-      <w:bookmarkStart w:id="927" w:name="_RefAnneal27"/>
+      <w:bookmarkStart w:id="928" w:name="_RefAnneal28"/>
       <w:r>
         <w:t xml:space="preserve">Vals AI, "LiveCodeBench leaderboard," 2026. </w:t>
       </w:r>
       <w:r>
         <w:t xml:space="preserve">[Online]. Available: </w:t>
       </w:r>
-      <w:hyperlink r:id="rId48">
+      <w:hyperlink r:id="rId49">
         <w:r>
           <w:rPr>
             <w:color w:val="0563C1"/>
@@ -5550,7 +5477,7 @@
       <w:r>
         <w:t xml:space="preserve"> (accessed Oct. 21, 2026).</w:t>
       </w:r>
-      <w:bookmarkEnd w:id="927"/>
+      <w:bookmarkEnd w:id="928"/>
     </w:p>
     <w:p>
       <w:pPr>
@@ -5562,14 +5489,14 @@
         <w:ind w:left="567" w:hanging="567"/>
         <w:jc w:val="left"/>
       </w:pPr>
-      <w:bookmarkStart w:id="928" w:name="_RefAnneal28"/>
+      <w:bookmarkStart w:id="929" w:name="_RefAnneal29"/>
       <w:r>
         <w:t xml:space="preserve">Vals AI, "SWE-bench Verified leaderboard," 2026. </w:t>
       </w:r>
       <w:r>
         <w:t xml:space="preserve">[Online]. Available: </w:t>
       </w:r>
-      <w:hyperlink r:id="rId49">
+      <w:hyperlink r:id="rId50">
         <w:r>
           <w:rPr>
             <w:color w:val="0563C1"/>
@@ -5581,7 +5508,7 @@
       <w:r>
         <w:t xml:space="preserve"> (accessed Oct. 21, 2026).</w:t>
       </w:r>
-      <w:bookmarkEnd w:id="928"/>
+      <w:bookmarkEnd w:id="929"/>
     </w:p>
     <w:p>
       <w:pPr>
@@ -5593,14 +5520,14 @@
         <w:ind w:left="567" w:hanging="567"/>
         <w:jc w:val="left"/>
       </w:pPr>
-      <w:bookmarkStart w:id="929" w:name="_RefAnneal29"/>
+      <w:bookmarkStart w:id="930" w:name="_RefAnneal30"/>
       <w:r>
         <w:t xml:space="preserve">Vals AI, "Terminal-Bench 2.1 leaderboard," 2026. </w:t>
       </w:r>
       <w:r>
         <w:t xml:space="preserve">[Online]. Available: </w:t>
       </w:r>
-      <w:hyperlink r:id="rId50">
+      <w:hyperlink r:id="rId51">
         <w:r>
           <w:rPr>
             <w:color w:val="0563C1"/>
@@ -5612,7 +5539,7 @@
       <w:r>
         <w:t xml:space="preserve"> (accessed Oct. 21, 2026).</w:t>
       </w:r>
-      <w:bookmarkEnd w:id="929"/>
+      <w:bookmarkEnd w:id="930"/>
     </w:p>
     <w:p>
       <w:pPr>
@@ -5624,14 +5551,14 @@
         <w:ind w:left="567" w:hanging="567"/>
         <w:jc w:val="left"/>
       </w:pPr>
-      <w:bookmarkStart w:id="930" w:name="_RefAnneal30"/>
+      <w:bookmarkStart w:id="931" w:name="_RefAnneal31"/>
       <w:r>
         <w:t xml:space="preserve">NVIDIA, "Nemotron-SFT-Math-v4," Hugging Face dataset card, 2026. </w:t>
       </w:r>
       <w:r>
         <w:t xml:space="preserve">[Online]. Available: </w:t>
       </w:r>
-      <w:hyperlink r:id="rId51">
+      <w:hyperlink r:id="rId52">
         <w:r>
           <w:rPr>
             <w:color w:val="0563C1"/>
@@ -5643,7 +5570,7 @@
       <w:r>
         <w:t xml:space="preserve"> (accessed Oct. 17, 2026).</w:t>
       </w:r>
-      <w:bookmarkEnd w:id="930"/>
+      <w:bookmarkEnd w:id="931"/>
     </w:p>
     <w:p>
       <w:pPr>
@@ -5655,14 +5582,14 @@
         <w:ind w:left="567" w:hanging="567"/>
         <w:jc w:val="left"/>
       </w:pPr>
-      <w:bookmarkStart w:id="931" w:name="_RefAnneal31"/>
+      <w:bookmarkStart w:id="932" w:name="_RefAnneal32"/>
       <w:r>
         <w:t xml:space="preserve">S. Yang, W.-L. Chiang, L. Zheng, J. E. Gonzalez, and I. Stoica, "Rethinking benchmark and contamination for language models with rephrased samples," arXiv preprint arXiv:2311.04850, 2023. </w:t>
       </w:r>
       <w:r>
         <w:t xml:space="preserve">[Online]. Available: </w:t>
       </w:r>
-      <w:hyperlink r:id="rId52">
+      <w:hyperlink r:id="rId53">
         <w:r>
           <w:rPr>
             <w:color w:val="0563C1"/>
@@ -5671,7 +5598,7 @@
           <w:t xml:space="preserve">https://arxiv.org/abs/2311.04850</w:t>
         </w:r>
       </w:hyperlink>
-      <w:bookmarkEnd w:id="931"/>
+      <w:bookmarkEnd w:id="932"/>
     </w:p>
     <w:p>
       <w:pPr>
@@ -5683,7 +5610,7 @@
         <w:ind w:left="567" w:hanging="567"/>
         <w:jc w:val="left"/>
       </w:pPr>
-      <w:bookmarkStart w:id="932" w:name="_RefAnneal32"/>
+      <w:bookmarkStart w:id="933" w:name="_RefAnneal33"/>
       <w:r>
         <w:t xml:space="preserve">W. U. Ahmad </w:t>
       </w:r>
@@ -5699,7 +5626,7 @@
       <w:r>
         <w:t xml:space="preserve">[Online]. Available: </w:t>
       </w:r>
-      <w:hyperlink r:id="rId53">
+      <w:hyperlink r:id="rId54">
         <w:r>
           <w:rPr>
             <w:color w:val="0563C1"/>
@@ -5708,7 +5635,7 @@
           <w:t xml:space="preserve">https://arxiv.org/abs/2504.04030</w:t>
         </w:r>
       </w:hyperlink>
-      <w:bookmarkEnd w:id="932"/>
+      <w:bookmarkEnd w:id="933"/>
     </w:p>
     <w:p>
       <w:pPr>
@@ -5720,7 +5647,7 @@
         <w:ind w:left="567" w:hanging="567"/>
         <w:jc w:val="left"/>
       </w:pPr>
-      <w:bookmarkStart w:id="933" w:name="_RefAnneal33"/>
+      <w:bookmarkStart w:id="934" w:name="_RefAnneal34"/>
       <w:r>
         <w:t xml:space="preserve">A. Singh </w:t>
       </w:r>
@@ -5736,7 +5663,7 @@
       <w:r>
         <w:t xml:space="preserve">[Online]. Available: </w:t>
       </w:r>
-      <w:hyperlink r:id="rId54">
+      <w:hyperlink r:id="rId55">
         <w:r>
           <w:rPr>
             <w:color w:val="0563C1"/>
@@ -5745,7 +5672,7 @@
           <w:t xml:space="preserve">https://arxiv.org/abs/2312.06585</w:t>
         </w:r>
       </w:hyperlink>
-      <w:bookmarkEnd w:id="933"/>
+      <w:bookmarkEnd w:id="934"/>
     </w:p>
     <w:p>
       <w:pPr>
@@ -5757,14 +5684,14 @@
         <w:ind w:left="567" w:hanging="567"/>
         <w:jc w:val="left"/>
       </w:pPr>
-      <w:bookmarkStart w:id="934" w:name="_RefAnneal34"/>
+      <w:bookmarkStart w:id="935" w:name="_RefAnneal35"/>
       <w:r>
         <w:t xml:space="preserve">DeepSeek-AI, "DeepSeek-R1-0528," Hugging Face model card, 2025. </w:t>
       </w:r>
       <w:r>
         <w:t xml:space="preserve">[Online]. Available: </w:t>
       </w:r>
-      <w:hyperlink r:id="rId55">
+      <w:hyperlink r:id="rId56">
         <w:r>
           <w:rPr>
             <w:color w:val="0563C1"/>
@@ -5776,7 +5703,7 @@
       <w:r>
         <w:t xml:space="preserve"> (accessed Oct. 17, 2026).</w:t>
       </w:r>
-      <w:bookmarkEnd w:id="934"/>
+      <w:bookmarkEnd w:id="935"/>
     </w:p>
     <w:p>
       <w:pPr>
@@ -5788,7 +5715,7 @@
         <w:ind w:left="567" w:hanging="567"/>
         <w:jc w:val="left"/>
       </w:pPr>
-      <w:bookmarkStart w:id="935" w:name="_RefAnneal35"/>
+      <w:bookmarkStart w:id="936" w:name="_RefAnneal36"/>
       <w:r>
         <w:t xml:space="preserve">A. Ibrahim </w:t>
       </w:r>
@@ -5813,7 +5740,7 @@
       <w:r>
         <w:t xml:space="preserve">[Online]. Available: </w:t>
       </w:r>
-      <w:hyperlink r:id="rId56">
+      <w:hyperlink r:id="rId57">
         <w:r>
           <w:rPr>
             <w:color w:val="0563C1"/>
@@ -5822,7 +5749,7 @@
           <w:t xml:space="preserve">https://arxiv.org/abs/2403.08763</w:t>
         </w:r>
       </w:hyperlink>
-      <w:bookmarkEnd w:id="935"/>
+      <w:bookmarkEnd w:id="936"/>
     </w:p>
     <w:p>
       <w:pPr>
@@ -5834,7 +5761,7 @@
         <w:ind w:left="567" w:hanging="567"/>
         <w:jc w:val="left"/>
       </w:pPr>
-      <w:bookmarkStart w:id="936" w:name="_RefAnneal36"/>
+      <w:bookmarkStart w:id="937" w:name="_RefAnneal37"/>
       <w:r>
         <w:t xml:space="preserve">Y. Li </w:t>
       </w:r>
@@ -5859,7 +5786,7 @@
       <w:r>
         <w:t xml:space="preserve">[Online]. Available: </w:t>
       </w:r>
-      <w:hyperlink r:id="rId57">
+      <w:hyperlink r:id="rId58">
         <w:r>
           <w:rPr>
             <w:color w:val="0563C1"/>
@@ -5868,7 +5795,7 @@
           <w:t xml:space="preserve">https://arxiv.org/abs/2203.07814</w:t>
         </w:r>
       </w:hyperlink>
-      <w:bookmarkEnd w:id="936"/>
+      <w:bookmarkEnd w:id="937"/>
     </w:p>
     <w:p>
       <w:pPr>
@@ -5880,7 +5807,7 @@
         <w:ind w:left="567" w:hanging="567"/>
         <w:jc w:val="left"/>
       </w:pPr>
-      <w:bookmarkStart w:id="937" w:name="_RefAnneal37"/>
+      <w:bookmarkStart w:id="938" w:name="_RefAnneal38"/>
       <w:r>
         <w:t xml:space="preserve">Y. Wang </w:t>
       </w:r>
@@ -5905,7 +5832,7 @@
       <w:r>
         <w:t xml:space="preserve">[Online]. Available: </w:t>
       </w:r>
-      <w:hyperlink r:id="rId58">
+      <w:hyperlink r:id="rId59">
         <w:r>
           <w:rPr>
             <w:color w:val="0563C1"/>
@@ -5914,7 +5841,7 @@
           <w:t xml:space="preserve">https://arxiv.org/abs/2406.01574</w:t>
         </w:r>
       </w:hyperlink>
-      <w:bookmarkEnd w:id="937"/>
+      <w:bookmarkEnd w:id="938"/>
     </w:p>
     <w:p>
       <w:pPr>
@@ -5926,14 +5853,14 @@
         <w:ind w:left="567" w:hanging="567"/>
         <w:jc w:val="left"/>
       </w:pPr>
-      <w:bookmarkStart w:id="938" w:name="_RefAnneal38"/>
+      <w:bookmarkStart w:id="939" w:name="_RefAnneal39"/>
       <w:r>
         <w:t xml:space="preserve">A. Hägele, E. Bakouch, A. Kosson, L. Ben Allal, L. Von Werra, and M. Jaggi, "Scaling laws and compute-optimal training beyond fixed training durations," arXiv preprint arXiv:2405.18392, 2024. </w:t>
       </w:r>
       <w:r>
         <w:t xml:space="preserve">[Online]. Available: </w:t>
       </w:r>
-      <w:hyperlink r:id="rId59">
+      <w:hyperlink r:id="rId60">
         <w:r>
           <w:rPr>
             <w:color w:val="0563C1"/>
@@ -5942,7 +5869,7 @@
           <w:t xml:space="preserve">https://arxiv.org/abs/2405.18392</w:t>
         </w:r>
       </w:hyperlink>
-      <w:bookmarkEnd w:id="938"/>
+      <w:bookmarkEnd w:id="939"/>
     </w:p>
     <w:p>
       <w:pPr>
@@ -5954,7 +5881,7 @@
         <w:ind w:left="567" w:hanging="567"/>
         <w:jc w:val="left"/>
       </w:pPr>
-      <w:bookmarkStart w:id="939" w:name="_RefAnneal39"/>
+      <w:bookmarkStart w:id="940" w:name="_RefAnneal40"/>
       <w:r>
         <w:t xml:space="preserve">Z. Yuan </w:t>
       </w:r>
@@ -5970,7 +5897,7 @@
       <w:r>
         <w:t xml:space="preserve">[Online]. Available: </w:t>
       </w:r>
-      <w:hyperlink r:id="rId60">
+      <w:hyperlink r:id="rId61">
         <w:r>
           <w:rPr>
             <w:color w:val="0563C1"/>
@@ -5979,7 +5906,7 @@
           <w:t xml:space="preserve">https://arxiv.org/abs/2308.01825</w:t>
         </w:r>
       </w:hyperlink>
-      <w:bookmarkEnd w:id="939"/>
+      <w:bookmarkEnd w:id="940"/>
     </w:p>
     <w:sectPr>
       <w:footerReference w:type="default" r:id="rId18"/>

</xml_diff>

<commit_message>
Outline: training rows up to 12,288 tokens
R2, O1 and its criterion, Table 2 (27.2 GiB measured at 12,288) and Figure 1 give the measured cap; 16,384 crashed. SWE-Gym is rejected for its weaker 2024 teachers. 3,987 words.
</commit_message>
<xml_diff>
--- a/dissertation/Anneal_Dissertation_Outline.docx
+++ b/dissertation/Anneal_Dissertation_Outline.docx
@@ -294,7 +294,7 @@
         </w:r>
       </w:fldSimple>
       <w:r>
-        <w:t xml:space="preserve">. Activation memory limits training examples to 8,192 tokens, perhaps 16,384, and short-example fine-tuning risks dulling long-range behaviour unnoticed </w:t>
+        <w:t xml:space="preserve">. Activation memory limits training examples to 12,288 tokens, and short-example fine-tuning risks dulling long-range behaviour unnoticed </w:t>
       </w:r>
       <w:fldSimple w:instr=" REF _RefAnneal3 \r \h ">
         <w:r>
@@ -402,7 +402,7 @@
         <w:tab/>
       </w:r>
       <w:r>
-        <w:t xml:space="preserve">Build a reproducible pipeline on PyTorch and ROCm that trains a Qwen3.8-27B adapter on examples of up to 8,192 tokens within the machine's 32 GB GPU allocation and survives interruptions to multi-week runs, by the end of Autumn week 12.</w:t>
+        <w:t xml:space="preserve">Build a reproducible pipeline on PyTorch and ROCm that trains a Qwen3.8-27B adapter on examples of up to 12,288 tokens within the machine's 32 GB GPU allocation and survives interruptions to multi-week runs, by the end of Autumn week 12.</w:t>
       </w:r>
     </w:p>
     <w:p>
@@ -1393,7 +1393,7 @@
               <w:rPr>
                 <w:sz w:val="20"/>
               </w:rPr>
-              <w:t xml:space="preserve"> trajectories exceed 8,192 tokens.</w:t>
+              <w:t xml:space="preserve"> trajectories come from 2024 models weaker than the base.</w:t>
             </w:r>
           </w:p>
         </w:tc>
@@ -1591,7 +1591,7 @@
         <w:pStyle w:val="BodyText"/>
       </w:pPr>
       <w:r>
-        <w:t xml:space="preserve">Table 2 decided the precision. An 8-bit base fits only if Unsloth's optimisations work on this chip, whereas a 4-bit base fits on either path; ablation A5 measures its cost in quantisation error. At 8,192 tokens the measured peak was 25.2 GiB. A five-step test before the loop tries 16,384-token rows, used only if the peak stays within 29 GB with 6 GB of system memory free.</w:t>
+        <w:t xml:space="preserve">Table 2 decided the precision. An 8-bit base fits only if Unsloth's optimisations work on this chip, whereas a 4-bit base fits on either path; ablation A5 measures its cost in quantisation error. The loop uses the longest rows that fit with a margin (peak within 29 GiB, 6 GB of system memory free): 16,384 tokens crashed, so the cap is 12,288.</w:t>
       </w:r>
     </w:p>
     <w:p>
@@ -1611,7 +1611,7 @@
         <w:rPr>
           <w:sz w:val="20"/>
         </w:rPr>
-        <w:t xml:space="preserve"> GPU memory per step at rank 16: estimated at 4,096 tokens, measured at 8,192 (GiB).</w:t>
+        <w:t xml:space="preserve"> GPU memory per step at rank 16: estimated at 4,096 tokens, measured at 8,192 and 12,288 (GiB).</w:t>
       </w:r>
     </w:p>
     <w:tbl>
@@ -1638,7 +1638,6 @@
           <w:p>
             <w:pPr>
               <w:pStyle w:val="BodyText"/>
-              <w:keepNext/>
               <w:spacing w:before="20" w:after="20"/>
               <w:jc w:val="left"/>
             </w:pPr>
@@ -1657,7 +1656,6 @@
           <w:p>
             <w:pPr>
               <w:pStyle w:val="BodyText"/>
-              <w:keepNext/>
               <w:spacing w:before="20" w:after="20"/>
               <w:jc w:val="left"/>
             </w:pPr>
@@ -1676,7 +1674,6 @@
           <w:p>
             <w:pPr>
               <w:pStyle w:val="BodyText"/>
-              <w:keepNext/>
               <w:spacing w:before="20" w:after="20"/>
               <w:jc w:val="left"/>
             </w:pPr>
@@ -1700,7 +1697,6 @@
           <w:p>
             <w:pPr>
               <w:pStyle w:val="BodyText"/>
-              <w:keepNext/>
               <w:spacing w:before="20" w:after="20"/>
               <w:jc w:val="left"/>
             </w:pPr>
@@ -1719,7 +1715,6 @@
           <w:p>
             <w:pPr>
               <w:pStyle w:val="BodyText"/>
-              <w:keepNext/>
               <w:spacing w:before="20" w:after="20"/>
               <w:jc w:val="left"/>
             </w:pPr>
@@ -1738,7 +1733,6 @@
           <w:p>
             <w:pPr>
               <w:pStyle w:val="BodyText"/>
-              <w:keepNext/>
               <w:spacing w:before="20" w:after="20"/>
               <w:jc w:val="left"/>
             </w:pPr>
@@ -1762,7 +1756,6 @@
           <w:p>
             <w:pPr>
               <w:pStyle w:val="BodyText"/>
-              <w:keepNext/>
               <w:spacing w:before="20" w:after="20"/>
               <w:jc w:val="left"/>
             </w:pPr>
@@ -1781,7 +1774,6 @@
           <w:p>
             <w:pPr>
               <w:pStyle w:val="BodyText"/>
-              <w:keepNext/>
               <w:spacing w:before="20" w:after="20"/>
               <w:jc w:val="left"/>
             </w:pPr>
@@ -1800,7 +1792,6 @@
           <w:p>
             <w:pPr>
               <w:pStyle w:val="BodyText"/>
-              <w:keepNext/>
               <w:spacing w:before="20" w:after="20"/>
               <w:jc w:val="left"/>
             </w:pPr>
@@ -1824,7 +1815,6 @@
           <w:p>
             <w:pPr>
               <w:pStyle w:val="BodyText"/>
-              <w:keepNext/>
               <w:spacing w:before="20" w:after="20"/>
               <w:jc w:val="left"/>
             </w:pPr>
@@ -1843,7 +1833,6 @@
           <w:p>
             <w:pPr>
               <w:pStyle w:val="BodyText"/>
-              <w:keepNext/>
               <w:spacing w:before="20" w:after="20"/>
               <w:jc w:val="left"/>
             </w:pPr>
@@ -1862,7 +1851,6 @@
           <w:p>
             <w:pPr>
               <w:pStyle w:val="BodyText"/>
-              <w:keepNext/>
               <w:spacing w:before="20" w:after="20"/>
               <w:jc w:val="left"/>
             </w:pPr>
@@ -1886,7 +1874,6 @@
           <w:p>
             <w:pPr>
               <w:pStyle w:val="BodyText"/>
-              <w:keepNext/>
               <w:spacing w:before="20" w:after="20"/>
               <w:jc w:val="left"/>
             </w:pPr>
@@ -1905,7 +1892,6 @@
           <w:p>
             <w:pPr>
               <w:pStyle w:val="BodyText"/>
-              <w:keepNext/>
               <w:spacing w:before="20" w:after="20"/>
               <w:jc w:val="left"/>
             </w:pPr>
@@ -1924,7 +1910,6 @@
           <w:p>
             <w:pPr>
               <w:pStyle w:val="BodyText"/>
-              <w:keepNext/>
               <w:spacing w:before="20" w:after="20"/>
               <w:jc w:val="left"/>
             </w:pPr>
@@ -1948,7 +1933,6 @@
           <w:p>
             <w:pPr>
               <w:pStyle w:val="BodyText"/>
-              <w:keepNext/>
               <w:spacing w:before="20" w:after="20"/>
               <w:jc w:val="left"/>
             </w:pPr>
@@ -1967,7 +1951,6 @@
           <w:p>
             <w:pPr>
               <w:pStyle w:val="BodyText"/>
-              <w:keepNext/>
               <w:spacing w:before="20" w:after="20"/>
               <w:jc w:val="left"/>
             </w:pPr>
@@ -1986,7 +1969,6 @@
           <w:p>
             <w:pPr>
               <w:pStyle w:val="BodyText"/>
-              <w:keepNext/>
               <w:spacing w:before="20" w:after="20"/>
               <w:jc w:val="left"/>
             </w:pPr>
@@ -2010,7 +1992,6 @@
           <w:p>
             <w:pPr>
               <w:pStyle w:val="BodyText"/>
-              <w:keepNext/>
               <w:spacing w:before="20" w:after="20"/>
               <w:jc w:val="left"/>
             </w:pPr>
@@ -2029,7 +2010,6 @@
           <w:p>
             <w:pPr>
               <w:pStyle w:val="BodyText"/>
-              <w:keepNext/>
               <w:spacing w:before="20" w:after="20"/>
               <w:jc w:val="left"/>
             </w:pPr>
@@ -2048,7 +2028,6 @@
           <w:p>
             <w:pPr>
               <w:pStyle w:val="BodyText"/>
-              <w:keepNext/>
               <w:spacing w:before="20" w:after="20"/>
               <w:jc w:val="left"/>
             </w:pPr>
@@ -2072,7 +2051,6 @@
           <w:p>
             <w:pPr>
               <w:pStyle w:val="BodyText"/>
-              <w:keepNext/>
               <w:spacing w:before="20" w:after="20"/>
               <w:jc w:val="left"/>
             </w:pPr>
@@ -2091,7 +2069,6 @@
           <w:p>
             <w:pPr>
               <w:pStyle w:val="BodyText"/>
-              <w:keepNext/>
               <w:spacing w:before="20" w:after="20"/>
               <w:jc w:val="left"/>
             </w:pPr>
@@ -2110,7 +2087,6 @@
           <w:p>
             <w:pPr>
               <w:pStyle w:val="BodyText"/>
-              <w:keepNext/>
               <w:spacing w:before="20" w:after="20"/>
               <w:jc w:val="left"/>
             </w:pPr>
@@ -2134,7 +2110,6 @@
           <w:p>
             <w:pPr>
               <w:pStyle w:val="BodyText"/>
-              <w:keepNext/>
               <w:spacing w:before="20" w:after="20"/>
               <w:jc w:val="left"/>
             </w:pPr>
@@ -2154,7 +2129,6 @@
           <w:p>
             <w:pPr>
               <w:pStyle w:val="BodyText"/>
-              <w:keepNext/>
               <w:spacing w:before="20" w:after="20"/>
               <w:jc w:val="left"/>
             </w:pPr>
@@ -2174,7 +2148,6 @@
           <w:p>
             <w:pPr>
               <w:pStyle w:val="BodyText"/>
-              <w:keepNext/>
               <w:spacing w:before="20" w:after="20"/>
               <w:jc w:val="left"/>
             </w:pPr>
@@ -2199,7 +2172,6 @@
           <w:p>
             <w:pPr>
               <w:pStyle w:val="BodyText"/>
-              <w:keepNext/>
               <w:spacing w:before="20" w:after="20"/>
               <w:jc w:val="left"/>
             </w:pPr>
@@ -2218,7 +2190,6 @@
           <w:p>
             <w:pPr>
               <w:pStyle w:val="BodyText"/>
-              <w:keepNext/>
               <w:spacing w:before="20" w:after="20"/>
               <w:jc w:val="left"/>
             </w:pPr>
@@ -2237,7 +2208,6 @@
           <w:p>
             <w:pPr>
               <w:pStyle w:val="BodyText"/>
-              <w:keepNext/>
               <w:spacing w:before="20" w:after="20"/>
               <w:jc w:val="left"/>
             </w:pPr>
@@ -2287,6 +2257,65 @@
                 <w:sz w:val="20"/>
               </w:rPr>
               <w:t xml:space="preserve">25.2</w:t>
+            </w:r>
+          </w:p>
+        </w:tc>
+        <w:tc>
+          <w:tcPr>
+            <w:tcW w:w="2000" w:type="dxa"/>
+          </w:tcPr>
+          <w:p>
+            <w:pPr>
+              <w:pStyle w:val="BodyText"/>
+              <w:spacing w:before="20" w:after="20"/>
+              <w:jc w:val="left"/>
+            </w:pPr>
+            <w:r>
+              <w:rPr>
+                <w:sz w:val="20"/>
+              </w:rPr>
+              <w:t xml:space="preserve">not run</w:t>
+            </w:r>
+          </w:p>
+        </w:tc>
+      </w:tr>
+      <w:tr>
+        <w:trPr>
+          <w:cantSplit/>
+        </w:trPr>
+        <w:tc>
+          <w:tcPr>
+            <w:tcW w:w="4296" w:type="dxa"/>
+          </w:tcPr>
+          <w:p>
+            <w:pPr>
+              <w:pStyle w:val="BodyText"/>
+              <w:spacing w:before="20" w:after="20"/>
+              <w:jc w:val="left"/>
+            </w:pPr>
+            <w:r>
+              <w:rPr>
+                <w:sz w:val="20"/>
+              </w:rPr>
+              <w:t xml:space="preserve">Measured peak at 12,288 tokens</w:t>
+            </w:r>
+          </w:p>
+        </w:tc>
+        <w:tc>
+          <w:tcPr>
+            <w:tcW w:w="2000" w:type="dxa"/>
+          </w:tcPr>
+          <w:p>
+            <w:pPr>
+              <w:pStyle w:val="BodyText"/>
+              <w:spacing w:before="20" w:after="20"/>
+              <w:jc w:val="left"/>
+            </w:pPr>
+            <w:r>
+              <w:rPr>
+                <w:sz w:val="20"/>
+              </w:rPr>
+              <w:t xml:space="preserve">27.2</w:t>
             </w:r>
           </w:p>
         </w:tc>
@@ -3178,7 +3207,7 @@
               <w:rPr>
                 <w:sz w:val="20"/>
               </w:rPr>
-              <w:t xml:space="preserve">Within the 32 GB GPU allocation at 8,192 tokens; resumed run matches</w:t>
+              <w:t xml:space="preserve">Within the 32 GB GPU allocation at 12,288 tokens; resumed run matches</w:t>
             </w:r>
           </w:p>
         </w:tc>

</xml_diff>

<commit_message>
Outline: early reject on the six-language test, two days per gate pass
A round whose bug-fix loss isn't clearly lower stops after a random third of the items unless ahead of the best. One gate pass takes about two days. Duplicate risk and HumanEval/32 notes folded in to keep chapter 3 on its pages. 3,941 words.
</commit_message>
<xml_diff>
--- a/dissertation/Anneal_Dissertation_Outline.docx
+++ b/dissertation/Anneal_Dissertation_Outline.docx
@@ -1469,7 +1469,7 @@
         <w:pStyle w:val="BodyText"/>
       </w:pPr>
       <w:r>
-        <w:t xml:space="preserve">In summary, QLoRA fixes the training configuration; LoRA and Biderman et al. frame what to expect and which hyperparameters to test; LongLoRA and RULER define the long-context risk; and SWE-bench shapes the realistic tasks. Anneal combines these at 256k context, on AMD hardware, within 32 GB, and reports the outcome openly.</w:t>
+        <w:t xml:space="preserve">In summary, QLoRA fixes the training configuration, LoRA and Biderman et al. frame expectations, LongLoRA and RULER define the long-context risk, and SWE-bench shapes the realistic tasks. Anneal combines these at 256k context, on AMD hardware, within 32 GB.</w:t>
       </w:r>
     </w:p>
     <w:p>
@@ -2358,7 +2358,7 @@
         <w:pStyle w:val="BodyFirst"/>
       </w:pPr>
       <w:r>
-        <w:t xml:space="preserve">From round 1, the loop trains only on public datasets, never on the base model's own rows, which would reinforce its biases. Every row must carry its teacher's real reasoning, and the teacher must match or beat Qwen3.8-27B on the Vals AI board for that task, where all models share one harness. Each round takes 45% from test-passed bug-fix runs in real TypeScript, Go, JavaScript and other non-Python repositories by DeepSeek V4-Flash-0731 </w:t>
+        <w:t xml:space="preserve">From round 1, the loop trains only on public datasets, never on the base model's own rows, which would reinforce its biases. Every row must carry its teacher's real reasoning, and the teacher must match or beat Qwen3.8-27B on the same-harness Vals AI board for that task. Each round takes 45% from test-passed bug-fix runs in TypeScript, Go, JavaScript and other non-Python repositories by DeepSeek V4-Flash-0731 </w:t>
       </w:r>
       <w:fldSimple w:instr=" REF _RefAnneal20 \r \h ">
         <w:r>
@@ -2514,7 +2514,7 @@
         </w:r>
       </w:fldSimple>
       <w:r>
-        <w:t xml:space="preserve"> items, never trained on or reported: write a program in C++, Java, Go, Rust, JavaScript or TypeScript (286), or fix a wrong C++ or Java submission (209), each built and run on up to 30 tests. A round is kept if a one-sided exact sign test against the best adapter gives p ≤ 0.05, or if its score is no lower and its loss falls on significantly more of 177 held-out bug-fix steps than it rises, since contest items cannot see what bug-fix rows teach. Either way, neither part nor 100 MMLU-Pro </w:t>
+        <w:t xml:space="preserve"> items, never trained on or reported: write a program in C++, Java, Go, Rust, JavaScript or TypeScript (286), or fix a wrong C++ or Java submission (209), each run on up to 30 tests. A round is kept if a one-sided exact sign test against the best adapter gives p ≤ 0.05, or if its score is no lower and its loss falls on significantly more of 177 held-out bug-fix steps than it rises, since contest items cannot see what bug-fix rows teach. Either way, neither part nor 100 MMLU-Pro </w:t>
       </w:r>
       <w:fldSimple w:instr=" REF _RefAnneal38 \r \h ">
         <w:r>
@@ -2522,7 +2522,7 @@
         </w:r>
       </w:fldSimple>
       <w:r>
-        <w:t xml:space="preserve"> questions outside computing may drop by over 5 points or significantly, and a fresh-seed re-score becomes the new reference. A rejected round's rows roll into the next attempt, up to 3,000 new rows, because a real 2-point gain passes the gate only 24 to 44% of the time (power calculation). EvalPlus, scored only on kept adapters, never selects them.</w:t>
+        <w:t xml:space="preserve"> questions outside computing may drop by over 5 points or significantly, and a fresh-seed re-score becomes the new reference. Unless its loss is clearly lower, a round stops, rejected, after a random third of the items if not ahead of the best; in simulation this cut the test time of non-improving rounds by a third for 5 to 7% fewer real keeps. A rejected round's rows roll into the next attempt, up to 3,000 new rows, because a real 2-point gain passes the gate only 24 to 44% of the time (power calculation, first gate). EvalPlus, scored only on kept adapters, never selects them.</w:t>
       </w:r>
     </w:p>
     <w:p>
@@ -2563,7 +2563,7 @@
         <w:pStyle w:val="BodyText"/>
       </w:pPr>
       <w:r>
-        <w:t xml:space="preserve">Small test fixtures caught four silent bugs, all fixed: the unit-test filter passed every answer, length was checked in characters so over-length rows could be truncated, the targets missed the 48 DeltaNet layers' projections, and a seed set after adapter creation made identical runs diverge from step 3.</w:t>
+        <w:t xml:space="preserve">Small test fixtures caught four silent bugs, all fixed, including a unit-test filter that passed every answer and targets that missed the 48 DeltaNet layers' projections.</w:t>
       </w:r>
     </w:p>
     <w:p>
@@ -3004,7 +3004,7 @@
         <w:pStyle w:val="BodyFirst"/>
       </w:pPr>
       <w:r>
-        <w:t xml:space="preserve">The evaluation script serves the model through llama.cpp at the full 262k context with thinking on and scores HumanEval+ and MBPP+ with the Windows EvalPlus port. HumanEval+ is also reported without HumanEval/32, which fails every solution through an EvalPlus 0.3.1 bug. A 20-problem calibration chose four parallel requests without multi-token prediction (MTP), 29.2 tokens per second in total; a 542-problem pass took 10 to 12 hours, as full answers reason longer than in calibration.</w:t>
+        <w:t xml:space="preserve">The evaluation script serves the model through llama.cpp at the full 262k context with thinking on and scores HumanEval+ and MBPP+ with the Windows EvalPlus port. Calibration chose four parallel requests without multi-token prediction (MTP) for throughput; a 542-problem pass takes 10 to 12 hours.</w:t>
       </w:r>
     </w:p>
     <w:p>
@@ -3028,7 +3028,7 @@
         <w:pStyle w:val="BodyFirst"/>
       </w:pPr>
       <w:r>
-        <w:t xml:space="preserve">The measurement-first design has paid off: the parity test caught a wrong fix before any real run used it. Speed and memory were measured only at rank 16. The Windows workarounds (a bundled C compiler, the convolution rewrite, disabled Vulkan kernels) could break on an update, so versions are pinned. With 20 to 50 personal tasks, confidence intervals will be wide. HumanEval+ and MBPP+ are Python-only, while the loop trains mostly on other languages, so EvalPlus may understate gains that the gate measures. Round 0 showed that a correctly working pipeline can still fail to improve a strong base.</w:t>
+        <w:t xml:space="preserve">The measurement-first design has paid off: the parity test caught a wrong fix before any real run used it. Speed and memory were measured only at rank 16. One gate pass takes about two days, which limits how many rounds fit. With 20 to 50 personal tasks, confidence intervals will be wide. HumanEval+ and MBPP+ are Python-only, while the loop trains mostly on other languages, so EvalPlus may understate gains that the gate measures. Round 0 showed that a correctly working pipeline can still fail to improve a strong base.</w:t>
       </w:r>
     </w:p>
     <w:p>
@@ -3619,7 +3619,7 @@
         <w:pStyle w:val="BodyFirst"/>
       </w:pPr>
       <w:r>
-        <w:t xml:space="preserve">Round 0 is scored (Section 3.4), and the loop starts from the base model. Of about 136 usable machine days from November to March, roughly 15 go to ablations and 20 to evaluation; loop rounds use the rest, since only one job can use the GPU at a time.</w:t>
+        <w:t xml:space="preserve">Round 0 is scored (Section 3.4), and the loop starts from the base model. Of about 136 usable machine days from November to March, roughly 15 go to ablations and 20 to evaluation; loop rounds use the rest.</w:t>
       </w:r>
     </w:p>
     <w:tbl>

</xml_diff>

<commit_message>
Outline: describe the rejected agent-session sets without naming one
Table 1 says public agent-session sets lack raw reasoning, and that dataset's reference is removed, so the reference numbers close up. 3,941 words.
</commit_message>
<xml_diff>
--- a/dissertation/Anneal_Dissertation_Outline.docx
+++ b/dissertation/Anneal_Dissertation_Outline.docx
@@ -1365,7 +1365,7 @@
               <w:rPr>
                 <w:sz w:val="20"/>
               </w:rPr>
-              <w:t xml:space="preserve"> traces only in the first run; human-written sets lack traces; agent-session sets </w:t>
+              <w:t xml:space="preserve"> traces only in the first run; human-written sets lack traces; public agent-session sets lack raw reasoning; API-generated rows are not public; SWE-Gym </w:t>
             </w:r>
             <w:fldSimple w:instr=" REF _RefAnneal25 \r \h ">
               <w:r>
@@ -1373,20 +1373,6 @@
                   <w:sz w:val="20"/>
                 </w:rPr>
                 <w:t xml:space="preserve">[25]</w:t>
-              </w:r>
-            </w:fldSimple>
-            <w:r>
-              <w:rPr>
-                <w:sz w:val="20"/>
-              </w:rPr>
-              <w:t xml:space="preserve"> lack raw reasoning; API-generated rows are not public; SWE-Gym </w:t>
-            </w:r>
-            <w:fldSimple w:instr=" REF _RefAnneal26 \r \h ">
-              <w:r>
-                <w:rPr>
-                  <w:sz w:val="20"/>
-                </w:rPr>
-                <w:t xml:space="preserve">[26]</w:t>
               </w:r>
             </w:fldSimple>
             <w:r>
@@ -1577,9 +1563,9 @@
       <w:r>
         <w:t xml:space="preserve"> changes two large terms (Table 2): Qwen3.8's 248,320-token vocabulary makes the standard loss expensive, and Cut Cross-Entropy, which cut Gemma 2's classifier-head training memory from 28 GB to 1 GB </w:t>
       </w:r>
-      <w:fldSimple w:instr=" REF _RefAnneal27 \r \h ">
+      <w:fldSimple w:instr=" REF _RefAnneal26 \r \h ">
         <w:r>
-          <w:t xml:space="preserve">[27]</w:t>
+          <w:t xml:space="preserve">[26]</w:t>
         </w:r>
       </w:fldSimple>
       <w:r>
@@ -2368,6 +2354,14 @@
       <w:r>
         <w:t xml:space="preserve">, which beats the base on LiveCodeBench, SWE-bench Verified and Terminal-Bench (87.3, 88.8 and 67.0 against 84.0, 86.0 and 58.4 </w:t>
       </w:r>
+      <w:fldSimple w:instr=" REF _RefAnneal27 \r \h ">
+        <w:r>
+          <w:t xml:space="preserve">[27]</w:t>
+        </w:r>
+      </w:fldSimple>
+      <w:r>
+        <w:t xml:space="preserve">, </w:t>
+      </w:r>
       <w:fldSimple w:instr=" REF _RefAnneal28 \r \h ">
         <w:r>
           <w:t xml:space="preserve">[28]</w:t>
@@ -2382,7 +2376,31 @@
         </w:r>
       </w:fldSimple>
       <w:r>
+        <w:t xml:space="preserve">); 30% from test-passed Linux terminal runs by GLM-5.3 </w:t>
+      </w:r>
+      <w:fldSimple w:instr=" REF _RefAnneal21 \r \h ">
+        <w:r>
+          <w:t xml:space="preserve">[21]</w:t>
+        </w:r>
+      </w:fldSimple>
+      <w:r>
+        <w:t xml:space="preserve"> (Terminal-Bench 71.5); and 25% from DeepSeek-V4-Pro coding answers </w:t>
+      </w:r>
+      <w:fldSimple w:instr=" REF _RefAnneal22 \r \h ">
+        <w:r>
+          <w:t xml:space="preserve">[22]</w:t>
+        </w:r>
+      </w:fldSimple>
+      <w:r>
         <w:t xml:space="preserve">, </w:t>
+      </w:r>
+      <w:fldSimple w:instr=" REF _RefAnneal23 \r \h ">
+        <w:r>
+          <w:t xml:space="preserve">[23]</w:t>
+        </w:r>
+      </w:fldSimple>
+      <w:r>
+        <w:t xml:space="preserve">, a teacher ahead only on LiveCodeBench (87.5). Rows using Python, and maths </w:t>
       </w:r>
       <w:fldSimple w:instr=" REF _RefAnneal30 \r \h ">
         <w:r>
@@ -2390,31 +2408,27 @@
         </w:r>
       </w:fldSimple>
       <w:r>
-        <w:t xml:space="preserve">); 30% from test-passed Linux terminal runs by GLM-5.3 </w:t>
-      </w:r>
-      <w:fldSimple w:instr=" REF _RefAnneal21 \r \h ">
-        <w:r>
-          <w:t xml:space="preserve">[21]</w:t>
-        </w:r>
-      </w:fldSimple>
-      <w:r>
-        <w:t xml:space="preserve"> (Terminal-Bench 71.5); and 25% from DeepSeek-V4-Pro coding answers </w:t>
-      </w:r>
-      <w:fldSimple w:instr=" REF _RefAnneal22 \r \h ">
-        <w:r>
-          <w:t xml:space="preserve">[22]</w:t>
-        </w:r>
-      </w:fldSimple>
-      <w:r>
-        <w:t xml:space="preserve">, </w:t>
-      </w:r>
-      <w:fldSimple w:instr=" REF _RefAnneal23 \r \h ">
-        <w:r>
-          <w:t xml:space="preserve">[23]</w:t>
-        </w:r>
-      </w:fldSimple>
-      <w:r>
-        <w:t xml:space="preserve">, a teacher ahead only on LiveCodeBench (87.5). Rows using Python, and maths </w:t>
+        <w:t xml:space="preserve">, wait until these run out. </w:t>
+      </w:r>
+      <w:r>
+        <w:rPr>
+          <w:rFonts w:ascii="Consolas" w:hAnsi="Consolas" w:cs="Consolas"/>
+          <w:sz w:val="19"/>
+        </w:rPr>
+        <w:t xml:space="preserve">prepare_dataset.py</w:t>
+      </w:r>
+      <w:r>
+        <w:t xml:space="preserve"> keeps rows with a </w:t>
+      </w:r>
+      <w:r>
+        <w:rPr>
+          <w:rFonts w:ascii="Consolas" w:hAnsi="Consolas" w:cs="Consolas"/>
+          <w:sz w:val="19"/>
+        </w:rPr>
+        <w:t xml:space="preserve">&lt;think&gt;</w:t>
+      </w:r>
+      <w:r>
+        <w:t xml:space="preserve"> trace, drops over-length rows and removes near-duplicates of evaluation prompts. An embedding search on the otherwise idle NPU also flags reworded copies, which n-gram checks miss </w:t>
       </w:r>
       <w:fldSimple w:instr=" REF _RefAnneal31 \r \h ">
         <w:r>
@@ -2422,27 +2436,15 @@
         </w:r>
       </w:fldSimple>
       <w:r>
-        <w:t xml:space="preserve">, wait until these run out. </w:t>
-      </w:r>
-      <w:r>
-        <w:rPr>
-          <w:rFonts w:ascii="Consolas" w:hAnsi="Consolas" w:cs="Consolas"/>
-          <w:sz w:val="19"/>
-        </w:rPr>
-        <w:t xml:space="preserve">prepare_dataset.py</w:t>
-      </w:r>
-      <w:r>
-        <w:t xml:space="preserve"> keeps rows with a </w:t>
-      </w:r>
-      <w:r>
-        <w:rPr>
-          <w:rFonts w:ascii="Consolas" w:hAnsi="Consolas" w:cs="Consolas"/>
-          <w:sz w:val="19"/>
-        </w:rPr>
-        <w:t xml:space="preserve">&lt;think&gt;</w:t>
-      </w:r>
-      <w:r>
-        <w:t xml:space="preserve"> trace, drops over-length rows and removes near-duplicates of evaluation prompts. An embedding search on the otherwise idle NPU also flags reworded copies, which n-gram checks miss </w:t>
+        <w:t xml:space="preserve">; in the first pools it flagged 33 of 15,276 rows without measurably slowing training.</w:t>
+      </w:r>
+    </w:p>
+    <w:p>
+      <w:pPr>
+        <w:pStyle w:val="BodyText"/>
+      </w:pPr>
+      <w:r>
+        <w:t xml:space="preserve">The first run, round 0, is a comparison run using the model's own rows: 500 base-model answers to OpenCodeInstruct </w:t>
       </w:r>
       <w:fldSimple w:instr=" REF _RefAnneal32 \r \h ">
         <w:r>
@@ -2450,15 +2452,7 @@
         </w:r>
       </w:fldSimple>
       <w:r>
-        <w:t xml:space="preserve">; in the first pools it flagged 33 of 15,276 rows without measurably slowing training.</w:t>
-      </w:r>
-    </w:p>
-    <w:p>
-      <w:pPr>
-        <w:pStyle w:val="BodyText"/>
-      </w:pPr>
-      <w:r>
-        <w:t xml:space="preserve">The first run, round 0, is a comparison run using the model's own rows: 500 base-model answers to OpenCodeInstruct </w:t>
+        <w:t xml:space="preserve"> prompts that passed their tests, as in ReST-EM </w:t>
       </w:r>
       <w:fldSimple w:instr=" REF _RefAnneal33 \r \h ">
         <w:r>
@@ -2466,7 +2460,7 @@
         </w:r>
       </w:fldSimple>
       <w:r>
-        <w:t xml:space="preserve"> prompts that passed their tests, as in ReST-EM </w:t>
+        <w:t xml:space="preserve">, plus 1,500 OpenCodeReasoning rows, whose DeepSeek-R1 teacher scores only 63.5 on LiveCodeBench </w:t>
       </w:r>
       <w:fldSimple w:instr=" REF _RefAnneal34 \r \h ">
         <w:r>
@@ -2474,7 +2468,23 @@
         </w:r>
       </w:fldSimple>
       <w:r>
-        <w:t xml:space="preserve">, plus 1,500 OpenCodeReasoning rows, whose DeepSeek-R1 teacher scores only 63.5 on LiveCodeBench </w:t>
+        <w:t xml:space="preserve">. Traces hitting the 6,144-token budget were rejected, so kept traces are short (median 436 tokens). Model-written code runs in a Windows AppContainer sandbox without network, file or administrator access, which passed 264 escape checks.</w:t>
+      </w:r>
+    </w:p>
+    <w:p>
+      <w:pPr>
+        <w:pStyle w:val="Heading2"/>
+      </w:pPr>
+      <w:r>
+        <w:t xml:space="preserve">Training</w:t>
+      </w:r>
+    </w:p>
+    <w:p>
+      <w:pPr>
+        <w:pStyle w:val="BodyFirst"/>
+      </w:pPr>
+      <w:r>
+        <w:t xml:space="preserve">Training runs as an unattended keep-if-better loop. Round 1 starts from the base model, never the first-run adapter; each later round continues the best adapter on 1,000 new rows plus 25% replayed from earlier rows, re-warming and decaying the learning rate, which in continual pre-training matched retraining on all data </w:t>
       </w:r>
       <w:fldSimple w:instr=" REF _RefAnneal35 \r \h ">
         <w:r>
@@ -2482,23 +2492,7 @@
         </w:r>
       </w:fldSimple>
       <w:r>
-        <w:t xml:space="preserve">. Traces hitting the 6,144-token budget were rejected, so kept traces are short (median 436 tokens). Model-written code runs in a Windows AppContainer sandbox without network, file or administrator access, which passed 264 escape checks.</w:t>
-      </w:r>
-    </w:p>
-    <w:p>
-      <w:pPr>
-        <w:pStyle w:val="Heading2"/>
-      </w:pPr>
-      <w:r>
-        <w:t xml:space="preserve">Training</w:t>
-      </w:r>
-    </w:p>
-    <w:p>
-      <w:pPr>
-        <w:pStyle w:val="BodyFirst"/>
-      </w:pPr>
-      <w:r>
-        <w:t xml:space="preserve">Training runs as an unattended keep-if-better loop. Round 1 starts from the base model, never the first-run adapter; each later round continues the best adapter on 1,000 new rows plus 25% replayed from earlier rows, re-warming and decaying the learning rate, which in continual pre-training matched retraining on all data </w:t>
+        <w:t xml:space="preserve">. Each round is scored on a held-out gate of 495 decontaminated CodeContests </w:t>
       </w:r>
       <w:fldSimple w:instr=" REF _RefAnneal36 \r \h ">
         <w:r>
@@ -2506,7 +2500,7 @@
         </w:r>
       </w:fldSimple>
       <w:r>
-        <w:t xml:space="preserve">. Each round is scored on a held-out gate of 495 decontaminated CodeContests </w:t>
+        <w:t xml:space="preserve"> items, never trained on or reported: write a program in C++, Java, Go, Rust, JavaScript or TypeScript (286), or fix a wrong C++ or Java submission (209), each run on up to 30 tests. A round is kept if a one-sided exact sign test against the best adapter gives p ≤ 0.05, or if its score is no lower and its loss falls on significantly more of 177 held-out bug-fix steps than it rises, since contest items cannot see what bug-fix rows teach. Either way, neither part nor 100 MMLU-Pro </w:t>
       </w:r>
       <w:fldSimple w:instr=" REF _RefAnneal37 \r \h ">
         <w:r>
@@ -2514,14 +2508,6 @@
         </w:r>
       </w:fldSimple>
       <w:r>
-        <w:t xml:space="preserve"> items, never trained on or reported: write a program in C++, Java, Go, Rust, JavaScript or TypeScript (286), or fix a wrong C++ or Java submission (209), each run on up to 30 tests. A round is kept if a one-sided exact sign test against the best adapter gives p ≤ 0.05, or if its score is no lower and its loss falls on significantly more of 177 held-out bug-fix steps than it rises, since contest items cannot see what bug-fix rows teach. Either way, neither part nor 100 MMLU-Pro </w:t>
-      </w:r>
-      <w:fldSimple w:instr=" REF _RefAnneal38 \r \h ">
-        <w:r>
-          <w:t xml:space="preserve">[38]</w:t>
-        </w:r>
-      </w:fldSimple>
-      <w:r>
         <w:t xml:space="preserve"> questions outside computing may drop by over 5 points or significantly, and a fresh-seed re-score becomes the new reference. Unless its loss is clearly lower, a round stops, rejected, after a random third of the items if not ahead of the best; in simulation this cut the test time of non-improving rounds by a third for 5 to 7% fewer real keeps. A rejected round's rows roll into the next attempt, up to 3,000 new rows, because a real 2-point gain passes the gate only 24 to 44% of the time (power calculation, first gate). EvalPlus, scored only on kept adapters, never selects them.</w:t>
       </w:r>
     </w:p>
@@ -2539,9 +2525,9 @@
       <w:r>
         <w:t xml:space="preserve"> uses a warmup-stable-decay schedule </w:t>
       </w:r>
-      <w:fldSimple w:instr=" REF _RefAnneal39 \r \h ">
+      <w:fldSimple w:instr=" REF _RefAnneal38 \r \h ">
         <w:r>
-          <w:t xml:space="preserve">[39]</w:t>
+          <w:t xml:space="preserve">[38]</w:t>
         </w:r>
       </w:fldSimple>
       <w:r>
@@ -3553,9 +3539,9 @@
       <w:r>
         <w:t xml:space="preserve"> Published results suggest small, flattening gains: supervised fine-tuning gains are log-linear in data and smaller for stronger models </w:t>
       </w:r>
-      <w:fldSimple w:instr=" REF _RefAnneal40 \r \h ">
+      <w:fldSimple w:instr=" REF _RefAnneal39 \r \h ">
         <w:r>
-          <w:t xml:space="preserve">[40]</w:t>
+          <w:t xml:space="preserve">[39]</w:t>
         </w:r>
       </w:fldSimple>
       <w:r>
@@ -5375,37 +5361,6 @@
       </w:pPr>
       <w:bookmarkStart w:id="925" w:name="_RefAnneal25"/>
       <w:r>
-        <w:t xml:space="preserve">Public agent-session dataset card, Hugging Face, 2026. </w:t>
-      </w:r>
-      <w:r>
-        <w:t xml:space="preserve">[Online]. Available: </w:t>
-      </w:r>
-      <w:hyperlink r:id="rId46">
-        <w:r>
-          <w:rPr>
-            <w:color w:val="0563C1"/>
-            <w:u w:val="single"/>
-          </w:rPr>
-          <w:t xml:space="preserve">https://huggingface.co/datasets</w:t>
-        </w:r>
-      </w:hyperlink>
-      <w:r>
-        <w:t xml:space="preserve"> (accessed Oct. 17, 2026).</w:t>
-      </w:r>
-      <w:bookmarkEnd w:id="925"/>
-    </w:p>
-    <w:p>
-      <w:pPr>
-        <w:pStyle w:val="Reference"/>
-        <w:tabs>
-          <w:tab w:val="clear" w:pos="426"/>
-          <w:tab w:val="num" w:pos="567"/>
-        </w:tabs>
-        <w:ind w:left="567" w:hanging="567"/>
-        <w:jc w:val="left"/>
-      </w:pPr>
-      <w:bookmarkStart w:id="926" w:name="_RefAnneal26"/>
-      <w:r>
         <w:t xml:space="preserve">J. Pan </w:t>
       </w:r>
       <w:r>
@@ -5429,7 +5384,7 @@
       <w:r>
         <w:t xml:space="preserve">[Online]. Available: </w:t>
       </w:r>
-      <w:hyperlink r:id="rId47">
+      <w:hyperlink r:id="rId46">
         <w:r>
           <w:rPr>
             <w:color w:val="0563C1"/>
@@ -5438,7 +5393,7 @@
           <w:t xml:space="preserve">https://proceedings.mlr.press/v267/pan25g.html</w:t>
         </w:r>
       </w:hyperlink>
-      <w:bookmarkEnd w:id="926"/>
+      <w:bookmarkEnd w:id="925"/>
     </w:p>
     <w:p>
       <w:pPr>
@@ -5450,7 +5405,7 @@
         <w:ind w:left="567" w:hanging="567"/>
         <w:jc w:val="left"/>
       </w:pPr>
-      <w:bookmarkStart w:id="927" w:name="_RefAnneal27"/>
+      <w:bookmarkStart w:id="926" w:name="_RefAnneal26"/>
       <w:r>
         <w:t xml:space="preserve">E. Wijmans, B. Huval, A. Hertzberg, V. Koltun, and P. Krähenbühl, "Cut your losses in large-vocabulary language models," in </w:t>
       </w:r>
@@ -5466,7 +5421,7 @@
       <w:r>
         <w:t xml:space="preserve">[Online]. Available: </w:t>
       </w:r>
-      <w:hyperlink r:id="rId48">
+      <w:hyperlink r:id="rId47">
         <w:r>
           <w:rPr>
             <w:color w:val="0563C1"/>
@@ -5475,7 +5430,7 @@
           <w:t xml:space="preserve">https://arxiv.org/abs/2411.09009</w:t>
         </w:r>
       </w:hyperlink>
-      <w:bookmarkEnd w:id="927"/>
+      <w:bookmarkEnd w:id="926"/>
     </w:p>
     <w:p>
       <w:pPr>
@@ -5487,14 +5442,14 @@
         <w:ind w:left="567" w:hanging="567"/>
         <w:jc w:val="left"/>
       </w:pPr>
-      <w:bookmarkStart w:id="928" w:name="_RefAnneal28"/>
+      <w:bookmarkStart w:id="927" w:name="_RefAnneal27"/>
       <w:r>
         <w:t xml:space="preserve">Vals AI, "LiveCodeBench leaderboard," 2026. </w:t>
       </w:r>
       <w:r>
         <w:t xml:space="preserve">[Online]. Available: </w:t>
       </w:r>
-      <w:hyperlink r:id="rId49">
+      <w:hyperlink r:id="rId48">
         <w:r>
           <w:rPr>
             <w:color w:val="0563C1"/>
@@ -5506,7 +5461,7 @@
       <w:r>
         <w:t xml:space="preserve"> (accessed Oct. 21, 2026).</w:t>
       </w:r>
-      <w:bookmarkEnd w:id="928"/>
+      <w:bookmarkEnd w:id="927"/>
     </w:p>
     <w:p>
       <w:pPr>
@@ -5518,14 +5473,14 @@
         <w:ind w:left="567" w:hanging="567"/>
         <w:jc w:val="left"/>
       </w:pPr>
-      <w:bookmarkStart w:id="929" w:name="_RefAnneal29"/>
+      <w:bookmarkStart w:id="928" w:name="_RefAnneal28"/>
       <w:r>
         <w:t xml:space="preserve">Vals AI, "SWE-bench Verified leaderboard," 2026. </w:t>
       </w:r>
       <w:r>
         <w:t xml:space="preserve">[Online]. Available: </w:t>
       </w:r>
-      <w:hyperlink r:id="rId50">
+      <w:hyperlink r:id="rId49">
         <w:r>
           <w:rPr>
             <w:color w:val="0563C1"/>
@@ -5537,7 +5492,7 @@
       <w:r>
         <w:t xml:space="preserve"> (accessed Oct. 21, 2026).</w:t>
       </w:r>
-      <w:bookmarkEnd w:id="929"/>
+      <w:bookmarkEnd w:id="928"/>
     </w:p>
     <w:p>
       <w:pPr>
@@ -5549,14 +5504,14 @@
         <w:ind w:left="567" w:hanging="567"/>
         <w:jc w:val="left"/>
       </w:pPr>
-      <w:bookmarkStart w:id="930" w:name="_RefAnneal30"/>
+      <w:bookmarkStart w:id="929" w:name="_RefAnneal29"/>
       <w:r>
         <w:t xml:space="preserve">Vals AI, "Terminal-Bench 2.1 leaderboard," 2026. </w:t>
       </w:r>
       <w:r>
         <w:t xml:space="preserve">[Online]. Available: </w:t>
       </w:r>
-      <w:hyperlink r:id="rId51">
+      <w:hyperlink r:id="rId50">
         <w:r>
           <w:rPr>
             <w:color w:val="0563C1"/>
@@ -5568,7 +5523,7 @@
       <w:r>
         <w:t xml:space="preserve"> (accessed Oct. 21, 2026).</w:t>
       </w:r>
-      <w:bookmarkEnd w:id="930"/>
+      <w:bookmarkEnd w:id="929"/>
     </w:p>
     <w:p>
       <w:pPr>
@@ -5580,14 +5535,14 @@
         <w:ind w:left="567" w:hanging="567"/>
         <w:jc w:val="left"/>
       </w:pPr>
-      <w:bookmarkStart w:id="931" w:name="_RefAnneal31"/>
+      <w:bookmarkStart w:id="930" w:name="_RefAnneal30"/>
       <w:r>
         <w:t xml:space="preserve">NVIDIA, "Nemotron-SFT-Math-v4," Hugging Face dataset card, 2026. </w:t>
       </w:r>
       <w:r>
         <w:t xml:space="preserve">[Online]. Available: </w:t>
       </w:r>
-      <w:hyperlink r:id="rId52">
+      <w:hyperlink r:id="rId51">
         <w:r>
           <w:rPr>
             <w:color w:val="0563C1"/>
@@ -5599,7 +5554,7 @@
       <w:r>
         <w:t xml:space="preserve"> (accessed Oct. 17, 2026).</w:t>
       </w:r>
-      <w:bookmarkEnd w:id="931"/>
+      <w:bookmarkEnd w:id="930"/>
     </w:p>
     <w:p>
       <w:pPr>
@@ -5611,14 +5566,14 @@
         <w:ind w:left="567" w:hanging="567"/>
         <w:jc w:val="left"/>
       </w:pPr>
-      <w:bookmarkStart w:id="932" w:name="_RefAnneal32"/>
+      <w:bookmarkStart w:id="931" w:name="_RefAnneal31"/>
       <w:r>
         <w:t xml:space="preserve">S. Yang, W.-L. Chiang, L. Zheng, J. E. Gonzalez, and I. Stoica, "Rethinking benchmark and contamination for language models with rephrased samples," arXiv preprint arXiv:2311.04850, 2023. </w:t>
       </w:r>
       <w:r>
         <w:t xml:space="preserve">[Online]. Available: </w:t>
       </w:r>
-      <w:hyperlink r:id="rId53">
+      <w:hyperlink r:id="rId52">
         <w:r>
           <w:rPr>
             <w:color w:val="0563C1"/>
@@ -5627,7 +5582,7 @@
           <w:t xml:space="preserve">https://arxiv.org/abs/2311.04850</w:t>
         </w:r>
       </w:hyperlink>
-      <w:bookmarkEnd w:id="932"/>
+      <w:bookmarkEnd w:id="931"/>
     </w:p>
     <w:p>
       <w:pPr>
@@ -5639,7 +5594,7 @@
         <w:ind w:left="567" w:hanging="567"/>
         <w:jc w:val="left"/>
       </w:pPr>
-      <w:bookmarkStart w:id="933" w:name="_RefAnneal33"/>
+      <w:bookmarkStart w:id="932" w:name="_RefAnneal32"/>
       <w:r>
         <w:t xml:space="preserve">W. U. Ahmad </w:t>
       </w:r>
@@ -5655,7 +5610,7 @@
       <w:r>
         <w:t xml:space="preserve">[Online]. Available: </w:t>
       </w:r>
-      <w:hyperlink r:id="rId54">
+      <w:hyperlink r:id="rId53">
         <w:r>
           <w:rPr>
             <w:color w:val="0563C1"/>
@@ -5664,7 +5619,7 @@
           <w:t xml:space="preserve">https://arxiv.org/abs/2504.04030</w:t>
         </w:r>
       </w:hyperlink>
-      <w:bookmarkEnd w:id="933"/>
+      <w:bookmarkEnd w:id="932"/>
     </w:p>
     <w:p>
       <w:pPr>
@@ -5676,7 +5631,7 @@
         <w:ind w:left="567" w:hanging="567"/>
         <w:jc w:val="left"/>
       </w:pPr>
-      <w:bookmarkStart w:id="934" w:name="_RefAnneal34"/>
+      <w:bookmarkStart w:id="933" w:name="_RefAnneal33"/>
       <w:r>
         <w:t xml:space="preserve">A. Singh </w:t>
       </w:r>
@@ -5692,7 +5647,7 @@
       <w:r>
         <w:t xml:space="preserve">[Online]. Available: </w:t>
       </w:r>
-      <w:hyperlink r:id="rId55">
+      <w:hyperlink r:id="rId54">
         <w:r>
           <w:rPr>
             <w:color w:val="0563C1"/>
@@ -5701,7 +5656,7 @@
           <w:t xml:space="preserve">https://arxiv.org/abs/2312.06585</w:t>
         </w:r>
       </w:hyperlink>
-      <w:bookmarkEnd w:id="934"/>
+      <w:bookmarkEnd w:id="933"/>
     </w:p>
     <w:p>
       <w:pPr>
@@ -5713,14 +5668,14 @@
         <w:ind w:left="567" w:hanging="567"/>
         <w:jc w:val="left"/>
       </w:pPr>
-      <w:bookmarkStart w:id="935" w:name="_RefAnneal35"/>
+      <w:bookmarkStart w:id="934" w:name="_RefAnneal34"/>
       <w:r>
         <w:t xml:space="preserve">DeepSeek-AI, "DeepSeek-R1-0528," Hugging Face model card, 2025. </w:t>
       </w:r>
       <w:r>
         <w:t xml:space="preserve">[Online]. Available: </w:t>
       </w:r>
-      <w:hyperlink r:id="rId56">
+      <w:hyperlink r:id="rId55">
         <w:r>
           <w:rPr>
             <w:color w:val="0563C1"/>
@@ -5732,7 +5687,7 @@
       <w:r>
         <w:t xml:space="preserve"> (accessed Oct. 17, 2026).</w:t>
       </w:r>
-      <w:bookmarkEnd w:id="935"/>
+      <w:bookmarkEnd w:id="934"/>
     </w:p>
     <w:p>
       <w:pPr>
@@ -5744,7 +5699,7 @@
         <w:ind w:left="567" w:hanging="567"/>
         <w:jc w:val="left"/>
       </w:pPr>
-      <w:bookmarkStart w:id="936" w:name="_RefAnneal36"/>
+      <w:bookmarkStart w:id="935" w:name="_RefAnneal35"/>
       <w:r>
         <w:t xml:space="preserve">A. Ibrahim </w:t>
       </w:r>
@@ -5769,7 +5724,7 @@
       <w:r>
         <w:t xml:space="preserve">[Online]. Available: </w:t>
       </w:r>
-      <w:hyperlink r:id="rId57">
+      <w:hyperlink r:id="rId56">
         <w:r>
           <w:rPr>
             <w:color w:val="0563C1"/>
@@ -5778,7 +5733,7 @@
           <w:t xml:space="preserve">https://arxiv.org/abs/2403.08763</w:t>
         </w:r>
       </w:hyperlink>
-      <w:bookmarkEnd w:id="936"/>
+      <w:bookmarkEnd w:id="935"/>
     </w:p>
     <w:p>
       <w:pPr>
@@ -5790,7 +5745,7 @@
         <w:ind w:left="567" w:hanging="567"/>
         <w:jc w:val="left"/>
       </w:pPr>
-      <w:bookmarkStart w:id="937" w:name="_RefAnneal37"/>
+      <w:bookmarkStart w:id="936" w:name="_RefAnneal36"/>
       <w:r>
         <w:t xml:space="preserve">Y. Li </w:t>
       </w:r>
@@ -5815,7 +5770,7 @@
       <w:r>
         <w:t xml:space="preserve">[Online]. Available: </w:t>
       </w:r>
-      <w:hyperlink r:id="rId58">
+      <w:hyperlink r:id="rId57">
         <w:r>
           <w:rPr>
             <w:color w:val="0563C1"/>
@@ -5824,7 +5779,7 @@
           <w:t xml:space="preserve">https://arxiv.org/abs/2203.07814</w:t>
         </w:r>
       </w:hyperlink>
-      <w:bookmarkEnd w:id="937"/>
+      <w:bookmarkEnd w:id="936"/>
     </w:p>
     <w:p>
       <w:pPr>
@@ -5836,7 +5791,7 @@
         <w:ind w:left="567" w:hanging="567"/>
         <w:jc w:val="left"/>
       </w:pPr>
-      <w:bookmarkStart w:id="938" w:name="_RefAnneal38"/>
+      <w:bookmarkStart w:id="937" w:name="_RefAnneal37"/>
       <w:r>
         <w:t xml:space="preserve">Y. Wang </w:t>
       </w:r>
@@ -5861,7 +5816,7 @@
       <w:r>
         <w:t xml:space="preserve">[Online]. Available: </w:t>
       </w:r>
-      <w:hyperlink r:id="rId59">
+      <w:hyperlink r:id="rId58">
         <w:r>
           <w:rPr>
             <w:color w:val="0563C1"/>
@@ -5870,7 +5825,7 @@
           <w:t xml:space="preserve">https://arxiv.org/abs/2406.01574</w:t>
         </w:r>
       </w:hyperlink>
-      <w:bookmarkEnd w:id="938"/>
+      <w:bookmarkEnd w:id="937"/>
     </w:p>
     <w:p>
       <w:pPr>
@@ -5882,14 +5837,14 @@
         <w:ind w:left="567" w:hanging="567"/>
         <w:jc w:val="left"/>
       </w:pPr>
-      <w:bookmarkStart w:id="939" w:name="_RefAnneal39"/>
+      <w:bookmarkStart w:id="938" w:name="_RefAnneal38"/>
       <w:r>
         <w:t xml:space="preserve">A. Hägele, E. Bakouch, A. Kosson, L. Ben Allal, L. Von Werra, and M. Jaggi, "Scaling laws and compute-optimal training beyond fixed training durations," arXiv preprint arXiv:2405.18392, 2024. </w:t>
       </w:r>
       <w:r>
         <w:t xml:space="preserve">[Online]. Available: </w:t>
       </w:r>
-      <w:hyperlink r:id="rId60">
+      <w:hyperlink r:id="rId59">
         <w:r>
           <w:rPr>
             <w:color w:val="0563C1"/>
@@ -5898,7 +5853,7 @@
           <w:t xml:space="preserve">https://arxiv.org/abs/2405.18392</w:t>
         </w:r>
       </w:hyperlink>
-      <w:bookmarkEnd w:id="939"/>
+      <w:bookmarkEnd w:id="938"/>
     </w:p>
     <w:p>
       <w:pPr>
@@ -5910,7 +5865,7 @@
         <w:ind w:left="567" w:hanging="567"/>
         <w:jc w:val="left"/>
       </w:pPr>
-      <w:bookmarkStart w:id="940" w:name="_RefAnneal40"/>
+      <w:bookmarkStart w:id="939" w:name="_RefAnneal39"/>
       <w:r>
         <w:t xml:space="preserve">Z. Yuan </w:t>
       </w:r>
@@ -5926,7 +5881,7 @@
       <w:r>
         <w:t xml:space="preserve">[Online]. Available: </w:t>
       </w:r>
-      <w:hyperlink r:id="rId61">
+      <w:hyperlink r:id="rId60">
         <w:r>
           <w:rPr>
             <w:color w:val="0563C1"/>
@@ -5935,7 +5890,7 @@
           <w:t xml:space="preserve">https://arxiv.org/abs/2308.01825</w:t>
         </w:r>
       </w:hyperlink>
-      <w:bookmarkEnd w:id="940"/>
+      <w:bookmarkEnd w:id="939"/>
     </w:p>
     <w:sectPr>
       <w:footerReference w:type="default" r:id="rId18"/>

</xml_diff>

<commit_message>
Outline: overstated claims toned down, EvalPlus as a no-worse check
The first-run result reads as no significant regression and no gain
measurable near the ceiling, with a probably weaker teacher as a second
cause. Improvement is measured on the six-language test; HumanEval+ and
MBPP+ join the no-worse checks. The loss rule is described as closeness
to reference answers. Table 2's text no longer says a 4-bit base fits
without Unsloth.
</commit_message>
<xml_diff>
--- a/dissertation/Anneal_Dissertation_Outline.docx
+++ b/dissertation/Anneal_Dissertation_Outline.docx
@@ -210,7 +210,7 @@
         <w:pStyle w:val="BodyFirst"/>
       </w:pPr>
       <w:r>
-        <w:t xml:space="preserve">Large language models (LLMs) are widely used to write and repair code, but the most capable run as paid cloud services, so source code leaves the developer's machine. Open-weight models run locally, yet adapting one to a particular kind of work normally needs datacentre hardware. This project, Anneal, investigates whether a low-rank adapter (LoRA) trained only on public datasets can measurably improve the software-development ability of the open-weight Qwen3.8-27B model, when training must fit within the 32 GB of memory allocated to the GPU of one AMD machine and the adapted model must keep its 256k-token context window, and how that gain changes as a months-long improvement loop adds data.</w:t>
+        <w:t xml:space="preserve">Large language models (LLMs) are widely used to write and repair code, but the most capable run as paid cloud services, so source code leaves the developer's machine. Open-weight models run locally, yet adapting one to a particular kind of work needs far more memory than running it. This project, Anneal, investigates whether a low-rank adapter (LoRA) trained only on public datasets can measurably improve the software-development ability of the open-weight Qwen3.8-27B model, when training must fit within the 32 GB of memory allocated to the GPU of one AMD machine and the adapted model must keep its 256k-token context window, and how any gain changes as a months-long improvement loop adds data.</w:t>
       </w:r>
     </w:p>
     <w:p>
@@ -226,7 +226,7 @@
         <w:pStyle w:val="BodyFirst"/>
       </w:pPr>
       <w:r>
-        <w:t xml:space="preserve">Programming assistants now carry out whole tasks: implementing a function from a description, fixing a bug across several files, or answering questions about an unfamiliar codebase. The last depends on context length: a 256k-token window holds tens of thousands of lines, enough for a medium-sized repository in one request.</w:t>
+        <w:t xml:space="preserve">Programming assistants now carry out whole tasks: implementing a function from a description, fixing a bug across several files, or answering questions about an unfamiliar codebase. The last depends on context length: a 256k-token window holds tens of thousands of lines, enough for many small and medium repositories in one request.</w:t>
       </w:r>
     </w:p>
     <w:p>
@@ -234,7 +234,7 @@
         <w:pStyle w:val="BodyText"/>
       </w:pPr>
       <w:r>
-        <w:t xml:space="preserve">Running such a model locally matters to anyone who cannot send code to a third party: companies with proprietary code, developers working offline, and students without a cloud budget. Strong open-weight models make this possible but are general-purpose, and full fine-tuning of a 27-billion-parameter model needs far more memory than any desktop offers. Parameter-efficient fine-tuning trains a small set of extra parameters instead, bringing the memory needed within reach of a high-end workstation. Whether this improves software engineering in a modern 27B model without losing long-context ability has not been established; this project measures it.</w:t>
+        <w:t xml:space="preserve">Running such a model locally matters to anyone who cannot send code to a third party: companies with proprietary code, developers working offline, and students without a cloud budget. Strong open-weight models make this possible but are general-purpose, and full fine-tuning of a 27-billion-parameter model needs far more memory than a desktop offers. Parameter-efficient fine-tuning trains a small set of extra parameters instead, bringing the memory needed within reach of a high-end workstation. Whether this improves software engineering in a modern 27B model without losing long-context ability is an open question; this project measures it.</w:t>
       </w:r>
     </w:p>
     <w:p>
@@ -272,7 +272,7 @@
         </w:r>
       </w:fldSimple>
       <w:r>
-        <w:t xml:space="preserve">, leaving most of the budget for the adapter, optimiser state and activations.</w:t>
+        <w:t xml:space="preserve">, leaving about half the budget for the adapter, optimiser state and activations.</w:t>
       </w:r>
     </w:p>
     <w:p>
@@ -294,7 +294,7 @@
         </w:r>
       </w:fldSimple>
       <w:r>
-        <w:t xml:space="preserve">. Activation memory limits training examples to 12,288 tokens, and short-example fine-tuning risks dulling long-range behaviour unnoticed </w:t>
+        <w:t xml:space="preserve">. Activation memory limits training examples to 12,288 tokens; training on shorter examples could weaken long-range behaviour in ways simple tests miss </w:t>
       </w:r>
       <w:fldSimple w:instr=" REF _RefAnneal3 \r \h ">
         <w:r>
@@ -302,7 +302,217 @@
         </w:r>
       </w:fldSimple>
       <w:r>
-        <w:t xml:space="preserve">, </w:t>
+        <w:t xml:space="preserve">, so retention must be measured, not assumed.</w:t>
+      </w:r>
+    </w:p>
+    <w:p>
+      <w:pPr>
+        <w:pStyle w:val="BodyText"/>
+      </w:pPr>
+      <w:r>
+        <w:rPr>
+          <w:b/>
+        </w:rPr>
+        <w:t xml:space="preserve">R3 Data.</w:t>
+      </w:r>
+      <w:r>
+        <w:t xml:space="preserve"> The model reasons in a </w:t>
+      </w:r>
+      <w:r>
+        <w:rPr>
+          <w:rFonts w:ascii="Consolas" w:hAnsi="Consolas" w:cs="Consolas"/>
+          <w:sz w:val="19"/>
+        </w:rPr>
+        <w:t xml:space="preserve">&lt;think&gt;</w:t>
+      </w:r>
+      <w:r>
+        <w:t xml:space="preserve"> block before answering, so every training row needs a trace, or the model may learn to skip reasoning. Data must come from public datasets licensed for training, written by a teacher at least as strong as the base, and must not overlap the evaluation sets, or gains could reflect memorisation.</w:t>
+      </w:r>
+    </w:p>
+    <w:p>
+      <w:pPr>
+        <w:pStyle w:val="BodyText"/>
+      </w:pPr>
+      <w:r>
+        <w:rPr>
+          <w:b/>
+        </w:rPr>
+        <w:t xml:space="preserve">R4 Deployment.</w:t>
+      </w:r>
+      <w:r>
+        <w:t xml:space="preserve"> The model runs locally as a quantised GGUF file through llama.cpp, so the base and adapted models are evaluated identically in that form.</w:t>
+      </w:r>
+    </w:p>
+    <w:p>
+      <w:pPr>
+        <w:pStyle w:val="BodyText"/>
+      </w:pPr>
+      <w:r>
+        <w:t xml:space="preserve">Three scenarios drive the evaluation: (S1) writing a function from a specification; (S2) changing code across a real repository; and (S3) reasoning about a large repository held in the context. Professional issues are licensing, reproducibility, honest reporting of negative results, and the time and energy each run costs, which will be logged.</w:t>
+      </w:r>
+    </w:p>
+    <w:p>
+      <w:pPr>
+        <w:pStyle w:val="Heading2"/>
+      </w:pPr>
+      <w:r>
+        <w:t xml:space="preserve">Scope and Objectives</w:t>
+      </w:r>
+    </w:p>
+    <w:p>
+      <w:pPr>
+        <w:pStyle w:val="BodyFirst"/>
+      </w:pPr>
+      <w:r>
+        <w:t xml:space="preserve">In scope are one base model, the post-trained Qwen3.8-27B checkpoint (no pre-trained base is released </w:t>
+      </w:r>
+      <w:fldSimple w:instr=" REF _RefAnneal2 \r \h ">
+        <w:r>
+          <w:t xml:space="preserve">[2]</w:t>
+        </w:r>
+      </w:fldSimple>
+      <w:r>
+        <w:t xml:space="preserve">), LoRA over a 4-bit base, thinking mode throughout, and one owned machine with no cloud or departmental compute. Out of scope are full fine-tuning, a second model, context beyond 256k, the vision encoder, reinforcement learning and user studies. The objectives are:</w:t>
+      </w:r>
+    </w:p>
+    <w:p>
+      <w:pPr>
+        <w:pStyle w:val="BodyText"/>
+        <w:tabs>
+          <w:tab w:val="left" w:pos="567"/>
+        </w:tabs>
+        <w:spacing w:after="60"/>
+        <w:ind w:left="567" w:hanging="567"/>
+      </w:pPr>
+      <w:r>
+        <w:rPr>
+          <w:b/>
+        </w:rPr>
+        <w:t xml:space="preserve">O1</w:t>
+      </w:r>
+      <w:r>
+        <w:tab/>
+      </w:r>
+      <w:r>
+        <w:t xml:space="preserve">Build a reproducible pipeline on PyTorch and ROCm that trains a Qwen3.8-27B adapter on examples of up to 12,288 tokens within the machine's 32 GB GPU allocation and survives interruptions to multi-week runs, by the end of Autumn week 12.</w:t>
+      </w:r>
+    </w:p>
+    <w:p>
+      <w:pPr>
+        <w:pStyle w:val="BodyText"/>
+        <w:tabs>
+          <w:tab w:val="left" w:pos="567"/>
+        </w:tabs>
+        <w:spacing w:after="60"/>
+        <w:ind w:left="567" w:hanging="567"/>
+      </w:pPr>
+      <w:r>
+        <w:rPr>
+          <w:b/>
+        </w:rPr>
+        <w:t xml:space="preserve">O2</w:t>
+      </w:r>
+      <w:r>
+        <w:tab/>
+      </w:r>
+      <w:r>
+        <w:t xml:space="preserve">Assemble licence-checked public training sets with reasoning traces, decontaminated against every gate and evaluation set and documented in a data card, before each set's first loop round.</w:t>
+      </w:r>
+    </w:p>
+    <w:p>
+      <w:pPr>
+        <w:pStyle w:val="BodyText"/>
+        <w:tabs>
+          <w:tab w:val="left" w:pos="567"/>
+        </w:tabs>
+        <w:spacing w:after="60"/>
+        <w:ind w:left="567" w:hanging="567"/>
+      </w:pPr>
+      <w:r>
+        <w:rPr>
+          <w:b/>
+        </w:rPr>
+        <w:t xml:space="preserve">O3</w:t>
+      </w:r>
+      <w:r>
+        <w:tab/>
+      </w:r>
+      <w:r>
+        <w:t xml:space="preserve">Produce an adapter that raises pass@1 on a held-out six-language coding test over the base model, with a 95% confidence interval for the difference that excludes zero, and report the same comparison on post-release LiveCodeBench problems and a personal task set.</w:t>
+      </w:r>
+    </w:p>
+    <w:p>
+      <w:pPr>
+        <w:pStyle w:val="BodyText"/>
+        <w:tabs>
+          <w:tab w:val="left" w:pos="567"/>
+        </w:tabs>
+        <w:spacing w:after="60"/>
+        <w:ind w:left="567" w:hanging="567"/>
+      </w:pPr>
+      <w:r>
+        <w:rPr>
+          <w:b/>
+        </w:rPr>
+        <w:t xml:space="preserve">O4</w:t>
+      </w:r>
+      <w:r>
+        <w:tab/>
+      </w:r>
+      <w:r>
+        <w:t xml:space="preserve">Keep HumanEval+ and MBPP+, long-context accuracy (RULER and LongCodeBench, 32k to 256k tokens) and a non-coding check within 3 percentage points of the base model.</w:t>
+      </w:r>
+    </w:p>
+    <w:p>
+      <w:pPr>
+        <w:pStyle w:val="BodyText"/>
+        <w:tabs>
+          <w:tab w:val="left" w:pos="567"/>
+        </w:tabs>
+        <w:spacing w:after="60"/>
+        <w:ind w:left="567" w:hanging="567"/>
+      </w:pPr>
+      <w:r>
+        <w:rPr>
+          <w:b/>
+        </w:rPr>
+        <w:t xml:space="preserve">O5</w:t>
+      </w:r>
+      <w:r>
+        <w:tab/>
+      </w:r>
+      <w:r>
+        <w:t xml:space="preserve">Measure how coding gain and retention change as loop rounds add public data, and the effect of rank, target modules, example length and base precision through ablations.</w:t>
+      </w:r>
+    </w:p>
+    <w:p>
+      <w:pPr>
+        <w:pStyle w:val="BodyText"/>
+        <w:tabs>
+          <w:tab w:val="left" w:pos="567"/>
+        </w:tabs>
+        <w:spacing w:after="60"/>
+        <w:ind w:left="567" w:hanging="567"/>
+      </w:pPr>
+      <w:r>
+        <w:rPr>
+          <w:b/>
+        </w:rPr>
+        <w:t xml:space="preserve">O6</w:t>
+      </w:r>
+      <w:r>
+        <w:tab/>
+      </w:r>
+      <w:r>
+        <w:t xml:space="preserve">Publish the pipeline, configurations, data card and adapter so that the results can be reproduced.</w:t>
+      </w:r>
+    </w:p>
+    <w:p>
+      <w:pPr>
+        <w:pStyle w:val="BodyText"/>
+      </w:pPr>
+      <w:r>
+        <w:t xml:space="preserve">The expected results are an adapter, an open pipeline for AMD hardware and a measured account of what LoRA can achieve under this budget, including negative results. This gives evidence on parameter-efficient fine-tuning outside the NVIDIA CUDA ecosystem in which LoRA and QLoRA were developed </w:t>
       </w:r>
       <w:fldSimple w:instr=" REF _RefAnneal4 \r \h ">
         <w:r>
@@ -310,217 +520,87 @@
         </w:r>
       </w:fldSimple>
       <w:r>
-        <w:t xml:space="preserve">, so retention must be measured, not assumed.</w:t>
-      </w:r>
-    </w:p>
-    <w:p>
-      <w:pPr>
-        <w:pStyle w:val="BodyText"/>
-      </w:pPr>
-      <w:r>
-        <w:rPr>
-          <w:b/>
-        </w:rPr>
-        <w:t xml:space="preserve">R3 Data.</w:t>
-      </w:r>
-      <w:r>
-        <w:t xml:space="preserve"> The model reasons in a </w:t>
-      </w:r>
-      <w:r>
-        <w:rPr>
-          <w:rFonts w:ascii="Consolas" w:hAnsi="Consolas" w:cs="Consolas"/>
-          <w:sz w:val="19"/>
-        </w:rPr>
-        <w:t xml:space="preserve">&lt;think&gt;</w:t>
-      </w:r>
-      <w:r>
-        <w:t xml:space="preserve"> block before answering, so every training row needs a trace, or the model learns to skip reasoning. Data must come from public datasets licensed for training, written by a teacher at least as strong as the base, and must not overlap the evaluation sets, or gains could reflect memorisation.</w:t>
-      </w:r>
-    </w:p>
-    <w:p>
-      <w:pPr>
-        <w:pStyle w:val="BodyText"/>
-      </w:pPr>
-      <w:r>
-        <w:rPr>
-          <w:b/>
-        </w:rPr>
-        <w:t xml:space="preserve">R4 Deployment.</w:t>
-      </w:r>
-      <w:r>
-        <w:t xml:space="preserve"> The model runs locally as a quantised GGUF file through llama.cpp, so the base and adapted models are evaluated identically in that form.</w:t>
-      </w:r>
-    </w:p>
-    <w:p>
-      <w:pPr>
-        <w:pStyle w:val="BodyText"/>
-      </w:pPr>
-      <w:r>
-        <w:t xml:space="preserve">Three scenarios drive the evaluation: (S1) writing a function from a specification; (S2) changing code across a real repository; and (S3) reasoning about a large repository held in the context. Professional issues are licensing, reproducibility, honest reporting of negative results, and the time and energy each run costs, which will be logged.</w:t>
-      </w:r>
-    </w:p>
-    <w:p>
-      <w:pPr>
-        <w:pStyle w:val="Heading2"/>
-      </w:pPr>
-      <w:r>
-        <w:t xml:space="preserve">Scope and Objectives</w:t>
-      </w:r>
-    </w:p>
-    <w:p>
-      <w:pPr>
-        <w:pStyle w:val="BodyFirst"/>
-      </w:pPr>
-      <w:r>
-        <w:t xml:space="preserve">In scope are one base model, the post-trained Qwen3.8-27B checkpoint (no pre-trained base is released </w:t>
-      </w:r>
-      <w:fldSimple w:instr=" REF _RefAnneal2 \r \h ">
+        <w:t xml:space="preserve">, </w:t>
+      </w:r>
+      <w:fldSimple w:instr=" REF _RefAnneal1 \r \h ">
         <w:r>
-          <w:t xml:space="preserve">[2]</w:t>
+          <w:t xml:space="preserve">[1]</w:t>
         </w:r>
       </w:fldSimple>
       <w:r>
-        <w:t xml:space="preserve">), LoRA over a 4-bit base, thinking mode throughout, and one owned machine with no cloud or departmental compute. Out of scope are full fine-tuning, a second model, context beyond 256k, the vision encoder, reinforcement learning and user studies. The objectives are:</w:t>
-      </w:r>
-    </w:p>
-    <w:p>
-      <w:pPr>
-        <w:pStyle w:val="BodyText"/>
-        <w:tabs>
-          <w:tab w:val="left" w:pos="567"/>
-        </w:tabs>
-        <w:spacing w:after="60"/>
-        <w:ind w:left="567" w:hanging="567"/>
-      </w:pPr>
-      <w:r>
-        <w:rPr>
-          <w:b/>
-        </w:rPr>
-        <w:t xml:space="preserve">O1</w:t>
-      </w:r>
-      <w:r>
-        <w:tab/>
-      </w:r>
-      <w:r>
-        <w:t xml:space="preserve">Build a reproducible pipeline on PyTorch and ROCm that trains a Qwen3.8-27B adapter on examples of up to 12,288 tokens within the machine's 32 GB GPU allocation and survives interruptions to multi-week runs, by the end of Autumn week 12.</w:t>
-      </w:r>
-    </w:p>
-    <w:p>
-      <w:pPr>
-        <w:pStyle w:val="BodyText"/>
-        <w:tabs>
-          <w:tab w:val="left" w:pos="567"/>
-        </w:tabs>
-        <w:spacing w:after="60"/>
-        <w:ind w:left="567" w:hanging="567"/>
-      </w:pPr>
-      <w:r>
-        <w:rPr>
-          <w:b/>
-        </w:rPr>
-        <w:t xml:space="preserve">O2</w:t>
-      </w:r>
-      <w:r>
-        <w:tab/>
-      </w:r>
-      <w:r>
-        <w:t xml:space="preserve">Assemble licence-checked public training sets with reasoning traces, decontaminated against every gate and evaluation set and documented in a data card, before each set's first loop round.</w:t>
-      </w:r>
-    </w:p>
-    <w:p>
-      <w:pPr>
-        <w:pStyle w:val="BodyText"/>
-        <w:tabs>
-          <w:tab w:val="left" w:pos="567"/>
-        </w:tabs>
-        <w:spacing w:after="60"/>
-        <w:ind w:left="567" w:hanging="567"/>
-      </w:pPr>
-      <w:r>
-        <w:rPr>
-          <w:b/>
-        </w:rPr>
-        <w:t xml:space="preserve">O3</w:t>
-      </w:r>
-      <w:r>
-        <w:tab/>
-      </w:r>
-      <w:r>
-        <w:t xml:space="preserve">Produce an adapter that raises pass@1 on HumanEval+ and MBPP+ over the base model, with a 95% confidence interval for the difference that excludes zero, and report the same comparison on post-release LiveCodeBench problems and a personal task set.</w:t>
-      </w:r>
-    </w:p>
-    <w:p>
-      <w:pPr>
-        <w:pStyle w:val="BodyText"/>
-        <w:tabs>
-          <w:tab w:val="left" w:pos="567"/>
-        </w:tabs>
-        <w:spacing w:after="60"/>
-        <w:ind w:left="567" w:hanging="567"/>
-      </w:pPr>
-      <w:r>
-        <w:rPr>
-          <w:b/>
-        </w:rPr>
-        <w:t xml:space="preserve">O4</w:t>
-      </w:r>
-      <w:r>
-        <w:tab/>
-      </w:r>
-      <w:r>
-        <w:t xml:space="preserve">Keep long-context accuracy (RULER and LongCodeBench, 32k to 256k tokens) and a non-coding check within 3 percentage points of the base model.</w:t>
-      </w:r>
-    </w:p>
-    <w:p>
-      <w:pPr>
-        <w:pStyle w:val="BodyText"/>
-        <w:tabs>
-          <w:tab w:val="left" w:pos="567"/>
-        </w:tabs>
-        <w:spacing w:after="60"/>
-        <w:ind w:left="567" w:hanging="567"/>
-      </w:pPr>
-      <w:r>
-        <w:rPr>
-          <w:b/>
-        </w:rPr>
-        <w:t xml:space="preserve">O5</w:t>
-      </w:r>
-      <w:r>
-        <w:tab/>
-      </w:r>
-      <w:r>
-        <w:t xml:space="preserve">Measure how coding gain and retention change as loop rounds add public data, and the effect of rank, target modules, example length and base precision through ablations.</w:t>
-      </w:r>
-    </w:p>
-    <w:p>
-      <w:pPr>
-        <w:pStyle w:val="BodyText"/>
-        <w:tabs>
-          <w:tab w:val="left" w:pos="567"/>
-        </w:tabs>
-        <w:spacing w:after="60"/>
-        <w:ind w:left="567" w:hanging="567"/>
-      </w:pPr>
-      <w:r>
-        <w:rPr>
-          <w:b/>
-        </w:rPr>
-        <w:t xml:space="preserve">O6</w:t>
-      </w:r>
-      <w:r>
-        <w:tab/>
-      </w:r>
-      <w:r>
-        <w:t xml:space="preserve">Publish the pipeline, configurations, data card and adapter so that the results can be reproduced.</w:t>
-      </w:r>
-    </w:p>
-    <w:p>
-      <w:pPr>
-        <w:pStyle w:val="BodyText"/>
-      </w:pPr>
-      <w:r>
-        <w:t xml:space="preserve">The expected results are an adapter, an open pipeline for AMD hardware and a measured account of what LoRA can achieve under this budget, including negative results. This gives evidence on parameter-efficient fine-tuning outside the NVIDIA CUDA ecosystem in which LoRA and QLoRA were developed </w:t>
+        <w:t xml:space="preserve">.</w:t>
+      </w:r>
+    </w:p>
+    <w:p>
+      <w:pPr>
+        <w:pStyle w:val="Heading1"/>
+      </w:pPr>
+      <w:r>
+        <w:t xml:space="preserve">State of The Art</w:t>
+      </w:r>
+    </w:p>
+    <w:p>
+      <w:pPr>
+        <w:pStyle w:val="BodyFirst"/>
+      </w:pPr>
+      <w:r>
+        <w:t xml:space="preserve">Three bodies of work shape this project: parameter-efficient fine-tuning, which makes training possible within 32 GB; long-context research, which defines what must be preserved; and execution-based code benchmarks, which define how improvement is measured. Six papers are reviewed below, then the technologies used.</w:t>
+      </w:r>
+    </w:p>
+    <w:p>
+      <w:pPr>
+        <w:pStyle w:val="Heading2"/>
+      </w:pPr>
+      <w:r>
+        <w:t xml:space="preserve">Parameter-Efficient Fine-Tuning</w:t>
+      </w:r>
+    </w:p>
+    <w:p>
+      <w:pPr>
+        <w:pStyle w:val="Heading3"/>
+      </w:pPr>
+      <w:r>
+        <w:t xml:space="preserve">Low-Rank Adaptation</w:t>
+      </w:r>
+    </w:p>
+    <w:p>
+      <w:pPr>
+        <w:pStyle w:val="BodyFirst"/>
+      </w:pPr>
+      <w:r>
+        <w:t xml:space="preserve">Hu et al. </w:t>
+      </w:r>
+      <w:fldSimple w:instr=" REF _RefAnneal4 \r \h ">
+        <w:r>
+          <w:t xml:space="preserve">[4]</w:t>
+        </w:r>
+      </w:fldSimple>
+      <w:r>
+        <w:t xml:space="preserve"> freeze the pretrained weights and learn each weight update as the product of two small matrices of rank r. On GPT-3 175B this cut the number of trainable parameters 10,000-fold and GPU memory threefold while matching full fine-tuning, and a merged adapter adds no inference latency. Its weaknesses for this project are that the frozen base stays in 16-bit precision, about 55 GB at 27B, and that the evaluation used short natural-language tasks and adapted only the attention projections. Anneal adopts the mechanism and separate adapter loading, but treats rank and target modules as variables to test rather than inheriting the original defaults.</w:t>
+      </w:r>
+    </w:p>
+    <w:p>
+      <w:pPr>
+        <w:pStyle w:val="Heading3"/>
+      </w:pPr>
+      <w:r>
+        <w:t xml:space="preserve">Quantised LoRA</w:t>
+      </w:r>
+    </w:p>
+    <w:p>
+      <w:pPr>
+        <w:pStyle w:val="BodyFirst"/>
+      </w:pPr>
+      <w:r>
+        <w:t xml:space="preserve">Dettmers et al. </w:t>
+      </w:r>
+      <w:fldSimple w:instr=" REF _RefAnneal1 \r \h ">
+        <w:r>
+          <w:t xml:space="preserve">[1]</w:t>
+        </w:r>
+      </w:fldSimple>
+      <w:r>
+        <w:t xml:space="preserve"> backpropagate through a frozen base quantised to 4-bit NormalFloat (NF4), adding double quantisation and paged optimisers. They fine-tuned a 65B model on one 48 GB GPU while matching 16-bit fine-tuning, and found that LoRA on all linear layers, not only attention, was needed to reach that quality. This suggested Anneal's budget was workable, which Section 3.1 confirms by measurement. However, the evaluation centred on chat and knowledge benchmarks with short sequences on NVIDIA GPUs, and the training format differs from the GGUF format used at deployment. Anneal adopts the recipe, a 4-bit NF4 base with LoRA on attention and feed-forward projections, and evaluates in the deployment format. Because Unsloth advises against 4-bit training on the closely related Qwen3.5 models, citing larger-than-normal quantisation differences </w:t>
       </w:r>
       <w:fldSimple w:instr=" REF _RefAnneal5 \r \h ">
         <w:r>
@@ -528,87 +608,7 @@
         </w:r>
       </w:fldSimple>
       <w:r>
-        <w:t xml:space="preserve">, </w:t>
-      </w:r>
-      <w:fldSimple w:instr=" REF _RefAnneal1 \r \h ">
-        <w:r>
-          <w:t xml:space="preserve">[1]</w:t>
-        </w:r>
-      </w:fldSimple>
-      <w:r>
-        <w:t xml:space="preserve">.</w:t>
-      </w:r>
-    </w:p>
-    <w:p>
-      <w:pPr>
-        <w:pStyle w:val="Heading1"/>
-      </w:pPr>
-      <w:r>
-        <w:t xml:space="preserve">State of The Art</w:t>
-      </w:r>
-    </w:p>
-    <w:p>
-      <w:pPr>
-        <w:pStyle w:val="BodyFirst"/>
-      </w:pPr>
-      <w:r>
-        <w:t xml:space="preserve">Three bodies of work shape this project: parameter-efficient fine-tuning, which makes training possible within 32 GB; long-context research, which defines what must be preserved; and execution-based code benchmarks, which define how improvement is measured. Six papers are reviewed below, each with what Anneal takes from it, followed by the technologies the project builds on.</w:t>
-      </w:r>
-    </w:p>
-    <w:p>
-      <w:pPr>
-        <w:pStyle w:val="Heading2"/>
-      </w:pPr>
-      <w:r>
-        <w:t xml:space="preserve">Parameter-Efficient Fine-Tuning</w:t>
-      </w:r>
-    </w:p>
-    <w:p>
-      <w:pPr>
-        <w:pStyle w:val="Heading3"/>
-      </w:pPr>
-      <w:r>
-        <w:t xml:space="preserve">Low-Rank Adaptation</w:t>
-      </w:r>
-    </w:p>
-    <w:p>
-      <w:pPr>
-        <w:pStyle w:val="BodyFirst"/>
-      </w:pPr>
-      <w:r>
-        <w:t xml:space="preserve">Hu et al. </w:t>
-      </w:r>
-      <w:fldSimple w:instr=" REF _RefAnneal5 \r \h ">
-        <w:r>
-          <w:t xml:space="preserve">[5]</w:t>
-        </w:r>
-      </w:fldSimple>
-      <w:r>
-        <w:t xml:space="preserve"> freeze the pretrained weights and learn each weight update as the product of two small matrices of rank r. On GPT-3 175B this cut the number of trainable parameters 10,000-fold and GPU memory threefold while matching full fine-tuning, and a merged adapter adds no inference latency. Its weaknesses for this project are that the frozen base stays in 16-bit precision, about 55 GB at 27B, and that the evaluation used short natural-language tasks and adapted only the attention projections. Anneal adopts the mechanism and separate adapter loading, but treats rank and target modules as variables to test rather than inheriting the original defaults.</w:t>
-      </w:r>
-    </w:p>
-    <w:p>
-      <w:pPr>
-        <w:pStyle w:val="Heading3"/>
-      </w:pPr>
-      <w:r>
-        <w:t xml:space="preserve">Quantised LoRA</w:t>
-      </w:r>
-    </w:p>
-    <w:p>
-      <w:pPr>
-        <w:pStyle w:val="BodyFirst"/>
-      </w:pPr>
-      <w:r>
-        <w:t xml:space="preserve">Dettmers et al. </w:t>
-      </w:r>
-      <w:fldSimple w:instr=" REF _RefAnneal1 \r \h ">
-        <w:r>
-          <w:t xml:space="preserve">[1]</w:t>
-        </w:r>
-      </w:fldSimple>
-      <w:r>
-        <w:t xml:space="preserve"> backpropagate through a frozen base quantised to 4-bit NormalFloat (NF4), adding double quantisation and paged optimisers. They fine-tuned a 65B model on one 48 GB GPU while matching 16-bit fine-tuning, and found that LoRA on all linear layers, not only attention, was needed to reach that quality. This is the strongest evidence that Anneal's budget is workable, since a 27B base leaves more room for activations. However, the evaluation centred on chat and knowledge benchmarks with short sequences on NVIDIA GPUs, and the training format differs from the GGUF format used at deployment. Anneal adopts the recipe, a 4-bit NF4 base with LoRA on attention and feed-forward projections, and evaluates in the deployment format. Because Unsloth advises against 4-bit training on the closely related Qwen3.5 models, citing larger-than-normal quantisation differences </w:t>
+        <w:t xml:space="preserve">, Anneal starts from the pre-quantised checkpoint Unsloth's guide uses for QLoRA </w:t>
       </w:r>
       <w:fldSimple w:instr=" REF _RefAnneal6 \r \h ">
         <w:r>
@@ -616,7 +616,23 @@
         </w:r>
       </w:fldSimple>
       <w:r>
-        <w:t xml:space="preserve">, Anneal starts from the pre-quantised checkpoint Unsloth's guide uses for QLoRA </w:t>
+        <w:t xml:space="preserve">, and ablation A5 trains one 8-bit adapter to measure the remaining cost.</w:t>
+      </w:r>
+    </w:p>
+    <w:p>
+      <w:pPr>
+        <w:pStyle w:val="Heading3"/>
+      </w:pPr>
+      <w:r>
+        <w:t xml:space="preserve">What LoRA Learns and Forgets</w:t>
+      </w:r>
+    </w:p>
+    <w:p>
+      <w:pPr>
+        <w:pStyle w:val="BodyFirst"/>
+      </w:pPr>
+      <w:r>
+        <w:t xml:space="preserve">Biderman et al. </w:t>
       </w:r>
       <w:fldSimple w:instr=" REF _RefAnneal7 \r \h ">
         <w:r>
@@ -624,7 +640,15 @@
         </w:r>
       </w:fldSimple>
       <w:r>
-        <w:t xml:space="preserve">, and ablation A5 trains one 8-bit adapter to measure the remaining cost.</w:t>
+        <w:t xml:space="preserve"> compared LoRA with full fine-tuning on code and mathematics. At standard ranks LoRA learned substantially less, but better preserved performance outside the target domain, and full fine-tuning learned weight changes of 10 to 100 times higher rank. They also report that forgetting grows with training duration, a direct risk for a months-long loop. The study used Llama-2-7B, far weaker than Qwen3.8-27B, so whether a strong base leaves similar room to improve is open. For Anneal the paper sets realistic expectations and justifies the rank ablation and the non-coding check; its finding that LoRA forgets less, though not tested at long context, gives some hope that long-context ability survives short-example training.</w:t>
+      </w:r>
+    </w:p>
+    <w:p>
+      <w:pPr>
+        <w:pStyle w:val="Heading2"/>
+      </w:pPr>
+      <w:r>
+        <w:t xml:space="preserve">Long-Context Behaviour</w:t>
       </w:r>
     </w:p>
     <w:p>
@@ -632,7 +656,7 @@
         <w:pStyle w:val="Heading3"/>
       </w:pPr>
       <w:r>
-        <w:t xml:space="preserve">What LoRA Learns and Forgets</w:t>
+        <w:t xml:space="preserve">Long-Context Fine-Tuning</w:t>
       </w:r>
     </w:p>
     <w:p>
@@ -640,7 +664,7 @@
         <w:pStyle w:val="BodyFirst"/>
       </w:pPr>
       <w:r>
-        <w:t xml:space="preserve">Biderman et al. </w:t>
+        <w:t xml:space="preserve">Chen et al. </w:t>
       </w:r>
       <w:fldSimple w:instr=" REF _RefAnneal8 \r \h ">
         <w:r>
@@ -648,15 +672,7 @@
         </w:r>
       </w:fldSimple>
       <w:r>
-        <w:t xml:space="preserve"> compared LoRA with full fine-tuning on code and mathematics. At standard ranks LoRA learned substantially less, but better preserved performance outside the target domain, and full fine-tuning learned weight changes of 10 to 100 times higher rank. They also report that forgetting grows with training duration, a direct risk for a months-long loop. The study used Llama-2-7B, far weaker than Qwen3.8-27B, so whether a strong base leaves similar room to improve is open. For Anneal the paper sets realistic expectations and justifies the rank ablation and the non-coding check; its finding that LoRA forgets less is also the main reason to expect long-context ability to survive short-example training.</w:t>
-      </w:r>
-    </w:p>
-    <w:p>
-      <w:pPr>
-        <w:pStyle w:val="Heading2"/>
-      </w:pPr>
-      <w:r>
-        <w:t xml:space="preserve">Long-Context Behaviour</w:t>
+        <w:t xml:space="preserve"> extend context windows using shifted sparse attention to cut training cost. They show that plain LoRA is not enough for extension: on Llama 2 7B at 32k tokens it reached a perplexity of 11.44 against 8.08 for full fine-tuning, while LoRA with trainable embedding and normalisation layers reached 8.12. Their largest run used eight A100 GPUs. Anneal preserves an existing 256k window rather than extending one, and shifted sparse attention assumes standard attention in every layer, whereas three in four Qwen3.8 layers use DeltaNet, so the method does not transfer directly. Two lessons do: which layers an adapter trains changes long-range results, so retention must be tested, and if it fails, long examples or trainable normalisation layers are remedies to try (ablation A4).</w:t>
       </w:r>
     </w:p>
     <w:p>
@@ -664,7 +680,7 @@
         <w:pStyle w:val="Heading3"/>
       </w:pPr>
       <w:r>
-        <w:t xml:space="preserve">Long-Context Fine-Tuning</w:t>
+        <w:t xml:space="preserve">Measuring Effective Context</w:t>
       </w:r>
     </w:p>
     <w:p>
@@ -672,7 +688,7 @@
         <w:pStyle w:val="BodyFirst"/>
       </w:pPr>
       <w:r>
-        <w:t xml:space="preserve">Chen et al. </w:t>
+        <w:t xml:space="preserve">Hsieh et al. </w:t>
       </w:r>
       <w:fldSimple w:instr=" REF _RefAnneal3 \r \h ">
         <w:r>
@@ -680,30 +696,6 @@
         </w:r>
       </w:fldSimple>
       <w:r>
-        <w:t xml:space="preserve"> extend context windows using shifted sparse attention to cut training cost. They show that plain LoRA is not enough for extension: on Llama 2 7B at 32k tokens it reached a perplexity of 11.44 against 8.08 for full fine-tuning, while LoRA with trainable embedding and normalisation layers reached 8.12. Their largest run used eight A100 GPUs. Anneal preserves an existing 256k window rather than extending one, and shifted sparse attention assumes standard attention in every layer, whereas three in four Qwen3.8 layers use DeltaNet, so the method does not transfer. Two lessons do: adapters can affect long-range behaviour in non-obvious ways, so retention must be tested, and if it fails, long examples or trainable normalisation layers are evidence-based remedies (ablation A4).</w:t>
-      </w:r>
-    </w:p>
-    <w:p>
-      <w:pPr>
-        <w:pStyle w:val="Heading3"/>
-      </w:pPr>
-      <w:r>
-        <w:t xml:space="preserve">Measuring Effective Context</w:t>
-      </w:r>
-    </w:p>
-    <w:p>
-      <w:pPr>
-        <w:pStyle w:val="BodyFirst"/>
-      </w:pPr>
-      <w:r>
-        <w:t xml:space="preserve">Hsieh et al. </w:t>
-      </w:r>
-      <w:fldSimple w:instr=" REF _RefAnneal4 \r \h ">
-        <w:r>
-          <w:t xml:space="preserve">[4]</w:t>
-        </w:r>
-      </w:fldSimple>
-      <w:r>
         <w:t xml:space="preserve"> show that the popular needle-in-a-haystack test overstates context ability. RULER adds multi-key retrieval, variable tracking, aggregation and question answering at configurable lengths. Almost every model tested passed the simple needle test, but only about half of those claiming 32k tokens or more performed satisfactorily at 32k. RULER is synthetic and contains no code, its main weakness here, so Anneal runs it at 32k to 256k alongside LongCodeBench (Table 1), which covers scenario S3.</w:t>
       </w:r>
     </w:p>
@@ -728,7 +720,7 @@
         </w:r>
       </w:fldSimple>
       <w:r>
-        <w:t xml:space="preserve"> built SWE-bench from 2,294 GitHub issues across 12 Python repositories: a model must edit the repository until the project's own tests pass, which matches scenario S2 far better than single-function benchmarks. Its weaknesses are cost and noise. Each task needs a container and a token-hungry agent loop, scores depend on the agent scaffold, and underspecified tasks led to SWE-bench Verified, a human-validated subset of 500 </w:t>
+        <w:t xml:space="preserve"> built SWE-bench from 2,294 GitHub issues across 12 Python repositories: a model must edit the repository until the project's own tests pass, which matches scenario S2 more closely than single-function benchmarks. Its weaknesses are cost and noise. Each task needs a container and a token-hungry agent loop, scores depend on the agent scaffold, and underspecified tasks led to SWE-bench Verified, a human-validated subset of 500 </w:t>
       </w:r>
       <w:fldSimple w:instr=" REF _RefAnneal10 \r \h ">
         <w:r>
@@ -736,7 +728,7 @@
         </w:r>
       </w:fldSimple>
       <w:r>
-        <w:t xml:space="preserve">. Public repositories also risk contamination. At this chip's generation speed (Section 3.5) even a subset would take days per system, so Anneal instead borrows SWE-bench's execution-based design for a personal set of repository-scale tasks drawn from the author's own code, which no public model has seen.</w:t>
+        <w:t xml:space="preserve">. Public repositories also risk contamination. At this chip's generation speed (Section 3.5) the 500 Verified tasks would likely take days per system, so Anneal instead borrows SWE-bench's execution-based design for a personal set of repository-scale tasks drawn from the author's own code, which public models are less likely to have seen.</w:t>
       </w:r>
     </w:p>
     <w:p>
@@ -951,12 +943,12 @@
               </w:rPr>
               <w:t xml:space="preserve">) that Unsloth documents for Qwen3.8-27B </w:t>
             </w:r>
-            <w:fldSimple w:instr=" REF _RefAnneal7 \r \h ">
+            <w:fldSimple w:instr=" REF _RefAnneal6 \r \h ">
               <w:r>
                 <w:rPr>
                   <w:sz w:val="20"/>
                 </w:rPr>
-                <w:t xml:space="preserve">[7]</w:t>
+                <w:t xml:space="preserve">[6]</w:t>
               </w:r>
             </w:fldSimple>
             <w:r>
@@ -977,7 +969,7 @@
               <w:rPr>
                 <w:sz w:val="20"/>
               </w:rPr>
-              <w:t xml:space="preserve"> is the backup; CUDA-only tools do not run here.</w:t>
+              <w:t xml:space="preserve"> would need 40 to 46 GiB (Table 2); CUDA-only tools do not run here.</w:t>
             </w:r>
           </w:p>
         </w:tc>
@@ -1096,7 +1088,7 @@
               <w:rPr>
                 <w:sz w:val="20"/>
               </w:rPr>
-              <w:t xml:space="preserve">HumanEval+ and MBPP+; LiveCodeBench; SWE-bench Verified</w:t>
+              <w:t xml:space="preserve">HumanEval+ and MBPP+; CodeContests; LiveCodeBench; SWE-bench Verified</w:t>
             </w:r>
           </w:p>
         </w:tc>
@@ -1115,7 +1107,7 @@
               <w:rPr>
                 <w:sz w:val="20"/>
               </w:rPr>
-              <w:t xml:space="preserve">EvalPlus </w:t>
+              <w:t xml:space="preserve">A six-language CodeContests test (Section 3.3) as the primary measure, since the base passes 97% of HumanEval; EvalPlus </w:t>
             </w:r>
             <w:fldSimple w:instr=" REF _RefAnneal16 \r \h ">
               <w:r>
@@ -1129,7 +1121,7 @@
               <w:rPr>
                 <w:sz w:val="20"/>
               </w:rPr>
-              <w:t xml:space="preserve"> HumanEval+ and MBPP+ (542 problems, far more tests than the originals) as the primary measure; LiveCodeBench </w:t>
+              <w:t xml:space="preserve"> HumanEval+ and MBPP+ (542 problems) check for regressions; post-release LiveCodeBench </w:t>
             </w:r>
             <w:fldSimple w:instr=" REF _RefAnneal17 \r \h ">
               <w:r>
@@ -1143,7 +1135,7 @@
               <w:rPr>
                 <w:sz w:val="20"/>
               </w:rPr>
-              <w:t xml:space="preserve"> problems released after the model guard against contamination; SWE-bench is too slow (Section 2.3).</w:t>
+              <w:t xml:space="preserve"> problems guard against contamination; SWE-bench is too slow (Section 2.3).</w:t>
             </w:r>
           </w:p>
         </w:tc>
@@ -1455,7 +1447,7 @@
         <w:pStyle w:val="BodyText"/>
       </w:pPr>
       <w:r>
-        <w:t xml:space="preserve">In summary, QLoRA fixes the training configuration, LoRA and Biderman et al. frame expectations, LongLoRA and RULER define the long-context risk, and SWE-bench shapes the realistic tasks. Anneal combines these at 256k context, on AMD hardware, within 32 GB.</w:t>
+        <w:t xml:space="preserve">QLoRA fixes the training configuration, LoRA and Biderman et al. frame expectations, LongLoRA and RULER define the long-context risk, and SWE-bench shapes the realistic tasks. Anneal combines these at 256k context, on AMD hardware, within 32 GB.</w:t>
       </w:r>
     </w:p>
     <w:p>
@@ -1471,7 +1463,7 @@
         <w:pStyle w:val="BodyFirst"/>
       </w:pPr>
       <w:r>
-        <w:t xml:space="preserve">The prototype is a version-controlled repository of scripts and configuration for every stage in Figure 1. Drafted before access to the training machine, it was brought up there in October 2026; the first real run, round 0 of the loop (Section 3.2), was trained and scored by 21 October.</w:t>
+        <w:t xml:space="preserve">The prototype is a version-controlled repository of scripts and configuration for every stage in Figure 1. It was brought up on the training machine in October 2026; the first run, round 0 (Section 3.2), was trained and scored by 21 October.</w:t>
       </w:r>
     </w:p>
     <w:p>
@@ -1543,7 +1535,7 @@
         <w:t xml:space="preserve">memory_estimate.py</w:t>
       </w:r>
       <w:r>
-        <w:t xml:space="preserve"> estimates training memory from the model's shape, and </w:t>
+        <w:t xml:space="preserve"> estimates training memory from the model's shape; </w:t>
       </w:r>
       <w:r>
         <w:rPr>
@@ -1553,7 +1545,7 @@
         <w:t xml:space="preserve">measure_memory.py</w:t>
       </w:r>
       <w:r>
-        <w:t xml:space="preserve"> measures the peak over real training steps. Unsloth </w:t>
+        <w:t xml:space="preserve"> measures real steps. Unsloth </w:t>
       </w:r>
       <w:fldSimple w:instr=" REF _RefAnneal11 \r \h ">
         <w:r>
@@ -1569,7 +1561,7 @@
         </w:r>
       </w:fldSimple>
       <w:r>
-        <w:t xml:space="preserve">, shrinks this model's loss from about 12.6 GiB to 0.5 GiB.</w:t>
+        <w:t xml:space="preserve">, is estimated to shrink this model's loss from 12.6 GiB to 0.5 GiB.</w:t>
       </w:r>
     </w:p>
     <w:p>
@@ -1577,7 +1569,7 @@
         <w:pStyle w:val="BodyText"/>
       </w:pPr>
       <w:r>
-        <w:t xml:space="preserve">Table 2 decided the precision. An 8-bit base fits only if Unsloth's optimisations work on this chip, whereas a 4-bit base fits on either path; ablation A5 measures its cost in quantisation error. The loop uses the longest rows that fit with a margin (peak within 29 GiB, 6 GB of system memory free): 16,384 tokens crashed, so the cap is 12,288.</w:t>
+        <w:t xml:space="preserve">Table 2 decided the precision: neither base would fit without Unsloth's optimisations, and with them an 8-bit base would barely fit while a 4-bit base leaves room for longer rows. Ablation A5 measures the 4-bit cost. The loop uses the longest rows that fit with a margin (peak within 29 GiB, 6 GB of system memory free): 16,384 tokens crashed, so the cap is 12,288.</w:t>
       </w:r>
     </w:p>
     <w:p>
@@ -2344,7 +2336,7 @@
         <w:pStyle w:val="BodyFirst"/>
       </w:pPr>
       <w:r>
-        <w:t xml:space="preserve">From round 1, the loop trains only on public datasets, never on the base model's own rows, which would reinforce its biases. Every row must carry its teacher's real reasoning, and the teacher must match or beat Qwen3.8-27B on the same-harness Vals AI board for that task. Each round takes 45% from test-passed bug-fix runs in TypeScript, Go, JavaScript and other non-Python repositories by DeepSeek V4-Flash-0731 </w:t>
+        <w:t xml:space="preserve">From round 1, the loop trains only on public datasets, never on the base model's own rows, which could reinforce its biases. Every row must carry its teacher's real reasoning, and the teacher must match or beat Qwen3.8-27B on the same-harness Vals AI board for that task. Each round takes 45% from test-passed bug-fix runs in TypeScript, Go, JavaScript and other non-Python repositories by DeepSeek V4-Flash-0731 </w:t>
       </w:r>
       <w:fldSimple w:instr=" REF _RefAnneal20 \r \h ">
         <w:r>
@@ -2428,7 +2420,7 @@
         <w:t xml:space="preserve">&lt;think&gt;</w:t>
       </w:r>
       <w:r>
-        <w:t xml:space="preserve"> trace, drops over-length rows and removes near-duplicates of evaluation prompts. An embedding search on the otherwise idle NPU also flags reworded copies, which n-gram checks miss </w:t>
+        <w:t xml:space="preserve"> trace, drops over-length rows and removes near-duplicates of evaluation prompts. An embedding search on the otherwise idle NPU also flags reworded copies, which n-gram checks can miss </w:t>
       </w:r>
       <w:fldSimple w:instr=" REF _RefAnneal31 \r \h ">
         <w:r>
@@ -2444,7 +2436,7 @@
         <w:pStyle w:val="BodyText"/>
       </w:pPr>
       <w:r>
-        <w:t xml:space="preserve">The first run, round 0, is a comparison run using the model's own rows: 500 base-model answers to OpenCodeInstruct </w:t>
+        <w:t xml:space="preserve">The first run, round 0, is a comparison run: 500 base-model answers to OpenCodeInstruct </w:t>
       </w:r>
       <w:fldSimple w:instr=" REF _RefAnneal32 \r \h ">
         <w:r>
@@ -2460,7 +2452,7 @@
         </w:r>
       </w:fldSimple>
       <w:r>
-        <w:t xml:space="preserve">, plus 1,500 OpenCodeReasoning rows, whose DeepSeek-R1 teacher scores only 63.5 on LiveCodeBench </w:t>
+        <w:t xml:space="preserve">, plus 1,500 OpenCodeReasoning rows, whose DeepSeek-R1 teacher scores 63.5 on LiveCodeBench </w:t>
       </w:r>
       <w:fldSimple w:instr=" REF _RefAnneal34 \r \h ">
         <w:r>
@@ -2468,7 +2460,7 @@
         </w:r>
       </w:fldSimple>
       <w:r>
-        <w:t xml:space="preserve">. Traces hitting the 6,144-token budget were rejected, so kept traces are short (median 436 tokens). Model-written code runs in a Windows AppContainer sandbox without network, file or administrator access, which passed 264 escape checks.</w:t>
+        <w:t xml:space="preserve">, probably below the base, though not measured like-for-like. Traces hitting the 6,144-token budget were rejected, so kept traces are short (median 436 tokens). Model-written code runs in a Windows AppContainer sandbox without network, file or administrator access, which passed 264 escape checks.</w:t>
       </w:r>
     </w:p>
     <w:p>
@@ -2492,7 +2484,7 @@
         </w:r>
       </w:fldSimple>
       <w:r>
-        <w:t xml:space="preserve">. Each round is scored on a held-out gate of 495 decontaminated CodeContests </w:t>
+        <w:t xml:space="preserve">. Each round is scored on a held-out six-language gate of 495 decontaminated CodeContests </w:t>
       </w:r>
       <w:fldSimple w:instr=" REF _RefAnneal36 \r \h ">
         <w:r>
@@ -2500,7 +2492,7 @@
         </w:r>
       </w:fldSimple>
       <w:r>
-        <w:t xml:space="preserve"> items, never trained on or reported: write a program in C++, Java, Go, Rust, JavaScript or TypeScript (286), or fix a wrong C++ or Java submission (209), each run on up to 30 tests. A round is kept if a one-sided exact sign test against the best adapter gives p ≤ 0.05, or if its score is no lower and its loss falls on significantly more of 177 held-out bug-fix steps than it rises, since contest items cannot see what bug-fix rows teach. Either way, neither part nor 100 MMLU-Pro </w:t>
+        <w:t xml:space="preserve"> items, never trained on: write a program in C++, Java, Go, Rust, JavaScript or TypeScript (286), or fix a wrong C++ or Java submission (209), each run on up to 30 tests. A round is kept if a one-sided exact sign test against the best adapter gives p ≤ 0.05, or if its score is no lower and its loss on 177 held-out bug-fix steps or on held-out terminal steps falls on significantly more steps than it rises (corrected for two tests), since contest items cannot see what those rows teach. These losses measure closeness to reference answers, not solved tasks. Either way, neither part nor 100 MMLU-Pro </w:t>
       </w:r>
       <w:fldSimple w:instr=" REF _RefAnneal37 \r \h ">
         <w:r>
@@ -2508,7 +2500,7 @@
         </w:r>
       </w:fldSimple>
       <w:r>
-        <w:t xml:space="preserve"> questions outside computing may drop by over 5 points or significantly, and a fresh-seed re-score becomes the new reference. Unless its loss is clearly lower, a round stops, rejected, after a random third of the items if not ahead of the best; in simulation this cut the test time of non-improving rounds by a third for 5 to 7% fewer real keeps. A rejected round's rows roll into the next attempt, up to 3,000 new rows, because a real 2-point gain passes the gate only 24 to 44% of the time (power calculation, first gate). EvalPlus, scored only on kept adapters, never selects them.</w:t>
+        <w:t xml:space="preserve"> questions outside computing may drop by over 5 points or significantly, a round that passes must show no real drop on EvalPlus, and a fresh-seed re-score becomes the new reference. Unless a loss is clearly lower, a round stops, rejected, after a random third of the items if not ahead of the best (in simulation, about a third less test time for 5 to 7% fewer real keeps). A rejected round's rows roll into the next attempt, up to 3,000 new rows, because a real 2-point gain passes the gate only an estimated 24 to 44% of the time.</w:t>
       </w:r>
     </w:p>
     <w:p>
@@ -2565,7 +2557,7 @@
         <w:pStyle w:val="BodyFirst"/>
       </w:pPr>
       <w:r>
-        <w:t xml:space="preserve">Bring-up and the first run raised the issues in Table 3. The run trained on 7.40 million tokens at about 100 tokens per second, and held-out loss fell from 0.593 to 0.498, yet scores did not rise. Over all 542 EvalPlus problems with extra tests the base scored 86.2% and the adapter 85.4% (−0.7 points, 95% CI −2.6 to +1.1, p = 0.57); HumanEval+ rose 1.8 points and MBPP+ fell 1.9, neither significant, and leaving out five unreliable or overlapping problems changes nothing. The adapter learned its data without improving, consistent with a teacher weaker than the base, though one answer per problem cannot separate the two sources.</w:t>
+        <w:t xml:space="preserve">Bring-up and the first run raised the issues in Table 3. The run trained on 7.40 million tokens at about 100 tokens per second, and held-out loss fell from 0.593 to 0.498. Over all 542 EvalPlus problems with extra tests the base scored 86.2% and the adapter 85.4% (−0.7 points, 95% CI −2.6 to +1.1, p = 0.57); HumanEval+ rose 1.8 points and MBPP+ fell 1.9, neither significant, and leaving out five unreliable or overlapping problems does not change this. So there was no significant regression, and no measurable gain this near the ceiling (base 97% on HumanEval); a probably weaker teacher may also have contributed. EvalPlus is therefore now only a regression check.</w:t>
       </w:r>
     </w:p>
     <w:p>
@@ -2998,7 +2990,7 @@
         <w:pStyle w:val="BodyText"/>
       </w:pPr>
       <w:r>
-        <w:t xml:space="preserve">The adapter is converted alone to GGUF and loaded over the same base, avoiding a 55 GB merged model. Trained against NF4 but served over Q4_K_M, a smoke-test adapter gave matching losses (0.756 in training, 0.728 in llama.cpp, 96% top-1 agreement), so evaluation measures the adapter as deployed.</w:t>
+        <w:t xml:space="preserve">The adapter is converted alone to GGUF and loaded over the same base, avoiding a 55 GB merged model. Trained against NF4 but served over Q4_K_M, a smoke-test adapter gave close losses (0.756 in training, 0.728 in llama.cpp, 96% top-1 agreement), suggesting the adapter carries over to the deployed base.</w:t>
       </w:r>
     </w:p>
     <w:p>
@@ -3014,7 +3006,7 @@
         <w:pStyle w:val="BodyFirst"/>
       </w:pPr>
       <w:r>
-        <w:t xml:space="preserve">The measurement-first design has paid off: the parity test caught a wrong fix before any real run used it. Speed and memory were measured only at rank 16. One gate pass takes about two days, which limits how many rounds fit. With 20 to 50 personal tasks, confidence intervals will be wide. HumanEval+ and MBPP+ are Python-only, while the loop trains mostly on other languages, so EvalPlus may understate gains that the gate measures. Round 0 showed that a correctly working pipeline can still fail to improve a strong base.</w:t>
+        <w:t xml:space="preserve">Measuring first helped: the parity test caught a wrong fix before any real run used it. Speed and memory were measured only at rank 16. One gate pass takes about two days, which limits how many rounds fit. With 20 to 50 personal tasks, confidence intervals will be wide. Round 0 showed that a working pipeline can still fail to improve a strong base, and that near-ceiling Python benchmarks cannot show small gains.</w:t>
       </w:r>
     </w:p>
     <w:p>
@@ -3038,7 +3030,7 @@
         </w:r>
       </w:fldSimple>
       <w:r>
-        <w:t xml:space="preserve">; Anneal keeps 0.6 and 32,768 tokens to bound evaluation time, so absolute scores may sit below the card's.</w:t>
+        <w:t xml:space="preserve">; Anneal keeps 0.6 and caps reasoning at 16,384 tokens on the gate and 32,768 on EvalPlus to bound evaluation time, so absolute scores may sit below the card's.</w:t>
       </w:r>
     </w:p>
     <w:p>
@@ -3298,7 +3290,7 @@
               <w:rPr>
                 <w:sz w:val="20"/>
               </w:rPr>
-              <w:t xml:space="preserve">HumanEval+ and MBPP+ pass@1, mean of three seeds (primary); post-August-2026 LiveCodeBench; 20 to 50 personal tasks</w:t>
+              <w:t xml:space="preserve">Six-language test pass@1, mean of three seeds (primary); held-out bug-fix and terminal loss; post-August-2026 LiveCodeBench; 20 to 50 personal tasks</w:t>
             </w:r>
           </w:p>
         </w:tc>
@@ -3317,7 +3309,7 @@
               <w:rPr>
                 <w:sz w:val="20"/>
               </w:rPr>
-              <w:t xml:space="preserve">A beats B on HumanEval+ and MBPP+ with a 95% CI excluding zero; the others reported with CIs</w:t>
+              <w:t xml:space="preserve">A beats B on the six-language test with a 95% CI excluding zero; the others reported with CIs</w:t>
             </w:r>
           </w:p>
         </w:tc>
@@ -3360,7 +3352,7 @@
               <w:rPr>
                 <w:sz w:val="20"/>
               </w:rPr>
-              <w:t xml:space="preserve">RULER and LongCodeBench at 32k to 256k and 100 MMLU-Pro questions, for each kept adapter</w:t>
+              <w:t xml:space="preserve">HumanEval+ and MBPP+, RULER and LongCodeBench at 32k to 256k, and 100 MMLU-Pro questions, for each kept adapter</w:t>
             </w:r>
           </w:p>
         </w:tc>
@@ -3422,7 +3414,7 @@
               <w:rPr>
                 <w:sz w:val="20"/>
               </w:rPr>
-              <w:t xml:space="preserve">Gate scores of every round; EvalPlus (one seed) for each kept adapter; ablations and the paired round</w:t>
+              <w:t xml:space="preserve">Gate scores and held-out losses of every round; ablations and the paired round</w:t>
             </w:r>
           </w:p>
         </w:tc>
@@ -3523,7 +3515,7 @@
         <w:t xml:space="preserve">Statistics.</w:t>
       </w:r>
       <w:r>
-        <w:t xml:space="preserve"> Pass rates are averaged over seeds; 95% confidence intervals for A minus B come from a paired bootstrap over problems, with a paired permutation test for significance. With one seed, round 0's 95% interval spanned 3.7 points; three seeds narrow it.</w:t>
+        <w:t xml:space="preserve"> Pass rates are averaged over seeds; 95% confidence intervals for A minus B come from a paired bootstrap over problems, with a paired permutation test for significance. With one seed, round 0's 95% interval spanned 3.7 points; three seeds should narrow it. As the gate also selects adapters, its final gain may be inflated; LiveCodeBench and the personal tasks, which select nothing, check it.</w:t>
       </w:r>
     </w:p>
     <w:p>
@@ -3547,13 +3539,13 @@
       <w:r>
         <w:t xml:space="preserve">, and LoRA learns less than full fine-tuning and forgets more the longer it trains </w:t>
       </w:r>
-      <w:fldSimple w:instr=" REF _RefAnneal8 \r \h ">
+      <w:fldSimple w:instr=" REF _RefAnneal7 \r \h ">
         <w:r>
-          <w:t xml:space="preserve">[8]</w:t>
+          <w:t xml:space="preserve">[7]</w:t>
         </w:r>
       </w:fldSimple>
       <w:r>
-        <w:t xml:space="preserve">. Round 0, three-quarters from a weaker teacher, showed no clear gain, and many rounds may be rejected; a flat curve is still a result.</w:t>
+        <w:t xml:space="preserve">. Round 0, three-quarters from a probably weaker teacher, showed no clear gain, and many rounds may be rejected; a flat curve is still a result.</w:t>
       </w:r>
     </w:p>
     <w:p>
@@ -3605,7 +3597,7 @@
         <w:pStyle w:val="BodyFirst"/>
       </w:pPr>
       <w:r>
-        <w:t xml:space="preserve">Round 0 is scored (Section 3.4), and the loop starts from the base model. Of about 136 usable machine days from November to March, roughly 15 go to ablations and 20 to evaluation; loop rounds use the rest.</w:t>
+        <w:t xml:space="preserve">Round 0 is scored (Section 3.4), and the loop has started from the base model. Of about 136 usable machine days from November to March, roughly 15 go to ablations and 20 to evaluation; loop rounds use the rest.</w:t>
       </w:r>
     </w:p>
     <w:tbl>
@@ -3721,7 +3713,7 @@
               <w:rPr>
                 <w:sz w:val="20"/>
               </w:rPr>
-              <w:t xml:space="preserve">Round 0 trained and scored against the base: no significant change. Six-language gate built; test longer rows; start the loop.</w:t>
+              <w:t xml:space="preserve">Round 0 trained and scored against the base: no significant change. Six-language gate built; longer rows tested; loop started.</w:t>
             </w:r>
           </w:p>
         </w:tc>
@@ -4538,7 +4530,7 @@
       </w:pPr>
       <w:bookmarkStart w:id="903" w:name="_RefAnneal3"/>
       <w:r>
-        <w:t xml:space="preserve">Y. Chen </w:t>
+        <w:t xml:space="preserve">C.-P. Hsieh </w:t>
       </w:r>
       <w:r>
         <w:rPr>
@@ -4547,52 +4539,6 @@
         <w:t xml:space="preserve">et al.</w:t>
       </w:r>
       <w:r>
-        <w:t xml:space="preserve">, "LongLoRA: Efficient fine-tuning of long-context large language models," in </w:t>
-      </w:r>
-      <w:r>
-        <w:rPr>
-          <w:i/>
-        </w:rPr>
-        <w:t xml:space="preserve">Proc. Int. Conf. Learning Representations (ICLR)</w:t>
-      </w:r>
-      <w:r>
-        <w:t xml:space="preserve">, 2024. </w:t>
-      </w:r>
-      <w:r>
-        <w:t xml:space="preserve">[Online]. Available: </w:t>
-      </w:r>
-      <w:hyperlink r:id="rId24">
-        <w:r>
-          <w:rPr>
-            <w:color w:val="0563C1"/>
-            <w:u w:val="single"/>
-          </w:rPr>
-          <w:t xml:space="preserve">https://arxiv.org/abs/2309.12307</w:t>
-        </w:r>
-      </w:hyperlink>
-      <w:bookmarkEnd w:id="903"/>
-    </w:p>
-    <w:p>
-      <w:pPr>
-        <w:pStyle w:val="Reference"/>
-        <w:tabs>
-          <w:tab w:val="clear" w:pos="426"/>
-          <w:tab w:val="num" w:pos="567"/>
-        </w:tabs>
-        <w:ind w:left="567" w:hanging="567"/>
-        <w:jc w:val="left"/>
-      </w:pPr>
-      <w:bookmarkStart w:id="904" w:name="_RefAnneal4"/>
-      <w:r>
-        <w:t xml:space="preserve">C.-P. Hsieh </w:t>
-      </w:r>
-      <w:r>
-        <w:rPr>
-          <w:i/>
-        </w:rPr>
-        <w:t xml:space="preserve">et al.</w:t>
-      </w:r>
-      <w:r>
         <w:t xml:space="preserve">, "RULER: What's the real context size of your long-context language models?" in </w:t>
       </w:r>
       <w:r>
@@ -4607,7 +4553,7 @@
       <w:r>
         <w:t xml:space="preserve">[Online]. Available: </w:t>
       </w:r>
-      <w:hyperlink r:id="rId25">
+      <w:hyperlink r:id="rId24">
         <w:r>
           <w:rPr>
             <w:color w:val="0563C1"/>
@@ -4616,7 +4562,7 @@
           <w:t xml:space="preserve">https://arxiv.org/abs/2404.06654</w:t>
         </w:r>
       </w:hyperlink>
-      <w:bookmarkEnd w:id="904"/>
+      <w:bookmarkEnd w:id="903"/>
     </w:p>
     <w:p>
       <w:pPr>
@@ -4628,7 +4574,7 @@
         <w:ind w:left="567" w:hanging="567"/>
         <w:jc w:val="left"/>
       </w:pPr>
-      <w:bookmarkStart w:id="905" w:name="_RefAnneal5"/>
+      <w:bookmarkStart w:id="904" w:name="_RefAnneal4"/>
       <w:r>
         <w:t xml:space="preserve">E. J. Hu </w:t>
       </w:r>
@@ -4653,7 +4599,7 @@
       <w:r>
         <w:t xml:space="preserve">[Online]. Available: </w:t>
       </w:r>
-      <w:hyperlink r:id="rId26">
+      <w:hyperlink r:id="rId25">
         <w:r>
           <w:rPr>
             <w:color w:val="0563C1"/>
@@ -4662,7 +4608,7 @@
           <w:t xml:space="preserve">https://arxiv.org/abs/2106.09685</w:t>
         </w:r>
       </w:hyperlink>
-      <w:bookmarkEnd w:id="905"/>
+      <w:bookmarkEnd w:id="904"/>
     </w:p>
     <w:p>
       <w:pPr>
@@ -4674,14 +4620,14 @@
         <w:ind w:left="567" w:hanging="567"/>
         <w:jc w:val="left"/>
       </w:pPr>
-      <w:bookmarkStart w:id="906" w:name="_RefAnneal6"/>
+      <w:bookmarkStart w:id="905" w:name="_RefAnneal5"/>
       <w:r>
         <w:t xml:space="preserve">Unsloth, "Qwen3.5 fine-tuning guide," Unsloth documentation, 2026. </w:t>
       </w:r>
       <w:r>
         <w:t xml:space="preserve">[Online]. Available: </w:t>
       </w:r>
-      <w:hyperlink r:id="rId27">
+      <w:hyperlink r:id="rId26">
         <w:r>
           <w:rPr>
             <w:color w:val="0563C1"/>
@@ -4693,7 +4639,7 @@
       <w:r>
         <w:t xml:space="preserve"> (accessed Oct. 17, 2026).</w:t>
       </w:r>
-      <w:bookmarkEnd w:id="906"/>
+      <w:bookmarkEnd w:id="905"/>
     </w:p>
     <w:p>
       <w:pPr>
@@ -4705,14 +4651,14 @@
         <w:ind w:left="567" w:hanging="567"/>
         <w:jc w:val="left"/>
       </w:pPr>
-      <w:bookmarkStart w:id="907" w:name="_RefAnneal7"/>
+      <w:bookmarkStart w:id="906" w:name="_RefAnneal6"/>
       <w:r>
         <w:t xml:space="preserve">Unsloth, "Qwen3.8: How to fine-tune," Unsloth documentation, 2026. </w:t>
       </w:r>
       <w:r>
         <w:t xml:space="preserve">[Online]. Available: </w:t>
       </w:r>
-      <w:hyperlink r:id="rId28">
+      <w:hyperlink r:id="rId27">
         <w:r>
           <w:rPr>
             <w:color w:val="0563C1"/>
@@ -4724,7 +4670,7 @@
       <w:r>
         <w:t xml:space="preserve"> (accessed Oct. 17, 2026).</w:t>
       </w:r>
-      <w:bookmarkEnd w:id="907"/>
+      <w:bookmarkEnd w:id="906"/>
     </w:p>
     <w:p>
       <w:pPr>
@@ -4736,7 +4682,7 @@
         <w:ind w:left="567" w:hanging="567"/>
         <w:jc w:val="left"/>
       </w:pPr>
-      <w:bookmarkStart w:id="908" w:name="_RefAnneal8"/>
+      <w:bookmarkStart w:id="907" w:name="_RefAnneal7"/>
       <w:r>
         <w:t xml:space="preserve">D. Biderman </w:t>
       </w:r>
@@ -4757,6 +4703,52 @@
       </w:r>
       <w:r>
         <w:t xml:space="preserve">, Aug. 2024. </w:t>
+      </w:r>
+      <w:r>
+        <w:t xml:space="preserve">[Online]. Available: </w:t>
+      </w:r>
+      <w:hyperlink r:id="rId28">
+        <w:r>
+          <w:rPr>
+            <w:color w:val="0563C1"/>
+            <w:u w:val="single"/>
+          </w:rPr>
+          <w:t xml:space="preserve">https://arxiv.org/abs/2405.09673</w:t>
+        </w:r>
+      </w:hyperlink>
+      <w:bookmarkEnd w:id="907"/>
+    </w:p>
+    <w:p>
+      <w:pPr>
+        <w:pStyle w:val="Reference"/>
+        <w:tabs>
+          <w:tab w:val="clear" w:pos="426"/>
+          <w:tab w:val="num" w:pos="567"/>
+        </w:tabs>
+        <w:ind w:left="567" w:hanging="567"/>
+        <w:jc w:val="left"/>
+      </w:pPr>
+      <w:bookmarkStart w:id="908" w:name="_RefAnneal8"/>
+      <w:r>
+        <w:t xml:space="preserve">Y. Chen </w:t>
+      </w:r>
+      <w:r>
+        <w:rPr>
+          <w:i/>
+        </w:rPr>
+        <w:t xml:space="preserve">et al.</w:t>
+      </w:r>
+      <w:r>
+        <w:t xml:space="preserve">, "LongLoRA: Efficient fine-tuning of long-context large language models," in </w:t>
+      </w:r>
+      <w:r>
+        <w:rPr>
+          <w:i/>
+        </w:rPr>
+        <w:t xml:space="preserve">Proc. Int. Conf. Learning Representations (ICLR)</w:t>
+      </w:r>
+      <w:r>
+        <w:t xml:space="preserve">, 2024. </w:t>
       </w:r>
       <w:r>
         <w:t xml:space="preserve">[Online]. Available: </w:t>
@@ -4767,7 +4759,7 @@
             <w:color w:val="0563C1"/>
             <w:u w:val="single"/>
           </w:rPr>
-          <w:t xml:space="preserve">https://arxiv.org/abs/2405.09673</w:t>
+          <w:t xml:space="preserve">https://arxiv.org/abs/2309.12307</w:t>
         </w:r>
       </w:hyperlink>
       <w:bookmarkEnd w:id="908"/>

</xml_diff>

<commit_message>
Outline: 40% GLM-5.3 terminal share, terminal loss path, EvalPlus 3-point check
Each round is 40% GLM-5.3 terminal steps from every passing run, 35%
Open-SWE bug fixes, 20% Tachibana4 and 5% Banaxi. The keep rule's loss
path covers held-out bug-fix or terminal steps, Holm-adjusted, and a
passing round may not drop more than 3 points or significantly on
EvalPlus.
</commit_message>
<xml_diff>
--- a/dissertation/Anneal_Dissertation_Outline.docx
+++ b/dissertation/Anneal_Dissertation_Outline.docx
@@ -576,7 +576,7 @@
         </w:r>
       </w:fldSimple>
       <w:r>
-        <w:t xml:space="preserve"> freeze the pretrained weights and learn each weight update as the product of two small matrices of rank r. On GPT-3 175B this cut the number of trainable parameters 10,000-fold and GPU memory threefold while matching full fine-tuning, and a merged adapter adds no inference latency. Its weaknesses for this project are that the frozen base stays in 16-bit precision, about 55 GB at 27B, and that the evaluation used short natural-language tasks and adapted only the attention projections. Anneal adopts the mechanism and separate adapter loading, but treats rank and target modules as variables to test rather than inheriting the original defaults.</w:t>
+        <w:t xml:space="preserve"> freeze the pretrained weights and learn each weight update as the product of two small matrices of rank r. On GPT-3 175B this cut the number of trainable parameters 10,000-fold and GPU memory threefold while matching full fine-tuning, and a merged adapter adds no inference latency. Its weaknesses for this project are that the frozen base stays in 16-bit precision, about 55 GB at 27B, and that the evaluation used short natural-language tasks and adapted only the attention projections. Anneal adopts the mechanism and separate adapter loading, but treats rank and target modules as variables to test.</w:t>
       </w:r>
     </w:p>
     <w:p>
@@ -600,7 +600,7 @@
         </w:r>
       </w:fldSimple>
       <w:r>
-        <w:t xml:space="preserve"> backpropagate through a frozen base quantised to 4-bit NormalFloat (NF4), adding double quantisation and paged optimisers. They fine-tuned a 65B model on one 48 GB GPU while matching 16-bit fine-tuning, and found that LoRA on all linear layers, not only attention, was needed to reach that quality. This suggested Anneal's budget was workable, which Section 3.1 confirms by measurement. However, the evaluation centred on chat and knowledge benchmarks with short sequences on NVIDIA GPUs, and the training format differs from the GGUF format used at deployment. Anneal adopts the recipe, a 4-bit NF4 base with LoRA on attention and feed-forward projections, and evaluates in the deployment format. Because Unsloth advises against 4-bit training on the closely related Qwen3.5 models, citing larger-than-normal quantisation differences </w:t>
+        <w:t xml:space="preserve"> backpropagate through a frozen base quantised to 4-bit NormalFloat (NF4), adding double quantisation and paged optimisers. They fine-tuned a 65B model on one 48 GB GPU while matching 16-bit fine-tuning, and found that LoRA on all linear layers, not only attention, was needed to reach that quality. This suggested Anneal's budget was workable, which Section 3.1 confirms by measurement. However, the evaluation centred on chat and knowledge benchmarks with short sequences on NVIDIA GPUs, and the training format differs from the GGUF format used at deployment. Anneal adopts the recipe, a 4-bit NF4 base with LoRA on attention and feed-forward projections. Because Unsloth advises against 4-bit training on the closely related Qwen3.5 models, citing larger-than-normal quantisation differences </w:t>
       </w:r>
       <w:fldSimple w:instr=" REF _RefAnneal5 \r \h ">
         <w:r>
@@ -672,7 +672,7 @@
         </w:r>
       </w:fldSimple>
       <w:r>
-        <w:t xml:space="preserve"> extend context windows using shifted sparse attention to cut training cost. They show that plain LoRA is not enough for extension: on Llama 2 7B at 32k tokens it reached a perplexity of 11.44 against 8.08 for full fine-tuning, while LoRA with trainable embedding and normalisation layers reached 8.12. Their largest run used eight A100 GPUs. Anneal preserves an existing 256k window rather than extending one, and shifted sparse attention assumes standard attention in every layer, whereas three in four Qwen3.8 layers use DeltaNet, so the method does not transfer directly. Two lessons do: which layers an adapter trains changes long-range results, so retention must be tested, and if it fails, long examples or trainable normalisation layers are remedies to try (ablation A4).</w:t>
+        <w:t xml:space="preserve"> extend context windows using shifted sparse attention to cut training cost. They show that plain LoRA is not enough for extension: on Llama 2 7B at 32k tokens it reached a perplexity of 11.44 against 8.08 for full fine-tuning, while LoRA with trainable embedding and normalisation layers reached 8.12. Anneal preserves an existing 256k window rather than extending one, and shifted sparse attention assumes standard attention in every layer, whereas three in four Qwen3.8 layers use DeltaNet, so the method does not transfer directly. Two lessons do: which layers an adapter trains changes long-range results, so retention must be tested, and if it fails, long examples or trainable normalisation layers are remedies to try (ablation A4).</w:t>
       </w:r>
     </w:p>
     <w:p>
@@ -2336,7 +2336,7 @@
         <w:pStyle w:val="BodyFirst"/>
       </w:pPr>
       <w:r>
-        <w:t xml:space="preserve">From round 1, the loop trains only on public datasets, never on the base model's own rows, which could reinforce its biases. Every row must carry its teacher's real reasoning, and the teacher must match or beat Qwen3.8-27B on the same-harness Vals AI board for that task. Each round takes 45% from test-passed bug-fix runs in TypeScript, Go, JavaScript and other non-Python repositories by DeepSeek V4-Flash-0731 </w:t>
+        <w:t xml:space="preserve">From round 1, the loop trains only on public datasets, never on the base model's own rows, which could reinforce its biases. Every row must carry its teacher's real reasoning, and the teacher must match or beat Qwen3.8-27B on the same-harness Vals AI board for that task. Each round takes 35% from test-passed bug-fix runs in TypeScript, Go, JavaScript and other non-Python repositories by DeepSeek V4-Flash-0731 </w:t>
       </w:r>
       <w:fldSimple w:instr=" REF _RefAnneal20 \r \h ">
         <w:r>
@@ -2368,7 +2368,7 @@
         </w:r>
       </w:fldSimple>
       <w:r>
-        <w:t xml:space="preserve">); 30% from test-passed Linux terminal runs by GLM-5.3 </w:t>
+        <w:t xml:space="preserve">); 40% from every test-passed Linux terminal run by GLM-5.3 </w:t>
       </w:r>
       <w:fldSimple w:instr=" REF _RefAnneal21 \r \h ">
         <w:r>
@@ -2376,7 +2376,15 @@
         </w:r>
       </w:fldSimple>
       <w:r>
-        <w:t xml:space="preserve"> (Terminal-Bench 71.5); and 25% from DeepSeek-V4-Pro coding answers </w:t>
+        <w:t xml:space="preserve"> (Terminal-Bench 71.5), since more distinct correct paths helped in maths fine-tuning </w:t>
+      </w:r>
+      <w:fldSimple w:instr=" REF _RefAnneal30 \r \h ">
+        <w:r>
+          <w:t xml:space="preserve">[30]</w:t>
+        </w:r>
+      </w:fldSimple>
+      <w:r>
+        <w:t xml:space="preserve">; and 25% from DeepSeek-V4-Pro coding answers </w:t>
       </w:r>
       <w:fldSimple w:instr=" REF _RefAnneal22 \r \h ">
         <w:r>
@@ -2394,9 +2402,9 @@
       <w:r>
         <w:t xml:space="preserve">, a teacher ahead only on LiveCodeBench (87.5). Rows using Python, and maths </w:t>
       </w:r>
-      <w:fldSimple w:instr=" REF _RefAnneal30 \r \h ">
+      <w:fldSimple w:instr=" REF _RefAnneal31 \r \h ">
         <w:r>
-          <w:t xml:space="preserve">[30]</w:t>
+          <w:t xml:space="preserve">[31]</w:t>
         </w:r>
       </w:fldSimple>
       <w:r>
@@ -2422,29 +2430,21 @@
       <w:r>
         <w:t xml:space="preserve"> trace, drops over-length rows and removes near-duplicates of evaluation prompts. An embedding search on the otherwise idle NPU also flags reworded copies, which n-gram checks can miss </w:t>
       </w:r>
-      <w:fldSimple w:instr=" REF _RefAnneal31 \r \h ">
-        <w:r>
-          <w:t xml:space="preserve">[31]</w:t>
-        </w:r>
-      </w:fldSimple>
-      <w:r>
-        <w:t xml:space="preserve">; in the first pools it flagged 33 of 15,276 rows without measurably slowing training.</w:t>
-      </w:r>
-    </w:p>
-    <w:p>
-      <w:pPr>
-        <w:pStyle w:val="BodyText"/>
-      </w:pPr>
-      <w:r>
-        <w:t xml:space="preserve">The first run, round 0, is a comparison run: 500 base-model answers to OpenCodeInstruct </w:t>
-      </w:r>
       <w:fldSimple w:instr=" REF _RefAnneal32 \r \h ">
         <w:r>
           <w:t xml:space="preserve">[32]</w:t>
         </w:r>
       </w:fldSimple>
       <w:r>
-        <w:t xml:space="preserve"> prompts that passed their tests, as in ReST-EM </w:t>
+        <w:t xml:space="preserve">; in the first pools it flagged 33 of 15,276 rows without measurably slowing training.</w:t>
+      </w:r>
+    </w:p>
+    <w:p>
+      <w:pPr>
+        <w:pStyle w:val="BodyText"/>
+      </w:pPr>
+      <w:r>
+        <w:t xml:space="preserve">The first run, round 0, is a comparison run: 500 base-model answers to OpenCodeInstruct </w:t>
       </w:r>
       <w:fldSimple w:instr=" REF _RefAnneal33 \r \h ">
         <w:r>
@@ -2452,7 +2452,7 @@
         </w:r>
       </w:fldSimple>
       <w:r>
-        <w:t xml:space="preserve">, plus 1,500 OpenCodeReasoning rows, whose DeepSeek-R1 teacher scores 63.5 on LiveCodeBench </w:t>
+        <w:t xml:space="preserve"> prompts that passed their tests, as in ReST-EM </w:t>
       </w:r>
       <w:fldSimple w:instr=" REF _RefAnneal34 \r \h ">
         <w:r>
@@ -2460,23 +2460,7 @@
         </w:r>
       </w:fldSimple>
       <w:r>
-        <w:t xml:space="preserve">, probably below the base, though not measured like-for-like. Traces hitting the 6,144-token budget were rejected, so kept traces are short (median 436 tokens). Model-written code runs in a Windows AppContainer sandbox without network, file or administrator access, which passed 264 escape checks.</w:t>
-      </w:r>
-    </w:p>
-    <w:p>
-      <w:pPr>
-        <w:pStyle w:val="Heading2"/>
-      </w:pPr>
-      <w:r>
-        <w:t xml:space="preserve">Training</w:t>
-      </w:r>
-    </w:p>
-    <w:p>
-      <w:pPr>
-        <w:pStyle w:val="BodyFirst"/>
-      </w:pPr>
-      <w:r>
-        <w:t xml:space="preserve">Training runs as an unattended keep-if-better loop. Round 1 starts from the base model, never the first-run adapter; each later round continues the best adapter on 1,000 new rows plus 25% replayed from earlier rows, re-warming and decaying the learning rate, which in continual pre-training matched retraining on all data </w:t>
+        <w:t xml:space="preserve">, plus 1,500 OpenCodeReasoning rows, whose DeepSeek-R1 teacher scores 63.5 on LiveCodeBench </w:t>
       </w:r>
       <w:fldSimple w:instr=" REF _RefAnneal35 \r \h ">
         <w:r>
@@ -2484,7 +2468,23 @@
         </w:r>
       </w:fldSimple>
       <w:r>
-        <w:t xml:space="preserve">. Each round is scored on a held-out six-language gate of 495 decontaminated CodeContests </w:t>
+        <w:t xml:space="preserve">, probably below the base, though not measured like-for-like. Traces hitting the 6,144-token budget were rejected, so kept traces are short (median 436 tokens). Model-written code runs in a Windows AppContainer sandbox without network, file or administrator access, which passed 264 escape checks.</w:t>
+      </w:r>
+    </w:p>
+    <w:p>
+      <w:pPr>
+        <w:pStyle w:val="Heading2"/>
+      </w:pPr>
+      <w:r>
+        <w:t xml:space="preserve">Training</w:t>
+      </w:r>
+    </w:p>
+    <w:p>
+      <w:pPr>
+        <w:pStyle w:val="BodyFirst"/>
+      </w:pPr>
+      <w:r>
+        <w:t xml:space="preserve">Training runs as an unattended keep-if-better loop. Round 1 starts from the base model, never the first-run adapter; each later round continues the best adapter on 1,000 new rows plus 25% replayed from earlier rows, re-warming and decaying the learning rate, which in continual pre-training matched retraining on all data </w:t>
       </w:r>
       <w:fldSimple w:instr=" REF _RefAnneal36 \r \h ">
         <w:r>
@@ -2492,7 +2492,7 @@
         </w:r>
       </w:fldSimple>
       <w:r>
-        <w:t xml:space="preserve"> items, never trained on: write a program in C++, Java, Go, Rust, JavaScript or TypeScript (286), or fix a wrong C++ or Java submission (209), each run on up to 30 tests. A round is kept if a one-sided exact sign test against the best adapter gives p ≤ 0.05, or if its score is no lower and its loss on 177 held-out bug-fix steps or on held-out terminal steps falls on significantly more steps than it rises (corrected for two tests), since contest items cannot see what those rows teach. These losses measure closeness to reference answers, not solved tasks. Either way, neither part nor 100 MMLU-Pro </w:t>
+        <w:t xml:space="preserve">. Each round is scored on a held-out six-language gate of 495 decontaminated CodeContests </w:t>
       </w:r>
       <w:fldSimple w:instr=" REF _RefAnneal37 \r \h ">
         <w:r>
@@ -2500,7 +2500,15 @@
         </w:r>
       </w:fldSimple>
       <w:r>
-        <w:t xml:space="preserve"> questions outside computing may drop by over 5 points or significantly, a round that passes must show no real drop on EvalPlus, and a fresh-seed re-score becomes the new reference. Unless a loss is clearly lower, a round stops, rejected, after a random third of the items if not ahead of the best (in simulation, about a third less test time for 5 to 7% fewer real keeps). A rejected round's rows roll into the next attempt, up to 3,000 new rows, because a real 2-point gain passes the gate only an estimated 24 to 44% of the time.</w:t>
+        <w:t xml:space="preserve"> items, never trained on: write a program in C++, Java, Go, Rust, JavaScript or TypeScript (286), or fix a wrong C++ or Java submission (209), each run on up to 30 tests. A round is kept if a one-sided exact sign test against the best adapter gives p ≤ 0.05, or if its score is no lower and its loss on 177 held-out bug-fix steps or up to 200 held-out terminal steps falls on significantly more steps than it rises (Holm-adjusted), since contest items cannot see what those rows teach. These losses measure closeness to reference answers, not solved tasks. Either way, neither part nor 100 MMLU-Pro </w:t>
+      </w:r>
+      <w:fldSimple w:instr=" REF _RefAnneal38 \r \h ">
+        <w:r>
+          <w:t xml:space="preserve">[38]</w:t>
+        </w:r>
+      </w:fldSimple>
+      <w:r>
+        <w:t xml:space="preserve"> questions outside computing may drop by over 5 points or significantly, nor EvalPlus, run only on passing rounds, by over 3 points or significantly, and a fresh-seed re-score becomes the new reference. Unless a loss is clearly lower, a round stops, rejected, after a random third of the items if not ahead of the best (in simulation, about a third less test time for 5 to 7% fewer real keeps). A rejected round's rows roll into the next attempt, up to 3,000 new rows, because a real 2-point gain passes the gate only an estimated 24 to 44% of the time.</w:t>
       </w:r>
     </w:p>
     <w:p>
@@ -2517,9 +2525,9 @@
       <w:r>
         <w:t xml:space="preserve"> uses a warmup-stable-decay schedule </w:t>
       </w:r>
-      <w:fldSimple w:instr=" REF _RefAnneal38 \r \h ">
+      <w:fldSimple w:instr=" REF _RefAnneal39 \r \h ">
         <w:r>
-          <w:t xml:space="preserve">[38]</w:t>
+          <w:t xml:space="preserve">[39]</w:t>
         </w:r>
       </w:fldSimple>
       <w:r>
@@ -3531,9 +3539,9 @@
       <w:r>
         <w:t xml:space="preserve"> Published results suggest small, flattening gains: supervised fine-tuning gains are log-linear in data and smaller for stronger models </w:t>
       </w:r>
-      <w:fldSimple w:instr=" REF _RefAnneal39 \r \h ">
+      <w:fldSimple w:instr=" REF _RefAnneal30 \r \h ">
         <w:r>
-          <w:t xml:space="preserve">[39]</w:t>
+          <w:t xml:space="preserve">[30]</w:t>
         </w:r>
       </w:fldSimple>
       <w:r>
@@ -5529,12 +5537,49 @@
       </w:pPr>
       <w:bookmarkStart w:id="930" w:name="_RefAnneal30"/>
       <w:r>
+        <w:t xml:space="preserve">Z. Yuan </w:t>
+      </w:r>
+      <w:r>
+        <w:rPr>
+          <w:i/>
+        </w:rPr>
+        <w:t xml:space="preserve">et al.</w:t>
+      </w:r>
+      <w:r>
+        <w:t xml:space="preserve">, "Scaling relationship on learning mathematical reasoning with large language models," arXiv preprint arXiv:2308.01825, 2023. </w:t>
+      </w:r>
+      <w:r>
+        <w:t xml:space="preserve">[Online]. Available: </w:t>
+      </w:r>
+      <w:hyperlink r:id="rId51">
+        <w:r>
+          <w:rPr>
+            <w:color w:val="0563C1"/>
+            <w:u w:val="single"/>
+          </w:rPr>
+          <w:t xml:space="preserve">https://arxiv.org/abs/2308.01825</w:t>
+        </w:r>
+      </w:hyperlink>
+      <w:bookmarkEnd w:id="930"/>
+    </w:p>
+    <w:p>
+      <w:pPr>
+        <w:pStyle w:val="Reference"/>
+        <w:tabs>
+          <w:tab w:val="clear" w:pos="426"/>
+          <w:tab w:val="num" w:pos="567"/>
+        </w:tabs>
+        <w:ind w:left="567" w:hanging="567"/>
+        <w:jc w:val="left"/>
+      </w:pPr>
+      <w:bookmarkStart w:id="931" w:name="_RefAnneal31"/>
+      <w:r>
         <w:t xml:space="preserve">NVIDIA, "Nemotron-SFT-Math-v4," Hugging Face dataset card, 2026. </w:t>
       </w:r>
       <w:r>
         <w:t xml:space="preserve">[Online]. Available: </w:t>
       </w:r>
-      <w:hyperlink r:id="rId51">
+      <w:hyperlink r:id="rId52">
         <w:r>
           <w:rPr>
             <w:color w:val="0563C1"/>
@@ -5546,7 +5591,7 @@
       <w:r>
         <w:t xml:space="preserve"> (accessed Oct. 17, 2026).</w:t>
       </w:r>
-      <w:bookmarkEnd w:id="930"/>
+      <w:bookmarkEnd w:id="931"/>
     </w:p>
     <w:p>
       <w:pPr>
@@ -5558,14 +5603,14 @@
         <w:ind w:left="567" w:hanging="567"/>
         <w:jc w:val="left"/>
       </w:pPr>
-      <w:bookmarkStart w:id="931" w:name="_RefAnneal31"/>
+      <w:bookmarkStart w:id="932" w:name="_RefAnneal32"/>
       <w:r>
         <w:t xml:space="preserve">S. Yang, W.-L. Chiang, L. Zheng, J. E. Gonzalez, and I. Stoica, "Rethinking benchmark and contamination for language models with rephrased samples," arXiv preprint arXiv:2311.04850, 2023. </w:t>
       </w:r>
       <w:r>
         <w:t xml:space="preserve">[Online]. Available: </w:t>
       </w:r>
-      <w:hyperlink r:id="rId52">
+      <w:hyperlink r:id="rId53">
         <w:r>
           <w:rPr>
             <w:color w:val="0563C1"/>
@@ -5574,7 +5619,7 @@
           <w:t xml:space="preserve">https://arxiv.org/abs/2311.04850</w:t>
         </w:r>
       </w:hyperlink>
-      <w:bookmarkEnd w:id="931"/>
+      <w:bookmarkEnd w:id="932"/>
     </w:p>
     <w:p>
       <w:pPr>
@@ -5586,7 +5631,7 @@
         <w:ind w:left="567" w:hanging="567"/>
         <w:jc w:val="left"/>
       </w:pPr>
-      <w:bookmarkStart w:id="932" w:name="_RefAnneal32"/>
+      <w:bookmarkStart w:id="933" w:name="_RefAnneal33"/>
       <w:r>
         <w:t xml:space="preserve">W. U. Ahmad </w:t>
       </w:r>
@@ -5602,7 +5647,7 @@
       <w:r>
         <w:t xml:space="preserve">[Online]. Available: </w:t>
       </w:r>
-      <w:hyperlink r:id="rId53">
+      <w:hyperlink r:id="rId54">
         <w:r>
           <w:rPr>
             <w:color w:val="0563C1"/>
@@ -5611,7 +5656,7 @@
           <w:t xml:space="preserve">https://arxiv.org/abs/2504.04030</w:t>
         </w:r>
       </w:hyperlink>
-      <w:bookmarkEnd w:id="932"/>
+      <w:bookmarkEnd w:id="933"/>
     </w:p>
     <w:p>
       <w:pPr>
@@ -5623,7 +5668,7 @@
         <w:ind w:left="567" w:hanging="567"/>
         <w:jc w:val="left"/>
       </w:pPr>
-      <w:bookmarkStart w:id="933" w:name="_RefAnneal33"/>
+      <w:bookmarkStart w:id="934" w:name="_RefAnneal34"/>
       <w:r>
         <w:t xml:space="preserve">A. Singh </w:t>
       </w:r>
@@ -5639,7 +5684,7 @@
       <w:r>
         <w:t xml:space="preserve">[Online]. Available: </w:t>
       </w:r>
-      <w:hyperlink r:id="rId54">
+      <w:hyperlink r:id="rId55">
         <w:r>
           <w:rPr>
             <w:color w:val="0563C1"/>
@@ -5648,7 +5693,7 @@
           <w:t xml:space="preserve">https://arxiv.org/abs/2312.06585</w:t>
         </w:r>
       </w:hyperlink>
-      <w:bookmarkEnd w:id="933"/>
+      <w:bookmarkEnd w:id="934"/>
     </w:p>
     <w:p>
       <w:pPr>
@@ -5660,14 +5705,14 @@
         <w:ind w:left="567" w:hanging="567"/>
         <w:jc w:val="left"/>
       </w:pPr>
-      <w:bookmarkStart w:id="934" w:name="_RefAnneal34"/>
+      <w:bookmarkStart w:id="935" w:name="_RefAnneal35"/>
       <w:r>
         <w:t xml:space="preserve">DeepSeek-AI, "DeepSeek-R1-0528," Hugging Face model card, 2025. </w:t>
       </w:r>
       <w:r>
         <w:t xml:space="preserve">[Online]. Available: </w:t>
       </w:r>
-      <w:hyperlink r:id="rId55">
+      <w:hyperlink r:id="rId56">
         <w:r>
           <w:rPr>
             <w:color w:val="0563C1"/>
@@ -5679,7 +5724,7 @@
       <w:r>
         <w:t xml:space="preserve"> (accessed Oct. 17, 2026).</w:t>
       </w:r>
-      <w:bookmarkEnd w:id="934"/>
+      <w:bookmarkEnd w:id="935"/>
     </w:p>
     <w:p>
       <w:pPr>
@@ -5691,7 +5736,7 @@
         <w:ind w:left="567" w:hanging="567"/>
         <w:jc w:val="left"/>
       </w:pPr>
-      <w:bookmarkStart w:id="935" w:name="_RefAnneal35"/>
+      <w:bookmarkStart w:id="936" w:name="_RefAnneal36"/>
       <w:r>
         <w:t xml:space="preserve">A. Ibrahim </w:t>
       </w:r>
@@ -5716,7 +5761,7 @@
       <w:r>
         <w:t xml:space="preserve">[Online]. Available: </w:t>
       </w:r>
-      <w:hyperlink r:id="rId56">
+      <w:hyperlink r:id="rId57">
         <w:r>
           <w:rPr>
             <w:color w:val="0563C1"/>
@@ -5725,7 +5770,7 @@
           <w:t xml:space="preserve">https://arxiv.org/abs/2403.08763</w:t>
         </w:r>
       </w:hyperlink>
-      <w:bookmarkEnd w:id="935"/>
+      <w:bookmarkEnd w:id="936"/>
     </w:p>
     <w:p>
       <w:pPr>
@@ -5737,7 +5782,7 @@
         <w:ind w:left="567" w:hanging="567"/>
         <w:jc w:val="left"/>
       </w:pPr>
-      <w:bookmarkStart w:id="936" w:name="_RefAnneal36"/>
+      <w:bookmarkStart w:id="937" w:name="_RefAnneal37"/>
       <w:r>
         <w:t xml:space="preserve">Y. Li </w:t>
       </w:r>
@@ -5762,7 +5807,7 @@
       <w:r>
         <w:t xml:space="preserve">[Online]. Available: </w:t>
       </w:r>
-      <w:hyperlink r:id="rId57">
+      <w:hyperlink r:id="rId58">
         <w:r>
           <w:rPr>
             <w:color w:val="0563C1"/>
@@ -5771,7 +5816,7 @@
           <w:t xml:space="preserve">https://arxiv.org/abs/2203.07814</w:t>
         </w:r>
       </w:hyperlink>
-      <w:bookmarkEnd w:id="936"/>
+      <w:bookmarkEnd w:id="937"/>
     </w:p>
     <w:p>
       <w:pPr>
@@ -5783,7 +5828,7 @@
         <w:ind w:left="567" w:hanging="567"/>
         <w:jc w:val="left"/>
       </w:pPr>
-      <w:bookmarkStart w:id="937" w:name="_RefAnneal37"/>
+      <w:bookmarkStart w:id="938" w:name="_RefAnneal38"/>
       <w:r>
         <w:t xml:space="preserve">Y. Wang </w:t>
       </w:r>
@@ -5808,7 +5853,7 @@
       <w:r>
         <w:t xml:space="preserve">[Online]. Available: </w:t>
       </w:r>
-      <w:hyperlink r:id="rId58">
+      <w:hyperlink r:id="rId59">
         <w:r>
           <w:rPr>
             <w:color w:val="0563C1"/>
@@ -5817,7 +5862,7 @@
           <w:t xml:space="preserve">https://arxiv.org/abs/2406.01574</w:t>
         </w:r>
       </w:hyperlink>
-      <w:bookmarkEnd w:id="937"/>
+      <w:bookmarkEnd w:id="938"/>
     </w:p>
     <w:p>
       <w:pPr>
@@ -5829,57 +5874,20 @@
         <w:ind w:left="567" w:hanging="567"/>
         <w:jc w:val="left"/>
       </w:pPr>
-      <w:bookmarkStart w:id="938" w:name="_RefAnneal38"/>
+      <w:bookmarkStart w:id="939" w:name="_RefAnneal39"/>
       <w:r>
         <w:t xml:space="preserve">A. Hägele, E. Bakouch, A. Kosson, L. Ben Allal, L. Von Werra, and M. Jaggi, "Scaling laws and compute-optimal training beyond fixed training durations," arXiv preprint arXiv:2405.18392, 2024. </w:t>
       </w:r>
       <w:r>
         <w:t xml:space="preserve">[Online]. Available: </w:t>
       </w:r>
-      <w:hyperlink r:id="rId59">
+      <w:hyperlink r:id="rId60">
         <w:r>
           <w:rPr>
             <w:color w:val="0563C1"/>
             <w:u w:val="single"/>
           </w:rPr>
           <w:t xml:space="preserve">https://arxiv.org/abs/2405.18392</w:t>
-        </w:r>
-      </w:hyperlink>
-      <w:bookmarkEnd w:id="938"/>
-    </w:p>
-    <w:p>
-      <w:pPr>
-        <w:pStyle w:val="Reference"/>
-        <w:tabs>
-          <w:tab w:val="clear" w:pos="426"/>
-          <w:tab w:val="num" w:pos="567"/>
-        </w:tabs>
-        <w:ind w:left="567" w:hanging="567"/>
-        <w:jc w:val="left"/>
-      </w:pPr>
-      <w:bookmarkStart w:id="939" w:name="_RefAnneal39"/>
-      <w:r>
-        <w:t xml:space="preserve">Z. Yuan </w:t>
-      </w:r>
-      <w:r>
-        <w:rPr>
-          <w:i/>
-        </w:rPr>
-        <w:t xml:space="preserve">et al.</w:t>
-      </w:r>
-      <w:r>
-        <w:t xml:space="preserve">, "Scaling relationship on learning mathematical reasoning with large language models," arXiv preprint arXiv:2308.01825, 2023. </w:t>
-      </w:r>
-      <w:r>
-        <w:t xml:space="preserve">[Online]. Available: </w:t>
-      </w:r>
-      <w:hyperlink r:id="rId60">
-        <w:r>
-          <w:rPr>
-            <w:color w:val="0563C1"/>
-            <w:u w:val="single"/>
-          </w:rPr>
-          <w:t xml:space="preserve">https://arxiv.org/abs/2308.01825</w:t>
         </w:r>
       </w:hyperlink>
       <w:bookmarkEnd w:id="939"/>

</xml_diff>

<commit_message>
Outline: final GLM-5.3 row count, 200 terminal steps, BFCL check, second early stop
The GLM-5.3 share is 24,689 rows from runs without Python; the loss path
uses 200 held-out terminal steps beside the 177 bug-fix steps; passing
rounds also face the BFCL Java and JavaScript tool-call check; early
reject looks at a third and two thirds of the six-language test.
</commit_message>
<xml_diff>
--- a/dissertation/Anneal_Dissertation_Outline.docx
+++ b/dissertation/Anneal_Dissertation_Outline.docx
@@ -640,7 +640,7 @@
         </w:r>
       </w:fldSimple>
       <w:r>
-        <w:t xml:space="preserve"> compared LoRA with full fine-tuning on code and mathematics. At standard ranks LoRA learned substantially less, but better preserved performance outside the target domain, and full fine-tuning learned weight changes of 10 to 100 times higher rank. They also report that forgetting grows with training duration, a direct risk for a months-long loop. The study used Llama-2-7B, far weaker than Qwen3.8-27B, so whether a strong base leaves similar room to improve is open. For Anneal the paper sets realistic expectations and justifies the rank ablation and the non-coding check; its finding that LoRA forgets less, though not tested at long context, gives some hope that long-context ability survives short-example training.</w:t>
+        <w:t xml:space="preserve"> compared LoRA with full fine-tuning on code and mathematics. At standard ranks LoRA learned substantially less, but better preserved performance outside the target domain, and full fine-tuning learned weight changes of 10 to 100 times higher rank. They also report that forgetting grows with training duration, a direct risk for a months-long loop. The study used Llama-2-7B, far weaker than Qwen3.8-27B, so whether a strong base leaves similar room to improve is open. For Anneal the paper sets realistic expectations and justifies the rank ablation and the non-coding check.</w:t>
       </w:r>
     </w:p>
     <w:p>
@@ -2376,7 +2376,7 @@
         </w:r>
       </w:fldSimple>
       <w:r>
-        <w:t xml:space="preserve"> (Terminal-Bench 71.5), since more distinct correct paths helped in maths fine-tuning </w:t>
+        <w:t xml:space="preserve"> (Terminal-Bench 71.5; 24,689 rows without Python), since more distinct correct paths helped in maths fine-tuning </w:t>
       </w:r>
       <w:fldSimple w:instr=" REF _RefAnneal30 \r \h ">
         <w:r>
@@ -2500,7 +2500,7 @@
         </w:r>
       </w:fldSimple>
       <w:r>
-        <w:t xml:space="preserve"> items, never trained on: write a program in C++, Java, Go, Rust, JavaScript or TypeScript (286), or fix a wrong C++ or Java submission (209), each run on up to 30 tests. A round is kept if a one-sided exact sign test against the best adapter gives p ≤ 0.05, or if its score is no lower and its loss on 177 held-out bug-fix steps or up to 200 held-out terminal steps falls on significantly more steps than it rises (Holm-adjusted), since contest items cannot see what those rows teach. These losses measure closeness to reference answers, not solved tasks. Either way, neither part nor 100 MMLU-Pro </w:t>
+        <w:t xml:space="preserve"> items, never trained on: write a program in C++, Java, Go, Rust, JavaScript or TypeScript (286), or fix a wrong C++ or Java submission (209), each run on up to 30 tests. A round is kept if a one-sided exact sign test against the best adapter gives p ≤ 0.05, or if its score is no lower and its loss on 177 held-out bug-fix steps or 200 held-out terminal steps falls on significantly more steps than it rises (Holm-adjusted), since contest items cannot see what those rows teach. These losses measure closeness to reference answers, not solved tasks. Either way, neither part nor 100 MMLU-Pro </w:t>
       </w:r>
       <w:fldSimple w:instr=" REF _RefAnneal38 \r \h ">
         <w:r>
@@ -2508,7 +2508,15 @@
         </w:r>
       </w:fldSimple>
       <w:r>
-        <w:t xml:space="preserve"> questions outside computing may drop by over 5 points or significantly, nor EvalPlus, run only on passing rounds, by over 3 points or significantly, and a fresh-seed re-score becomes the new reference. Unless a loss is clearly lower, a round stops, rejected, after a random third of the items if not ahead of the best (in simulation, about a third less test time for 5 to 7% fewer real keeps). A rejected round's rows roll into the next attempt, up to 3,000 new rows, because a real 2-point gain passes the gate only an estimated 24 to 44% of the time.</w:t>
+        <w:t xml:space="preserve"> questions outside computing may drop by over 5 points or significantly; a passing round also may not drop on EvalPlus by over 3 points, or on 150 Java and JavaScript BFCL tool calls </w:t>
+      </w:r>
+      <w:fldSimple w:instr=" REF _RefAnneal39 \r \h ">
+        <w:r>
+          <w:t xml:space="preserve">[39]</w:t>
+        </w:r>
+      </w:fldSimple>
+      <w:r>
+        <w:t xml:space="preserve"> by over 6, or significantly. A fresh-seed re-score then becomes the new reference. Unless a loss is clearly lower, a round stops, rejected, after a random third, or two-thirds, of the items if not ahead of the best (in simulation, 40% less test time for non-improving rounds and 5 to 7% fewer real keeps). A rejected round's rows roll into the next attempt, up to 3,000 new rows, because a real 2-point gain passes the gate only an estimated 24 to 44% of the time.</w:t>
       </w:r>
     </w:p>
     <w:p>
@@ -2525,9 +2533,9 @@
       <w:r>
         <w:t xml:space="preserve"> uses a warmup-stable-decay schedule </w:t>
       </w:r>
-      <w:fldSimple w:instr=" REF _RefAnneal39 \r \h ">
+      <w:fldSimple w:instr=" REF _RefAnneal40 \r \h ">
         <w:r>
-          <w:t xml:space="preserve">[39]</w:t>
+          <w:t xml:space="preserve">[40]</w:t>
         </w:r>
       </w:fldSimple>
       <w:r>
@@ -5876,12 +5884,52 @@
       </w:pPr>
       <w:bookmarkStart w:id="939" w:name="_RefAnneal39"/>
       <w:r>
+        <w:t xml:space="preserve">S. G. Patil </w:t>
+      </w:r>
+      <w:r>
+        <w:rPr>
+          <w:i/>
+        </w:rPr>
+        <w:t xml:space="preserve">et al.</w:t>
+      </w:r>
+      <w:r>
+        <w:t xml:space="preserve">, "Berkeley Function Calling Leaderboard (bfcl-eval 2026.3.23)," GitHub repository, 2026. </w:t>
+      </w:r>
+      <w:r>
+        <w:t xml:space="preserve">[Online]. Available: </w:t>
+      </w:r>
+      <w:hyperlink r:id="rId60">
+        <w:r>
+          <w:rPr>
+            <w:color w:val="0563C1"/>
+            <w:u w:val="single"/>
+          </w:rPr>
+          <w:t xml:space="preserve">https://github.com/ShishirPatil/gorilla</w:t>
+        </w:r>
+      </w:hyperlink>
+      <w:r>
+        <w:t xml:space="preserve"> (accessed Oct. 21, 2026).</w:t>
+      </w:r>
+      <w:bookmarkEnd w:id="939"/>
+    </w:p>
+    <w:p>
+      <w:pPr>
+        <w:pStyle w:val="Reference"/>
+        <w:tabs>
+          <w:tab w:val="clear" w:pos="426"/>
+          <w:tab w:val="num" w:pos="567"/>
+        </w:tabs>
+        <w:ind w:left="567" w:hanging="567"/>
+        <w:jc w:val="left"/>
+      </w:pPr>
+      <w:bookmarkStart w:id="940" w:name="_RefAnneal40"/>
+      <w:r>
         <w:t xml:space="preserve">A. Hägele, E. Bakouch, A. Kosson, L. Ben Allal, L. Von Werra, and M. Jaggi, "Scaling laws and compute-optimal training beyond fixed training durations," arXiv preprint arXiv:2405.18392, 2024. </w:t>
       </w:r>
       <w:r>
         <w:t xml:space="preserve">[Online]. Available: </w:t>
       </w:r>
-      <w:hyperlink r:id="rId60">
+      <w:hyperlink r:id="rId61">
         <w:r>
           <w:rPr>
             <w:color w:val="0563C1"/>
@@ -5890,7 +5938,7 @@
           <w:t xml:space="preserve">https://arxiv.org/abs/2405.18392</w:t>
         </w:r>
       </w:hyperlink>
-      <w:bookmarkEnd w:id="939"/>
+      <w:bookmarkEnd w:id="940"/>
     </w:p>
     <w:sectPr>
       <w:footerReference w:type="default" r:id="rId18"/>

</xml_diff>

<commit_message>
Outline: six answers at once, 55-hour gate pass, CWEval no-worse check
Every model is scored with identical settings; six parallel answers
measured about 19% faster than four, so every check but EvalPlus runs
six. Passing rounds also face CWEval's 32 Go and JavaScript
secure-coding tasks.
</commit_message>
<xml_diff>
--- a/dissertation/Anneal_Dissertation_Outline.docx
+++ b/dissertation/Anneal_Dissertation_Outline.docx
@@ -576,7 +576,7 @@
         </w:r>
       </w:fldSimple>
       <w:r>
-        <w:t xml:space="preserve"> freeze the pretrained weights and learn each weight update as the product of two small matrices of rank r. On GPT-3 175B this cut the number of trainable parameters 10,000-fold and GPU memory threefold while matching full fine-tuning, and a merged adapter adds no inference latency. Its weaknesses for this project are that the frozen base stays in 16-bit precision, about 55 GB at 27B, and that the evaluation used short natural-language tasks and adapted only the attention projections. Anneal adopts the mechanism and separate adapter loading, but treats rank and target modules as variables to test.</w:t>
+        <w:t xml:space="preserve"> freeze the pretrained weights and learn each weight update as the product of two small matrices of rank r. On GPT-3 175B this cut the number of trainable parameters 10,000-fold and GPU memory threefold while matching full fine-tuning. Its weaknesses for this project are that the frozen base stays in 16-bit precision, about 55 GB at 27B, and that the evaluation used short natural-language tasks and adapted only the attention projections. Anneal adopts the mechanism and separate adapter loading, but treats rank and target modules as variables to test.</w:t>
       </w:r>
     </w:p>
     <w:p>
@@ -720,7 +720,7 @@
         </w:r>
       </w:fldSimple>
       <w:r>
-        <w:t xml:space="preserve"> built SWE-bench from 2,294 GitHub issues across 12 Python repositories: a model must edit the repository until the project's own tests pass, which matches scenario S2 more closely than single-function benchmarks. Its weaknesses are cost and noise. Each task needs a container and a token-hungry agent loop, scores depend on the agent scaffold, and underspecified tasks led to SWE-bench Verified, a human-validated subset of 500 </w:t>
+        <w:t xml:space="preserve"> built SWE-bench from 2,294 GitHub issues across 12 Python repositories: a model must edit the repository until the project's own tests pass, which matches scenario S2 more closely than single-function benchmarks. Each task needs a container and a token-hungry agent loop, scores depend on the agent scaffold, and underspecified tasks led to SWE-bench Verified, a human-validated subset of 500 </w:t>
       </w:r>
       <w:fldSimple w:instr=" REF _RefAnneal10 \r \h ">
         <w:r>
@@ -2500,7 +2500,7 @@
         </w:r>
       </w:fldSimple>
       <w:r>
-        <w:t xml:space="preserve"> items, never trained on: write a program in C++, Java, Go, Rust, JavaScript or TypeScript (286), or fix a wrong C++ or Java submission (209), each run on up to 30 tests. A round is kept if a one-sided exact sign test against the best adapter gives p ≤ 0.05, or if its score is no lower and its loss on 177 held-out bug-fix steps or 200 held-out terminal steps falls on significantly more steps than it rises (Holm-adjusted), since contest items cannot see what those rows teach. These losses measure closeness to reference answers, not solved tasks. Either way, neither part nor 100 MMLU-Pro </w:t>
+        <w:t xml:space="preserve"> items, never trained on: write a program in C++, Java, Go, Rust, JavaScript or TypeScript (286), or fix a wrong C++ or Java submission (209). A round is kept if a one-sided exact sign test against the best adapter gives p ≤ 0.05, or if its score is no lower and its loss on 177 held-out bug-fix steps or 200 held-out terminal steps falls on significantly more steps than it rises (Holm-adjusted), since contest items cannot see what those rows teach. These losses measure closeness to reference answers, not solved tasks. Either way, neither part nor 100 MMLU-Pro </w:t>
       </w:r>
       <w:fldSimple w:instr=" REF _RefAnneal38 \r \h ">
         <w:r>
@@ -2508,7 +2508,7 @@
         </w:r>
       </w:fldSimple>
       <w:r>
-        <w:t xml:space="preserve"> questions outside computing may drop by over 5 points or significantly; a passing round also may not drop on EvalPlus by over 3 points, or on 150 Java and JavaScript BFCL tool calls </w:t>
+        <w:t xml:space="preserve"> questions outside computing may drop by over 5 points or significantly; a passing round also may not drop on EvalPlus by over 3 points, on 150 Java and JavaScript BFCL tool calls </w:t>
       </w:r>
       <w:fldSimple w:instr=" REF _RefAnneal39 \r \h ">
         <w:r>
@@ -2516,7 +2516,15 @@
         </w:r>
       </w:fldSimple>
       <w:r>
-        <w:t xml:space="preserve"> by over 6, or significantly. A fresh-seed re-score then becomes the new reference. Unless a loss is clearly lower, a round stops, rejected, after a random third, or two-thirds, of the items if not ahead of the best (in simulation, 40% less test time for non-improving rounds and 5 to 7% fewer real keeps). A rejected round's rows roll into the next attempt, up to 3,000 new rows, because a real 2-point gain passes the gate only an estimated 24 to 44% of the time.</w:t>
+        <w:t xml:space="preserve"> by over 6, or on 32 Go and JavaScript CWEval secure-coding tasks </w:t>
+      </w:r>
+      <w:fldSimple w:instr=" REF _RefAnneal40 \r \h ">
+        <w:r>
+          <w:t xml:space="preserve">[40]</w:t>
+        </w:r>
+      </w:fldSimple>
+      <w:r>
+        <w:t xml:space="preserve"> by over 12, or significantly. A fresh-seed re-score then becomes the new reference. Unless a loss is clearly lower, a round stops, rejected, after a random third, or two-thirds, of the items if not ahead of the best (in simulation, 40% less test time for non-improving rounds and 5 to 7% fewer real keeps). A rejected round's rows roll into the next attempt, up to 3,000 new rows, because a real 2-point gain passes the gate only an estimated 24 to 44% of the time.</w:t>
       </w:r>
     </w:p>
     <w:p>
@@ -2533,13 +2541,13 @@
       <w:r>
         <w:t xml:space="preserve"> uses a warmup-stable-decay schedule </w:t>
       </w:r>
-      <w:fldSimple w:instr=" REF _RefAnneal40 \r \h ">
+      <w:fldSimple w:instr=" REF _RefAnneal41 \r \h ">
         <w:r>
-          <w:t xml:space="preserve">[40]</w:t>
+          <w:t xml:space="preserve">[41]</w:t>
         </w:r>
       </w:fldSimple>
       <w:r>
-        <w:t xml:space="preserve"> (20 warm-up steps, decay over the last 20%). To survive crashes and updates over months, it saves every 10 steps, resumes when the same command is re-run, and refuses to resume if the training file has changed. In a CPU test with a tiny model of the same architecture, a run killed with </w:t>
+        <w:t xml:space="preserve"> (20 warm-up steps, decay over the last 20%). To survive crashes and updates over months, it saves every 10 steps and resumes when the same command is re-run. In a CPU test with a tiny model of the same architecture, a run killed with </w:t>
       </w:r>
       <w:r>
         <w:rPr>
@@ -2998,7 +3006,7 @@
         <w:pStyle w:val="BodyFirst"/>
       </w:pPr>
       <w:r>
-        <w:t xml:space="preserve">The evaluation script serves the model through llama.cpp at the full 262k context with thinking on and scores HumanEval+ and MBPP+ with the Windows EvalPlus port. Calibration chose four parallel requests without multi-token prediction (MTP) for throughput; a 542-problem pass takes 10 to 12 hours.</w:t>
+        <w:t xml:space="preserve">The evaluation script serves the model through llama.cpp at the full 262k context with thinking on, and every model is scored with identical settings. Six parallel answers measured about 19% faster than four, so every check but EvalPlus runs six, and the base's gate pass restarted to match; EvalPlus keeps four, as for its base score, at 10 to 12 hours a pass.</w:t>
       </w:r>
     </w:p>
     <w:p>
@@ -3022,7 +3030,7 @@
         <w:pStyle w:val="BodyFirst"/>
       </w:pPr>
       <w:r>
-        <w:t xml:space="preserve">Measuring first helped: the parity test caught a wrong fix before any real run used it. Speed and memory were measured only at rank 16. One gate pass takes about two days, which limits how many rounds fit. With 20 to 50 personal tasks, confidence intervals will be wide. Round 0 showed that a working pipeline can still fail to improve a strong base, and that near-ceiling Python benchmarks cannot show small gains.</w:t>
+        <w:t xml:space="preserve">Measuring first helped: the parity test caught a wrong fix before any real run used it. Speed and memory were measured only at rank 16. One gate pass takes an estimated 55 hours, which limits how many rounds fit. With 20 to 50 personal tasks, confidence intervals will be wide. Round 0 showed that a working pipeline can still fail to improve a strong base, and that near-ceiling Python benchmarks cannot show small gains.</w:t>
       </w:r>
     </w:p>
     <w:p>
@@ -5924,12 +5932,49 @@
       </w:pPr>
       <w:bookmarkStart w:id="940" w:name="_RefAnneal40"/>
       <w:r>
+        <w:t xml:space="preserve">J. Peng, L. Cui, K. Huang, J. Yang, and B. Ray, "CWEval: Outcome-driven evaluation on functionality and security of LLM code generation," in </w:t>
+      </w:r>
+      <w:r>
+        <w:rPr>
+          <w:i/>
+        </w:rPr>
+        <w:t xml:space="preserve">Proc. IEEE/ACM Int. Workshop Large Language Models for Code (LLM4Code)</w:t>
+      </w:r>
+      <w:r>
+        <w:t xml:space="preserve">, 2025. </w:t>
+      </w:r>
+      <w:r>
+        <w:t xml:space="preserve">[Online]. Available: </w:t>
+      </w:r>
+      <w:hyperlink r:id="rId61">
+        <w:r>
+          <w:rPr>
+            <w:color w:val="0563C1"/>
+            <w:u w:val="single"/>
+          </w:rPr>
+          <w:t xml:space="preserve">https://arxiv.org/abs/2501.08200</w:t>
+        </w:r>
+      </w:hyperlink>
+      <w:bookmarkEnd w:id="940"/>
+    </w:p>
+    <w:p>
+      <w:pPr>
+        <w:pStyle w:val="Reference"/>
+        <w:tabs>
+          <w:tab w:val="clear" w:pos="426"/>
+          <w:tab w:val="num" w:pos="567"/>
+        </w:tabs>
+        <w:ind w:left="567" w:hanging="567"/>
+        <w:jc w:val="left"/>
+      </w:pPr>
+      <w:bookmarkStart w:id="941" w:name="_RefAnneal41"/>
+      <w:r>
         <w:t xml:space="preserve">A. Hägele, E. Bakouch, A. Kosson, L. Ben Allal, L. Von Werra, and M. Jaggi, "Scaling laws and compute-optimal training beyond fixed training durations," arXiv preprint arXiv:2405.18392, 2024. </w:t>
       </w:r>
       <w:r>
         <w:t xml:space="preserve">[Online]. Available: </w:t>
       </w:r>
-      <w:hyperlink r:id="rId61">
+      <w:hyperlink r:id="rId62">
         <w:r>
           <w:rPr>
             <w:color w:val="0563C1"/>
@@ -5938,7 +5983,7 @@
           <w:t xml:space="preserve">https://arxiv.org/abs/2405.18392</w:t>
         </w:r>
       </w:hyperlink>
-      <w:bookmarkEnd w:id="940"/>
+      <w:bookmarkEnd w:id="941"/>
     </w:p>
     <w:sectPr>
       <w:footerReference w:type="default" r:id="rId18"/>

</xml_diff>

<commit_message>
Outline: five answers at once, 32,768-token thinking cap, no gate-hours figure
Every check but EvalPlus runs five answers at once, the most with room
for 40,960-token answers; reasoning is capped at 32,768 tokens, ended
with Qwen's stop-thinking sentence on all but EvalPlus; a gate pass
takes several days until the base pass measures it.
</commit_message>
<xml_diff>
--- a/dissertation/Anneal_Dissertation_Outline.docx
+++ b/dissertation/Anneal_Dissertation_Outline.docx
@@ -2581,7 +2581,7 @@
         <w:pStyle w:val="BodyFirst"/>
       </w:pPr>
       <w:r>
-        <w:t xml:space="preserve">Bring-up and the first run raised the issues in Table 3. The run trained on 7.40 million tokens at about 100 tokens per second, and held-out loss fell from 0.593 to 0.498. Over all 542 EvalPlus problems with extra tests the base scored 86.2% and the adapter 85.4% (−0.7 points, 95% CI −2.6 to +1.1, p = 0.57); HumanEval+ rose 1.8 points and MBPP+ fell 1.9, neither significant, and leaving out five unreliable or overlapping problems does not change this. So there was no significant regression, and no measurable gain this near the ceiling (base 97% on HumanEval); a probably weaker teacher may also have contributed. EvalPlus is therefore now only a regression check.</w:t>
+        <w:t xml:space="preserve">Bring-up and the first run raised the issues in Table 3. The run trained on 7.40 million tokens, and held-out loss fell from 0.593 to 0.498. Over all 542 EvalPlus problems with extra tests the base scored 86.2% and the adapter 85.4% (−0.7 points, 95% CI −2.6 to +1.1, p = 0.57); HumanEval+ rose 1.8 points and MBPP+ fell 1.9, neither significant, and leaving out five unreliable or overlapping problems does not change this. So there was no significant regression, and no measurable gain this near the ceiling (base 97% on HumanEval); a probably weaker teacher may also have contributed. EvalPlus is therefore now only a regression check.</w:t>
       </w:r>
     </w:p>
     <w:p>
@@ -3006,7 +3006,7 @@
         <w:pStyle w:val="BodyFirst"/>
       </w:pPr>
       <w:r>
-        <w:t xml:space="preserve">The evaluation script serves the model through llama.cpp at the full 262k context with thinking on, and every model is scored with identical settings. Six parallel answers measured about 19% faster than four, so every check but EvalPlus runs six, and the base's gate pass restarted to match; EvalPlus keeps four, as for its base score, at 10 to 12 hours a pass.</w:t>
+        <w:t xml:space="preserve">The evaluation script serves the model through llama.cpp at the full 262k context with thinking on, and every model is scored with identical settings. Five parallel answers, the most with room for 40,960-token answers, measured about 13% faster than four, so every check but EvalPlus runs five, and the base's gate pass restarted to match; EvalPlus keeps its base score's four (10 to 12 hours a pass).</w:t>
       </w:r>
     </w:p>
     <w:p>
@@ -3014,7 +3014,7 @@
         <w:pStyle w:val="BodyText"/>
       </w:pPr>
       <w:r>
-        <w:t xml:space="preserve">The adapter is converted alone to GGUF and loaded over the same base, avoiding a 55 GB merged model. Trained against NF4 but served over Q4_K_M, a smoke-test adapter gave close losses (0.756 in training, 0.728 in llama.cpp, 96% top-1 agreement), suggesting the adapter carries over to the deployed base.</w:t>
+        <w:t xml:space="preserve">The adapter is converted alone to GGUF and loaded over the same base, avoiding a 55 GB merged model. Trained against NF4 but served over Q4_K_M, a smoke-test adapter gave close losses (0.756 in training, 0.728 in llama.cpp, 96% top-1 agreement), suggesting it carries over to the deployed base.</w:t>
       </w:r>
     </w:p>
     <w:p>
@@ -3030,7 +3030,7 @@
         <w:pStyle w:val="BodyFirst"/>
       </w:pPr>
       <w:r>
-        <w:t xml:space="preserve">Measuring first helped: the parity test caught a wrong fix before any real run used it. Speed and memory were measured only at rank 16. One gate pass takes an estimated 55 hours, which limits how many rounds fit. With 20 to 50 personal tasks, confidence intervals will be wide. Round 0 showed that a working pipeline can still fail to improve a strong base, and that near-ceiling Python benchmarks cannot show small gains.</w:t>
+        <w:t xml:space="preserve">Measuring first helped: the parity test caught a wrong fix before any real run used it. Speed and memory were measured only at rank 16. One gate pass takes several days, which limits how many rounds fit. With 20 to 50 personal tasks, confidence intervals will be wide. Round 0 showed that a working pipeline can still fail to improve a strong base.</w:t>
       </w:r>
     </w:p>
     <w:p>
@@ -3054,7 +3054,7 @@
         </w:r>
       </w:fldSimple>
       <w:r>
-        <w:t xml:space="preserve">; Anneal keeps 0.6 and caps reasoning at 16,384 tokens on the gate and 32,768 on EvalPlus to bound evaluation time, so absolute scores may sit below the card's.</w:t>
+        <w:t xml:space="preserve">; Anneal keeps 0.6 and caps reasoning at 32,768 tokens to bound evaluation time, ending it with Qwen's stop-thinking sentence on all but EvalPlus, so absolute scores may sit below the card's.</w:t>
       </w:r>
     </w:p>
     <w:p>

</xml_diff>

<commit_message>
Outline: fixed 200-problem six-language test, fixed checker, eight answers at once
The gate is a fixed 200 of the 495 problems, each answer run on its
problem's full test set under a checker that accepts any valid answer.
Table 1 gives the base's 69.5% on it against 97% on HumanEval. Every
check but EvalPlus runs eight answers at once.
</commit_message>
<xml_diff>
--- a/dissertation/Anneal_Dissertation_Outline.docx
+++ b/dissertation/Anneal_Dissertation_Outline.docx
@@ -696,7 +696,7 @@
         </w:r>
       </w:fldSimple>
       <w:r>
-        <w:t xml:space="preserve"> show that the popular needle-in-a-haystack test overstates context ability. RULER adds multi-key retrieval, variable tracking, aggregation and question answering at configurable lengths. Almost every model tested passed the simple needle test, but only about half of those claiming 32k tokens or more performed satisfactorily at 32k. RULER is synthetic and contains no code, its main weakness here, so Anneal runs it at 32k to 256k alongside LongCodeBench (Table 1), which covers scenario S3.</w:t>
+        <w:t xml:space="preserve"> show that the popular needle-in-a-haystack test overstates context ability. Almost every model tested passed the simple needle test, but only about half of those claiming 32k tokens or more performed satisfactorily at 32k. RULER is synthetic and contains no code, its main weakness here, so Anneal runs it at 32k to 256k alongside LongCodeBench (Table 1), which covers scenario S3.</w:t>
       </w:r>
     </w:p>
     <w:p>
@@ -1107,7 +1107,7 @@
               <w:rPr>
                 <w:sz w:val="20"/>
               </w:rPr>
-              <w:t xml:space="preserve">A six-language CodeContests test (Section 3.3) as the primary measure, since the base passes 97% of HumanEval; EvalPlus </w:t>
+              <w:t xml:space="preserve">A six-language CodeContests test (Section 3.3) as the primary measure, since the base passes 97% of HumanEval but 69.5% of it; EvalPlus </w:t>
             </w:r>
             <w:fldSimple w:instr=" REF _RefAnneal16 \r \h ">
               <w:r>
@@ -2468,7 +2468,7 @@
         </w:r>
       </w:fldSimple>
       <w:r>
-        <w:t xml:space="preserve">, probably below the base, though not measured like-for-like. Traces hitting the 6,144-token budget were rejected, so kept traces are short (median 436 tokens). Model-written code runs in a Windows AppContainer sandbox without network, file or administrator access, which passed 264 escape checks.</w:t>
+        <w:t xml:space="preserve">, probably below the base, though not measured like-for-like. Model-written code runs in a Windows AppContainer sandbox without network, file or administrator access, which passed 264 escape checks.</w:t>
       </w:r>
     </w:p>
     <w:p>
@@ -2484,7 +2484,7 @@
         <w:pStyle w:val="BodyFirst"/>
       </w:pPr>
       <w:r>
-        <w:t xml:space="preserve">Training runs as an unattended keep-if-better loop. Round 1 starts from the base model, never the first-run adapter; each later round continues the best adapter on 1,000 new rows plus 25% replayed from earlier rows, re-warming and decaying the learning rate, which in continual pre-training matched retraining on all data </w:t>
+        <w:t xml:space="preserve">Training runs as an unattended keep-if-better loop. The loop starts from the base model, never the first-run adapter; each later round continues the best adapter on 1,000 new rows plus 25% replayed from earlier rows, re-warming and decaying the learning rate, which in continual pre-training matched retraining on all data </w:t>
       </w:r>
       <w:fldSimple w:instr=" REF _RefAnneal36 \r \h ">
         <w:r>
@@ -2492,7 +2492,7 @@
         </w:r>
       </w:fldSimple>
       <w:r>
-        <w:t xml:space="preserve">. Each round is scored on a held-out six-language gate of 495 decontaminated CodeContests </w:t>
+        <w:t xml:space="preserve">. Each round is scored on a held-out six-language gate of 200 decontaminated CodeContests </w:t>
       </w:r>
       <w:fldSimple w:instr=" REF _RefAnneal37 \r \h ">
         <w:r>
@@ -2500,7 +2500,7 @@
         </w:r>
       </w:fldSimple>
       <w:r>
-        <w:t xml:space="preserve"> items, never trained on: write a program in C++, Java, Go, Rust, JavaScript or TypeScript (286), or fix a wrong C++ or Java submission (209). A round is kept if a one-sided exact sign test against the best adapter gives p ≤ 0.05, or if its score is no lower and its loss on 177 held-out bug-fix steps or 200 held-out terminal steps falls on significantly more steps than it rises (Holm-adjusted), since contest items cannot see what those rows teach. These losses measure closeness to reference answers, not solved tasks. Either way, neither part nor 100 MMLU-Pro </w:t>
+        <w:t xml:space="preserve"> items, never trained on: write a program in C++, Java, Go, Rust, JavaScript or TypeScript, or fix a wrong C++ or Java submission. They are a fixed draw from 495, by rating, language and task, leaning towards harder problems and never chosen by the base's results; each answer runs on its problem's full test set, under a checker that accepts any valid answer. A round is kept if a one-sided exact sign test against the best adapter gives p ≤ 0.05, or if its score is no lower and its loss on 177 held-out bug-fix steps or 200 held-out terminal steps falls on significantly more steps than it rises (Holm-adjusted), since contest items cannot see what those rows teach. These losses measure closeness to reference answers, not solved tasks. Either way, neither part nor 100 MMLU-Pro </w:t>
       </w:r>
       <w:fldSimple w:instr=" REF _RefAnneal38 \r \h ">
         <w:r>
@@ -2524,7 +2524,7 @@
         </w:r>
       </w:fldSimple>
       <w:r>
-        <w:t xml:space="preserve"> by over 12, or significantly. A fresh-seed re-score then becomes the new reference. Unless a loss is clearly lower, a round stops, rejected, after a random third, or two-thirds, of the items if not ahead of the best (in simulation, 40% less test time for non-improving rounds and 5 to 7% fewer real keeps). A rejected round's rows roll into the next attempt, up to 3,000 new rows, because a real 2-point gain passes the gate only an estimated 24 to 44% of the time.</w:t>
+        <w:t xml:space="preserve"> by over 12, or significantly. A fresh-seed re-score then becomes the new reference. Unless a loss is clearly lower, a round stops, rejected, after a random third, or two-thirds, of the items if not ahead of the best. A rejected round's rows roll into the next attempt, up to 3,000 new rows, because small real gains often fail the gate, and 200 items need about 1.6 times the gain 495 did (estimated).</w:t>
       </w:r>
     </w:p>
     <w:p>
@@ -2581,7 +2581,7 @@
         <w:pStyle w:val="BodyFirst"/>
       </w:pPr>
       <w:r>
-        <w:t xml:space="preserve">Bring-up and the first run raised the issues in Table 3. The run trained on 7.40 million tokens, and held-out loss fell from 0.593 to 0.498. Over all 542 EvalPlus problems with extra tests the base scored 86.2% and the adapter 85.4% (−0.7 points, 95% CI −2.6 to +1.1, p = 0.57); HumanEval+ rose 1.8 points and MBPP+ fell 1.9, neither significant, and leaving out five unreliable or overlapping problems does not change this. So there was no significant regression, and no measurable gain this near the ceiling (base 97% on HumanEval); a probably weaker teacher may also have contributed. EvalPlus is therefore now only a regression check.</w:t>
+        <w:t xml:space="preserve">Bring-up and the first run raised the issues in Table 3. The run trained on 7.40 million tokens, and held-out loss fell from 0.593 to 0.498. Over all 542 EvalPlus problems with extra tests the base scored 86.2% and the adapter 85.4% (−0.7 points, 95% CI −2.6 to +1.1, p = 0.57); HumanEval+ rose 1.8 points and MBPP+ fell 1.9, neither significant. So there was no significant regression, and no measurable gain this near the ceiling (base 97% on HumanEval); a probably weaker teacher may also have contributed. EvalPlus is therefore now only a regression check.</w:t>
       </w:r>
     </w:p>
     <w:p>
@@ -3006,7 +3006,7 @@
         <w:pStyle w:val="BodyFirst"/>
       </w:pPr>
       <w:r>
-        <w:t xml:space="preserve">The evaluation script serves the model through llama.cpp at the full 262k context with thinking on, and every model is scored with identical settings. Five parallel answers, the most with room for 40,960-token answers, measured about 13% faster than four, so every check but EvalPlus runs five, and the base's gate pass restarted to match; EvalPlus keeps its base score's four (10 to 12 hours a pass).</w:t>
+        <w:t xml:space="preserve">The evaluation script serves the model through llama.cpp at the full 262k context with thinking on, and every model gets the same prompts, token limits, sampling, checker and graphics driver. With a larger cache, eight parallel answers each still have room for 40,960 tokens and measured 12 to 15% faster than five, so every check but EvalPlus runs eight; EvalPlus keeps its base score's four (10 to 12 hours a pass).</w:t>
       </w:r>
     </w:p>
     <w:p>
@@ -3030,7 +3030,7 @@
         <w:pStyle w:val="BodyFirst"/>
       </w:pPr>
       <w:r>
-        <w:t xml:space="preserve">Measuring first helped: the parity test caught a wrong fix before any real run used it. Speed and memory were measured only at rank 16. One gate pass takes several days, which limits how many rounds fit. With 20 to 50 personal tasks, confidence intervals will be wide. Round 0 showed that a working pipeline can still fail to improve a strong base.</w:t>
+        <w:t xml:space="preserve">Measuring first helped: the parity test caught a wrong fix before any real run used it. Speed and memory were measured only at rank 16. A full 495-item gate pass took about four days, so rounds use a fixed 200, trading power for more rounds. With 20 to 50 personal tasks, confidence intervals will be wide. Round 0 showed that a working pipeline can still fail to improve a strong base.</w:t>
       </w:r>
     </w:p>
     <w:p>

</xml_diff>

<commit_message>
Outline: first loop round's result and the next round's recipe
</commit_message>
<xml_diff>
--- a/dissertation/Anneal_Dissertation_Outline.docx
+++ b/dissertation/Anneal_Dissertation_Outline.docx
@@ -1463,7 +1463,7 @@
         <w:pStyle w:val="BodyFirst"/>
       </w:pPr>
       <w:r>
-        <w:t xml:space="preserve">The prototype is a version-controlled repository of scripts and configuration for every stage in Figure 1. It was brought up on the training machine in October 2026; the first run, round 0 (Section 3.2), was trained and scored by 21 October.</w:t>
+        <w:t xml:space="preserve">The prototype is a version-controlled repository of scripts and configuration for every stage in Figure 1. It was brought up in October 2026; the first run, round 0 (Section 3.2), was scored by 21 October.</w:t>
       </w:r>
     </w:p>
     <w:p>
@@ -1569,7 +1569,7 @@
         <w:pStyle w:val="BodyText"/>
       </w:pPr>
       <w:r>
-        <w:t xml:space="preserve">Table 2 decided the precision: neither base would fit without Unsloth's optimisations, and with them an 8-bit base would barely fit while a 4-bit base leaves room for longer rows. Ablation A5 measures the 4-bit cost. The loop uses the longest rows that fit with a margin (peak within 29 GiB, 6 GB of system memory free): 16,384 tokens crashed, so the cap is 12,288.</w:t>
+        <w:t xml:space="preserve">Table 2 decided the precision: neither base would fit without Unsloth's optimisations, and with them an 8-bit base would barely fit while a 4-bit base leaves room for longer rows. The loop uses the longest rows that fit with a margin (peak within 29 GiB, 6 GB of system memory free): 16,384 tokens crashed, so the cap is 12,288.</w:t>
       </w:r>
     </w:p>
     <w:p>
@@ -2468,7 +2468,7 @@
         </w:r>
       </w:fldSimple>
       <w:r>
-        <w:t xml:space="preserve">, probably below the base, though not measured like-for-like. Model-written code runs in a Windows AppContainer sandbox without network, file or administrator access, which passed 264 escape checks.</w:t>
+        <w:t xml:space="preserve">, probably below the base, though not measured like-for-like. Model-written code runs in an AppContainer sandbox without network, file or administrator access, which passed 264 escape checks.</w:t>
       </w:r>
     </w:p>
     <w:p>
@@ -2565,7 +2565,7 @@
         <w:pStyle w:val="BodyText"/>
       </w:pPr>
       <w:r>
-        <w:t xml:space="preserve">Small test fixtures caught four silent bugs, all fixed, including a unit-test filter that passed every answer and targets that missed the 48 DeltaNet layers' projections.</w:t>
+        <w:t xml:space="preserve">Test fixtures caught four silent bugs, all fixed, such as LoRA targets missing DeltaNet.</w:t>
       </w:r>
     </w:p>
     <w:p>
@@ -2573,7 +2573,7 @@
         <w:pStyle w:val="Heading2"/>
       </w:pPr>
       <w:r>
-        <w:t xml:space="preserve">Bring-up and First Run</w:t>
+        <w:t xml:space="preserve">Bring-up and First Rounds</w:t>
       </w:r>
     </w:p>
     <w:p>
@@ -2581,7 +2581,7 @@
         <w:pStyle w:val="BodyFirst"/>
       </w:pPr>
       <w:r>
-        <w:t xml:space="preserve">Bring-up and the first run raised the issues in Table 3. The run trained on 7.40 million tokens, and held-out loss fell from 0.593 to 0.498. Over all 542 EvalPlus problems with extra tests the base scored 86.2% and the adapter 85.4% (−0.7 points, 95% CI −2.6 to +1.1, p = 0.57); HumanEval+ rose 1.8 points and MBPP+ fell 1.9, neither significant. So there was no significant regression, and no measurable gain this near the ceiling (base 97% on HumanEval); a probably weaker teacher may also have contributed. EvalPlus is therefore now only a regression check.</w:t>
+        <w:t xml:space="preserve">Bring-up and the first run raised the issues in Table 3. The run trained on 7.40 million tokens, and held-out loss fell from 0.593 to 0.498. Over all 542 EvalPlus problems with extra tests the base scored 86.2% and the adapter 85.4% (−0.7 points, 95% CI −2.6 to +1.1, p = 0.57), so there was no significant regression, and no measurable gain this near the ceiling (base 97% on HumanEval); a probably weaker teacher may also have contributed.</w:t>
       </w:r>
     </w:p>
     <w:p>
@@ -2876,68 +2876,6 @@
           <w:p>
             <w:pPr>
               <w:pStyle w:val="BodyText"/>
-              <w:keepNext/>
-              <w:spacing w:before="20" w:after="20"/>
-              <w:jc w:val="left"/>
-            </w:pPr>
-            <w:r>
-              <w:rPr>
-                <w:sz w:val="20"/>
-              </w:rPr>
-              <w:t xml:space="preserve">EvalPlus scorer does not run on Windows</w:t>
-            </w:r>
-          </w:p>
-        </w:tc>
-        <w:tc>
-          <w:tcPr>
-            <w:tcW w:w="2900" w:type="dxa"/>
-          </w:tcPr>
-          <w:p>
-            <w:pPr>
-              <w:pStyle w:val="BodyText"/>
-              <w:keepNext/>
-              <w:spacing w:before="20" w:after="20"/>
-              <w:jc w:val="left"/>
-            </w:pPr>
-            <w:r>
-              <w:rPr>
-                <w:sz w:val="20"/>
-              </w:rPr>
-              <w:t xml:space="preserve">It relies on Unix-only signals and resource limits</w:t>
-            </w:r>
-          </w:p>
-        </w:tc>
-        <w:tc>
-          <w:tcPr>
-            <w:tcW w:w="3196" w:type="dxa"/>
-          </w:tcPr>
-          <w:p>
-            <w:pPr>
-              <w:pStyle w:val="BodyText"/>
-              <w:keepNext/>
-              <w:spacing w:before="20" w:after="20"/>
-              <w:jc w:val="left"/>
-            </w:pPr>
-            <w:r>
-              <w:rPr>
-                <w:sz w:val="20"/>
-              </w:rPr>
-              <w:t xml:space="preserve">Sandboxed port; reference solutions score 378/378 (MBPP+) and 163/164 (HumanEval+)</w:t>
-            </w:r>
-          </w:p>
-        </w:tc>
-      </w:tr>
-      <w:tr>
-        <w:trPr>
-          <w:cantSplit/>
-        </w:trPr>
-        <w:tc>
-          <w:tcPr>
-            <w:tcW w:w="2200" w:type="dxa"/>
-          </w:tcPr>
-          <w:p>
-            <w:pPr>
-              <w:pStyle w:val="BodyText"/>
               <w:spacing w:before="20" w:after="20"/>
               <w:jc w:val="left"/>
             </w:pPr>
@@ -2995,6 +2933,14 @@
     </w:p>
     <w:p>
       <w:pPr>
+        <w:pStyle w:val="BodyText"/>
+      </w:pPr>
+      <w:r>
+        <w:t xml:space="preserve">The first loop round, a prototype run through every check, was rejected by the keep rule but kept for testing settings: it passed 111 of the 200 against the base's 139 (14 won, 42 lost) and scored lower on MMLU-Pro, BFCL, CWEval and EvalPlus (82.3% against 86.2%), though its held-out losses fell about 14.5%. It reasoned far less (median 11,542 tokens against 32,790 on fix items), likely, though not proven, because its rows' median reasoning was 224 tokens. The next round restarts from the base with bug-fix and terminal steps of at least 150 reasoning tokens, longest-reasoning coding rows first, and an equal-weight KL term pulling its predictions on reasoning tokens towards the base model's.</w:t>
+      </w:r>
+    </w:p>
+    <w:p>
+      <w:pPr>
         <w:pStyle w:val="Heading2"/>
       </w:pPr>
       <w:r>
@@ -3006,7 +2952,7 @@
         <w:pStyle w:val="BodyFirst"/>
       </w:pPr>
       <w:r>
-        <w:t xml:space="preserve">The evaluation script serves the model through llama.cpp at the full 262k context with thinking on, and every model gets the same prompts, token limits, sampling, checker and graphics driver. With a larger cache, eight parallel answers each still have room for 40,960 tokens and measured 12 to 15% faster than five, so every check but EvalPlus runs eight; EvalPlus keeps its base score's four (10 to 12 hours a pass).</w:t>
+        <w:t xml:space="preserve">The evaluation script serves the model through llama.cpp at the full 262k context with thinking on, and every model gets the same prompts, token limits, sampling, checker and graphics driver. Every check but EvalPlus runs eight answers at once, each with room for 40,960 tokens, measured 12 to 15% faster than five; EvalPlus keeps four.</w:t>
       </w:r>
     </w:p>
     <w:p>
@@ -3539,7 +3485,7 @@
         <w:t xml:space="preserve">Statistics.</w:t>
       </w:r>
       <w:r>
-        <w:t xml:space="preserve"> Pass rates are averaged over seeds; 95% confidence intervals for A minus B come from a paired bootstrap over problems, with a paired permutation test for significance. With one seed, round 0's 95% interval spanned 3.7 points; three seeds should narrow it. As the gate also selects adapters, its final gain may be inflated; LiveCodeBench and the personal tasks, which select nothing, check it.</w:t>
+        <w:t xml:space="preserve"> Pass rates are averaged over seeds; 95% confidence intervals for A minus B come from a paired bootstrap over problems, with a paired permutation test for significance. As the gate also selects adapters, its final gain may be inflated; LiveCodeBench and the personal tasks, which select nothing, check it.</w:t>
       </w:r>
     </w:p>
     <w:p>
@@ -3583,7 +3529,7 @@
         <w:t xml:space="preserve">Ablations.</w:t>
       </w:r>
       <w:r>
-        <w:t xml:space="preserve"> One loop round tests A1 rank and A2 DeltaNet targets together: rank 64 on every projection (435M trainable parameters against 80M), retrained from the base on all kept rows. A paired round retrains a kept adapter's rows from the base, comparing continuing with replay against retraining. Separate 1,000-row runs cover A3 example length (4,096, 8,192), A4 long examples or trainable normalisation if a kept adapter fails O4, and A5 an 8-bit base.</w:t>
+        <w:t xml:space="preserve"> One loop round tests A1 rank and A2 DeltaNet targets together: rank 64 on every projection, retrained from the base on all kept rows. A paired round retrains a kept adapter's rows from the base, comparing continuing with replay against retraining. Separate 1,000-row runs cover A3 example length (4,096, 8,192), A4 long examples or trainable normalisation if a kept adapter fails O4, and A5 an 8-bit base.</w:t>
       </w:r>
     </w:p>
     <w:p>
@@ -3621,7 +3567,7 @@
         <w:pStyle w:val="BodyFirst"/>
       </w:pPr>
       <w:r>
-        <w:t xml:space="preserve">Round 0 is scored (Section 3.4), and the loop has started from the base model. Of about 136 usable machine days from November to March, roughly 15 go to ablations and 20 to evaluation; loop rounds use the rest.</w:t>
+        <w:t xml:space="preserve">Round 0 and the first loop round are scored (Section 3.4). Of about 136 usable machine days from November to March, roughly 15 go to ablations and 20 to evaluation; loop rounds use the rest.</w:t>
       </w:r>
     </w:p>
     <w:tbl>
@@ -3737,7 +3683,7 @@
               <w:rPr>
                 <w:sz w:val="20"/>
               </w:rPr>
-              <w:t xml:space="preserve">Round 0 trained and scored against the base: no significant change. Six-language gate built; longer rows tested; loop started.</w:t>
+              <w:t xml:space="preserve">Round 0 trained and scored against the base: no significant change. Six-language gate built; longer rows tested; first loop round rejected.</w:t>
             </w:r>
           </w:p>
         </w:tc>

</xml_diff>